<commit_message>
Remove introductory BSP and Network summary
</commit_message>
<xml_diff>
--- a/VuDuyKhanh_BCTTTN.docx
+++ b/VuDuyKhanh_BCTTTN.docx
@@ -10442,44 +10442,6 @@
       <w:pPr>
         <w:pBdr/>
         <w:spacing w:after="0" w:before="0" w:line="360" w:lineRule="auto"/>
-        <w:ind w:firstLine="720"/>
-        <w:jc w:val="both"/>
-        <w:rPr/>
-      </w:pPr>
-      <w:r>
-        <w:rPr>
-          <w:rFonts w:ascii="Times New Roman" w:hAnsi="Times New Roman" w:eastAsia="Times New Roman" w:cs="Times New Roman"/>
-          <w:color w:val="000000"/>
-          <w:sz w:val="28"/>
-          <w:szCs w:val="28"/>
-          <w:lang w:val="vi-VN"/>
-        </w:rPr>
-        <w:t xml:space="preserve">Vị trí thực tập thuộc bộ phận BSP của Công ty Cổ phần HSPTEK. BSP (Board Support Package, gói hỗ trợ bo mạch) là phần mềm nền tảng giúp hệ điều hành làm việc với một cấu hình phần cứng cụ thể. Theo thông tin được cung cấp, bộ phận này phát triển phần mềm nền tảng và đưa phần cứng vào hoạt động ban đầu (bring-up) trên các nền tảng Qualcomm; công việc chủ yếu gắn với Linux. Nội dung mạng (Network) đã được xác định là định hướng chuyên môn cho kỳ thực tập. Hiện việc tìm hiểu và gỡ lỗi một bo mạch liên quan vẫn đang tiếp diễn; báo cáo chỉ mô tả ở mức có thể công khai và chưa khẳng định kết quả kỹ thuật cuối cùng.</w:t>
-      </w:r>
-      <w:r>
-        <w:rPr>
-          <w:rFonts w:ascii="Times New Roman" w:hAnsi="Times New Roman" w:eastAsia="Times New Roman" w:cs="Times New Roman"/>
-          <w:color w:val="000000"/>
-          <w:sz w:val="28"/>
-          <w:szCs w:val="28"/>
-          <w:lang w:val="vi-VN"/>
-        </w:rPr>
-        <w:t xml:space="preserve"/>
-      </w:r>
-      <w:r>
-        <w:rPr>
-          <w:rFonts w:ascii="Times New Roman" w:hAnsi="Times New Roman" w:eastAsia="Times New Roman" w:cs="Times New Roman"/>
-          <w:sz w:val="28"/>
-          <w:szCs w:val="28"/>
-          <w:lang w:val="vi-VN"/>
-        </w:rPr>
-      </w:r>
-      <w:r/>
-    </w:p>
-    <w:p>
-      <w:pPr>
-        <w:pBdr/>
-        <w:spacing w:after="0" w:before="0" w:line="360" w:lineRule="auto"/>
         <w:ind/>
         <w:jc w:val="left"/>
         <w:rPr/>

</xml_diff>

<commit_message>
Refine opening problem statement
</commit_message>
<xml_diff>
--- a/VuDuyKhanh_BCTTTN.docx
+++ b/VuDuyKhanh_BCTTTN.docx
@@ -10398,7 +10398,7 @@
           <w:szCs w:val="28"/>
           <w:lang w:val="vi-VN"/>
         </w:rPr>
-        <w:t xml:space="preserve">Thiết bị điện tử nhúng kết hợp phần cứng và phần mềm để khởi động, điều khiển linh kiện và trao đổi dữ liệu. Khi tiếp cận công việc trong lĩnh vực này, cần hiểu chức năng chung của thiết bị và cách các thành phần phối hợp.</w:t>
+        <w:t xml:space="preserve">Thiết bị điện tử nhúng tích hợp phần cứng và phần mềm để thực hiện các chức năng xác định, như khởi tạo hệ thống, điều khiển thiết bị ngoại vi, xử lý và trao đổi dữ liệu. Để hiểu hoạt động của thiết bị, cần nắm chức năng của từng thành phần và cách chúng phối hợp trong toàn hệ thống.</w:t>
       </w:r>
       <w:r>
         <w:rPr>
@@ -10426,7 +10426,7 @@
           <w:szCs w:val="28"/>
           <w:lang w:val="vi-VN"/>
         </w:rPr>
-        <w:t xml:space="preserve">Kiến thức về điện tử, hệ thống nhúng và Internet vạn vật (IoT) được học ở trường là nền tảng ban đầu cho quá trình tiếp cận công việc. Báo cáo trình bày quá trình thực tập tại HSPTEK, nội dung công việc được định hướng và những kiến thức chuyên môn liên quan.</w:t>
+        <w:t xml:space="preserve">Kiến thức về điện tử, hệ thống nhúng và Internet vạn vật (IoT) được học ở trường là nền tảng ban đầu để tiếp cận lĩnh vực này. Báo cáo trình bày quá trình thực tập tại HSPTEK, phạm vi công việc được định hướng và các kiến thức chuyên môn có liên quan.</w:t>
       </w:r>
       <w:r>
         <w:rPr>

</xml_diff>

<commit_message>
Keep internship opening broad and defer network detail
</commit_message>
<xml_diff>
--- a/VuDuyKhanh_BCTTTN.docx
+++ b/VuDuyKhanh_BCTTTN.docx
@@ -44,7 +44,7 @@
         <mc:AlternateContent>
           <mc:Choice Requires="wpg">
             <w:drawing>
-              <wp:anchor distT="0" distB="0" distL="0" distR="0" simplePos="0" relativeHeight="251659264" behindDoc="1" locked="0" layoutInCell="1" allowOverlap="1">
+              <wp:anchor xmlns:wp="http://schemas.openxmlformats.org/drawingml/2006/wordprocessingDrawing" xmlns:wp14="http://schemas.microsoft.com/office/word/2010/wordprocessingDrawing" distT="0" distB="0" distL="0" distR="0" simplePos="0" relativeHeight="251659264" behindDoc="1" locked="0" layoutInCell="1" allowOverlap="1">
                 <wp:simplePos x="0" y="0"/>
                 <wp:positionH relativeFrom="margin">
                   <wp:posOffset>-101600</wp:posOffset>
@@ -57,7 +57,7 @@
                 <wp:wrapNone/>
                 <wp:docPr id="2" name="Outer cover frame" descr="Black rectangular outer border on cover"/>
                 <wp:cNvGraphicFramePr/>
-                <a:graphic>
+                <a:graphic xmlns:a="http://schemas.openxmlformats.org/drawingml/2006/main">
                   <a:graphicData uri="http://schemas.microsoft.com/office/word/2010/wordprocessingShape">
                     <wps:wsp>
                       <wps:cNvPr id="0" name=""/>
@@ -103,7 +103,7 @@
         <mc:AlternateContent>
           <mc:Choice Requires="wpg">
             <w:drawing>
-              <wp:anchor distT="0" distB="0" distL="0" distR="0" simplePos="0" relativeHeight="251659263" behindDoc="1" locked="0" layoutInCell="1" allowOverlap="1">
+              <wp:anchor xmlns:wp="http://schemas.openxmlformats.org/drawingml/2006/wordprocessingDrawing" xmlns:wp14="http://schemas.microsoft.com/office/word/2010/wordprocessingDrawing" distT="0" distB="0" distL="0" distR="0" simplePos="0" relativeHeight="251659263" behindDoc="1" locked="0" layoutInCell="1" allowOverlap="1">
                 <wp:simplePos x="0" y="0"/>
                 <wp:positionH relativeFrom="margin">
                   <wp:posOffset>-76200</wp:posOffset>
@@ -116,7 +116,7 @@
                 <wp:wrapNone/>
                 <wp:docPr id="3" name="Inner cover frame" descr="Thin black rectangular inner border on cover"/>
                 <wp:cNvGraphicFramePr/>
-                <a:graphic>
+                <a:graphic xmlns:a="http://schemas.openxmlformats.org/drawingml/2006/main">
                   <a:graphicData uri="http://schemas.microsoft.com/office/word/2010/wordprocessingShape">
                     <wps:wsp>
                       <wps:cNvPr id="0" name=""/>
@@ -315,14 +315,14 @@
         <mc:AlternateContent>
           <mc:Choice Requires="wpg">
             <w:drawing>
-              <wp:inline distT="0" distB="0" distL="0" distR="0">
+              <wp:inline xmlns:wp="http://schemas.openxmlformats.org/drawingml/2006/wordprocessingDrawing" distT="0" distB="0" distL="0" distR="0">
                 <wp:extent cx="1728455" cy="1844778"/>
                 <wp:effectExtent l="0" t="0" r="0" b="0"/>
                 <wp:docPr id="4" name="Picture 1" descr="Có thể là hình ảnh về văn bản cho biết 'HỌC HỌCVIỆN VIỆN KỸ THUẬT MẬT ΗΑ MÃ 1976 ACADEMY TECHNIQUES OF CRYPTOGRAPHY'"/>
                 <wp:cNvGraphicFramePr>
-                  <a:graphicFrameLocks noChangeAspect="1"/>
+                  <a:graphicFrameLocks xmlns:a="http://schemas.openxmlformats.org/drawingml/2006/main" noChangeAspect="1"/>
                 </wp:cNvGraphicFramePr>
-                <a:graphic>
+                <a:graphic xmlns:a="http://schemas.openxmlformats.org/drawingml/2006/main">
                   <a:graphicData uri="http://schemas.openxmlformats.org/drawingml/2006/picture">
                     <pic:pic xmlns:pic="http://schemas.openxmlformats.org/drawingml/2006/picture">
                       <pic:nvPicPr>
@@ -10362,12 +10362,12 @@
     </w:p>
     <w:p>
       <w:pPr>
+        <w:keepNext w:val="true"/>
         <w:pBdr/>
         <w:spacing w:after="0" w:before="0" w:line="360" w:lineRule="auto"/>
         <w:ind/>
         <w:jc w:val="left"/>
         <w:rPr/>
-        <w:keepNext w:val="true"/>
       </w:pPr>
       <w:r>
         <w:rPr>
@@ -10398,7 +10398,17 @@
           <w:szCs w:val="28"/>
           <w:lang w:val="vi-VN"/>
         </w:rPr>
-        <w:t xml:space="preserve">Thiết bị điện tử nhúng tích hợp phần cứng và phần mềm để thực hiện các chức năng xác định, như khởi tạo hệ thống, điều khiển thiết bị ngoại vi, xử lý và trao đổi dữ liệu. Để hiểu hoạt động của thiết bị, cần nắm chức năng của từng thành phần và cách chúng phối hợp trong toàn hệ thống.</w:t>
+        <w:t xml:space="preserve">Thiết bị nhúng tích </w:t>
+      </w:r>
+      <w:r>
+        <w:rPr>
+          <w:rFonts w:ascii="Times New Roman" w:hAnsi="Times New Roman" w:eastAsia="Times New Roman" w:cs="Times New Roman"/>
+          <w:color w:val="000000"/>
+          <w:sz w:val="28"/>
+          <w:szCs w:val="28"/>
+          <w:lang w:val="vi-VN"/>
+        </w:rPr>
+        <w:t xml:space="preserve">hợp phần cứng và phần mềm để thực hiện các chức năng xác định, như khởi tạo hệ thống, điều khiển thiết bị ngoại vi, xử lý và trao đổi dữ liệu. Để hiểu hoạt động của thiết bị, cần nắm chức năng của từng thành phần và cách chúng phối hợp trong toàn hệ thống.</w:t>
       </w:r>
       <w:r>
         <w:rPr>
@@ -10426,7 +10436,7 @@
           <w:szCs w:val="28"/>
           <w:lang w:val="vi-VN"/>
         </w:rPr>
-        <w:t xml:space="preserve">Kiến thức về điện tử, hệ thống nhúng và Internet vạn vật (IoT) được học ở trường là nền tảng ban đầu để tiếp cận lĩnh vực này. Báo cáo trình bày quá trình thực tập tại HSPTEK, phạm vi công việc được định hướng và các kiến thức chuyên môn có liên quan.</w:t>
+        <w:t xml:space="preserve">Kiến thức về điện tử, hệ thống nhúng và Internet vạn vật (IoT) được học ở trường là nền tảng ban đầu để tiếp cận lĩnh vực này. Báo cáo trình bày quá trình thực tập tại HSPTEK cùng những kiến thức chuyên môn có liên quan.</w:t>
       </w:r>
       <w:r>
         <w:rPr>
@@ -10440,12 +10450,12 @@
     </w:p>
     <w:p>
       <w:pPr>
+        <w:keepNext w:val="true"/>
         <w:pBdr/>
         <w:spacing w:after="0" w:before="0" w:line="360" w:lineRule="auto"/>
         <w:ind/>
         <w:jc w:val="left"/>
         <w:rPr/>
-        <w:keepNext w:val="true"/>
       </w:pPr>
       <w:r>
         <w:rPr>
@@ -10481,16 +10491,6 @@
       <w:r>
         <w:rPr>
           <w:rFonts w:ascii="Times New Roman" w:hAnsi="Times New Roman" w:eastAsia="Times New Roman" w:cs="Times New Roman"/>
-          <w:color w:val="000000"/>
-          <w:sz w:val="28"/>
-          <w:szCs w:val="28"/>
-          <w:lang w:val="vi-VN"/>
-        </w:rPr>
-        <w:t xml:space="preserve"/>
-      </w:r>
-      <w:r>
-        <w:rPr>
-          <w:rFonts w:ascii="Times New Roman" w:hAnsi="Times New Roman" w:eastAsia="Times New Roman" w:cs="Times New Roman"/>
           <w:sz w:val="28"/>
           <w:szCs w:val="28"/>
           <w:lang w:val="vi-VN"/>
@@ -10502,7 +10502,7 @@
       <w:pPr>
         <w:pBdr/>
         <w:spacing w:after="0" w:before="0" w:line="360" w:lineRule="auto"/>
-        <w:ind w:left="720" w:hanging="360"/>
+        <w:ind w:hanging="360" w:left="720"/>
         <w:jc w:val="both"/>
         <w:rPr/>
       </w:pPr>
@@ -10514,17 +10514,7 @@
           <w:szCs w:val="28"/>
           <w:lang w:val="vi-VN"/>
         </w:rPr>
-        <w:t xml:space="preserve">- Củng cố kiến thức nền tảng về Linux, mạng máy tính và lập trình;</w:t>
-      </w:r>
-      <w:r>
-        <w:rPr>
-          <w:rFonts w:ascii="Times New Roman" w:hAnsi="Times New Roman" w:eastAsia="Times New Roman" w:cs="Times New Roman"/>
-          <w:color w:val="000000"/>
-          <w:sz w:val="28"/>
-          <w:szCs w:val="28"/>
-          <w:lang w:val="vi-VN"/>
-        </w:rPr>
-        <w:t xml:space="preserve"/>
+        <w:t xml:space="preserve">- Củng cố và hệ thống hóa kiến thức nền tảng về điện tử, hệ thống nhúng và Linux;</w:t>
       </w:r>
       <w:r>
         <w:rPr>
@@ -10540,7 +10530,7 @@
       <w:pPr>
         <w:pBdr/>
         <w:spacing w:after="0" w:before="0" w:line="360" w:lineRule="auto"/>
-        <w:ind w:left="720" w:hanging="360"/>
+        <w:ind w:hanging="360" w:left="720"/>
         <w:jc w:val="both"/>
         <w:rPr/>
       </w:pPr>
@@ -10552,17 +10542,7 @@
           <w:szCs w:val="28"/>
           <w:lang w:val="vi-VN"/>
         </w:rPr>
-        <w:t xml:space="preserve">- Hiểu khái quát các bước cấu hình, xây dựng và cài đặt phần mềm hệ thống lên thiết bị;</w:t>
-      </w:r>
-      <w:r>
-        <w:rPr>
-          <w:rFonts w:ascii="Times New Roman" w:hAnsi="Times New Roman" w:eastAsia="Times New Roman" w:cs="Times New Roman"/>
-          <w:color w:val="000000"/>
-          <w:sz w:val="28"/>
-          <w:szCs w:val="28"/>
-          <w:lang w:val="vi-VN"/>
-        </w:rPr>
-        <w:t xml:space="preserve"/>
+        <w:t xml:space="preserve">- Tìm hiểu mối quan hệ giữa phần cứng, phần mềm nền tảng và thiết bị ngoại vi trong hệ thống nhúng;</w:t>
       </w:r>
       <w:r>
         <w:rPr>
@@ -10578,7 +10558,7 @@
       <w:pPr>
         <w:pBdr/>
         <w:spacing w:after="0" w:before="0" w:line="360" w:lineRule="auto"/>
-        <w:ind w:left="720" w:hanging="360"/>
+        <w:ind w:hanging="360" w:left="720"/>
         <w:jc w:val="both"/>
         <w:rPr/>
       </w:pPr>
@@ -10590,17 +10570,7 @@
           <w:szCs w:val="28"/>
           <w:lang w:val="vi-VN"/>
         </w:rPr>
-        <w:t xml:space="preserve">- Tìm hiểu mối quan hệ giữa bo mạch, nền tảng Qualcomm, trình điều khiển và các thành phần mạng;</w:t>
-      </w:r>
-      <w:r>
-        <w:rPr>
-          <w:rFonts w:ascii="Times New Roman" w:hAnsi="Times New Roman" w:eastAsia="Times New Roman" w:cs="Times New Roman"/>
-          <w:color w:val="000000"/>
-          <w:sz w:val="28"/>
-          <w:szCs w:val="28"/>
-          <w:lang w:val="vi-VN"/>
-        </w:rPr>
-        <w:t xml:space="preserve"/>
+        <w:t xml:space="preserve">- Nắm khái quát các bước cấu hình, xây dựng và cài đặt phần mềm hệ thống trên thiết bị;</w:t>
       </w:r>
       <w:r>
         <w:rPr>
@@ -10616,7 +10586,7 @@
       <w:pPr>
         <w:pBdr/>
         <w:spacing w:after="0" w:before="0" w:line="360" w:lineRule="auto"/>
-        <w:ind w:left="720" w:hanging="360"/>
+        <w:ind w:hanging="360" w:left="720"/>
         <w:jc w:val="both"/>
         <w:rPr/>
       </w:pPr>
@@ -10628,17 +10598,7 @@
           <w:szCs w:val="28"/>
           <w:lang w:val="vi-VN"/>
         </w:rPr>
-        <w:t xml:space="preserve">- Rèn luyện kỹ năng đọc tài liệu kỹ thuật, trao đổi với người hướng dẫn và phân tích vấn đề theo từng lớp;</w:t>
-      </w:r>
-      <w:r>
-        <w:rPr>
-          <w:rFonts w:ascii="Times New Roman" w:hAnsi="Times New Roman" w:eastAsia="Times New Roman" w:cs="Times New Roman"/>
-          <w:color w:val="000000"/>
-          <w:sz w:val="28"/>
-          <w:szCs w:val="28"/>
-          <w:lang w:val="vi-VN"/>
-        </w:rPr>
-        <w:t xml:space="preserve"/>
+        <w:t xml:space="preserve">- Rèn luyện kỹ năng đọc tài liệu kỹ thuật, trao đổi chuyên môn và phân tích vấn đề có hệ thống;</w:t>
       </w:r>
       <w:r>
         <w:rPr>
@@ -10654,7 +10614,7 @@
       <w:pPr>
         <w:pBdr/>
         <w:spacing w:after="0" w:before="0" w:line="360" w:lineRule="auto"/>
-        <w:ind w:left="720" w:hanging="360"/>
+        <w:ind w:hanging="360" w:left="720"/>
         <w:jc w:val="both"/>
         <w:rPr/>
       </w:pPr>
@@ -10666,17 +10626,7 @@
           <w:szCs w:val="28"/>
           <w:lang w:val="vi-VN"/>
         </w:rPr>
-        <w:t xml:space="preserve">- Tổng hợp kiến thức đã học, kỹ năng đang hình thành và nội dung cần tiếp tục rèn luyện trong báo cáo.</w:t>
-      </w:r>
-      <w:r>
-        <w:rPr>
-          <w:rFonts w:ascii="Times New Roman" w:hAnsi="Times New Roman" w:eastAsia="Times New Roman" w:cs="Times New Roman"/>
-          <w:color w:val="000000"/>
-          <w:sz w:val="28"/>
-          <w:szCs w:val="28"/>
-          <w:lang w:val="vi-VN"/>
-        </w:rPr>
-        <w:t xml:space="preserve"/>
+        <w:t xml:space="preserve">- Tổng hợp kiến thức, kỹ năng thu nhận và tự đánh giá những nội dung cần tiếp tục rèn luyện.</w:t>
       </w:r>
       <w:r>
         <w:rPr>
@@ -10690,12 +10640,12 @@
     </w:p>
     <w:p>
       <w:pPr>
+        <w:keepNext w:val="true"/>
         <w:pBdr/>
         <w:spacing w:after="0" w:before="0" w:line="360" w:lineRule="auto"/>
         <w:ind/>
         <w:jc w:val="left"/>
         <w:rPr/>
-        <w:keepNext w:val="true"/>
       </w:pPr>
       <w:r>
         <w:rPr>
@@ -10726,7 +10676,7 @@
           <w:szCs w:val="28"/>
           <w:lang w:val="vi-VN"/>
         </w:rPr>
-        <w:t xml:space="preserve">Phạm vi báo cáo gồm thông tin công khai về HSPTEK và nội dung thực tập tại bộ phận BSP đã được xác nhận. Phần chuyên môn trình bày Linux, nền tảng Qualcomm, bring-up phần cứng và kiến thức mạng để giải thích bối cảnh công việc. Wi-Fi, modem di động và trình điều khiển được giới thiệu ở mức kiến thức nền; chưa khẳng định đã trực tiếp sửa hoặc kiểm thử các thành phần này.</w:t>
+        <w:t xml:space="preserve">Phạm vi báo cáo gồm thông tin công khai về HSPTEK, kiến thức nền tảng liên quan đến hệ thống nhúng và những nội dung thực tập có thể trình bày trên cơ sở thông tin đã xác nhận. Các nội dung chuyên môn được sắp xếp từ khái quát đến cụ thể để làm rõ kiến thức cần thiết trước khi trình bày quá trình thực tập.</w:t>
       </w:r>
       <w:r>
         <w:rPr>
@@ -10756,14 +10706,15 @@
         <w:ind w:firstLine="720"/>
         <w:jc w:val="both"/>
         <w:rPr/>
-      </w:pPr>
-      <w:r>
-        <w:rPr>
-          <w:rFonts w:ascii="Times New Roman" w:hAnsi="Times New Roman" w:eastAsia="Times New Roman" w:cs="Times New Roman"/>
-          <w:color w:val="000000"/>
-          <w:sz w:val="28"/>
-        </w:rPr>
-        <w:t xml:space="preserve">Việc tìm hiểu và phân tích lỗi mạng vẫn đang tiếp diễn, chưa có kết luận kỹ thuật cuối cùng được xác nhận. Để bảo đảm yêu cầu bảo mật, báo cáo không nêu mã dự án, mã bo mạch, khách hàng, nhật ký hệ thống, cấu hình nội bộ hoặc thông số kiểm thử. Các sơ đồ tự tổng hợp chỉ mô tả quy trình phổ quát; phần trải nghiệm cá nhân giới hạn ở việc tiếp cận tài liệu, làm quen với bo mạch phát triển và tìm hiểu nội dung mạng theo thông tin đã xác nhận.</w:t>
+        <w:keepLines/>
+      </w:pPr>
+      <w:r>
+        <w:rPr>
+          <w:rFonts w:ascii="Times New Roman" w:hAnsi="Times New Roman" w:eastAsia="Times New Roman" w:cs="Times New Roman"/>
+          <w:color w:val="000000"/>
+          <w:sz w:val="28"/>
+        </w:rPr>
+        <w:t xml:space="preserve">Để bảo đảm yêu cầu bảo mật, báo cáo không nêu tên hoặc mã dự án, mã bo mạch, thông tin khách hàng, nhật ký hệ thống, cấu hình nội bộ hay thông số kiểm thử. Các sơ đồ chỉ minh họa quy trình khái quát; nội dung chưa xác nhận không được trình bày như kết luận kỹ thuật.</w:t>
       </w:r>
       <w:r>
         <w:rPr>
@@ -10784,12 +10735,12 @@
     </w:p>
     <w:p>
       <w:pPr>
+        <w:keepNext w:val="true"/>
         <w:pBdr/>
         <w:spacing w:after="0" w:before="0" w:line="360" w:lineRule="auto"/>
         <w:ind/>
         <w:jc w:val="left"/>
         <w:rPr/>
-        <w:keepNext w:val="true"/>
       </w:pPr>
       <w:r>
         <w:rPr>
@@ -10820,7 +10771,7 @@
           <w:szCs w:val="28"/>
           <w:lang w:val="vi-VN"/>
         </w:rPr>
-        <w:t xml:space="preserve">Về chuyên môn, báo cáo đi từ cấu trúc hệ thống nhúng và vai trò BSP tới Linux trên nền tảng Qualcomm, các thành phần mạng và tiến trình tìm hiểu công việc. Kiến thức về cấu hình, xây dựng phần mềm hệ thống, bộ giao thức Internet (TCP/IP), Wi-Fi và trình điều khiển được dùng để giải thích bối cảnh kỹ thuật; phần trải nghiệm được trình bày theo đúng trạng thái đã học, đang tìm hiểu hoặc đã xác nhận.</w:t>
+        <w:t xml:space="preserve">Về chuyên môn, báo cáo được sắp xếp từ kiến thức nền tảng về hệ thống nhúng và phần mềm hệ thống tới các nội dung kỹ thuật cụ thể hơn. Quá trình thực tập được trình bày theo từng giai đoạn; những gì đã học, đang tìm hiểu và đã xác nhận được phân biệt rõ.</w:t>
       </w:r>
       <w:r>
         <w:rPr>
@@ -10844,12 +10795,12 @@
     </w:p>
     <w:p>
       <w:pPr>
+        <w:keepNext w:val="true"/>
         <w:pBdr/>
         <w:spacing w:after="0" w:before="0" w:line="360" w:lineRule="auto"/>
         <w:ind/>
         <w:jc w:val="left"/>
         <w:rPr/>
-        <w:keepNext w:val="true"/>
       </w:pPr>
       <w:r>
         <w:rPr>
@@ -10885,16 +10836,6 @@
       <w:r>
         <w:rPr>
           <w:rFonts w:ascii="Times New Roman" w:hAnsi="Times New Roman" w:eastAsia="Times New Roman" w:cs="Times New Roman"/>
-          <w:color w:val="000000"/>
-          <w:sz w:val="28"/>
-          <w:szCs w:val="28"/>
-          <w:lang w:val="vi-VN"/>
-        </w:rPr>
-        <w:t xml:space="preserve"/>
-      </w:r>
-      <w:r>
-        <w:rPr>
-          <w:rFonts w:ascii="Times New Roman" w:hAnsi="Times New Roman" w:eastAsia="Times New Roman" w:cs="Times New Roman"/>
           <w:sz w:val="28"/>
           <w:szCs w:val="28"/>
           <w:lang w:val="vi-VN"/>
@@ -10918,7 +10859,7 @@
       <w:pPr>
         <w:pBdr/>
         <w:spacing w:after="0" w:before="0" w:line="360" w:lineRule="auto"/>
-        <w:ind w:left="720" w:hanging="360"/>
+        <w:ind w:hanging="360" w:left="720"/>
         <w:jc w:val="both"/>
         <w:rPr/>
       </w:pPr>
@@ -10935,30 +10876,12 @@
       <w:r>
         <w:rPr>
           <w:rFonts w:ascii="Times New Roman" w:hAnsi="Times New Roman" w:eastAsia="Times New Roman" w:cs="Times New Roman"/>
-          <w:color w:val="000000"/>
           <w:sz w:val="28"/>
           <w:szCs w:val="28"/>
           <w:lang w:val="vi-VN"/>
         </w:rPr>
-        <w:t xml:space="preserve"/>
-      </w:r>
-      <w:r>
-        <w:rPr>
-          <w:rFonts w:ascii="Times New Roman" w:hAnsi="Times New Roman" w:eastAsia="Times New Roman" w:cs="Times New Roman"/>
-          <w:sz w:val="28"/>
-          <w:szCs w:val="28"/>
-          <w:lang w:val="vi-VN"/>
-        </w:rPr>
       </w:r>
       <w:bookmarkStart w:id="8" w:name="_2y7a94r9jxtv"/>
-      <w:r/>
-      <w:bookmarkEnd w:id="0"/>
-      <w:r/>
-      <w:bookmarkEnd w:id="1"/>
-      <w:r/>
-      <w:bookmarkEnd w:id="6"/>
-      <w:r/>
-      <w:bookmarkEnd w:id="7"/>
       <w:r/>
       <w:bookmarkEnd w:id="8"/>
       <w:r/>
@@ -10968,7 +10891,7 @@
       <w:pPr>
         <w:pBdr/>
         <w:spacing w:after="0" w:before="0" w:line="360" w:lineRule="auto"/>
-        <w:ind w:left="720" w:hanging="360"/>
+        <w:ind w:hanging="360" w:left="720"/>
         <w:jc w:val="both"/>
         <w:rPr/>
       </w:pPr>
@@ -10980,35 +10903,17 @@
           <w:szCs w:val="28"/>
           <w:lang w:val="vi-VN"/>
         </w:rPr>
-        <w:t xml:space="preserve">- Chương 2 trình bày công việc tại bộ phận BSP, kiến thức chuyên môn và tiến trình tìm hiểu Network theo trạng thái đã xác nhận;</w:t>
-      </w:r>
-      <w:r>
-        <w:rPr>
-          <w:rFonts w:ascii="Times New Roman" w:hAnsi="Times New Roman" w:eastAsia="Times New Roman" w:cs="Times New Roman"/>
-          <w:color w:val="000000"/>
+        <w:t xml:space="preserve">- Chương 2 trình bày cơ sở kỹ thuật cần thiết, tiếp theo là quá trình thực tập và các nội dung chuyên môn được tiếp cận;</w:t>
+      </w:r>
+      <w:r>
+        <w:rPr>
+          <w:rFonts w:ascii="Times New Roman" w:hAnsi="Times New Roman" w:eastAsia="Times New Roman" w:cs="Times New Roman"/>
           <w:sz w:val="28"/>
           <w:szCs w:val="28"/>
           <w:lang w:val="vi-VN"/>
         </w:rPr>
-        <w:t xml:space="preserve"/>
-      </w:r>
-      <w:r>
-        <w:rPr>
-          <w:rFonts w:ascii="Times New Roman" w:hAnsi="Times New Roman" w:eastAsia="Times New Roman" w:cs="Times New Roman"/>
-          <w:sz w:val="28"/>
-          <w:szCs w:val="28"/>
-          <w:lang w:val="vi-VN"/>
-        </w:rPr>
       </w:r>
       <w:bookmarkStart w:id="8" w:name="_2y7a94r9jxtv"/>
-      <w:r/>
-      <w:bookmarkEnd w:id="0"/>
-      <w:r/>
-      <w:bookmarkEnd w:id="1"/>
-      <w:r/>
-      <w:bookmarkEnd w:id="6"/>
-      <w:r/>
-      <w:bookmarkEnd w:id="7"/>
       <w:r/>
       <w:bookmarkEnd w:id="8"/>
       <w:r/>
@@ -11018,7 +10923,7 @@
       <w:pPr>
         <w:pBdr/>
         <w:spacing w:after="0" w:before="0" w:line="360" w:lineRule="auto"/>
-        <w:ind w:left="720" w:hanging="360"/>
+        <w:ind w:hanging="360" w:left="720"/>
         <w:jc w:val="both"/>
         <w:rPr/>
       </w:pPr>
@@ -11035,30 +10940,12 @@
       <w:r>
         <w:rPr>
           <w:rFonts w:ascii="Times New Roman" w:hAnsi="Times New Roman" w:eastAsia="Times New Roman" w:cs="Times New Roman"/>
-          <w:color w:val="000000"/>
           <w:sz w:val="28"/>
           <w:szCs w:val="28"/>
           <w:lang w:val="vi-VN"/>
         </w:rPr>
-        <w:t xml:space="preserve"/>
-      </w:r>
-      <w:r>
-        <w:rPr>
-          <w:rFonts w:ascii="Times New Roman" w:hAnsi="Times New Roman" w:eastAsia="Times New Roman" w:cs="Times New Roman"/>
-          <w:sz w:val="28"/>
-          <w:szCs w:val="28"/>
-          <w:lang w:val="vi-VN"/>
-        </w:rPr>
       </w:r>
       <w:bookmarkStart w:id="8" w:name="_2y7a94r9jxtv"/>
-      <w:r/>
-      <w:bookmarkEnd w:id="0"/>
-      <w:r/>
-      <w:bookmarkEnd w:id="1"/>
-      <w:r/>
-      <w:bookmarkEnd w:id="6"/>
-      <w:r/>
-      <w:bookmarkEnd w:id="7"/>
       <w:r/>
       <w:bookmarkEnd w:id="8"/>
       <w:r/>
@@ -11140,15 +11027,22 @@
           <w:color w:val="000000"/>
           <w:sz w:val="28"/>
         </w:rPr>
-        <w:t xml:space="preserve">Chương này lần lượt giới thiệu HSPTEK, quá trình phát triển, lĩnh vực hoạt động, sản phẩm công khai, bộ phận thực tập và định hướng của doanh nghiệp. Trình tự này đặt nội dung BSP và Network ở các chương sau vào bối cảnh phát triển thiết bị điện tử, nơi phần cứng và phần mềm cần được tích hợp qua nhiều giai đoạn.</w:t>
-      </w:r>
-      <w:r>
-        <w:rPr>
-          <w:rFonts w:ascii="Times New Roman" w:hAnsi="Times New Roman" w:eastAsia="Times New Roman" w:cs="Times New Roman"/>
-          <w:color w:val="000000"/>
-          <w:sz w:val="28"/>
-        </w:rPr>
-        <w:t xml:space="preserve"/>
+        <w:t xml:space="preserve">Chương này lần lượt giới thiệu HSPTEK, quá trình phát triể</w:t>
+      </w:r>
+      <w:r>
+        <w:rPr>
+          <w:rFonts w:ascii="Times New Roman" w:hAnsi="Times New Roman" w:eastAsia="Times New Roman" w:cs="Times New Roman"/>
+          <w:color w:val="000000"/>
+          <w:sz w:val="28"/>
+        </w:rPr>
+        <w:t xml:space="preserve">n, lĩnh vực hoạt động, sản phẩm công khai, bộ phận thực tập và định hướng của doanh nghiệp. Trình tự này đặt nội dung BSP và Network ở các chương sau vào bối cảnh phát triển thiết bị điện tử, nơi phần cứng và phần mềm cần được tích hợp qua nhiều giai đoạn.</w:t>
+      </w:r>
+      <w:r>
+        <w:rPr>
+          <w:rFonts w:ascii="Times New Roman" w:hAnsi="Times New Roman" w:eastAsia="Times New Roman" w:cs="Times New Roman"/>
+          <w:color w:val="000000"/>
+          <w:sz w:val="28"/>
+        </w:rPr>
       </w:r>
       <w:r/>
     </w:p>
@@ -11225,7 +11119,7 @@
           <w:szCs w:val="28"/>
           <w:lang w:val="vi-VN"/>
         </w:rPr>
-        <w:t xml:space="preserve">Công ty Cổ phần HSPTEK (HSPTEK Joint Stock Company) hoạt động trong lĩnh vực nghiên cứu, phát triển và sản xuất sản phẩm điện tử công nghệ cao. Website chính thức cho biết đội ngũ của công ty có hơn 15 năm kinh nghiệm trong các lĩnh vực này; con số này mô tả kinh nghiệm đội ngũ, không phải thời gian hoạt động của công ty. Các nhóm sản phẩm được giới thiệu gồm điện thoại thông minh, thiết bị nhà thông minh, camera trí tuệ nhân tạo (AI) và thiết bị AIoT, tức thiết bị kết hợp trí tuệ nhân tạo với Internet vạn vật.</w:t>
+        <w:t xml:space="preserve">Công</w:t>
       </w:r>
       <w:r>
         <w:rPr>
@@ -11235,7 +11129,26 @@
           <w:szCs w:val="28"/>
           <w:lang w:val="vi-VN"/>
         </w:rPr>
-        <w:t xml:space="preserve"/>
+        <w:t xml:space="preserve"> ty Cổ phần HSPTEK (HSPTEK Joint Stock Company) hoạt động trong lĩnh vực nghiên cứu, phát triển và sản xuất sản phẩm điện tử công nghệ cao. Website chính thức cho biết đội ngũ của công ty có hơn 15 năm kinh nghiệm trong các lĩnh vực này; con số này mô tả k</w:t>
+      </w:r>
+      <w:r>
+        <w:rPr>
+          <w:rFonts w:ascii="Times New Roman" w:hAnsi="Times New Roman" w:eastAsia="Times New Roman" w:cs="Times New Roman"/>
+          <w:color w:val="000000"/>
+          <w:sz w:val="28"/>
+          <w:szCs w:val="28"/>
+          <w:lang w:val="vi-VN"/>
+        </w:rPr>
+        <w:t xml:space="preserve">inh nghiệm đội ngũ, không phải thời gian hoạt động của công ty. Các nhóm sản phẩm được giới thiệu gồm điện thoại thông minh, thiết bị nhà thông minh, camera trí tuệ nhân tạo (AI) và thiết bị AIoT, tức thiết bị kết hợp trí tuệ nhân tạo với Internet vạn vật.</w:t>
+      </w:r>
+      <w:r>
+        <w:rPr>
+          <w:rFonts w:ascii="Times New Roman" w:hAnsi="Times New Roman" w:eastAsia="Times New Roman" w:cs="Times New Roman"/>
+          <w:color w:val="000000"/>
+          <w:sz w:val="28"/>
+          <w:szCs w:val="28"/>
+          <w:lang w:val="vi-VN"/>
+        </w:rPr>
       </w:r>
       <w:r/>
     </w:p>
@@ -11265,7 +11178,6 @@
           <w:szCs w:val="28"/>
           <w:lang w:val="vi-VN"/>
         </w:rPr>
-        <w:t xml:space="preserve"/>
       </w:r>
       <w:r/>
     </w:p>
@@ -11301,14 +11213,14 @@
         <mc:AlternateContent>
           <mc:Choice Requires="wpg">
             <w:drawing>
-              <wp:inline distT="0" distB="0" distL="0" distR="0">
+              <wp:inline xmlns:wp="http://schemas.openxmlformats.org/drawingml/2006/wordprocessingDrawing" distT="0" distB="0" distL="0" distR="0">
                 <wp:extent cx="4320000" cy="1498537"/>
                 <wp:effectExtent l="0" t="0" r="0" b="0"/>
-                <wp:docPr id="13" name="Logo HSPTEK" descr="Logo Công ty Cổ phần HSPTEK lấy từ website chính thức."/>
+                <wp:docPr id="5" name="Logo HSPTEK" descr="Logo Công ty Cổ phần HSPTEK lấy từ website chính thức."/>
                 <wp:cNvGraphicFramePr>
-                  <a:graphicFrameLocks noChangeAspect="1"/>
+                  <a:graphicFrameLocks xmlns:a="http://schemas.openxmlformats.org/drawingml/2006/main" noChangeAspect="1"/>
                 </wp:cNvGraphicFramePr>
-                <a:graphic>
+                <a:graphic xmlns:a="http://schemas.openxmlformats.org/drawingml/2006/main">
                   <a:graphicData uri="http://schemas.openxmlformats.org/drawingml/2006/picture">
                     <pic:pic xmlns:pic="http://schemas.openxmlformats.org/drawingml/2006/picture">
                       <pic:nvPicPr>
@@ -11319,7 +11231,7 @@
                         <pic:nvPr/>
                       </pic:nvPicPr>
                       <pic:blipFill rotWithShape="1">
-                        <a:blip r:embed="rId24"/>
+                        <a:blip r:embed="rId16"/>
                         <a:stretch/>
                       </pic:blipFill>
                       <pic:spPr bwMode="auto">
@@ -11358,7 +11270,7 @@
                 <v:path o:extrusionok="f" gradientshapeok="t" o:connecttype="rect"/>
                 <o:lock v:ext="edit" aspectratio="t"/>
               </v:shapetype>
-              <v:shape id="_x0000_i4" o:spid="_x0000_s4" type="#_x0000_t75" style="width:252.00pt;height:168.42pt;mso-wrap-distance-left:0.00pt;mso-wrap-distance-top:0.00pt;mso-wrap-distance-right:0.00pt;mso-wrap-distance-bottom:0.00pt;z-index:1;" stroked="false">
+              <v:shape id="_x0000_i4" o:spid="_x0000_s4" type="#_x0000_t75" style="width:340.16pt;height:118.00pt;mso-wrap-distance-left:0.00pt;mso-wrap-distance-top:0.00pt;mso-wrap-distance-right:0.00pt;mso-wrap-distance-bottom:0.00pt;z-index:1;" stroked="false">
                 <v:imagedata r:id="rId16" o:title=""/>
                 <o:lock v:ext="edit" rotation="t"/>
               </v:shape>
@@ -11460,7 +11372,7 @@
           <w:szCs w:val="28"/>
           <w:lang w:val="vi-VN"/>
         </w:rPr>
-        <w:t xml:space="preserve">Tháng 3 năm 2024, HSPTEK giới thiệu nền tảng máy tính AI điện toán biên KIMQ tại Data Center &amp; Cloud Infrastructure Summit (DCCI Summit). Điện toán biên là cách xử lý dữ liệu ngay tại hoặc gần thiết bị tạo dữ liệu, thay vì chuyển toàn bộ dữ liệu đến máy chủ ở xa. KIMQ là tên dòng sản phẩm do HSPTEK giới thiệu; các mô-đun KIMQ 5430 và KIMQ 6490 ban đầu sử dụng hệ thống trên chip (System on Chip, SoC) Qualcomm QCS5430 và QCS6490. SoC tích hợp các khối xử lý và giao tiếp chính của thiết bị. Theo bài viết kỷ niệm hai năm thành lập, các mốc tiếp theo gồm giải Nhì tại Qualcomm Vietnam Innovation Challenge 2024, giải Vàng Make in Vietnam cho nền tảng KIMQ, lô sản phẩm đầu tiên được xuất khẩu trong giai đoạn sản xuất hàng loạt vào tháng 3 năm 2025 và việc ra mắt KIMQ 8550 vào tháng 5 năm 2025.</w:t>
+        <w:t xml:space="preserve">Tháng 3 năm 2024, HSPTEK giớ</w:t>
       </w:r>
       <w:r>
         <w:rPr>
@@ -11470,7 +11382,36 @@
           <w:szCs w:val="28"/>
           <w:lang w:val="vi-VN"/>
         </w:rPr>
-        <w:t xml:space="preserve"/>
+        <w:t xml:space="preserve">i thiệu nền tảng máy tính AI điện toán biên KIMQ tại Data Center &amp; Cloud Infrastructure Summit (DCCI Summit). Điện toán biên là cách xử lý dữ liệu ngay tại hoặc gần thiết bị tạo dữ liệu, thay vì chuyển toàn bộ dữ liệu đến máy chủ ở xa. KIMQ là tên dòng sản</w:t>
+      </w:r>
+      <w:r>
+        <w:rPr>
+          <w:rFonts w:ascii="Times New Roman" w:hAnsi="Times New Roman" w:eastAsia="Times New Roman" w:cs="Times New Roman"/>
+          <w:color w:val="000000"/>
+          <w:sz w:val="28"/>
+          <w:szCs w:val="28"/>
+          <w:lang w:val="vi-VN"/>
+        </w:rPr>
+        <w:t xml:space="preserve"> phẩm do HSPTEK giới thiệu; các mô-đun KIMQ 5430 và KIMQ 6490 ban đầu sử dụng hệ thống trên chip (System on Chip, SoC) Qualcomm QCS5430 và QCS6490. SoC tích hợp các khối xử lý và giao tiếp chính của thiết bị. Theo bài viết kỷ niệm hai năm thành lập, các mố</w:t>
+      </w:r>
+      <w:r>
+        <w:rPr>
+          <w:rFonts w:ascii="Times New Roman" w:hAnsi="Times New Roman" w:eastAsia="Times New Roman" w:cs="Times New Roman"/>
+          <w:color w:val="000000"/>
+          <w:sz w:val="28"/>
+          <w:szCs w:val="28"/>
+          <w:lang w:val="vi-VN"/>
+        </w:rPr>
+        <w:t xml:space="preserve">c tiếp theo gồm giải Nhì tại Qualcomm Vietnam Innovation Challenge 2024, giải Vàng Make in Vietnam cho nền tảng KIMQ, lô sản phẩm đầu tiên được xuất khẩu trong giai đoạn sản xuất hàng loạt vào tháng 3 năm 2025 và việc ra mắt KIMQ 8550 vào tháng 5 năm 2025.</w:t>
+      </w:r>
+      <w:r>
+        <w:rPr>
+          <w:rFonts w:ascii="Times New Roman" w:hAnsi="Times New Roman" w:eastAsia="Times New Roman" w:cs="Times New Roman"/>
+          <w:color w:val="000000"/>
+          <w:sz w:val="28"/>
+          <w:szCs w:val="28"/>
+          <w:lang w:val="vi-VN"/>
+        </w:rPr>
       </w:r>
       <w:r/>
     </w:p>
@@ -11500,7 +11441,6 @@
           <w:szCs w:val="28"/>
           <w:lang w:val="vi-VN"/>
         </w:rPr>
-        <w:t xml:space="preserve"/>
       </w:r>
       <w:r/>
     </w:p>
@@ -11580,7 +11520,7 @@
           <w:szCs w:val="28"/>
           <w:lang w:val="vi-VN"/>
         </w:rPr>
-        <w:t xml:space="preserve">Trong giai đoạn thiết kế điện tử, sơ đồ nguyên lý mô tả cách các linh kiện được kết nối; bo mạch in (Printed Circuit Board, PCB) là nền để gắn linh kiện và tạo các kết nối điện. HSPTEK giới thiệu dịch vụ xây dựng sơ đồ nguyên lý, thiết kế PCB và mô phỏng tín hiệu. Ở mảng tần số vô tuyến (RF), dịch vụ gồm thiết kế ăng-ten và mạch vô tuyến, cùng hoạt động kiểm tra phù hợp. Thiết kế cơ khí gồm kiểu dáng, chi tiết kỹ thuật, mô hình 3D, mô phỏng lắp ráp và phân tích nhiệt.</w:t>
+        <w:t xml:space="preserve">Trong giai đoạn thiết kế điện tử, sơ đồ nguyên lý mô tả cách các linh kiện được kết nối; bo mạch in (Printed Circuit Board, PCB) là nền để gắn linh kiện và tạo các kết nối điện. HSPTEK giới thiệu dịch vụ xây dựng sơ </w:t>
       </w:r>
       <w:r>
         <w:rPr>
@@ -11590,7 +11530,16 @@
           <w:szCs w:val="28"/>
           <w:lang w:val="vi-VN"/>
         </w:rPr>
-        <w:t xml:space="preserve"/>
+        <w:t xml:space="preserve">đồ nguyên lý, thiết kế PCB và mô phỏng tín hiệu. Ở mảng tần số vô tuyến (RF), dịch vụ gồm thiết kế ăng-ten và mạch vô tuyến, cùng hoạt động kiểm tra phù hợp. Thiết kế cơ khí gồm kiểu dáng, chi tiết kỹ thuật, mô hình 3D, mô phỏng lắp ráp và phân tích nhiệt.</w:t>
+      </w:r>
+      <w:r>
+        <w:rPr>
+          <w:rFonts w:ascii="Times New Roman" w:hAnsi="Times New Roman" w:eastAsia="Times New Roman" w:cs="Times New Roman"/>
+          <w:color w:val="000000"/>
+          <w:sz w:val="28"/>
+          <w:szCs w:val="28"/>
+          <w:lang w:val="vi-VN"/>
+        </w:rPr>
       </w:r>
       <w:r/>
     </w:p>
@@ -11610,7 +11559,7 @@
           <w:szCs w:val="28"/>
           <w:lang w:val="vi-VN"/>
         </w:rPr>
-        <w:t xml:space="preserve">Ở mảng phần mềm, công ty giới thiệu kinh nghiệm phát triển hệ điều hành và ứng dụng cho thiết bị điện tử trên Linux và Android. Hệ điều hành quản lý tài nguyên thiết bị và cung cấp môi trường để ứng dụng vận hành; vì vậy, phần mềm cần phù hợp với phần cứng mà sản phẩm sử dụng. Các lĩnh vực trên là những năng lực do doanh nghiệp công bố trong chuỗi phát triển sản phẩm.</w:t>
+        <w:t xml:space="preserve">Ở mảng phần mềm, công ty giới thiệu kinh nghiệm phát triển hệ điều hành và ứng dụng cho thiết bị điện tử trên Linu</w:t>
       </w:r>
       <w:r>
         <w:rPr>
@@ -11620,7 +11569,16 @@
           <w:szCs w:val="28"/>
           <w:lang w:val="vi-VN"/>
         </w:rPr>
-        <w:t xml:space="preserve"/>
+        <w:t xml:space="preserve">x và Android. Hệ điều hành quản lý tài nguyên thiết bị và cung cấp môi trường để ứng dụng vận hành; vì vậy, phần mềm cần phù hợp với phần cứng mà sản phẩm sử dụng. Các lĩnh vực trên là những năng lực do doanh nghiệp công bố trong chuỗi phát triển sản phẩm.</w:t>
+      </w:r>
+      <w:r>
+        <w:rPr>
+          <w:rFonts w:ascii="Times New Roman" w:hAnsi="Times New Roman" w:eastAsia="Times New Roman" w:cs="Times New Roman"/>
+          <w:color w:val="000000"/>
+          <w:sz w:val="28"/>
+          <w:szCs w:val="28"/>
+          <w:lang w:val="vi-VN"/>
+        </w:rPr>
       </w:r>
       <w:r/>
     </w:p>
@@ -11670,7 +11628,7 @@
           <w:szCs w:val="28"/>
           <w:lang w:val="vi-VN"/>
         </w:rPr>
-        <w:t xml:space="preserve">Trong sản xuất theo đơn đặt hàng, ODM (Original Design Manufacturer) thường chỉ mô hình nhà cung cấp tham gia thiết kế hoặc phát triển sản phẩm; OEM (Original Equipment Manufacturer) thường chỉ mô hình sản xuất theo thiết kế hay yêu cầu của đối tác. HSPTEK giới thiệu dịch vụ ODM/OEM gồm thiết kế sản phẩm, thiết kế cơ khí và điện tử, thiết kế RF, phát triển phần mềm, tạo mẫu, thử nghiệm và sản xuất. Công ty cũng nêu các hoạt động đo kiểm, bảo đảm chất lượng và quản lý chuỗi cung ứng.</w:t>
+        <w:t xml:space="preserve">Trong sản xuất theo đơn đặt hàng, ODM (Original Design Manufacturer) thường chỉ mô hình nhà cung cấp tham gia thiết kế hoặc phát triển sản phẩm; OEM (Original Equipment Manufacturer) thường chỉ mô hình sản xuất theo thiết kế hay yê</w:t>
       </w:r>
       <w:r>
         <w:rPr>
@@ -11680,7 +11638,16 @@
           <w:szCs w:val="28"/>
           <w:lang w:val="vi-VN"/>
         </w:rPr>
-        <w:t xml:space="preserve"/>
+        <w:t xml:space="preserve">u cầu của đối tác. HSPTEK giới thiệu dịch vụ ODM/OEM gồm thiết kế sản phẩm, thiết kế cơ khí và điện tử, thiết kế RF, phát triển phần mềm, tạo mẫu, thử nghiệm và sản xuất. Công ty cũng nêu các hoạt động đo kiểm, bảo đảm chất lượng và quản lý chuỗi cung ứng.</w:t>
+      </w:r>
+      <w:r>
+        <w:rPr>
+          <w:rFonts w:ascii="Times New Roman" w:hAnsi="Times New Roman" w:eastAsia="Times New Roman" w:cs="Times New Roman"/>
+          <w:color w:val="000000"/>
+          <w:sz w:val="28"/>
+          <w:szCs w:val="28"/>
+          <w:lang w:val="vi-VN"/>
+        </w:rPr>
       </w:r>
       <w:r/>
     </w:p>
@@ -11700,7 +11667,7 @@
           <w:szCs w:val="28"/>
           <w:lang w:val="vi-VN"/>
         </w:rPr>
-        <w:t xml:space="preserve">Trang dịch vụ của doanh nghiệp giới thiệu các công đoạn sản xuất như kiểm tra linh kiện đầu vào, dây chuyền SMT (Surface-Mount Technology, công nghệ gắn linh kiện bề mặt), lắp ráp, kiểm tra bằng tia X và sửa chữa bo mạch. Đây là mô tả năng lực do doanh nghiệp công bố; công đoạn áp dụng cụ thể phụ thuộc từng sản phẩm và dự án.</w:t>
+        <w:t xml:space="preserve">Trang dịch vụ của doanh nghiệp giới thiệu các công đoạn sản xuất như ki</w:t>
       </w:r>
       <w:r>
         <w:rPr>
@@ -11710,7 +11677,16 @@
           <w:szCs w:val="28"/>
           <w:lang w:val="vi-VN"/>
         </w:rPr>
-        <w:t xml:space="preserve"/>
+        <w:t xml:space="preserve">ểm tra linh kiện đầu vào, dây chuyền SMT (Surface-Mount Technology, công nghệ gắn linh kiện bề mặt), lắp ráp, kiểm tra bằng tia X và sửa chữa bo mạch. Đây là mô tả năng lực do doanh nghiệp công bố; công đoạn áp dụng cụ thể phụ thuộc từng sản phẩm và dự án.</w:t>
+      </w:r>
+      <w:r>
+        <w:rPr>
+          <w:rFonts w:ascii="Times New Roman" w:hAnsi="Times New Roman" w:eastAsia="Times New Roman" w:cs="Times New Roman"/>
+          <w:color w:val="000000"/>
+          <w:sz w:val="28"/>
+          <w:szCs w:val="28"/>
+          <w:lang w:val="vi-VN"/>
+        </w:rPr>
       </w:r>
       <w:r/>
     </w:p>
@@ -11729,15 +11705,22 @@
           <w:color w:val="000000"/>
           <w:sz w:val="28"/>
         </w:rPr>
-        <w:t xml:space="preserve">Trên thực tế, ranh giới giữa ODM và OEM không cố định hoàn toàn: hợp đồng có thể phân chia trách nhiệm thiết kế, cung ứng linh kiện, thử nghiệm và sản xuất theo những cách khác nhau. Vì vậy, các thuật ngữ này được dùng trong báo cáo ở mức khái quát để mô tả loại hình dịch vụ, không suy ra trách nhiệm cụ thể của một dự án.</w:t>
-      </w:r>
-      <w:r>
-        <w:rPr>
-          <w:rFonts w:ascii="Times New Roman" w:hAnsi="Times New Roman" w:eastAsia="Times New Roman" w:cs="Times New Roman"/>
-          <w:color w:val="000000"/>
-          <w:sz w:val="28"/>
-        </w:rPr>
-        <w:t xml:space="preserve"/>
+        <w:t xml:space="preserve">Trên thực tế, ranh giới giữa ODM và OEM không cố định hoàn toàn: hợ</w:t>
+      </w:r>
+      <w:r>
+        <w:rPr>
+          <w:rFonts w:ascii="Times New Roman" w:hAnsi="Times New Roman" w:eastAsia="Times New Roman" w:cs="Times New Roman"/>
+          <w:color w:val="000000"/>
+          <w:sz w:val="28"/>
+        </w:rPr>
+        <w:t xml:space="preserve">p đồng có thể phân chia trách nhiệm thiết kế, cung ứng linh kiện, thử nghiệm và sản xuất theo những cách khác nhau. Vì vậy, các thuật ngữ này được dùng trong báo cáo ở mức khái quát để mô tả loại hình dịch vụ, không suy ra trách nhiệm cụ thể của một dự án.</w:t>
+      </w:r>
+      <w:r>
+        <w:rPr>
+          <w:rFonts w:ascii="Times New Roman" w:hAnsi="Times New Roman" w:eastAsia="Times New Roman" w:cs="Times New Roman"/>
+          <w:color w:val="000000"/>
+          <w:sz w:val="28"/>
+        </w:rPr>
       </w:r>
       <w:r/>
     </w:p>
@@ -11756,15 +11739,15 @@
           <w:color w:val="000000"/>
           <w:sz w:val="28"/>
         </w:rPr>
-        <w:t xml:space="preserve">Chuỗi tạo mẫu và sản xuất cần có tài liệu chế tạo, lắp ráp và kiểm tra đủ rõ để các mẫu tiếp theo có thể được đối chiếu. Những công đoạn kiểm tra đầu vào, lắp ráp, kiểm tra mối hàn và sửa chữa bo mạch là các ví dụ được doanh nghiệp nêu trên trang dịch vụ; đây không phải căn cứ để kết luận về phần việc thực tập.</w:t>
-      </w:r>
-      <w:r>
-        <w:rPr>
-          <w:rFonts w:ascii="Times New Roman" w:hAnsi="Times New Roman" w:eastAsia="Times New Roman" w:cs="Times New Roman"/>
-          <w:color w:val="000000"/>
-          <w:sz w:val="28"/>
-        </w:rPr>
-        <w:t xml:space="preserve"/>
+        <w:t xml:space="preserve">Chuỗi tạo mẫu và sản xuất cần có tài liệu chế tạo, lắp r</w:t>
+      </w:r>
+      <w:r>
+        <w:rPr>
+          <w:rFonts w:ascii="Times New Roman" w:hAnsi="Times New Roman" w:eastAsia="Times New Roman" w:cs="Times New Roman"/>
+          <w:color w:val="000000"/>
+          <w:sz w:val="28"/>
+        </w:rPr>
+        <w:t xml:space="preserve">áp và kiểm tra đủ rõ để các mẫu tiếp theo có thể được đối chiếu. Những công đoạn kiểm tra đầu vào, lắp ráp, kiểm tra mối hàn và sửa chữa bo mạch là các ví dụ được doanh nghiệp nêu trên trang dịch vụ; đây không phải căn cứ để kết luận về phần việc thực tập.</w:t>
       </w:r>
       <w:r>
         <w:rPr>
@@ -11821,7 +11804,7 @@
           <w:szCs w:val="28"/>
           <w:lang w:val="vi-VN"/>
         </w:rPr>
-        <w:t xml:space="preserve">HSPTEK giới thiệu các hoạt động kiểm thử ở nhiều phạm vi, từ từng thành phần đến toàn bộ hệ thống, cùng kiểm thử hồi quy, kiểm thử môi trường và đánh giá khả năng tương tác giữa thiết bị với hệ thống khác. Công ty cũng nêu hoạt động đánh giá sự phù hợp với yêu cầu của FCC (Federal Communications Commission, cơ quan quản lý truyền thông tại Hoa Kỳ), yêu cầu gắn dấu CE đối với sản phẩm thuộc phạm vi quy định của Liên minh châu Âu và RoHS (Restriction of Hazardous Substances, hạn chế một số chất nguy hại trong thiết bị điện và điện tử).</w:t>
+        <w:t xml:space="preserve">HSPTEK giới thiệu các hoạt </w:t>
       </w:r>
       <w:r>
         <w:rPr>
@@ -11831,7 +11814,26 @@
           <w:szCs w:val="28"/>
           <w:lang w:val="vi-VN"/>
         </w:rPr>
-        <w:t xml:space="preserve"/>
+        <w:t xml:space="preserve">động kiểm thử ở nhiều phạm vi, từ từng thành phần đến toàn bộ hệ thống, cùng kiểm thử hồi quy, kiểm thử môi trường và đánh giá khả năng tương tác giữa thiết bị với hệ thống khác. Công ty cũng nêu hoạt động đánh giá sự phù hợp với yêu cầu của FCC (Federal C</w:t>
+      </w:r>
+      <w:r>
+        <w:rPr>
+          <w:rFonts w:ascii="Times New Roman" w:hAnsi="Times New Roman" w:eastAsia="Times New Roman" w:cs="Times New Roman"/>
+          <w:color w:val="000000"/>
+          <w:sz w:val="28"/>
+          <w:szCs w:val="28"/>
+          <w:lang w:val="vi-VN"/>
+        </w:rPr>
+        <w:t xml:space="preserve">ommunications Commission, cơ quan quản lý truyền thông tại Hoa Kỳ), yêu cầu gắn dấu CE đối với sản phẩm thuộc phạm vi quy định của Liên minh châu Âu và RoHS (Restriction of Hazardous Substances, hạn chế một số chất nguy hại trong thiết bị điện và điện tử).</w:t>
+      </w:r>
+      <w:r>
+        <w:rPr>
+          <w:rFonts w:ascii="Times New Roman" w:hAnsi="Times New Roman" w:eastAsia="Times New Roman" w:cs="Times New Roman"/>
+          <w:color w:val="000000"/>
+          <w:sz w:val="28"/>
+          <w:szCs w:val="28"/>
+          <w:lang w:val="vi-VN"/>
+        </w:rPr>
       </w:r>
       <w:r/>
     </w:p>
@@ -11870,15 +11872,22 @@
           <w:color w:val="000000"/>
           <w:sz w:val="28"/>
         </w:rPr>
-        <w:t xml:space="preserve">Các loại kiểm thử trả lời những câu hỏi khác nhau. Kiểm thử đơn vị xem xét một thành phần riêng; kiểm thử tích hợp xem các thành phần phối hợp ra sao; kiểm thử hệ thống đánh giá thiết bị như một chỉnh thể; kiểm thử chấp nhận đối chiếu kết quả với yêu cầu đã thống nhất. Kiểm thử hồi quy kiểm tra chức năng cũ sau khi có thay đổi; kiểm thử môi trường đánh giá hoạt động trong những điều kiện xác định. Kết quả đạt ở một loại kiểm thử không tự động chứng minh các loại còn lại đều đạt yêu cầu.</w:t>
-      </w:r>
-      <w:r>
-        <w:rPr>
-          <w:rFonts w:ascii="Times New Roman" w:hAnsi="Times New Roman" w:eastAsia="Times New Roman" w:cs="Times New Roman"/>
-          <w:color w:val="000000"/>
-          <w:sz w:val="28"/>
-        </w:rPr>
-        <w:t xml:space="preserve"/>
+        <w:t xml:space="preserve">Các loại kiểm thử trả lời những câu hỏi khác nhau. Kiểm thử đơn vị xem xét một thành phần riêng; kiểm thử tích hợp xem các thành phần phối hợp ra sao; kiểm thử hệ thống đánh giá thiết bị như một chỉnh thể; kiểm thử chấp nhận đối chiếu </w:t>
+      </w:r>
+      <w:r>
+        <w:rPr>
+          <w:rFonts w:ascii="Times New Roman" w:hAnsi="Times New Roman" w:eastAsia="Times New Roman" w:cs="Times New Roman"/>
+          <w:color w:val="000000"/>
+          <w:sz w:val="28"/>
+        </w:rPr>
+        <w:t xml:space="preserve">kết quả với yêu cầu đã thống nhất. Kiểm thử hồi quy kiểm tra chức năng cũ sau khi có thay đổi; kiểm thử môi trường đánh giá hoạt động trong những điều kiện xác định. Kết quả đạt ở một loại kiểm thử không tự động chứng minh các loại còn lại đều đạt yêu cầu.</w:t>
+      </w:r>
+      <w:r>
+        <w:rPr>
+          <w:rFonts w:ascii="Times New Roman" w:hAnsi="Times New Roman" w:eastAsia="Times New Roman" w:cs="Times New Roman"/>
+          <w:color w:val="000000"/>
+          <w:sz w:val="28"/>
+        </w:rPr>
       </w:r>
       <w:r/>
     </w:p>
@@ -11923,12 +11932,12 @@
           </w:tcPr>
           <w:p>
             <w:pPr>
+              <w:pageBreakBefore w:val="true"/>
               <w:pBdr/>
               <w:spacing w:after="0" w:before="0" w:line="360" w:lineRule="auto"/>
               <w:ind w:firstLine="0" w:left="0"/>
               <w:jc w:val="center"/>
               <w:rPr/>
-              <w:pageBreakBefore w:val="true"/>
             </w:pPr>
             <w:r>
               <w:rPr>
@@ -12614,12 +12623,12 @@
           </w:tcPr>
           <w:p>
             <w:pPr>
+              <w:keepNext w:val="true"/>
               <w:pBdr/>
               <w:spacing w:after="0" w:before="0" w:line="360" w:lineRule="auto"/>
               <w:ind w:firstLine="0" w:left="0"/>
               <w:jc w:val="left"/>
               <w:rPr/>
-              <w:keepNext w:val="true"/>
             </w:pPr>
             <w:r>
               <w:rPr>
@@ -12707,7 +12716,7 @@
           <w:szCs w:val="28"/>
           <w:lang w:val="vi-VN"/>
         </w:rPr>
-        <w:t xml:space="preserve">HSPTEK cho biết dịch vụ ODM/OEM sử dụng nền tảng chip của Qualcomm và MediaTek. Website doanh nghiệp cũng đề cập mạng lưới đối tác gồm nhóm nghiên cứu và phát triển (R&amp;D) của Qualcomm cùng phòng thử nghiệm. Đây là các vai trò khác nhau: Qualcomm vừa cung cấp nền tảng xử lý cho một số sản phẩm, vừa được nêu trong mạng lưới đối tác; danh mục công nghệ của HSPTEK không chỉ giới hạn ở Qualcomm.</w:t>
+        <w:t xml:space="preserve">HSPTEK cho biết dịch vụ ODM/OEM sử dụng nền tảng chip của Qualcomm và MediaTek. Website doanh nghiệp cũng đề cập mạng lưới đối tác gồm nh</w:t>
       </w:r>
       <w:r>
         <w:rPr>
@@ -12717,7 +12726,16 @@
           <w:szCs w:val="28"/>
           <w:lang w:val="vi-VN"/>
         </w:rPr>
-        <w:t xml:space="preserve"/>
+        <w:t xml:space="preserve">óm nghiên cứu và phát triển (R&amp;D) của Qualcomm cùng phòng thử nghiệm. Đây là các vai trò khác nhau: Qualcomm vừa cung cấp nền tảng xử lý cho một số sản phẩm, vừa được nêu trong mạng lưới đối tác; danh mục công nghệ của HSPTEK không chỉ giới hạn ở Qualcomm.</w:t>
+      </w:r>
+      <w:r>
+        <w:rPr>
+          <w:rFonts w:ascii="Times New Roman" w:hAnsi="Times New Roman" w:eastAsia="Times New Roman" w:cs="Times New Roman"/>
+          <w:color w:val="000000"/>
+          <w:sz w:val="28"/>
+          <w:szCs w:val="28"/>
+          <w:lang w:val="vi-VN"/>
+        </w:rPr>
       </w:r>
       <w:r/>
     </w:p>
@@ -12737,7 +12755,7 @@
           <w:szCs w:val="28"/>
           <w:lang w:val="vi-VN"/>
         </w:rPr>
-        <w:t xml:space="preserve">Các mô-đun KIMQ 5430, KIMQ 6490 và KIMQ 8550 là sản phẩm do HSPTEK giới thiệu trên các SoC Qualcomm tương ứng. Ngoài mô-đun, một số thiết bị AI Box (máy tính điện toán biên dạng hộp, tích hợp mô-đun tính toán và cổng kết nối) cũng được phát triển trên các nền tảng này. Thông tin sản phẩm không đồng nghĩa với việc nội dung thực tập trực tiếp bao gồm phát triển các sản phẩm đó.</w:t>
+        <w:t xml:space="preserve">Các mô-đun KIMQ 5430, KIMQ 6490 và KIMQ 8550 là sản phẩm do HSPTEK giới thiệu trên các SoC Qualcomm tương ứng. Ngoài mô-đu</w:t>
       </w:r>
       <w:r>
         <w:rPr>
@@ -12747,7 +12765,7 @@
           <w:szCs w:val="28"/>
           <w:lang w:val="vi-VN"/>
         </w:rPr>
-        <w:t xml:space="preserve"/>
+        <w:t xml:space="preserve">n, một số thiết bị AI Box (máy tính điện toán biên dạng hộp, tích hợp mô-đun tính toán và cổng kết nối) cũng được phát triển trên các nền tảng này. Thông tin sản phẩm không đồng nghĩa với việc nội dung thực tập trực tiếp bao gồm phát triển các sản phẩm đó.</w:t>
       </w:r>
       <w:r>
         <w:rPr>
@@ -12775,15 +12793,30 @@
           <w:color w:val="000000"/>
           <w:sz w:val="28"/>
         </w:rPr>
-        <w:t xml:space="preserve">SoC tích hợp nhiều chức năng xử lý và giao tiếp trên một vi mạch, nhưng thiết bị hoàn chỉnh còn cần bo mạch, bộ nhớ, nguồn, ngoại vi, phần mềm khởi động và hệ điều hành. Phần mềm nền tảng gồm nhân hệ điều hành (kernel), trình điều khiển (driver) để hệ điều hành điều khiển phần cứng, firmware là chương trình mức thấp gắn với phần cứng, và các dịch vụ hoặc ứng dụng chạy ngoài nhân hệ điều hành (userspace). Khả năng khởi động và vận hành phụ thuộc vào sự phối hợp giữa các thành phần này, không chỉ ở bước biên dịch kernel.</w:t>
-      </w:r>
-      <w:r>
-        <w:rPr>
-          <w:rFonts w:ascii="Times New Roman" w:hAnsi="Times New Roman" w:eastAsia="Times New Roman" w:cs="Times New Roman"/>
-          <w:color w:val="000000"/>
-          <w:sz w:val="28"/>
-        </w:rPr>
-        <w:t xml:space="preserve"/>
+        <w:t xml:space="preserve">SoC tích hợp</w:t>
+      </w:r>
+      <w:r>
+        <w:rPr>
+          <w:rFonts w:ascii="Times New Roman" w:hAnsi="Times New Roman" w:eastAsia="Times New Roman" w:cs="Times New Roman"/>
+          <w:color w:val="000000"/>
+          <w:sz w:val="28"/>
+        </w:rPr>
+        <w:t xml:space="preserve"> nhiều chức năng xử lý và giao tiếp trên một vi mạch, nhưng thiết bị hoàn chỉnh còn cần bo mạch, bộ nhớ, nguồn, ngoại vi, phần mềm khởi động và hệ điều hành. Phần mềm nền tảng gồm nhân hệ điều hành (kernel), trình điều khiển (driver) để hệ điều hành điều k</w:t>
+      </w:r>
+      <w:r>
+        <w:rPr>
+          <w:rFonts w:ascii="Times New Roman" w:hAnsi="Times New Roman" w:eastAsia="Times New Roman" w:cs="Times New Roman"/>
+          <w:color w:val="000000"/>
+          <w:sz w:val="28"/>
+        </w:rPr>
+        <w:t xml:space="preserve">hiển phần cứng, firmware là chương trình mức thấp gắn với phần cứng, và các dịch vụ hoặc ứng dụng chạy ngoài nhân hệ điều hành (userspace). Khả năng khởi động và vận hành phụ thuộc vào sự phối hợp giữa các thành phần này, không chỉ ở bước biên dịch kernel.</w:t>
+      </w:r>
+      <w:r>
+        <w:rPr>
+          <w:rFonts w:ascii="Times New Roman" w:hAnsi="Times New Roman" w:eastAsia="Times New Roman" w:cs="Times New Roman"/>
+          <w:color w:val="000000"/>
+          <w:sz w:val="28"/>
+        </w:rPr>
       </w:r>
       <w:r/>
     </w:p>
@@ -12802,15 +12835,22 @@
           <w:color w:val="000000"/>
           <w:sz w:val="28"/>
         </w:rPr>
-        <w:t xml:space="preserve">Với một nền tảng SoC cụ thể, tài liệu kỹ thuật của nhà cung cấp giúp xác định phiên bản, cấu hình và quy trình xây dựng phần mềm được hỗ trợ. Một số tài liệu có thể yêu cầu quyền truy cập hoặc điều kiện cấp phép; phần trình bày ở đây chỉ dựa trên thông tin công khai và kiến thức khái quát. Việc đối chiếu đúng tài liệu giúp hiểu quan hệ giữa mã nguồn, cấu hình bo mạch và phiên bản phần mềm.</w:t>
-      </w:r>
-      <w:r>
-        <w:rPr>
-          <w:rFonts w:ascii="Times New Roman" w:hAnsi="Times New Roman" w:eastAsia="Times New Roman" w:cs="Times New Roman"/>
-          <w:color w:val="000000"/>
-          <w:sz w:val="28"/>
-        </w:rPr>
-        <w:t xml:space="preserve"/>
+        <w:t xml:space="preserve">Với một nền tảng SoC cụ thể, tài liệu kỹ thuật của nhà cung cấp giúp xác định phiên bản, cấu hình và quy trình xây dựng phần mềm được hỗ</w:t>
+      </w:r>
+      <w:r>
+        <w:rPr>
+          <w:rFonts w:ascii="Times New Roman" w:hAnsi="Times New Roman" w:eastAsia="Times New Roman" w:cs="Times New Roman"/>
+          <w:color w:val="000000"/>
+          <w:sz w:val="28"/>
+        </w:rPr>
+        <w:t xml:space="preserve"> trợ. Một số tài liệu có thể yêu cầu quyền truy cập hoặc điều kiện cấp phép; phần trình bày ở đây chỉ dựa trên thông tin công khai và kiến thức khái quát. Việc đối chiếu đúng tài liệu giúp hiểu quan hệ giữa mã nguồn, cấu hình bo mạch và phiên bản phần mềm.</w:t>
+      </w:r>
+      <w:r>
+        <w:rPr>
+          <w:rFonts w:ascii="Times New Roman" w:hAnsi="Times New Roman" w:eastAsia="Times New Roman" w:cs="Times New Roman"/>
+          <w:color w:val="000000"/>
+          <w:sz w:val="28"/>
+        </w:rPr>
       </w:r>
       <w:r/>
     </w:p>
@@ -12829,15 +12869,15 @@
           <w:color w:val="000000"/>
           <w:sz w:val="28"/>
         </w:rPr>
-        <w:t xml:space="preserve">Trong các ứng dụng như camera hoặc thiết bị công nghiệp cần phản hồi nhanh, xử lý dữ liệu ở gần nguồn có thể giảm lượng dữ liệu phải gửi đến máy chủ ở xa. Mức độ phù hợp phụ thuộc cấu hình thiết bị, loại dữ liệu và yêu cầu của ứng dụng; đây là bối cảnh sử dụng được giới thiệu cho một số sản phẩm KIMQ.</w:t>
-      </w:r>
-      <w:r>
-        <w:rPr>
-          <w:rFonts w:ascii="Times New Roman" w:hAnsi="Times New Roman" w:eastAsia="Times New Roman" w:cs="Times New Roman"/>
-          <w:color w:val="000000"/>
-          <w:sz w:val="28"/>
-        </w:rPr>
-        <w:t xml:space="preserve"/>
+        <w:t xml:space="preserve">Trong các ứng dụng như camera hoặc thiết bị cô</w:t>
+      </w:r>
+      <w:r>
+        <w:rPr>
+          <w:rFonts w:ascii="Times New Roman" w:hAnsi="Times New Roman" w:eastAsia="Times New Roman" w:cs="Times New Roman"/>
+          <w:color w:val="000000"/>
+          <w:sz w:val="28"/>
+        </w:rPr>
+        <w:t xml:space="preserve">ng nghiệp cần phản hồi nhanh, xử lý dữ liệu ở gần nguồn có thể giảm lượng dữ liệu phải gửi đến máy chủ ở xa. Mức độ phù hợp phụ thuộc cấu hình thiết bị, loại dữ liệu và yêu cầu của ứng dụng; đây là bối cảnh sử dụng được giới thiệu cho một số sản phẩm KIMQ.</w:t>
       </w:r>
       <w:r>
         <w:rPr>
@@ -12863,15 +12903,22 @@
           <w:color w:val="000000"/>
           <w:sz w:val="28"/>
         </w:rPr>
-        <w:t xml:space="preserve">Phần cứng và phần mềm cần được xem xét đồng bộ. Bo mạch quyết định nguồn, bus, chân kết nối và ngoại vi; thiết kế cơ khí bố trí không gian, tản nhiệt và vị trí ăng-ten; thiết kế RF ảnh hưởng đến đường truyền và đặc tính vô tuyến; phần mềm phải nhận biết, cấu hình và điều khiển các thành phần đã tích hợp. Một chức năng có thể không hoạt động như mong muốn nếu giao diện giữa các thành phần chưa được cấu hình hoặc xác minh đầy đủ.</w:t>
-      </w:r>
-      <w:r>
-        <w:rPr>
-          <w:rFonts w:ascii="Times New Roman" w:hAnsi="Times New Roman" w:eastAsia="Times New Roman" w:cs="Times New Roman"/>
-          <w:color w:val="000000"/>
-          <w:sz w:val="28"/>
-        </w:rPr>
-        <w:t xml:space="preserve"/>
+        <w:t xml:space="preserve">Phần cứng và phần mềm cần được xem xét đồng bộ. Bo mạch quyết định nguồn, bus, chân kết nối và ngoại vi; thiết kế cơ khí bố trí không gian, tản nhiệt và vị trí ăng-ten; thiết </w:t>
+      </w:r>
+      <w:r>
+        <w:rPr>
+          <w:rFonts w:ascii="Times New Roman" w:hAnsi="Times New Roman" w:eastAsia="Times New Roman" w:cs="Times New Roman"/>
+          <w:color w:val="000000"/>
+          <w:sz w:val="28"/>
+        </w:rPr>
+        <w:t xml:space="preserve">kế RF ảnh hưởng đến đường truyền và đặc tính vô tuyến; phần mềm phải nhận biết, cấu hình và điều khiển các thành phần đã tích hợp. Một chức năng có thể không hoạt động như mong muốn nếu giao diện giữa các thành phần chưa được cấu hình hoặc xác minh đầy đủ.</w:t>
+      </w:r>
+      <w:r>
+        <w:rPr>
+          <w:rFonts w:ascii="Times New Roman" w:hAnsi="Times New Roman" w:eastAsia="Times New Roman" w:cs="Times New Roman"/>
+          <w:color w:val="000000"/>
+          <w:sz w:val="28"/>
+        </w:rPr>
       </w:r>
       <w:r/>
     </w:p>
@@ -12890,15 +12937,22 @@
           <w:color w:val="000000"/>
           <w:sz w:val="28"/>
         </w:rPr>
-        <w:t xml:space="preserve">Giai đoạn tích hợp ban đầu, thường gọi là bring-up, là quá trình đưa phần cứng và phần mềm nền tảng đến trạng thái có thể khởi động, nhận diện thành phần và kiểm tra chức năng cơ bản. Sơ đồ, mô tả giao tiếp, phiên bản nền tảng và yêu cầu cấp nguồn giúp xác định bối cảnh trước khi kiểm tra hành vi ở cấp hệ điều hành. Vì vậy, bring-up có liên hệ với cả thiết kế phần cứng lẫn phát triển phần mềm.</w:t>
-      </w:r>
-      <w:r>
-        <w:rPr>
-          <w:rFonts w:ascii="Times New Roman" w:hAnsi="Times New Roman" w:eastAsia="Times New Roman" w:cs="Times New Roman"/>
-          <w:color w:val="000000"/>
-          <w:sz w:val="28"/>
-        </w:rPr>
-        <w:t xml:space="preserve"/>
+        <w:t xml:space="preserve">Giai đoạn tích hợp ban đầu, thường gọi là bring-up, là quá trình đưa phần cứng và phần mềm nền tảng đến trạng thái có thể khởi động, nhận di</w:t>
+      </w:r>
+      <w:r>
+        <w:rPr>
+          <w:rFonts w:ascii="Times New Roman" w:hAnsi="Times New Roman" w:eastAsia="Times New Roman" w:cs="Times New Roman"/>
+          <w:color w:val="000000"/>
+          <w:sz w:val="28"/>
+        </w:rPr>
+        <w:t xml:space="preserve">ện thành phần và kiểm tra chức năng cơ bản. Sơ đồ, mô tả giao tiếp, phiên bản nền tảng và yêu cầu cấp nguồn giúp xác định bối cảnh trước khi kiểm tra hành vi ở cấp hệ điều hành. Vì vậy, bring-up có liên hệ với cả thiết kế phần cứng lẫn phát triển phần mềm.</w:t>
+      </w:r>
+      <w:r>
+        <w:rPr>
+          <w:rFonts w:ascii="Times New Roman" w:hAnsi="Times New Roman" w:eastAsia="Times New Roman" w:cs="Times New Roman"/>
+          <w:color w:val="000000"/>
+          <w:sz w:val="28"/>
+        </w:rPr>
       </w:r>
       <w:r/>
     </w:p>
@@ -12975,7 +13029,7 @@
           <w:color w:val="000000"/>
           <w:sz w:val="28"/>
         </w:rPr>
-        <w:t xml:space="preserve">Các sản phẩm KIMQ được giới thiệu như mô-đun tính toán nhúng sử dụng bộ xử lý ứng dụng Qualcomm, có thể chạy hệ điều hành Linux hoặc Android tùy cấu hình. Nhóm này phục vụ thiết bị cần chạy phần mềm nền tảng và ứng dụng phong phú; khác với bộ vi điều khiển thường dành cho tác vụ điều khiển gọn và chuyên biệt. Hai loại có mục tiêu khác nhau và không thay thế nhau trong mọi ứng dụng.</w:t>
+        <w:t xml:space="preserve">Các sản phẩm KIMQ được giới thiệu như mô-đun tính toán nhúng sử dụng bộ xử lý ứng dụng Qualcomm, có thể chạy hệ điều hành Linux </w:t>
       </w:r>
       <w:r>
         <w:rPr>
@@ -12984,7 +13038,15 @@
           <w:color w:val="000000"/>
           <w:sz w:val="28"/>
         </w:rPr>
-        <w:t xml:space="preserve"/>
+        <w:t xml:space="preserve">hoặc Android tùy cấu hình. Nhóm này phục vụ thiết bị cần chạy phần mềm nền tảng và ứng dụng phong phú; khác với bộ vi điều khiển thường dành cho tác vụ điều khiển gọn và chuyên biệt. Hai loại có mục tiêu khác nhau và không thay thế nhau trong mọi ứng dụng.</w:t>
+      </w:r>
+      <w:r>
+        <w:rPr>
+          <w:rFonts w:ascii="Times New Roman" w:hAnsi="Times New Roman" w:eastAsia="Times New Roman" w:cs="Times New Roman"/>
+          <w:b w:val="0"/>
+          <w:color w:val="000000"/>
+          <w:sz w:val="28"/>
+        </w:rPr>
       </w:r>
       <w:r/>
     </w:p>
@@ -13003,7 +13065,7 @@
           <w:color w:val="000000"/>
           <w:sz w:val="28"/>
         </w:rPr>
-        <w:t xml:space="preserve">Danh mục công khai có thể được hiểu theo mức độ tích hợp: mô-đun KIMQ cung cấp phần tính toán để lắp vào sản phẩm; bo mạch mở rộng bổ sung đầu nối và giao tiếp phục vụ tích hợp hoặc thử nghiệm; AI Box kết hợp mô-đun với vỏ và các cổng kết nối thành thiết bị hoàn chỉnh hơn. Các dạng sản phẩm này tạo bối cảnh cho phần mô tả chi tiết tiếp theo.</w:t>
+        <w:t xml:space="preserve">Danh mục công khai có thể được hiểu theo mức độ tích hợp: mô-đun KIMQ cung cấp phần tín</w:t>
       </w:r>
       <w:r>
         <w:rPr>
@@ -13012,7 +13074,15 @@
           <w:color w:val="000000"/>
           <w:sz w:val="28"/>
         </w:rPr>
-        <w:t xml:space="preserve"/>
+        <w:t xml:space="preserve">h toán để lắp vào sản phẩm; bo mạch mở rộng bổ sung đầu nối và giao tiếp phục vụ tích hợp hoặc thử nghiệm; AI Box kết hợp mô-đun với vỏ và các cổng kết nối thành thiết bị hoàn chỉnh hơn. Các dạng sản phẩm này tạo bối cảnh cho phần mô tả chi tiết tiếp theo.</w:t>
+      </w:r>
+      <w:r>
+        <w:rPr>
+          <w:rFonts w:ascii="Times New Roman" w:hAnsi="Times New Roman" w:eastAsia="Times New Roman" w:cs="Times New Roman"/>
+          <w:b w:val="0"/>
+          <w:color w:val="000000"/>
+          <w:sz w:val="28"/>
+        </w:rPr>
       </w:r>
       <w:r/>
     </w:p>
@@ -13031,7 +13101,7 @@
           <w:color w:val="000000"/>
           <w:sz w:val="28"/>
         </w:rPr>
-        <w:t xml:space="preserve">So với máy tính một bo mạch phổ biến như Raspberry Pi, KIMQ hoặc AI Box có thể phù hợp hơn với một số yêu cầu như tăng tốc AI tích hợp, giao tiếp camera MIPI, kết nối di động hoặc I/O công nghiệp. Đây không phải kết luận rằng mọi sản phẩm HSPTEK vượt trội hơn mọi phiên bản Raspberry Pi; việc so sánh cần đặt cùng ứng dụng, cấu hình, phần mềm, công suất và điều kiện tản nhiệt.</w:t>
+        <w:t xml:space="preserve">So với máy tính một bo mạch phổ biến như Raspberry Pi, KIMQ hoặc AI Box có thể phù hợp hơn với một số yêu cầu như tăng tố</w:t>
       </w:r>
       <w:r>
         <w:rPr>
@@ -13040,7 +13110,15 @@
           <w:color w:val="000000"/>
           <w:sz w:val="28"/>
         </w:rPr>
-        <w:t xml:space="preserve"/>
+        <w:t xml:space="preserve">c AI tích hợp, giao tiếp camera MIPI, kết nối di động hoặc I/O công nghiệp. Đây không phải kết luận rằng mọi sản phẩm HSPTEK vượt trội hơn mọi phiên bản Raspberry Pi; việc so sánh cần đặt cùng ứng dụng, cấu hình, phần mềm, công suất và điều kiện tản nhiệt.</w:t>
+      </w:r>
+      <w:r>
+        <w:rPr>
+          <w:rFonts w:ascii="Times New Roman" w:hAnsi="Times New Roman" w:eastAsia="Times New Roman" w:cs="Times New Roman"/>
+          <w:b w:val="0"/>
+          <w:color w:val="000000"/>
+          <w:sz w:val="28"/>
+        </w:rPr>
       </w:r>
       <w:r/>
     </w:p>
@@ -13762,7 +13840,7 @@
           <w:color w:val="000000"/>
           <w:sz w:val="28"/>
         </w:rPr>
-        <w:t xml:space="preserve">System on Module (SoM) là mô-đun tính toán tích hợp SoC cùng một số thành phần cần thiết và được lắp lên bo mạch mang. Bo mạch mang là bo mạch chính cung cấp nguồn, đầu nối và giao tiếp với phần còn lại của sản phẩm. Trong báo cáo này, KIMQ 5430, KIMQ 6490 và KIMQ 8550 là tên các mô-đun sản phẩm do HSPTEK phát triển; chúng lần lượt sử dụng SoC Qualcomm QCS5430, QCS6490 và QCS8550. Như vậy, KIMQ là tên dòng sản phẩm của HSPTEK, Qualcomm là nhà cung cấp SoC, còn SoM chỉ dạng mô-đun. Phần nguồn, ăng-ten, vỏ và ngoại vi được tích hợp theo yêu cầu của thiết bị đích; Linux hoặc Android cần gói phần mềm nền tảng phù hợp với cấu hình phần cứng.</w:t>
+        <w:t xml:space="preserve">System on Module (SoM) là mô-đun tính toán tích hợp SoC cùng một số thành phần cần thiết và được lắp lên bo mạch mang. Bo mạch mang </w:t>
       </w:r>
       <w:r>
         <w:rPr>
@@ -13771,7 +13849,7 @@
           <w:color w:val="000000"/>
           <w:sz w:val="28"/>
         </w:rPr>
-        <w:t xml:space="preserve"/>
+        <w:t xml:space="preserve">là bo mạch chính cung cấp nguồn, đầu nối và giao tiếp với phần còn lại của sản phẩm. Trong báo cáo này, KIMQ 5430, KIMQ 6490 và KIMQ 8550 là tên các mô-đun sản phẩm do HSPTEK phát triển; chúng lần lượt sử dụng SoC Qualcomm QCS5430, QCS6490 và QCS8550. Như </w:t>
       </w:r>
       <w:r>
         <w:rPr>
@@ -13780,7 +13858,7 @@
           <w:color w:val="000000"/>
           <w:sz w:val="28"/>
         </w:rPr>
-        <w:t xml:space="preserve"/>
+        <w:t xml:space="preserve">vậy, KIMQ là tên dòng sản phẩm của HSPTEK, Qualcomm là nhà cung cấp SoC, còn SoM chỉ dạng mô-đun. Phần nguồn, ăng-ten, vỏ và ngoại vi được tích hợp theo yêu cầu của thiết bị đích; Linux hoặc Android cần gói phần mềm nền tảng phù hợp với cấu hình phần cứng.</w:t>
       </w:r>
       <w:r>
         <w:rPr>
@@ -13831,7 +13909,7 @@
           <w:color w:val="000000"/>
           <w:sz w:val="28"/>
         </w:rPr>
-        <w:t xml:space="preserve">KIMQ 5430 được phát triển trên SoC Qualcomm QCS5430. Trang sản phẩm nêu giao tiếp camera MIPI CSI (MIPI Camera Serial Interface, giao tiếp nối tiếp cho camera), USB và các giao tiếp điều khiển ngoại vi; nền tảng được giới thiệu cho Linux và Android. Ứng dụng công khai gồm thiết bị cầm tay công nghiệp, máy tính bảng, camera AI, drone và điện toán biên. Bo mạch mang và phần mềm cần được thiết kế theo yêu cầu sản phẩm.</w:t>
+        <w:t xml:space="preserve">KIMQ 5430 được phát triển trên SoC Qualcomm QCS5430. Trang sản phẩm nêu giao tiếp camera MIPI CSI (MIPI Camera Serial Interface, giao tiếp nối tiếp cho camera), US</w:t>
       </w:r>
       <w:r>
         <w:rPr>
@@ -13840,7 +13918,15 @@
           <w:color w:val="000000"/>
           <w:sz w:val="28"/>
         </w:rPr>
-        <w:t xml:space="preserve"/>
+        <w:t xml:space="preserve">B và các giao tiếp điều khiển ngoại vi; nền tảng được giới thiệu cho Linux và Android. Ứng dụng công khai gồm thiết bị cầm tay công nghiệp, máy tính bảng, camera AI, drone và điện toán biên. Bo mạch mang và phần mềm cần được thiết kế theo yêu cầu sản phẩm.</w:t>
+      </w:r>
+      <w:r>
+        <w:rPr>
+          <w:rFonts w:ascii="Times New Roman" w:hAnsi="Times New Roman" w:eastAsia="Times New Roman" w:cs="Times New Roman"/>
+          <w:b w:val="0"/>
+          <w:color w:val="000000"/>
+          <w:sz w:val="28"/>
+        </w:rPr>
       </w:r>
       <w:r/>
     </w:p>
@@ -13856,14 +13942,14 @@
         <mc:AlternateContent>
           <mc:Choice Requires="wpg">
             <w:drawing>
-              <wp:inline distT="0" distB="0" distL="0" distR="0">
+              <wp:inline xmlns:wp="http://schemas.openxmlformats.org/drawingml/2006/wordprocessingDrawing" distT="0" distB="0" distL="0" distR="0">
                 <wp:extent cx="3200400" cy="2138907"/>
                 <wp:effectExtent l="0" t="0" r="0" b="0"/>
-                <wp:docPr id="5" name="Picture 903694901"/>
+                <wp:docPr id="6" name="Picture 903694901"/>
                 <wp:cNvGraphicFramePr>
-                  <a:graphicFrameLocks noChangeAspect="1"/>
+                  <a:graphicFrameLocks xmlns:a="http://schemas.openxmlformats.org/drawingml/2006/main" noChangeAspect="1"/>
                 </wp:cNvGraphicFramePr>
-                <a:graphic>
+                <a:graphic xmlns:a="http://schemas.openxmlformats.org/drawingml/2006/main">
                   <a:graphicData uri="http://schemas.openxmlformats.org/drawingml/2006/picture">
                     <pic:pic xmlns:pic="http://schemas.openxmlformats.org/drawingml/2006/picture">
                       <pic:nvPicPr>
@@ -13874,7 +13960,7 @@
                         <pic:nvPr/>
                       </pic:nvPicPr>
                       <pic:blipFill rotWithShape="1">
-                        <a:blip r:embed="rId16"/>
+                        <a:blip r:embed="rId17"/>
                         <a:stretch/>
                       </pic:blipFill>
                       <pic:spPr bwMode="auto">
@@ -13913,8 +13999,8 @@
                 <v:path o:extrusionok="f" gradientshapeok="t" o:connecttype="rect"/>
                 <o:lock v:ext="edit" aspectratio="t"/>
               </v:shapetype>
-              <v:shape id="_x0000_i4" o:spid="_x0000_s4" type="#_x0000_t75" style="width:252.00pt;height:168.42pt;mso-wrap-distance-left:0.00pt;mso-wrap-distance-top:0.00pt;mso-wrap-distance-right:0.00pt;mso-wrap-distance-bottom:0.00pt;z-index:1;" stroked="false">
-                <v:imagedata r:id="rId16" o:title=""/>
+              <v:shape id="_x0000_i5" o:spid="_x0000_s5" type="#_x0000_t75" style="width:252.00pt;height:168.42pt;mso-wrap-distance-left:0.00pt;mso-wrap-distance-top:0.00pt;mso-wrap-distance-right:0.00pt;mso-wrap-distance-bottom:0.00pt;z-index:1;" stroked="false">
+                <v:imagedata r:id="rId17" o:title=""/>
                 <o:lock v:ext="edit" rotation="t"/>
               </v:shape>
             </w:pict>
@@ -14066,14 +14152,14 @@
         <mc:AlternateContent>
           <mc:Choice Requires="wpg">
             <w:drawing>
-              <wp:inline distT="0" distB="0" distL="0" distR="0">
+              <wp:inline xmlns:wp="http://schemas.openxmlformats.org/drawingml/2006/wordprocessingDrawing" distT="0" distB="0" distL="0" distR="0">
                 <wp:extent cx="5303520" cy="2850642"/>
                 <wp:effectExtent l="0" t="0" r="0" b="0"/>
-                <wp:docPr id="6" name="Sơ đồ khối KIMQ 8550" descr="Sơ đồ khối vẽ lại bằng draw.io, trình bày khái quát theo tài liệu công khai."/>
+                <wp:docPr id="7" name="Sơ đồ khối KIMQ 8550" descr="Sơ đồ khối vẽ lại bằng draw.io, trình bày khái quát theo tài liệu công khai."/>
                 <wp:cNvGraphicFramePr>
-                  <a:graphicFrameLocks noChangeAspect="1"/>
+                  <a:graphicFrameLocks xmlns:a="http://schemas.openxmlformats.org/drawingml/2006/main" noChangeAspect="1"/>
                 </wp:cNvGraphicFramePr>
-                <a:graphic>
+                <a:graphic xmlns:a="http://schemas.openxmlformats.org/drawingml/2006/main">
                   <a:graphicData uri="http://schemas.openxmlformats.org/drawingml/2006/picture">
                     <pic:pic xmlns:pic="http://schemas.openxmlformats.org/drawingml/2006/picture">
                       <pic:nvPicPr>
@@ -14084,7 +14170,7 @@
                         <pic:nvPr/>
                       </pic:nvPicPr>
                       <pic:blipFill rotWithShape="1">
-                        <a:blip r:embed="rId17"/>
+                        <a:blip r:embed="rId18"/>
                         <a:stretch/>
                       </pic:blipFill>
                       <pic:spPr bwMode="auto">
@@ -14123,8 +14209,8 @@
                 <v:path o:extrusionok="f" gradientshapeok="t" o:connecttype="rect"/>
                 <o:lock v:ext="edit" aspectratio="t"/>
               </v:shapetype>
-              <v:shape id="_x0000_i5" o:spid="_x0000_s5" type="#_x0000_t75" style="width:417.60pt;height:289.95pt;mso-wrap-distance-left:0.00pt;mso-wrap-distance-top:0.00pt;mso-wrap-distance-right:0.00pt;mso-wrap-distance-bottom:0.00pt;z-index:1;" stroked="false">
-                <v:imagedata r:id="rId17" o:title=""/>
+              <v:shape id="_x0000_i6" o:spid="_x0000_s6" type="#_x0000_t75" style="width:417.60pt;height:224.46pt;mso-wrap-distance-left:0.00pt;mso-wrap-distance-top:0.00pt;mso-wrap-distance-right:0.00pt;mso-wrap-distance-bottom:0.00pt;z-index:1;" stroked="false">
+                <v:imagedata r:id="rId18" o:title=""/>
                 <o:lock v:ext="edit" rotation="t"/>
               </v:shape>
             </w:pict>
@@ -14198,7 +14284,7 @@
           <w:color w:val="000000"/>
           <w:sz w:val="28"/>
         </w:rPr>
-        <w:t xml:space="preserve">KIMQ IQ9 là tên sản phẩm của HSPTEK; theo trang sản phẩm của công ty, đây là máy tính AI biên công nghiệp sử dụng Qualcomm QCS9075, hướng đến robot học, robot di động tự hành và thiết bị thông minh. Ethernet, CAN (Controller Area Network, mạng truyền thông dùng trong hệ thống điều khiển) và các giao tiếp mở rộng hỗ trợ kết nối với cảm biến, thiết bị điều khiển và mạng. KIMQ IQ9 là máy tính AI biên, khác với các mô-đun KIMQ 5430, 6490 và 8550 dạng SoM.</w:t>
+        <w:t xml:space="preserve">KIMQ IQ9 là tên sản phẩm của HSPTEK; theo trang sản phẩm của công ty, đây là máy tính AI biên công nghiệp sử dụng Qualcomm QCS9075, hướng đến robot học, robot di động tự hành và thiết bị thông minh. </w:t>
       </w:r>
       <w:r>
         <w:rPr>
@@ -14207,7 +14293,7 @@
           <w:color w:val="000000"/>
           <w:sz w:val="28"/>
         </w:rPr>
-        <w:t xml:space="preserve"/>
+        <w:t xml:space="preserve">Ethernet, CAN (Controller Area Network, mạng truyền thông dùng trong hệ thống điều khiển) và các giao tiếp mở rộng hỗ trợ kết nối với cảm biến, thiết bị điều khiển và mạng. KIMQ IQ9 là máy tính AI biên, khác với các mô-đun KIMQ 5430, 6490 và 8550 dạng SoM.</w:t>
       </w:r>
       <w:r>
         <w:rPr>
@@ -14393,14 +14479,14 @@
         <mc:AlternateContent>
           <mc:Choice Requires="wpg">
             <w:drawing>
-              <wp:inline distT="0" distB="0" distL="0" distR="0">
+              <wp:inline xmlns:wp="http://schemas.openxmlformats.org/drawingml/2006/wordprocessingDrawing" distT="0" distB="0" distL="0" distR="0">
                 <wp:extent cx="4114800" cy="3086100"/>
                 <wp:effectExtent l="0" t="0" r="0" b="0"/>
-                <wp:docPr id="7" name="Picture 903694902"/>
+                <wp:docPr id="8" name="Picture 903694902"/>
                 <wp:cNvGraphicFramePr>
-                  <a:graphicFrameLocks noChangeAspect="1"/>
+                  <a:graphicFrameLocks xmlns:a="http://schemas.openxmlformats.org/drawingml/2006/main" noChangeAspect="1"/>
                 </wp:cNvGraphicFramePr>
-                <a:graphic>
+                <a:graphic xmlns:a="http://schemas.openxmlformats.org/drawingml/2006/main">
                   <a:graphicData uri="http://schemas.openxmlformats.org/drawingml/2006/picture">
                     <pic:pic xmlns:pic="http://schemas.openxmlformats.org/drawingml/2006/picture">
                       <pic:nvPicPr>
@@ -14411,7 +14497,7 @@
                         <pic:nvPr/>
                       </pic:nvPicPr>
                       <pic:blipFill rotWithShape="1">
-                        <a:blip r:embed="rId18"/>
+                        <a:blip r:embed="rId19"/>
                         <a:stretch/>
                       </pic:blipFill>
                       <pic:spPr bwMode="auto">
@@ -14450,8 +14536,8 @@
                 <v:path o:extrusionok="f" gradientshapeok="t" o:connecttype="rect"/>
                 <o:lock v:ext="edit" aspectratio="t"/>
               </v:shapetype>
-              <v:shape id="_x0000_i6" o:spid="_x0000_s6" type="#_x0000_t75" style="width:324.00pt;height:243.00pt;mso-wrap-distance-left:0.00pt;mso-wrap-distance-top:0.00pt;mso-wrap-distance-right:0.00pt;mso-wrap-distance-bottom:0.00pt;z-index:1;" stroked="false">
-                <v:imagedata r:id="rId18" o:title=""/>
+              <v:shape id="_x0000_i7" o:spid="_x0000_s7" type="#_x0000_t75" style="width:324.00pt;height:243.00pt;mso-wrap-distance-left:0.00pt;mso-wrap-distance-top:0.00pt;mso-wrap-distance-right:0.00pt;mso-wrap-distance-bottom:0.00pt;z-index:1;" stroked="false">
+                <v:imagedata r:id="rId19" o:title=""/>
                 <o:lock v:ext="edit" rotation="t"/>
               </v:shape>
             </w:pict>
@@ -14669,7 +14755,7 @@
           <w:color w:val="000000"/>
           <w:sz w:val="28"/>
         </w:rPr>
-        <w:t xml:space="preserve">KIMQ IO Board là bo mạch mở rộng được giới thiệu với cổng USB; đầu nối camera MIPI CSI; giao diện màn hình MIPI DSI (Display Serial Interface); và các giao tiếp UART, SPI, I²C, I³C, GPIO (chân vào/ra đa dụng). Bo mạch này giúp thử nghiệm ngoại vi của mô-đun và tạo nguyên mẫu. Khi chuyển sang sản phẩm cuối, cơ khí, nguồn, tín hiệu tốc độ cao và cấu hình phần mềm vẫn cần được xác nhận trên phần cứng đích.</w:t>
+        <w:t xml:space="preserve">KIMQ IO Board là bo mạch mở rộng được giới thiệu với cổng USB; đầu nối camera MIPI CSI; giao diện màn hình MIPI DSI (Display Serial Interface); và các</w:t>
       </w:r>
       <w:r>
         <w:rPr>
@@ -14678,7 +14764,15 @@
           <w:color w:val="000000"/>
           <w:sz w:val="28"/>
         </w:rPr>
-        <w:t xml:space="preserve"/>
+        <w:t xml:space="preserve"> giao tiếp UART, SPI, I²C, I³C, GPIO (chân vào/ra đa dụng). Bo mạch này giúp thử nghiệm ngoại vi của mô-đun và tạo nguyên mẫu. Khi chuyển sang sản phẩm cuối, cơ khí, nguồn, tín hiệu tốc độ cao và cấu hình phần mềm vẫn cần được xác nhận trên phần cứng đích.</w:t>
+      </w:r>
+      <w:r>
+        <w:rPr>
+          <w:rFonts w:ascii="Times New Roman" w:hAnsi="Times New Roman" w:eastAsia="Times New Roman" w:cs="Times New Roman"/>
+          <w:b w:val="0"/>
+          <w:color w:val="000000"/>
+          <w:sz w:val="28"/>
+        </w:rPr>
       </w:r>
       <w:r/>
     </w:p>
@@ -14721,7 +14815,7 @@
           <w:color w:val="000000"/>
           <w:sz w:val="28"/>
         </w:rPr>
-        <w:t xml:space="preserve">Website HSPTEK phân nhóm giải pháp theo Mobility (thiết bị di động và phương tiện), AIoT và Camera; hồ sơ doanh nghiệp cũng nêu camera AI, loa thông minh và thiết bị di động công nghiệp. Một số mô tả AI Box đưa ra ví dụ xử lý ảnh như nhận diện đối tượng, khuôn mặt và biển số. Đây là các ứng dụng do nhà sản xuất giới thiệu; phạm vi công khai có thể tóm tắt như sau:</w:t>
+        <w:t xml:space="preserve">Website HSPTEK phân nhóm giải pháp theo Mobility (thiết bị di động và phương tiện), AIoT và Camera; hồ sơ doan</w:t>
       </w:r>
       <w:r>
         <w:rPr>
@@ -14730,7 +14824,15 @@
           <w:color w:val="000000"/>
           <w:sz w:val="28"/>
         </w:rPr>
-        <w:t xml:space="preserve"/>
+        <w:t xml:space="preserve">h nghiệp cũng nêu camera AI, loa thông minh và thiết bị di động công nghiệp. Một số mô tả AI Box đưa ra ví dụ xử lý ảnh như nhận diện đối tượng, khuôn mặt và biển số. Đây là các ứng dụng do nhà sản xuất giới thiệu; phạm vi công khai có thể tóm tắt như sau:</w:t>
+      </w:r>
+      <w:r>
+        <w:rPr>
+          <w:rFonts w:ascii="Times New Roman" w:hAnsi="Times New Roman" w:eastAsia="Times New Roman" w:cs="Times New Roman"/>
+          <w:b w:val="0"/>
+          <w:color w:val="000000"/>
+          <w:sz w:val="28"/>
+        </w:rPr>
       </w:r>
       <w:r/>
     </w:p>
@@ -15471,14 +15573,14 @@
         <mc:AlternateContent>
           <mc:Choice Requires="wpg">
             <w:drawing>
-              <wp:inline distT="0" distB="0" distL="0" distR="0">
+              <wp:inline xmlns:wp="http://schemas.openxmlformats.org/drawingml/2006/wordprocessingDrawing" distT="0" distB="0" distL="0" distR="0">
                 <wp:extent cx="4892040" cy="3669030"/>
                 <wp:effectExtent l="0" t="0" r="0" b="0"/>
-                <wp:docPr id="8" name="Picture 903694901" descr="Khu trưng bày nền tảng KIMQ của HSPTEK với mô-đun và AI Box tại một sự kiện công nghệ." title="Hình 1.1. Khu trưng bày các sản phẩm KIMQ tại DCCI Summit 2024"/>
+                <wp:docPr id="9" name="Picture 903694901" descr="Khu trưng bày nền tảng KIMQ của HSPTEK với mô-đun và AI Box tại một sự kiện công nghệ." title="Hình 1.1. Khu trưng bày các sản phẩm KIMQ tại DCCI Summit 2024"/>
                 <wp:cNvGraphicFramePr>
-                  <a:graphicFrameLocks noChangeAspect="1"/>
+                  <a:graphicFrameLocks xmlns:a="http://schemas.openxmlformats.org/drawingml/2006/main" noChangeAspect="1"/>
                 </wp:cNvGraphicFramePr>
-                <a:graphic>
+                <a:graphic xmlns:a="http://schemas.openxmlformats.org/drawingml/2006/main">
                   <a:graphicData uri="http://schemas.openxmlformats.org/drawingml/2006/picture">
                     <pic:pic xmlns:pic="http://schemas.openxmlformats.org/drawingml/2006/picture">
                       <pic:nvPicPr>
@@ -15489,7 +15591,7 @@
                         <pic:nvPr/>
                       </pic:nvPicPr>
                       <pic:blipFill rotWithShape="1">
-                        <a:blip r:embed="rId19"/>
+                        <a:blip r:embed="rId20"/>
                         <a:stretch/>
                       </pic:blipFill>
                       <pic:spPr bwMode="auto">
@@ -15528,8 +15630,8 @@
                 <v:path o:extrusionok="f" gradientshapeok="t" o:connecttype="rect"/>
                 <o:lock v:ext="edit" aspectratio="t"/>
               </v:shapetype>
-              <v:shape id="_x0000_i7" o:spid="_x0000_s7" type="#_x0000_t75" style="width:385.20pt;height:288.90pt;mso-wrap-distance-left:0.00pt;mso-wrap-distance-top:0.00pt;mso-wrap-distance-right:0.00pt;mso-wrap-distance-bottom:0.00pt;z-index:1;" stroked="false">
-                <v:imagedata r:id="rId19" o:title=""/>
+              <v:shape id="_x0000_i8" o:spid="_x0000_s8" type="#_x0000_t75" style="width:385.20pt;height:288.90pt;mso-wrap-distance-left:0.00pt;mso-wrap-distance-top:0.00pt;mso-wrap-distance-right:0.00pt;mso-wrap-distance-bottom:0.00pt;z-index:1;" stroked="false">
+                <v:imagedata r:id="rId20" o:title=""/>
                 <o:lock v:ext="edit" rotation="t"/>
               </v:shape>
             </w:pict>
@@ -15546,6 +15648,7 @@
         <w:jc w:val="center"/>
         <w:rPr/>
       </w:pPr>
+      <w:r/>
       <w:bookmarkStart w:id="170" w:name="KhanhFig_01"/>
       <w:r>
         <w:rPr>
@@ -15558,6 +15661,8 @@
         <w:t xml:space="preserve">Hình 1.5. KIMQ được giới thiệu tại DCCI Summit 2024</w:t>
       </w:r>
       <w:bookmarkEnd w:id="170"/>
+      <w:r/>
+      <w:r/>
     </w:p>
     <w:p>
       <w:pPr>
@@ -15604,15 +15709,22 @@
           <w:color w:val="000000"/>
           <w:sz w:val="28"/>
         </w:rPr>
-        <w:t xml:space="preserve">BSP (Board Support Package, gói hỗ trợ bo mạch) là tập hợp thành phần phần mềm nền tảng giúp hệ điều hành làm việc với một bo mạch hoặc dòng bo mạch cụ thể. Các thành phần có thể gồm cấu hình, trình điều khiển, firmware và phần tích hợp hệ điều hành. Vì vậy, công việc BSP kết nối hiểu biết về phần cứng với phát triển phần mềm hệ thống; phạm vi chính xác thay đổi theo sản phẩm và cách tổ chức của từng doanh nghiệp.</w:t>
-      </w:r>
-      <w:r>
-        <w:rPr>
-          <w:rFonts w:ascii="Times New Roman" w:hAnsi="Times New Roman" w:eastAsia="Times New Roman" w:cs="Times New Roman"/>
-          <w:color w:val="000000"/>
-          <w:sz w:val="28"/>
-        </w:rPr>
-        <w:t xml:space="preserve"/>
+        <w:t xml:space="preserve">BSP (Board Support Package, gói hỗ trợ bo mạch) là tập hợp thành phần phần mềm nền tảng giúp hệ điều hành làm việc với một bo mạch hoặc dòng bo mạch cụ thể. Các </w:t>
+      </w:r>
+      <w:r>
+        <w:rPr>
+          <w:rFonts w:ascii="Times New Roman" w:hAnsi="Times New Roman" w:eastAsia="Times New Roman" w:cs="Times New Roman"/>
+          <w:color w:val="000000"/>
+          <w:sz w:val="28"/>
+        </w:rPr>
+        <w:t xml:space="preserve">thành phần có thể gồm cấu hình, trình điều khiển, firmware và phần tích hợp hệ điều hành. Vì vậy, công việc BSP kết nối hiểu biết về phần cứng với phát triển phần mềm hệ thống; phạm vi chính xác thay đổi theo sản phẩm và cách tổ chức của từng doanh nghiệp.</w:t>
+      </w:r>
+      <w:r>
+        <w:rPr>
+          <w:rFonts w:ascii="Times New Roman" w:hAnsi="Times New Roman" w:eastAsia="Times New Roman" w:cs="Times New Roman"/>
+          <w:color w:val="000000"/>
+          <w:sz w:val="28"/>
+        </w:rPr>
       </w:r>
       <w:r/>
     </w:p>
@@ -15631,15 +15743,15 @@
           <w:color w:val="000000"/>
           <w:sz w:val="28"/>
         </w:rPr>
-        <w:t xml:space="preserve">Theo thông tin được cung cấp, bộ phận BSP tại HSPTEK phát triển phần mềm và thực hiện bring-up phần cứng trên nền tảng Qualcomm, trong đó Linux là môi trường làm việc thường xuyên. Mô tả này giải thích chức năng liên quan đến đề tài; báo cáo không dựng sơ đồ tổ chức hoặc suy đoán vai trò nội bộ khi chưa có dữ liệu được phép công bố.</w:t>
-      </w:r>
-      <w:r>
-        <w:rPr>
-          <w:rFonts w:ascii="Times New Roman" w:hAnsi="Times New Roman" w:eastAsia="Times New Roman" w:cs="Times New Roman"/>
-          <w:color w:val="000000"/>
-          <w:sz w:val="28"/>
-        </w:rPr>
-        <w:t xml:space="preserve"/>
+        <w:t xml:space="preserve">Theo thông tin được cung cấp, bộ phận BSP tại HSPTEK phát triển phần mềm và th</w:t>
+      </w:r>
+      <w:r>
+        <w:rPr>
+          <w:rFonts w:ascii="Times New Roman" w:hAnsi="Times New Roman" w:eastAsia="Times New Roman" w:cs="Times New Roman"/>
+          <w:color w:val="000000"/>
+          <w:sz w:val="28"/>
+        </w:rPr>
+        <w:t xml:space="preserve">ực hiện bring-up phần cứng trên nền tảng Qualcomm, trong đó Linux là môi trường làm việc thường xuyên. Mô tả này giải thích chức năng liên quan đến đề tài; báo cáo không dựng sơ đồ tổ chức hoặc suy đoán vai trò nội bộ khi chưa có dữ liệu được phép công bố.</w:t>
       </w:r>
       <w:r>
         <w:rPr>
@@ -15696,8 +15808,19 @@
           <w:szCs w:val="28"/>
           <w:lang w:val="vi-VN"/>
         </w:rPr>
-        <w:t xml:space="preserve">Trong quá trình bring-up, thông thường cần đối chiếu tài liệu phần cứng, theo dõi tiến trình khởi động và xác nhận hệ điều hành nhận diện các thành phần. Những bước này làm rõ mối liên hệ giữa bo mạch, phần mềm nền tảng và ngoại vi; nội dung thực tập được trình bày ở Chương 2 theo phạm vi đã xác nhận.</w:t>
-      </w:r>
+        <w:t xml:space="preserve">Trong quá trình bring-up, thông thường cần đối</w:t>
+      </w:r>
+      <w:r>
+        <w:rPr>
+          <w:rFonts w:ascii="Times New Roman" w:hAnsi="Times New Roman" w:eastAsia="Times New Roman" w:cs="Times New Roman"/>
+          <w:color w:val="000000"/>
+          <w:sz w:val="28"/>
+          <w:szCs w:val="28"/>
+          <w:lang w:val="vi-VN"/>
+        </w:rPr>
+        <w:t xml:space="preserve"> chiếu tài liệu phần cứng, theo dõi tiến trình khởi động và xác nhận hệ điều hành nhận diện các thành phần. Những bước này làm rõ mối liên hệ giữa bo mạch, phần mềm nền tảng và ngoại vi; nội dung thực tập được trình bày ở Chương 2 theo phạm vi đã xác nhận.</w:t>
+      </w:r>
+      <w:r/>
     </w:p>
     <w:p>
       <w:pPr>
@@ -15745,7 +15868,7 @@
           <w:szCs w:val="28"/>
           <w:lang w:val="vi-VN"/>
         </w:rPr>
-        <w:t xml:space="preserve">Định hướng thực tập tập trung vào nội dung mạng (Network) cho các dự án. Tài liệu và hướng dẫn từ các kỹ sư hỗ trợ quá trình tìm hiểu cấu trúc bo mạch trước khi phân tích hiện tượng. Việc tìm hiểu và gỡ lỗi (debug) trên một bo mạch liên quan vẫn đang tiếp diễn; tên bo mạch, thông số, nguyên nhân và kết quả cuối cùng chưa được xác nhận để công khai. Phần công việc được trình bày ở Chương 2 theo giới hạn này.</w:t>
+        <w:t xml:space="preserve">Định hướng thực tập tập trung vào nội dung mạng (Network) cho các dự án. Tài liệu và hướng dẫn từ các kỹ sư hỗ trợ quá trình tìm hiểu cấu trúc bo mạch trư</w:t>
       </w:r>
       <w:r>
         <w:rPr>
@@ -15755,7 +15878,7 @@
           <w:szCs w:val="28"/>
           <w:lang w:val="vi-VN"/>
         </w:rPr>
-        <w:t xml:space="preserve"/>
+        <w:t xml:space="preserve">ớc khi phân tích hiện tượng. Việc tìm hiểu và gỡ lỗi (debug) trên một bo mạch liên quan vẫn đang tiếp diễn; tên bo mạch, thông số, nguyên nhân và kết quả cuối cùng chưa được xác nhận để công khai. Phần công việc được trình bày ở Chương 2 theo giới hạn này.</w:t>
       </w:r>
       <w:r>
         <w:rPr>
@@ -15874,7 +15997,7 @@
           <w:szCs w:val="28"/>
           <w:lang w:val="vi-VN"/>
         </w:rPr>
-        <w:t xml:space="preserve">Nhìn chung, HSPTEK công bố năng lực từ thiết kế phần cứng, cơ khí và phần mềm nhúng đến tạo mẫu, kiểm thử và sản xuất; các dòng KIMQ và AI Box minh họa nhóm sản phẩm điện toán biên được doanh nghiệp giới thiệu. Bối cảnh này giúp xác định vị trí của bộ phận BSP và định hướng mạng (Network) trong báo cáo. Quá trình thực tập và kiến thức chuyên môn được trình bày ở Chương 2 và Chương 3 theo phạm vi đã xác nhận, không suy rộng thành đánh giá độc lập về quy mô, chất lượng hay hiệu quả sản phẩm.</w:t>
+        <w:t xml:space="preserve">Nhìn chung, HSPTEK công bố năng lực từ thiết kế phần cứng, cơ khí và phần mềm nhúng đến tạo mẫu, kiểm thử và sản xuất; các dòng KIMQ và AI Box minh họa nhóm sản phẩm điện toán biên được doanh nghiệp giới thiệu. Bối cảnh này giúp xác định </w:t>
       </w:r>
       <w:r>
         <w:rPr>
@@ -15884,7 +16007,16 @@
           <w:szCs w:val="28"/>
           <w:lang w:val="vi-VN"/>
         </w:rPr>
-        <w:t xml:space="preserve"/>
+        <w:t xml:space="preserve">vị trí của bộ phận BSP và định hướng mạng (Network) trong báo cáo. Quá trình thực tập và kiến thức chuyên môn được trình bày ở Chương 2 và Chương 3 theo phạm vi đã xác nhận, không suy rộng thành đánh giá độc lập về quy mô, chất lượng hay hiệu quả sản phẩm.</w:t>
+      </w:r>
+      <w:r>
+        <w:rPr>
+          <w:rFonts w:ascii="Times New Roman" w:hAnsi="Times New Roman" w:eastAsia="Times New Roman" w:cs="Times New Roman"/>
+          <w:color w:val="000000"/>
+          <w:sz w:val="28"/>
+          <w:szCs w:val="28"/>
+          <w:lang w:val="vi-VN"/>
+        </w:rPr>
       </w:r>
       <w:r/>
     </w:p>
@@ -16126,6 +16258,7 @@
         </w:rPr>
         <w:t xml:space="preserve">Trước kỳ thực tập, định hướng công việc là tiếp cận nội dung Network trong các dự án. Định hướng này xác định lĩnh vực cần chuẩn bị kiến thức; quá trình tiếp cận và kết quả kỹ thuật được trình bày theo trạng thái đã xác nhận.</w:t>
       </w:r>
+      <w:r/>
     </w:p>
     <w:p>
       <w:pPr>
@@ -16638,14 +16771,14 @@
         <mc:AlternateContent>
           <mc:Choice Requires="wpg">
             <w:drawing>
-              <wp:inline distT="0" distB="0" distL="0" distR="0">
+              <wp:inline xmlns:wp="http://schemas.openxmlformats.org/drawingml/2006/wordprocessingDrawing" distT="0" distB="0" distL="0" distR="0">
                 <wp:extent cx="5029200" cy="2828925"/>
                 <wp:effectExtent l="0" t="0" r="0" b="0"/>
-                <wp:docPr id="9" name="Picture 903694902" descr="Sơ đồ khối vẽ lại bằng draw.io, trình bày khái quát theo tài liệu công khai." title="Hình 2.1. Quan hệ khái quát giữa hệ điều hành, BSP và phần cứng nhúng"/>
+                <wp:docPr id="10" name="Picture 903694902" descr="Sơ đồ khối vẽ lại bằng draw.io, trình bày khái quát theo tài liệu công khai." title="Hình 2.1. Quan hệ khái quát giữa hệ điều hành, BSP và phần cứng nhúng"/>
                 <wp:cNvGraphicFramePr>
-                  <a:graphicFrameLocks noChangeAspect="1"/>
+                  <a:graphicFrameLocks xmlns:a="http://schemas.openxmlformats.org/drawingml/2006/main" noChangeAspect="1"/>
                 </wp:cNvGraphicFramePr>
-                <a:graphic>
+                <a:graphic xmlns:a="http://schemas.openxmlformats.org/drawingml/2006/main">
                   <a:graphicData uri="http://schemas.openxmlformats.org/drawingml/2006/picture">
                     <pic:pic xmlns:pic="http://schemas.openxmlformats.org/drawingml/2006/picture">
                       <pic:nvPicPr>
@@ -16656,7 +16789,7 @@
                         <pic:nvPr/>
                       </pic:nvPicPr>
                       <pic:blipFill rotWithShape="1">
-                        <a:blip r:embed="rId20"/>
+                        <a:blip r:embed="rId21"/>
                         <a:stretch/>
                       </pic:blipFill>
                       <pic:spPr bwMode="auto">
@@ -16695,8 +16828,8 @@
                 <v:path o:extrusionok="f" gradientshapeok="t" o:connecttype="rect"/>
                 <o:lock v:ext="edit" aspectratio="t"/>
               </v:shapetype>
-              <v:shape id="_x0000_i8" o:spid="_x0000_s8" type="#_x0000_t75" style="width:396.00pt;height:275.00pt;mso-wrap-distance-left:0.00pt;mso-wrap-distance-top:0.00pt;mso-wrap-distance-right:0.00pt;mso-wrap-distance-bottom:0.00pt;z-index:1;" stroked="false">
-                <v:imagedata r:id="rId20" o:title=""/>
+              <v:shape id="_x0000_i9" o:spid="_x0000_s9" type="#_x0000_t75" style="width:396.00pt;height:222.75pt;mso-wrap-distance-left:0.00pt;mso-wrap-distance-top:0.00pt;mso-wrap-distance-right:0.00pt;mso-wrap-distance-bottom:0.00pt;z-index:1;" stroked="false">
+                <v:imagedata r:id="rId21" o:title=""/>
                 <o:lock v:ext="edit" rotation="t"/>
               </v:shape>
             </w:pict>
@@ -16856,7 +16989,6 @@
           <w:szCs w:val="28"/>
           <w:lang w:val="vi-VN"/>
         </w:rPr>
-        <w:t xml:space="preserve"/>
       </w:r>
       <w:r/>
     </w:p>
@@ -16982,14 +17114,14 @@
         <mc:AlternateContent>
           <mc:Choice Requires="wpg">
             <w:drawing>
-              <wp:inline distT="0" distB="0" distL="0" distR="0">
+              <wp:inline xmlns:wp="http://schemas.openxmlformats.org/drawingml/2006/wordprocessingDrawing" distT="0" distB="0" distL="0" distR="0">
                 <wp:extent cx="5303520" cy="1359027"/>
                 <wp:effectExtent l="0" t="0" r="0" b="0"/>
-                <wp:docPr id="10" name="Picture 903694903" descr="Sơ đồ khối vẽ lại bằng draw.io, trình bày khái quát theo tài liệu công khai." title="Hình 2.2. Chuỗi tổng quát từ mã nguồn đến kiểm tra phần mềm trên thiết bị"/>
+                <wp:docPr id="11" name="Picture 903694903" descr="Sơ đồ khối vẽ lại bằng draw.io, trình bày khái quát theo tài liệu công khai." title="Hình 2.2. Chuỗi tổng quát từ mã nguồn đến kiểm tra phần mềm trên thiết bị"/>
                 <wp:cNvGraphicFramePr>
-                  <a:graphicFrameLocks noChangeAspect="1"/>
+                  <a:graphicFrameLocks xmlns:a="http://schemas.openxmlformats.org/drawingml/2006/main" noChangeAspect="1"/>
                 </wp:cNvGraphicFramePr>
-                <a:graphic>
+                <a:graphic xmlns:a="http://schemas.openxmlformats.org/drawingml/2006/main">
                   <a:graphicData uri="http://schemas.openxmlformats.org/drawingml/2006/picture">
                     <pic:pic xmlns:pic="http://schemas.openxmlformats.org/drawingml/2006/picture">
                       <pic:nvPicPr>
@@ -17000,13 +17132,13 @@
                         <pic:nvPr/>
                       </pic:nvPicPr>
                       <pic:blipFill rotWithShape="1">
-                        <a:blip r:embed="rId21"/>
+                        <a:blip r:embed="rId22"/>
                         <a:stretch/>
                       </pic:blipFill>
                       <pic:spPr bwMode="auto">
                         <a:xfrm>
                           <a:off x="0" y="0"/>
-                          <a:ext cx="5303520" cy="1359027"/>
+                          <a:ext cx="5303520" cy="1359026"/>
                         </a:xfrm>
                         <a:prstGeom prst="rect">
                           <a:avLst/>
@@ -17039,8 +17171,8 @@
                 <v:path o:extrusionok="f" gradientshapeok="t" o:connecttype="rect"/>
                 <o:lock v:ext="edit" aspectratio="t"/>
               </v:shapetype>
-              <v:shape id="_x0000_i9" o:spid="_x0000_s9" type="#_x0000_t75" style="width:417.60pt;height:83.52pt;mso-wrap-distance-left:0.00pt;mso-wrap-distance-top:0.00pt;mso-wrap-distance-right:0.00pt;mso-wrap-distance-bottom:0.00pt;z-index:1;" stroked="false">
-                <v:imagedata r:id="rId21" o:title=""/>
+              <v:shape id="_x0000_i10" o:spid="_x0000_s10" type="#_x0000_t75" style="width:417.60pt;height:107.01pt;mso-wrap-distance-left:0.00pt;mso-wrap-distance-top:0.00pt;mso-wrap-distance-right:0.00pt;mso-wrap-distance-bottom:0.00pt;z-index:1;" stroked="false">
+                <v:imagedata r:id="rId22" o:title=""/>
                 <o:lock v:ext="edit" rotation="t"/>
               </v:shape>
             </w:pict>
@@ -17237,15 +17369,22 @@
           <w:color w:val="000000"/>
           <w:sz w:val="28"/>
         </w:rPr>
-        <w:t xml:space="preserve">Mô hình OSI chia chức năng giao tiếp thành bảy tầng, còn bộ giao thức TCP/IP thường được trình bày theo bốn nhóm chức năng. Hai cách phân loại chỉ ánh xạ gần đúng; một số chức năng của OSI, như phiên và trình bày, thường nằm trong tầng ứng dụng hoặc thư viện của kiến trúc TCP/IP. Bảng 2.1 đối chiếu các nhóm để hỗ trợ học tập, không quy định cách cài đặt bắt buộc.</w:t>
-      </w:r>
-      <w:r>
-        <w:rPr>
-          <w:rFonts w:ascii="Times New Roman" w:hAnsi="Times New Roman" w:eastAsia="Times New Roman" w:cs="Times New Roman"/>
-          <w:color w:val="000000"/>
-          <w:sz w:val="28"/>
-        </w:rPr>
-        <w:t xml:space="preserve"/>
+        <w:t xml:space="preserve">Mô hình OSI chia chức năng giao tiếp thành bảy tầng, còn bộ giao thức TCP/IP thường được trình bày theo bốn n</w:t>
+      </w:r>
+      <w:r>
+        <w:rPr>
+          <w:rFonts w:ascii="Times New Roman" w:hAnsi="Times New Roman" w:eastAsia="Times New Roman" w:cs="Times New Roman"/>
+          <w:color w:val="000000"/>
+          <w:sz w:val="28"/>
+        </w:rPr>
+        <w:t xml:space="preserve">hóm chức năng. Hai cách phân loại chỉ ánh xạ gần đúng; một số chức năng của OSI, như phiên và trình bày, thường nằm trong tầng ứng dụng hoặc thư viện của kiến trúc TCP/IP. Bảng 2.1 đối chiếu các nhóm để hỗ trợ học tập, không quy định cách cài đặt bắt buộc.</w:t>
+      </w:r>
+      <w:r>
+        <w:rPr>
+          <w:rFonts w:ascii="Times New Roman" w:hAnsi="Times New Roman" w:eastAsia="Times New Roman" w:cs="Times New Roman"/>
+          <w:color w:val="000000"/>
+          <w:sz w:val="28"/>
+        </w:rPr>
       </w:r>
       <w:r/>
     </w:p>
@@ -18979,8 +19118,17 @@
           <w:color w:val="000000"/>
           <w:sz w:val="28"/>
         </w:rPr>
-        <w:t xml:space="preserve">Wi-Fi và kết nối di động khác nhau ở phương thức truy nhập nhưng cùng phối hợp với ngăn xếp IP và các ứng dụng trong hệ điều hành. So sánh hai đường kết nối giúp nhận diện phần chức năng dùng chung và phần đặc thù của driver, firmware hoặc modem. Đây là kiến thức nền có liên quan đến định hướng Network; việc nêu modem không khẳng định đã thực hiện thao tác cụ thể với thiết bị này.</w:t>
-      </w:r>
+        <w:t xml:space="preserve">Wi-Fi và kết nối di động khác nhau ở phương thức truy nhập nhưng cùng phối hợp với ngăn xếp IP và các ứng dụng trong hệ điều hà</w:t>
+      </w:r>
+      <w:r>
+        <w:rPr>
+          <w:rFonts w:ascii="Times New Roman" w:hAnsi="Times New Roman" w:eastAsia="Times New Roman" w:cs="Times New Roman"/>
+          <w:color w:val="000000"/>
+          <w:sz w:val="28"/>
+        </w:rPr>
+        <w:t xml:space="preserve">nh. So sánh hai đường kết nối giúp nhận diện phần chức năng dùng chung và phần đặc thù của driver, firmware hoặc modem. Đây là kiến thức nền có liên quan đến định hướng Network; việc nêu modem không khẳng định đã thực hiện thao tác cụ thể với thiết bị này.</w:t>
+      </w:r>
+      <w:r/>
     </w:p>
     <w:p>
       <w:pPr>
@@ -18995,14 +19143,14 @@
         <mc:AlternateContent>
           <mc:Choice Requires="wpg">
             <w:drawing>
-              <wp:inline distT="0" distB="0" distL="0" distR="0">
+              <wp:inline xmlns:wp="http://schemas.openxmlformats.org/drawingml/2006/wordprocessingDrawing" distT="0" distB="0" distL="0" distR="0">
                 <wp:extent cx="4937760" cy="2962656"/>
                 <wp:effectExtent l="0" t="0" r="0" b="0"/>
-                <wp:docPr id="11" name="Picture 903694904" descr="Sơ đồ khối vẽ lại bằng draw.io, trình bày khái quát theo tài liệu công khai." title="Hình 2.3. Đường đi khái quát từ ứng dụng tới mạng ngoài qua Wi-Fi hoặc modem"/>
+                <wp:docPr id="12" name="Picture 903694904" descr="Sơ đồ khối vẽ lại bằng draw.io, trình bày khái quát theo tài liệu công khai." title="Hình 2.3. Đường đi khái quát từ ứng dụng tới mạng ngoài qua Wi-Fi hoặc modem"/>
                 <wp:cNvGraphicFramePr>
-                  <a:graphicFrameLocks noChangeAspect="1"/>
+                  <a:graphicFrameLocks xmlns:a="http://schemas.openxmlformats.org/drawingml/2006/main" noChangeAspect="1"/>
                 </wp:cNvGraphicFramePr>
-                <a:graphic>
+                <a:graphic xmlns:a="http://schemas.openxmlformats.org/drawingml/2006/main">
                   <a:graphicData uri="http://schemas.openxmlformats.org/drawingml/2006/picture">
                     <pic:pic xmlns:pic="http://schemas.openxmlformats.org/drawingml/2006/picture">
                       <pic:nvPicPr>
@@ -19013,7 +19161,7 @@
                         <pic:nvPr/>
                       </pic:nvPicPr>
                       <pic:blipFill rotWithShape="1">
-                        <a:blip r:embed="rId22"/>
+                        <a:blip r:embed="rId23"/>
                         <a:stretch/>
                       </pic:blipFill>
                       <pic:spPr bwMode="auto">
@@ -19052,8 +19200,8 @@
                 <v:path o:extrusionok="f" gradientshapeok="t" o:connecttype="rect"/>
                 <o:lock v:ext="edit" aspectratio="t"/>
               </v:shapetype>
-              <v:shape id="_x0000_i10" o:spid="_x0000_s10" type="#_x0000_t75" style="width:388.80pt;height:235.33pt;mso-wrap-distance-left:0.00pt;mso-wrap-distance-top:0.00pt;mso-wrap-distance-right:0.00pt;mso-wrap-distance-bottom:0.00pt;z-index:1;" stroked="false">
-                <v:imagedata r:id="rId22" o:title=""/>
+              <v:shape id="_x0000_i11" o:spid="_x0000_s11" type="#_x0000_t75" style="width:388.80pt;height:233.28pt;mso-wrap-distance-left:0.00pt;mso-wrap-distance-top:0.00pt;mso-wrap-distance-right:0.00pt;mso-wrap-distance-bottom:0.00pt;z-index:1;" stroked="false">
+                <v:imagedata r:id="rId23" o:title=""/>
                 <o:lock v:ext="edit" rotation="t"/>
               </v:shape>
             </w:pict>
@@ -19766,8 +19914,19 @@
           <w:szCs w:val="28"/>
           <w:lang w:val="vi-VN"/>
         </w:rPr>
-        <w:t xml:space="preserve">Phạm vi đang tìm hiểu tập trung vào hoạt động mạng trên Linux, các thành phần Network liên quan đến nền tảng và cách phân tích khi thiết bị không kết nối được hoặc hoạt động khác mong đợi. Wi-Fi, chip mạng, driver và công suất tín hiệu là những khái niệm nền đang được xem xét; việc đề cập ở đây không xác nhận rằng tất cả đều có trên bo mạch đang tìm hiểu hoặc là nguyên nhân của hiện tượng.</w:t>
-      </w:r>
+        <w:t xml:space="preserve">Phạm vi đang tìm hiểu tập trung vào hoạt động mạng trên Linux, các thành phần Network liên quan đến nền tảng và cách phân tích khi thiết</w:t>
+      </w:r>
+      <w:r>
+        <w:rPr>
+          <w:rFonts w:ascii="Times New Roman" w:hAnsi="Times New Roman" w:eastAsia="Times New Roman" w:cs="Times New Roman"/>
+          <w:color w:val="000000"/>
+          <w:sz w:val="28"/>
+          <w:szCs w:val="28"/>
+          <w:lang w:val="vi-VN"/>
+        </w:rPr>
+        <w:t xml:space="preserve"> bị không kết nối được hoặc hoạt động khác mong đợi. Wi-Fi, chip mạng, driver và công suất tín hiệu là những khái niệm nền đang được xem xét; việc đề cập ở đây không xác nhận rằng tất cả đều có trên bo mạch đang tìm hiểu hoặc là nguyên nhân của hiện tượng.</w:t>
+      </w:r>
+      <w:r/>
     </w:p>
     <w:p>
       <w:pPr>
@@ -19962,8 +20121,19 @@
           <w:szCs w:val="28"/>
           <w:lang w:val="vi-VN"/>
         </w:rPr>
-        <w:t xml:space="preserve">Do nội dung Network vẫn đang được tìm hiểu và thông tin dự án cần được bảo mật, mục này trình bày khung suy luận chung để tiếp cận vấn đề mạng trên thiết bị nhúng, không phải biên bản thao tác trên bo mạch cụ thể. Mọi thao tác thực tế cần tuân theo tài liệu áp dụng, hướng dẫn của kỹ sư phụ trách và quy định của công ty.</w:t>
-      </w:r>
+        <w:t xml:space="preserve">Do nội dung Network vẫn đang được tìm hiểu và thông tin dự án cần</w:t>
+      </w:r>
+      <w:r>
+        <w:rPr>
+          <w:rFonts w:ascii="Times New Roman" w:hAnsi="Times New Roman" w:eastAsia="Times New Roman" w:cs="Times New Roman"/>
+          <w:color w:val="000000"/>
+          <w:sz w:val="28"/>
+          <w:szCs w:val="28"/>
+          <w:lang w:val="vi-VN"/>
+        </w:rPr>
+        <w:t xml:space="preserve"> được bảo mật, mục này trình bày khung suy luận chung để tiếp cận vấn đề mạng trên thiết bị nhúng, không phải biên bản thao tác trên bo mạch cụ thể. Mọi thao tác thực tế cần tuân theo tài liệu áp dụng, hướng dẫn của kỹ sư phụ trách và quy định của công ty.</w:t>
+      </w:r>
+      <w:r/>
     </w:p>
     <w:p>
       <w:pPr>
@@ -20306,12 +20476,12 @@
           </w:tcPr>
           <w:p>
             <w:pPr>
+              <w:pageBreakBefore w:val="true"/>
               <w:pBdr/>
               <w:spacing w:after="0" w:before="0" w:line="360" w:lineRule="auto"/>
               <w:ind w:firstLine="0" w:left="0"/>
               <w:jc w:val="center"/>
               <w:rPr/>
-              <w:pageBreakBefore/>
             </w:pPr>
             <w:r>
               <w:rPr>
@@ -20972,14 +21142,14 @@
         <mc:AlternateContent>
           <mc:Choice Requires="wpg">
             <w:drawing>
-              <wp:inline distT="0" distB="0" distL="0" distR="0">
+              <wp:inline xmlns:wp="http://schemas.openxmlformats.org/drawingml/2006/wordprocessingDrawing" distT="0" distB="0" distL="0" distR="0">
                 <wp:extent cx="5074920" cy="2854642"/>
                 <wp:effectExtent l="0" t="0" r="0" b="0"/>
-                <wp:docPr id="12" name="Picture 903694905" descr="Sơ đồ khối vẽ lại bằng draw.io, trình bày khái quát theo tài liệu công khai." title="Hình 2.4. Vòng lặp phân tích, thử nghiệm và cập nhật giả thuyết"/>
+                <wp:docPr id="13" name="Picture 903694905" descr="Sơ đồ khối vẽ lại bằng draw.io, trình bày khái quát theo tài liệu công khai." title="Hình 2.4. Vòng lặp phân tích, thử nghiệm và cập nhật giả thuyết"/>
                 <wp:cNvGraphicFramePr>
-                  <a:graphicFrameLocks noChangeAspect="1"/>
+                  <a:graphicFrameLocks xmlns:a="http://schemas.openxmlformats.org/drawingml/2006/main" noChangeAspect="1"/>
                 </wp:cNvGraphicFramePr>
-                <a:graphic>
+                <a:graphic xmlns:a="http://schemas.openxmlformats.org/drawingml/2006/main">
                   <a:graphicData uri="http://schemas.openxmlformats.org/drawingml/2006/picture">
                     <pic:pic xmlns:pic="http://schemas.openxmlformats.org/drawingml/2006/picture">
                       <pic:nvPicPr>
@@ -20990,7 +21160,7 @@
                         <pic:nvPr/>
                       </pic:nvPicPr>
                       <pic:blipFill rotWithShape="1">
-                        <a:blip r:embed="rId23"/>
+                        <a:blip r:embed="rId24"/>
                         <a:stretch/>
                       </pic:blipFill>
                       <pic:spPr bwMode="auto">
@@ -21029,8 +21199,8 @@
                 <v:path o:extrusionok="f" gradientshapeok="t" o:connecttype="rect"/>
                 <o:lock v:ext="edit" aspectratio="t"/>
               </v:shapetype>
-              <v:shape id="_x0000_i11" o:spid="_x0000_s11" type="#_x0000_t75" style="width:399.60pt;height:185.08pt;mso-wrap-distance-left:0.00pt;mso-wrap-distance-top:0.00pt;mso-wrap-distance-right:0.00pt;mso-wrap-distance-bottom:0.00pt;z-index:1;" stroked="false">
-                <v:imagedata r:id="rId23" o:title=""/>
+              <v:shape id="_x0000_i12" o:spid="_x0000_s12" type="#_x0000_t75" style="width:399.60pt;height:224.77pt;mso-wrap-distance-left:0.00pt;mso-wrap-distance-top:0.00pt;mso-wrap-distance-right:0.00pt;mso-wrap-distance-bottom:0.00pt;z-index:1;" stroked="false">
+                <v:imagedata r:id="rId24" o:title=""/>
                 <o:lock v:ext="edit" rotation="t"/>
               </v:shape>
             </w:pict>
@@ -21578,8 +21748,19 @@
           <w:szCs w:val="28"/>
           <w:lang w:val="vi-VN"/>
         </w:rPr>
-        <w:t xml:space="preserve">Ở thời điểm soạn thảo, nội dung Network vẫn đang được tìm hiểu và chưa có kết luận kỹ thuật cuối cùng. Do phạm vi thông tin có thể công bố còn giới hạn, chương này tập trung vào kiến thức nền và cách tổ chức phân tích ở mức khái quát; không nêu kết quả đo, nguyên nhân lỗi hoặc thay đổi mã nguồn.</w:t>
-      </w:r>
+        <w:t xml:space="preserve">Ở thời điểm soạn thảo, nội dung Network </w:t>
+      </w:r>
+      <w:r>
+        <w:rPr>
+          <w:rFonts w:ascii="Times New Roman" w:hAnsi="Times New Roman" w:eastAsia="Times New Roman" w:cs="Times New Roman"/>
+          <w:color w:val="000000"/>
+          <w:sz w:val="28"/>
+          <w:szCs w:val="28"/>
+          <w:lang w:val="vi-VN"/>
+        </w:rPr>
+        <w:t xml:space="preserve">vẫn đang được tìm hiểu và chưa có kết luận kỹ thuật cuối cùng. Do phạm vi thông tin có thể công bố còn giới hạn, chương này tập trung vào kiến thức nền và cách tổ chức phân tích ở mức khái quát; không nêu kết quả đo, nguyên nhân lỗi hoặc thay đổi mã nguồn.</w:t>
+      </w:r>
+      <w:r/>
     </w:p>
     <w:p>
       <w:pPr>
@@ -21627,8 +21808,19 @@
           <w:szCs w:val="28"/>
           <w:lang w:val="vi-VN"/>
         </w:rPr>
-        <w:t xml:space="preserve">Nguồn học tập chủ yếu gồm tài liệu về bo mạch, phần cứng và nền tảng; kiến thức nền được các kỹ sư chia sẻ; cùng việc tiếp cận bo mạch phát triển và công cụ được giao để phục vụ học tập. Trong kỳ thực tập, tài liệu và hướng dẫn được cung cấp theo phạm vi cần thiết. Tài liệu nền tảng thường gắn với phiên bản, cấu hình và biến thể phần cứng cụ thể nên cần đối chiếu đúng phạm vi áp dụng; nội dung hạn chế không được đưa vào báo cáo.</w:t>
-      </w:r>
+        <w:t xml:space="preserve">Nguồn học tập chủ yếu gồm tài liệu về bo mạch, phần cứng và nền tảng; kiến thức nền được các kỹ sư chia sẻ; cùng việc tiếp cận bo mạch phát triển và công cụ được giao để phục v</w:t>
+      </w:r>
+      <w:r>
+        <w:rPr>
+          <w:rFonts w:ascii="Times New Roman" w:hAnsi="Times New Roman" w:eastAsia="Times New Roman" w:cs="Times New Roman"/>
+          <w:color w:val="000000"/>
+          <w:sz w:val="28"/>
+          <w:szCs w:val="28"/>
+          <w:lang w:val="vi-VN"/>
+        </w:rPr>
+        <w:t xml:space="preserve">ụ học tập. Trong kỳ thực tập, tài liệu và hướng dẫn được cung cấp theo phạm vi cần thiết. Tài liệu nền tảng thường gắn với phiên bản, cấu hình và biến thể phần cứng cụ thể nên cần đối chiếu đúng phạm vi áp dụng; nội dung hạn chế không được đưa vào báo cáo.</w:t>
+      </w:r>
+      <w:r/>
     </w:p>
     <w:p>
       <w:pPr>
@@ -22155,8 +22347,19 @@
           <w:szCs w:val="28"/>
           <w:lang w:val="vi-VN"/>
         </w:rPr>
-        <w:t xml:space="preserve">Mảng Network tạo liên hệ giữa kiến thức mạng máy tính với cách Linux tổ chức giao diện và giao thức. Modem di động là thành phần có thể xuất hiện trong một số kiến trúc kết nối và được giới thiệu ở đây như kiến thức nền. Cùng một biểu hiện “không truy cập được mạng” có thể bắt nguồn từ liên kết vật lý hoặc vô tuyến, driver, firmware, trạng thái modem, cấu hình IP hay dịch vụ ứng dụng. Vì vậy, cần xác định đúng giai đoạn của chuỗi kết nối trước khi chọn hướng kiểm tra.</w:t>
-      </w:r>
+        <w:t xml:space="preserve">Mảng Network tạo liên hệ giữa kiến thức mạng máy tính với cách Linux tổ chức giao diện và giao thức. Modem di động là thành phần có thể xuất hiện trong một số kiến trúc kết nối và được giới thiệu ở đây như kiến thức </w:t>
+      </w:r>
+      <w:r>
+        <w:rPr>
+          <w:rFonts w:ascii="Times New Roman" w:hAnsi="Times New Roman" w:eastAsia="Times New Roman" w:cs="Times New Roman"/>
+          <w:color w:val="000000"/>
+          <w:sz w:val="28"/>
+          <w:szCs w:val="28"/>
+          <w:lang w:val="vi-VN"/>
+        </w:rPr>
+        <w:t xml:space="preserve">nền. Cùng một biểu hiện “không truy cập được mạng” có thể bắt nguồn từ liên kết vật lý hoặc vô tuyến, driver, firmware, trạng thái modem, cấu hình IP hay dịch vụ ứng dụng. Vì vậy, cần xác định đúng giai đoạn của chuỗi kết nối trước khi chọn hướng kiểm tra.</w:t>
+      </w:r>
+      <w:r/>
     </w:p>
     <w:p>
       <w:pPr>
@@ -22417,6 +22620,7 @@
         </w:rPr>
         <w:t xml:space="preserve">Bảng 3.1 tóm tắt phạm vi kiến thức và trạng thái được mô tả trong báo cáo, phân biệt nội dung đã học hoặc tiếp cận với kết quả kỹ thuật đã xác nhận. Hiện chưa có kết quả cuối cùng về xử lý lỗi Network.</w:t>
       </w:r>
+      <w:r/>
     </w:p>
     <w:tbl>
       <w:tblPr>
@@ -22715,6 +22919,7 @@
               </w:rPr>
               <w:t xml:space="preserve">Quan hệ mã nguồn, cấu hình, gói phần mềm hệ thống và thiết bị</w:t>
             </w:r>
+            <w:r/>
           </w:p>
         </w:tc>
         <w:tc>
@@ -24158,6 +24363,7 @@
         </w:rPr>
         <w:t xml:space="preserve">Nhiệm vụ Network vẫn đang được debug nên chưa có kết luận kỹ thuật độc lập hoặc số liệu trước và sau để đánh giá. Do đó, chưa có căn cứ để kết luận hiệu quả xử lý lỗi; phần tự đánh giá tập trung vào quá trình học tập và những kỹ năng đang hình thành.</w:t>
       </w:r>
+      <w:r/>
     </w:p>
     <w:p>
       <w:pPr>
@@ -24594,12 +24800,12 @@
     </w:p>
     <w:p>
       <w:pPr>
+        <w:keepLines w:val="true"/>
         <w:pBdr/>
         <w:spacing w:after="0" w:before="0" w:line="360" w:lineRule="auto"/>
         <w:ind w:firstLine="720"/>
         <w:jc w:val="both"/>
         <w:rPr/>
-        <w:keepLines w:val="true"/>
       </w:pPr>
       <w:r>
         <w:rPr>
@@ -24648,8 +24854,19 @@
           <w:szCs w:val="28"/>
           <w:lang w:val="vi-VN"/>
         </w:rPr>
-        <w:t xml:space="preserve">Nhà trường có thể tăng cường hướng dẫn đọc tài liệu tiếng Anh, ghi nhận thí nghiệm và trao đổi vấn đề có cấu trúc; đồng thời giúp sinh viên phân biệt ghi chép phục vụ học tập với nội dung được phép chia sẻ. Khi trình bày kết quả, cần xác minh tính chính xác và quyền công bố; nếu chưa có kết luận, cần ghi đúng trạng thái đang tiếp tục.</w:t>
-      </w:r>
+        <w:t xml:space="preserve">Nhà trường có thể tăng cường hướng dẫn đọc tài liệu tiếng Anh, ghi nhận thí nghi</w:t>
+      </w:r>
+      <w:r>
+        <w:rPr>
+          <w:rFonts w:ascii="Times New Roman" w:hAnsi="Times New Roman" w:eastAsia="Times New Roman" w:cs="Times New Roman"/>
+          <w:color w:val="000000"/>
+          <w:sz w:val="28"/>
+          <w:szCs w:val="28"/>
+          <w:lang w:val="vi-VN"/>
+        </w:rPr>
+        <w:t xml:space="preserve">ệm và trao đổi vấn đề có cấu trúc; đồng thời giúp sinh viên phân biệt ghi chép phục vụ học tập với nội dung được phép chia sẻ. Khi trình bày kết quả, cần xác minh tính chính xác và quyền công bố; nếu chưa có kết luận, cần ghi đúng trạng thái đang tiếp tục.</w:t>
+      </w:r>
+      <w:r/>
     </w:p>
     <w:p>
       <w:pPr>
@@ -24697,8 +24914,19 @@
           <w:szCs w:val="28"/>
           <w:lang w:val="vi-VN"/>
         </w:rPr>
-        <w:t xml:space="preserve">Tiếp tục học theo mục tiêu nhỏ: củng cố Linux, đọc quy trình build và khởi động, tìm hiểu từng phần của đường đi mạng; đồng thời rèn kiến thức về kiến trúc hệ điều hành, đọc tài liệu kỹ thuật và ghi chép nội dung được phép chia sẻ. Khi được giao thao tác debug, cần tuân theo hướng dẫn, ghi rõ điều kiện và kết quả, thay đổi từng yếu tố có kiểm soát, phân biệt dữ liệu quan sát với suy luận và xác nhận quyền công bố trước khi đưa kết quả vào báo cáo.</w:t>
-      </w:r>
+        <w:t xml:space="preserve">Tiếp tục học theo mục tiêu nhỏ: củng cố Linux, đọc quy trình build và khởi động, tìm hiểu từng phần của đường đi mạng; đồng thời rèn kiến thức về kiến trúc hệ điều hành, đọc tài liệu kỹ thuật và </w:t>
+      </w:r>
+      <w:r>
+        <w:rPr>
+          <w:rFonts w:ascii="Times New Roman" w:hAnsi="Times New Roman" w:eastAsia="Times New Roman" w:cs="Times New Roman"/>
+          <w:color w:val="000000"/>
+          <w:sz w:val="28"/>
+          <w:szCs w:val="28"/>
+          <w:lang w:val="vi-VN"/>
+        </w:rPr>
+        <w:t xml:space="preserve">ghi chép nội dung được phép chia sẻ. Khi được giao thao tác debug, cần tuân theo hướng dẫn, ghi rõ điều kiện và kết quả, thay đổi từng yếu tố có kiểm soát, phân biệt dữ liệu quan sát với suy luận và xác nhận quyền công bố trước khi đưa kết quả vào báo cáo.</w:t>
+      </w:r>
+      <w:r/>
     </w:p>
     <w:p>
       <w:pPr>
@@ -24785,8 +25013,19 @@
           <w:szCs w:val="28"/>
           <w:lang w:val="vi-VN"/>
         </w:rPr>
-        <w:t xml:space="preserve">Kiến thức Linux và mạng trong Linux vẫn cần đào sâu, còn nhiệm vụ Network chưa có kết luận kỹ thuật được phép công bố. Vì vậy, kết quả được giới hạn ở phạm vi đã xác nhận; nhận xét về tiến độ và năng lực không được suy rộng thành kết luận sửa lỗi. Kỳ thực tập giúp xác định hướng học tập tiếp theo và nền tảng để phát triển chuyên môn.</w:t>
-      </w:r>
+        <w:t xml:space="preserve">Kiến thức Linux và mạng trong Linux vẫn cần đào sâu, còn nhiệm vụ Network chưa </w:t>
+      </w:r>
+      <w:r>
+        <w:rPr>
+          <w:rFonts w:ascii="Times New Roman" w:hAnsi="Times New Roman" w:eastAsia="Times New Roman" w:cs="Times New Roman"/>
+          <w:color w:val="000000"/>
+          <w:sz w:val="28"/>
+          <w:szCs w:val="28"/>
+          <w:lang w:val="vi-VN"/>
+        </w:rPr>
+        <w:t xml:space="preserve">có kết luận kỹ thuật được phép công bố. Vì vậy, kết quả được giới hạn ở phạm vi đã xác nhận; nhận xét về tiến độ và năng lực không được suy rộng thành kết luận sửa lỗi. Kỳ thực tập giúp xác định hướng học tập tiếp theo và nền tảng để phát triển chuyên môn.</w:t>
+      </w:r>
+      <w:r/>
     </w:p>
     <w:p>
       <w:pPr>
@@ -59839,7 +60078,7 @@
     <customSectPr/>
   </customSectProps>
   <customShpExts>
-    <customShpInfo spid="_x005F_x005F_x005F_x005F_x005F_x005F_x005F_x005F_x005F_x005F_x005F_x005F_x005F_x005F_x005F_x005F_x005F_x005F_x005F_x005F_x005F_x005F_x005F_x005F_x005F_x005F_x005F_x005F_x005F_x005F_x005F_x005F_x005F_x005F_x005F_x005F_x005F_x005F_x005F_x005F_x005F_x005F_x005F_x005F_x005F_x005F_x005F_x005F_x005F_x005F_x005F_x005F_x005F_x005F_x005F_x005F_x005F_x005F_x005F_x005F_x005F_x005F_x005F_x005F_x005F_x005F_x005F_x005F_x005F_x005F_x005F_x005F_x005F_x005F_x005F_x005F_x005F_x005F_x005F_x005F_x005F_x005F_x005F_x005F_x005F_x005F_x005F_x005F_x005F_x005F_x005F_x005F_x005F_x005F_x005F_x005F_x005F_x005F_x005F_x005F_x005F_x005F_x005F_x005F_x005F_x005F_x005F_x005F_x005F_x005F_x005F_x005F_x005F_x005F_x005F_x005F_x005F_x005F_x005F_x005F_x005F_x005F_x005F_x005F_x005F_x005F_x005F_x005F_x005F_x005F_x005F_x005F_x005F_x005F_x005F_x005F_x005F_x005F_x005F_x005F_x005F_x005F_x005F_x005F_x005F_x005F_x005F_x005F_x005F_x005F_x005F_x005F_x005F_x005F_x005F_x005F_x005F_x005F_x005F_x005F_x005F_x005F_x005F_x005F_x005F_x005F_x005F_x005F_x005F_x005F_x005F_x005F_x005F_x005F_x005F_x005F_x005F_x005F_x005F_x005F_x005F_x005F_x005F_x005F_x005F_x005F_x005F_x005F_x005F_x005F_x005F_x005F_x005F_x005F_x005F_x005F_x005F_x005F_x005F_x005F_x005F_x005F_x005F_x005F_x005F_x005F_x005F_x005F_x005F_x005F_x005F_x005F_x005F_x005F_x005F_x005F_x005F_x005F_x005F_x005F_x005F_x005F_x005F_x005F_x005F_x005F_x005F_x005F_x005F_x005F_x005F_x005F_x005F_x005F_x005F_x005F_x005F_x005F_x005F_x005F_x005F_x005F_x005F_x005F_x005F_x005F_x005F_x005F_x005F_x005F_x005F_x005F_x005F_x005F_x005F_x0000_s1026" textRotate="1"/>
+    <customShpInfo spid="_x005F_x005F_x005F_x005F_x005F_x005F_x005F_x005F_x005F_x005F_x005F_x005F_x005F_x005F_x005F_x005F_x005F_x005F_x005F_x005F_x005F_x005F_x005F_x005F_x005F_x005F_x005F_x005F_x005F_x005F_x005F_x005F_x005F_x005F_x005F_x005F_x005F_x005F_x005F_x005F_x005F_x005F_x005F_x005F_x005F_x005F_x005F_x005F_x005F_x005F_x005F_x005F_x005F_x005F_x005F_x005F_x005F_x005F_x005F_x005F_x005F_x005F_x005F_x005F_x005F_x005F_x005F_x005F_x005F_x005F_x005F_x005F_x005F_x005F_x005F_x005F_x005F_x005F_x005F_x005F_x005F_x005F_x005F_x005F_x005F_x005F_x005F_x005F_x005F_x005F_x005F_x005F_x005F_x005F_x005F_x005F_x005F_x005F_x005F_x005F_x005F_x005F_x005F_x005F_x005F_x005F_x005F_x005F_x005F_x005F_x005F_x005F_x005F_x005F_x005F_x005F_x005F_x005F_x005F_x005F_x005F_x005F_x005F_x005F_x005F_x005F_x005F_x005F_x005F_x005F_x005F_x005F_x005F_x005F_x005F_x005F_x005F_x005F_x005F_x005F_x005F_x005F_x005F_x005F_x005F_x005F_x005F_x005F_x005F_x005F_x005F_x005F_x005F_x005F_x005F_x005F_x005F_x005F_x005F_x005F_x005F_x005F_x005F_x005F_x005F_x005F_x005F_x005F_x005F_x005F_x005F_x005F_x005F_x005F_x005F_x005F_x005F_x005F_x005F_x005F_x005F_x005F_x005F_x005F_x005F_x005F_x005F_x005F_x005F_x005F_x005F_x005F_x005F_x005F_x005F_x005F_x005F_x005F_x005F_x005F_x005F_x005F_x005F_x005F_x005F_x005F_x005F_x005F_x005F_x005F_x005F_x005F_x005F_x005F_x005F_x005F_x005F_x005F_x005F_x005F_x005F_x005F_x005F_x005F_x005F_x005F_x005F_x005F_x005F_x005F_x005F_x005F_x005F_x005F_x005F_x005F_x005F_x005F_x005F_x005F_x005F_x005F_x005F_x005F_x005F_x005F_x005F_x005F_x005F_x005F_x005F_x005F_x005F_x005F_x005F_x005F_x005F_x005F_x005F_x005F_x005F_x005F_x005F_x005F_x005F_x005F_x005F_x005F_x005F_x005F_x005F_x005F_x005F_x005F_x005F_x005F_x005F_x005F_x005F_x005F_x005F_x005F_x005F_x005F_x005F_x005F_x005F_x005F_x005F_x005F_x005F_x005F_x005F_x005F_x005F_x005F_x005F_x005F_x005F_x005F_x005F_x005F_x005F_x005F_x005F_x005F_x005F_x005F_x005F_x005F_x005F_x005F_x005F_x005F_x005F_x005F_x005F_x005F_x005F_x005F_x005F_x005F_x005F_x005F_x005F_x005F_x005F_x005F_x005F_x005F_x005F_x005F_x005F_x005F_x005F_x005F_x005F_x005F_x005F_x005F_x005F_x005F_x005F_x005F_x005F_x005F_x005F_x005F_x005F_x005F_x005F_x005F_x005F_x005F_x005F_x005F_x005F_x005F_x005F_x005F_x005F_x005F_x005F_x005F_x005F_x005F_x005F_x005F_x005F_x005F_x005F_x005F_x005F_x005F_x005F_x005F_x005F_x005F_x005F_x005F_x005F_x005F_x005F_x005F_x005F_x005F_x005F_x005F_x005F_x005F_x005F_x005F_x005F_x005F_x005F_x005F_x005F_x005F_x005F_x005F_x005F_x005F_x005F_x005F_x005F_x005F_x005F_x005F_x005F_x005F_x005F_x005F_x005F_x005F_x005F_x005F_x005F_x005F_x005F_x005F_x005F_x005F_x005F_x005F_x005F_x005F_x005F_x005F_x005F_x005F_x005F_x005F_x005F_x005F_x005F_x005F_x005F_x005F_x005F_x005F_x005F_x005F_x005F_x005F_x005F_x005F_x005F_x005F_x005F_x005F_x005F_x005F_x005F_x005F_x005F_x005F_x005F_x005F_x005F_x005F_x005F_x005F_x005F_x005F_x005F_x005F_x005F_x005F_x005F_x005F_x005F_x005F_x005F_x005F_x005F_x005F_x005F_x005F_x005F_x005F_x005F_x005F_x005F_x005F_x005F_x005F_x005F_x005F_x005F_x005F_x005F_x005F_x005F_x005F_x005F_x005F_x005F_x005F_x005F_x005F_x005F_x005F_x005F_x005F_x005F_x005F_x005F_x005F_x005F_x005F_x005F_x0000_s1026" textRotate="1"/>
   </customShpExts>
 </s:customData>
 </file>

</xml_diff>

<commit_message>
Restructure HSPTEK history and add milestones
</commit_message>
<xml_diff>
--- a/VuDuyKhanh_BCTTTN.docx
+++ b/VuDuyKhanh_BCTTTN.docx
@@ -3003,7 +3003,7 @@
                 <w:sz w:val="28"/>
                 <w:szCs w:val="28"/>
               </w:rPr>
-              <w:t xml:space="preserve">1</w:t>
+              <w:t xml:space="preserve">3</w:t>
             </w:r>
           </w:fldSimple>
           <w:r>
@@ -3061,7 +3061,7 @@
                 <w:sz w:val="28"/>
                 <w:szCs w:val="28"/>
               </w:rPr>
-              <w:t xml:space="preserve">2</w:t>
+              <w:t xml:space="preserve">3</w:t>
             </w:r>
           </w:fldSimple>
           <w:r>
@@ -3508,6 +3508,116 @@
                 <w:sz w:val="28"/>
                 <w:szCs w:val="28"/>
               </w:rPr>
+              <w:t xml:space="preserve">12</w:t>
+            </w:r>
+          </w:fldSimple>
+          <w:r>
+            <w:rPr>
+              <w:rFonts w:asciiTheme="minorHAnsi" w:hAnsiTheme="minorHAnsi" w:eastAsiaTheme="minorEastAsia" w:cstheme="minorBidi"/>
+              <w:sz w:val="28"/>
+              <w:szCs w:val="28"/>
+            </w:rPr>
+          </w:r>
+          <w:r>
+            <w:rPr>
+              <w:rFonts w:asciiTheme="minorHAnsi" w:hAnsiTheme="minorHAnsi" w:eastAsiaTheme="minorEastAsia" w:cstheme="minorBidi"/>
+              <w:sz w:val="28"/>
+              <w:szCs w:val="28"/>
+            </w:rPr>
+          </w:r>
+        </w:p>
+        <w:p>
+          <w:pPr>
+            <w:pStyle w:val="970"/>
+            <w:pBdr/>
+            <w:spacing w:after="0" w:before="0" w:line="360" w:lineRule="auto"/>
+            <w:ind w:left="720"/>
+            <w:rPr>
+              <w:rFonts w:asciiTheme="minorHAnsi" w:hAnsiTheme="minorHAnsi" w:eastAsiaTheme="minorEastAsia" w:cstheme="minorBidi"/>
+              <w:sz w:val="28"/>
+              <w:szCs w:val="28"/>
+            </w:rPr>
+          </w:pPr>
+          <w:r>
+            <w:rPr>
+              <w:rFonts w:ascii="Times New Roman" w:hAnsi="Times New Roman" w:eastAsia="Times New Roman" w:cs="Times New Roman"/>
+              <w:color w:val="000000"/>
+              <w:sz w:val="28"/>
+              <w:szCs w:val="28"/>
+            </w:rPr>
+            <w:t xml:space="preserve">1.1.2.1. Quá trình hình thành</w:t>
+          </w:r>
+          <w:r>
+            <w:rPr>
+              <w:rFonts w:ascii="Times New Roman" w:hAnsi="Times New Roman" w:eastAsia="Times New Roman" w:cs="Times New Roman"/>
+              <w:sz w:val="28"/>
+              <w:szCs w:val="28"/>
+            </w:rPr>
+            <w:tab/>
+          </w:r>
+          <w:fldSimple w:instr="PAGEREF KhanhHead_101 \h ">
+            <w:r>
+              <w:rPr>
+                <w:rFonts w:ascii="Times New Roman" w:hAnsi="Times New Roman" w:eastAsia="Times New Roman" w:cs="Times New Roman"/>
+                <w:color w:val="000000"/>
+                <w:sz w:val="28"/>
+                <w:szCs w:val="28"/>
+              </w:rPr>
+              <w:t xml:space="preserve">12</w:t>
+            </w:r>
+          </w:fldSimple>
+          <w:r>
+            <w:rPr>
+              <w:rFonts w:asciiTheme="minorHAnsi" w:hAnsiTheme="minorHAnsi" w:eastAsiaTheme="minorEastAsia" w:cstheme="minorBidi"/>
+              <w:sz w:val="28"/>
+              <w:szCs w:val="28"/>
+            </w:rPr>
+          </w:r>
+          <w:r>
+            <w:rPr>
+              <w:rFonts w:asciiTheme="minorHAnsi" w:hAnsiTheme="minorHAnsi" w:eastAsiaTheme="minorEastAsia" w:cstheme="minorBidi"/>
+              <w:sz w:val="28"/>
+              <w:szCs w:val="28"/>
+            </w:rPr>
+          </w:r>
+        </w:p>
+        <w:p>
+          <w:pPr>
+            <w:pStyle w:val="970"/>
+            <w:pBdr/>
+            <w:spacing w:after="0" w:before="0" w:line="360" w:lineRule="auto"/>
+            <w:ind w:left="720"/>
+            <w:rPr>
+              <w:rFonts w:asciiTheme="minorHAnsi" w:hAnsiTheme="minorHAnsi" w:eastAsiaTheme="minorEastAsia" w:cstheme="minorBidi"/>
+              <w:sz w:val="28"/>
+              <w:szCs w:val="28"/>
+            </w:rPr>
+          </w:pPr>
+          <w:r>
+            <w:rPr>
+              <w:rFonts w:ascii="Times New Roman" w:hAnsi="Times New Roman" w:eastAsia="Times New Roman" w:cs="Times New Roman"/>
+              <w:color w:val="000000"/>
+              <w:sz w:val="28"/>
+              <w:szCs w:val="28"/>
+            </w:rPr>
+            <w:t xml:space="preserve">1.1.2.2. Các dấu mốc phát triển và thành tựu</w:t>
+          </w:r>
+          <w:r>
+            <w:rPr>
+              <w:rFonts w:ascii="Times New Roman" w:hAnsi="Times New Roman" w:eastAsia="Times New Roman" w:cs="Times New Roman"/>
+              <w:sz w:val="28"/>
+              <w:szCs w:val="28"/>
+            </w:rPr>
+            <w:tab/>
+          </w:r>
+          <w:fldSimple w:instr="PAGEREF KhanhHead_102 \h ">
+            <w:r>
+              <w:rPr>
+                <w:rFonts w:ascii="Times New Roman" w:hAnsi="Times New Roman" w:eastAsia="Times New Roman" w:cs="Times New Roman"/>
+                <w:color w:val="000000"/>
+                <w:sz w:val="28"/>
+                <w:szCs w:val="28"/>
+              </w:rPr>
               <w:t xml:space="preserve">13</w:t>
             </w:r>
           </w:fldSimple>
@@ -3553,7 +3663,7 @@
               <w:rPr>
                 <w:color w:val="000000"/>
               </w:rPr>
-              <w:t xml:space="preserve">13</w:t>
+              <w:t xml:space="preserve">14</w:t>
             </w:r>
           </w:fldSimple>
           <w:r>
@@ -3608,7 +3718,7 @@
                 <w:sz w:val="28"/>
                 <w:szCs w:val="28"/>
               </w:rPr>
-              <w:t xml:space="preserve">13</w:t>
+              <w:t xml:space="preserve">14</w:t>
             </w:r>
           </w:fldSimple>
           <w:r>
@@ -3663,7 +3773,7 @@
                 <w:sz w:val="28"/>
                 <w:szCs w:val="28"/>
               </w:rPr>
-              <w:t xml:space="preserve">14</w:t>
+              <w:t xml:space="preserve">15</w:t>
             </w:r>
           </w:fldSimple>
           <w:r>
@@ -3718,7 +3828,7 @@
                 <w:sz w:val="28"/>
                 <w:szCs w:val="28"/>
               </w:rPr>
-              <w:t xml:space="preserve">15</w:t>
+              <w:t xml:space="preserve">16</w:t>
             </w:r>
           </w:fldSimple>
           <w:r>
@@ -3773,7 +3883,7 @@
                 <w:sz w:val="28"/>
                 <w:szCs w:val="28"/>
               </w:rPr>
-              <w:t xml:space="preserve">16</w:t>
+              <w:t xml:space="preserve">17</w:t>
             </w:r>
           </w:fldSimple>
           <w:r>
@@ -3818,7 +3928,7 @@
               <w:rPr>
                 <w:color w:val="000000"/>
               </w:rPr>
-              <w:t xml:space="preserve">18</w:t>
+              <w:t xml:space="preserve">19</w:t>
             </w:r>
           </w:fldSimple>
           <w:r>
@@ -3873,7 +3983,7 @@
                 <w:sz w:val="28"/>
                 <w:szCs w:val="28"/>
               </w:rPr>
-              <w:t xml:space="preserve">19</w:t>
+              <w:t xml:space="preserve">20</w:t>
             </w:r>
           </w:fldSimple>
           <w:r>
@@ -3928,7 +4038,7 @@
                 <w:sz w:val="28"/>
                 <w:szCs w:val="28"/>
               </w:rPr>
-              <w:t xml:space="preserve">20</w:t>
+              <w:t xml:space="preserve">21</w:t>
             </w:r>
           </w:fldSimple>
           <w:r>
@@ -3983,7 +4093,7 @@
                 <w:sz w:val="28"/>
                 <w:szCs w:val="28"/>
               </w:rPr>
-              <w:t xml:space="preserve">20</w:t>
+              <w:t xml:space="preserve">21</w:t>
             </w:r>
           </w:fldSimple>
           <w:r>
@@ -4038,7 +4148,7 @@
                 <w:sz w:val="28"/>
                 <w:szCs w:val="28"/>
               </w:rPr>
-              <w:t xml:space="preserve">20</w:t>
+              <w:t xml:space="preserve">21</w:t>
             </w:r>
           </w:fldSimple>
           <w:r>
@@ -4093,7 +4203,7 @@
                 <w:sz w:val="28"/>
                 <w:szCs w:val="28"/>
               </w:rPr>
-              <w:t xml:space="preserve">21</w:t>
+              <w:t xml:space="preserve">22</w:t>
             </w:r>
           </w:fldSimple>
           <w:r>
@@ -4148,7 +4258,7 @@
                 <w:sz w:val="28"/>
                 <w:szCs w:val="28"/>
               </w:rPr>
-              <w:t xml:space="preserve">21</w:t>
+              <w:t xml:space="preserve">22</w:t>
             </w:r>
           </w:fldSimple>
           <w:r>
@@ -4203,7 +4313,7 @@
                 <w:sz w:val="28"/>
                 <w:szCs w:val="28"/>
               </w:rPr>
-              <w:t xml:space="preserve">21</w:t>
+              <w:t xml:space="preserve">22</w:t>
             </w:r>
           </w:fldSimple>
           <w:r>
@@ -4258,7 +4368,7 @@
                 <w:sz w:val="28"/>
                 <w:szCs w:val="28"/>
               </w:rPr>
-              <w:t xml:space="preserve">22</w:t>
+              <w:t xml:space="preserve">23</w:t>
             </w:r>
           </w:fldSimple>
           <w:r>
@@ -4313,7 +4423,7 @@
                 <w:sz w:val="28"/>
                 <w:szCs w:val="28"/>
               </w:rPr>
-              <w:t xml:space="preserve">22</w:t>
+              <w:t xml:space="preserve">23</w:t>
             </w:r>
           </w:fldSimple>
           <w:r>
@@ -4368,7 +4478,7 @@
                 <w:sz w:val="28"/>
                 <w:szCs w:val="28"/>
               </w:rPr>
-              <w:t xml:space="preserve">22</w:t>
+              <w:t xml:space="preserve">23</w:t>
             </w:r>
           </w:fldSimple>
           <w:r>
@@ -4423,7 +4533,7 @@
                 <w:sz w:val="28"/>
                 <w:szCs w:val="28"/>
               </w:rPr>
-              <w:t xml:space="preserve">23</w:t>
+              <w:t xml:space="preserve">24</w:t>
             </w:r>
           </w:fldSimple>
           <w:r>
@@ -4478,7 +4588,7 @@
                 <w:sz w:val="28"/>
                 <w:szCs w:val="28"/>
               </w:rPr>
-              <w:t xml:space="preserve">23</w:t>
+              <w:t xml:space="preserve">24</w:t>
             </w:r>
           </w:fldSimple>
           <w:r>
@@ -4533,7 +4643,7 @@
                 <w:sz w:val="28"/>
                 <w:szCs w:val="28"/>
               </w:rPr>
-              <w:t xml:space="preserve">23</w:t>
+              <w:t xml:space="preserve">24</w:t>
             </w:r>
           </w:fldSimple>
           <w:r>
@@ -4588,7 +4698,7 @@
                 <w:sz w:val="28"/>
                 <w:szCs w:val="28"/>
               </w:rPr>
-              <w:t xml:space="preserve">24</w:t>
+              <w:t xml:space="preserve">25</w:t>
             </w:r>
           </w:fldSimple>
           <w:r>
@@ -4688,7 +4798,7 @@
                 <w:sz w:val="28"/>
                 <w:szCs w:val="28"/>
               </w:rPr>
-              <w:t xml:space="preserve">25</w:t>
+              <w:t xml:space="preserve">26</w:t>
             </w:r>
           </w:fldSimple>
           <w:r>
@@ -4889,7 +4999,7 @@
                 <w:sz w:val="28"/>
                 <w:szCs w:val="28"/>
               </w:rPr>
-              <w:t xml:space="preserve">27</w:t>
+              <w:t xml:space="preserve">28</w:t>
             </w:r>
           </w:fldSimple>
           <w:r>
@@ -4936,7 +5046,7 @@
               <w:rPr>
                 <w:color w:val="000000"/>
               </w:rPr>
-              <w:t xml:space="preserve">27</w:t>
+              <w:t xml:space="preserve">28</w:t>
             </w:r>
           </w:fldSimple>
           <w:r>
@@ -4991,7 +5101,7 @@
                 <w:sz w:val="28"/>
                 <w:szCs w:val="28"/>
               </w:rPr>
-              <w:t xml:space="preserve">27</w:t>
+              <w:t xml:space="preserve">28</w:t>
             </w:r>
           </w:fldSimple>
           <w:r>
@@ -5046,7 +5156,7 @@
                 <w:sz w:val="28"/>
                 <w:szCs w:val="28"/>
               </w:rPr>
-              <w:t xml:space="preserve">27</w:t>
+              <w:t xml:space="preserve">28</w:t>
             </w:r>
           </w:fldSimple>
           <w:r>
@@ -5091,7 +5201,7 @@
               <w:rPr>
                 <w:color w:val="000000"/>
               </w:rPr>
-              <w:t xml:space="preserve">28</w:t>
+              <w:t xml:space="preserve">29</w:t>
             </w:r>
           </w:fldSimple>
           <w:r>
@@ -5146,7 +5256,7 @@
                 <w:sz w:val="28"/>
                 <w:szCs w:val="28"/>
               </w:rPr>
-              <w:t xml:space="preserve">29</w:t>
+              <w:t xml:space="preserve">30</w:t>
             </w:r>
           </w:fldSimple>
           <w:r>
@@ -5201,7 +5311,7 @@
                 <w:sz w:val="28"/>
                 <w:szCs w:val="28"/>
               </w:rPr>
-              <w:t xml:space="preserve">29</w:t>
+              <w:t xml:space="preserve">30</w:t>
             </w:r>
           </w:fldSimple>
           <w:r>
@@ -5256,7 +5366,7 @@
                 <w:sz w:val="28"/>
                 <w:szCs w:val="28"/>
               </w:rPr>
-              <w:t xml:space="preserve">31</w:t>
+              <w:t xml:space="preserve">32</w:t>
             </w:r>
           </w:fldSimple>
           <w:r>
@@ -5311,7 +5421,7 @@
                 <w:sz w:val="28"/>
                 <w:szCs w:val="28"/>
               </w:rPr>
-              <w:t xml:space="preserve">32</w:t>
+              <w:t xml:space="preserve">33</w:t>
             </w:r>
           </w:fldSimple>
           <w:r>
@@ -5366,7 +5476,7 @@
                 <w:sz w:val="28"/>
                 <w:szCs w:val="28"/>
               </w:rPr>
-              <w:t xml:space="preserve">33</w:t>
+              <w:t xml:space="preserve">34</w:t>
             </w:r>
           </w:fldSimple>
           <w:r>
@@ -5421,7 +5531,7 @@
                 <w:sz w:val="28"/>
                 <w:szCs w:val="28"/>
               </w:rPr>
-              <w:t xml:space="preserve">35</w:t>
+              <w:t xml:space="preserve">36</w:t>
             </w:r>
           </w:fldSimple>
           <w:r>
@@ -5476,7 +5586,7 @@
                 <w:sz w:val="28"/>
                 <w:szCs w:val="28"/>
               </w:rPr>
-              <w:t xml:space="preserve">37</w:t>
+              <w:t xml:space="preserve">38</w:t>
             </w:r>
           </w:fldSimple>
           <w:r>
@@ -5531,7 +5641,7 @@
                 <w:sz w:val="28"/>
                 <w:szCs w:val="28"/>
               </w:rPr>
-              <w:t xml:space="preserve">38</w:t>
+              <w:t xml:space="preserve">39</w:t>
             </w:r>
           </w:fldSimple>
           <w:r>
@@ -5586,7 +5696,7 @@
                 <w:sz w:val="28"/>
                 <w:szCs w:val="28"/>
               </w:rPr>
-              <w:t xml:space="preserve">38</w:t>
+              <w:t xml:space="preserve">39</w:t>
             </w:r>
           </w:fldSimple>
           <w:r>
@@ -5631,7 +5741,7 @@
               <w:rPr>
                 <w:color w:val="000000"/>
               </w:rPr>
-              <w:t xml:space="preserve">39</w:t>
+              <w:t xml:space="preserve">40</w:t>
             </w:r>
           </w:fldSimple>
           <w:r>
@@ -5686,7 +5796,7 @@
                 <w:sz w:val="28"/>
                 <w:szCs w:val="28"/>
               </w:rPr>
-              <w:t xml:space="preserve">40</w:t>
+              <w:t xml:space="preserve">41</w:t>
             </w:r>
           </w:fldSimple>
           <w:r>
@@ -5741,7 +5851,7 @@
                 <w:sz w:val="28"/>
                 <w:szCs w:val="28"/>
               </w:rPr>
-              <w:t xml:space="preserve">40</w:t>
+              <w:t xml:space="preserve">41</w:t>
             </w:r>
           </w:fldSimple>
           <w:r>
@@ -5796,7 +5906,7 @@
                 <w:sz w:val="28"/>
                 <w:szCs w:val="28"/>
               </w:rPr>
-              <w:t xml:space="preserve">41</w:t>
+              <w:t xml:space="preserve">42</w:t>
             </w:r>
           </w:fldSimple>
           <w:r>
@@ -5851,7 +5961,7 @@
                 <w:sz w:val="28"/>
                 <w:szCs w:val="28"/>
               </w:rPr>
-              <w:t xml:space="preserve">42</w:t>
+              <w:t xml:space="preserve">43</w:t>
             </w:r>
           </w:fldSimple>
           <w:r>
@@ -5906,7 +6016,7 @@
                 <w:sz w:val="28"/>
                 <w:szCs w:val="28"/>
               </w:rPr>
-              <w:t xml:space="preserve">42</w:t>
+              <w:t xml:space="preserve">43</w:t>
             </w:r>
           </w:fldSimple>
           <w:r>
@@ -5951,7 +6061,7 @@
               <w:rPr>
                 <w:color w:val="000000"/>
               </w:rPr>
-              <w:t xml:space="preserve">43</w:t>
+              <w:t xml:space="preserve">44</w:t>
             </w:r>
           </w:fldSimple>
           <w:r>
@@ -6006,7 +6116,7 @@
                 <w:sz w:val="28"/>
                 <w:szCs w:val="28"/>
               </w:rPr>
-              <w:t xml:space="preserve">43</w:t>
+              <w:t xml:space="preserve">44</w:t>
             </w:r>
           </w:fldSimple>
           <w:r>
@@ -6061,7 +6171,7 @@
                 <w:sz w:val="28"/>
                 <w:szCs w:val="28"/>
               </w:rPr>
-              <w:t xml:space="preserve">44</w:t>
+              <w:t xml:space="preserve">45</w:t>
             </w:r>
           </w:fldSimple>
           <w:r>
@@ -6116,7 +6226,7 @@
                 <w:sz w:val="28"/>
                 <w:szCs w:val="28"/>
               </w:rPr>
-              <w:t xml:space="preserve">46</w:t>
+              <w:t xml:space="preserve">47</w:t>
             </w:r>
           </w:fldSimple>
           <w:r>
@@ -6171,7 +6281,7 @@
                 <w:sz w:val="28"/>
                 <w:szCs w:val="28"/>
               </w:rPr>
-              <w:t xml:space="preserve">47</w:t>
+              <w:t xml:space="preserve">48</w:t>
             </w:r>
           </w:fldSimple>
           <w:r>
@@ -6226,7 +6336,7 @@
                 <w:sz w:val="28"/>
                 <w:szCs w:val="28"/>
               </w:rPr>
-              <w:t xml:space="preserve">47</w:t>
+              <w:t xml:space="preserve">48</w:t>
             </w:r>
           </w:fldSimple>
           <w:r>
@@ -6281,7 +6391,7 @@
                 <w:sz w:val="28"/>
                 <w:szCs w:val="28"/>
               </w:rPr>
-              <w:t xml:space="preserve">49</w:t>
+              <w:t xml:space="preserve">50</w:t>
             </w:r>
           </w:fldSimple>
           <w:r>
@@ -6326,7 +6436,7 @@
               <w:rPr>
                 <w:color w:val="000000"/>
               </w:rPr>
-              <w:t xml:space="preserve">49</w:t>
+              <w:t xml:space="preserve">50</w:t>
             </w:r>
           </w:fldSimple>
           <w:r>
@@ -6371,7 +6481,7 @@
               <w:rPr>
                 <w:color w:val="000000"/>
               </w:rPr>
-              <w:t xml:space="preserve">49</w:t>
+              <w:t xml:space="preserve">50</w:t>
             </w:r>
           </w:fldSimple>
           <w:r>
@@ -6427,7 +6537,7 @@
                 <w:sz w:val="28"/>
                 <w:szCs w:val="28"/>
               </w:rPr>
-              <w:t xml:space="preserve">50</w:t>
+              <w:t xml:space="preserve">51</w:t>
             </w:r>
           </w:fldSimple>
           <w:r>
@@ -6474,7 +6584,7 @@
               <w:rPr>
                 <w:color w:val="000000"/>
               </w:rPr>
-              <w:t xml:space="preserve">50</w:t>
+              <w:t xml:space="preserve">51</w:t>
             </w:r>
           </w:fldSimple>
           <w:r>
@@ -6529,7 +6639,7 @@
                 <w:sz w:val="28"/>
                 <w:szCs w:val="28"/>
               </w:rPr>
-              <w:t xml:space="preserve">50</w:t>
+              <w:t xml:space="preserve">51</w:t>
             </w:r>
           </w:fldSimple>
           <w:r>
@@ -6584,7 +6694,7 @@
                 <w:sz w:val="28"/>
                 <w:szCs w:val="28"/>
               </w:rPr>
-              <w:t xml:space="preserve">51</w:t>
+              <w:t xml:space="preserve">52</w:t>
             </w:r>
           </w:fldSimple>
           <w:r>
@@ -6639,7 +6749,7 @@
                 <w:sz w:val="28"/>
                 <w:szCs w:val="28"/>
               </w:rPr>
-              <w:t xml:space="preserve">52</w:t>
+              <w:t xml:space="preserve">53</w:t>
             </w:r>
           </w:fldSimple>
           <w:r>
@@ -6684,7 +6794,7 @@
               <w:rPr>
                 <w:color w:val="000000"/>
               </w:rPr>
-              <w:t xml:space="preserve">53</w:t>
+              <w:t xml:space="preserve">54</w:t>
             </w:r>
           </w:fldSimple>
           <w:r>
@@ -6729,7 +6839,7 @@
               <w:rPr>
                 <w:color w:val="000000"/>
               </w:rPr>
-              <w:t xml:space="preserve">54</w:t>
+              <w:t xml:space="preserve">55</w:t>
             </w:r>
           </w:fldSimple>
           <w:r>
@@ -6774,7 +6884,7 @@
               <w:rPr>
                 <w:color w:val="000000"/>
               </w:rPr>
-              <w:t xml:space="preserve">55</w:t>
+              <w:t xml:space="preserve">56</w:t>
             </w:r>
           </w:fldSimple>
           <w:r>
@@ -6819,7 +6929,7 @@
               <w:rPr>
                 <w:color w:val="000000"/>
               </w:rPr>
-              <w:t xml:space="preserve">55</w:t>
+              <w:t xml:space="preserve">56</w:t>
             </w:r>
           </w:fldSimple>
           <w:r>
@@ -6864,7 +6974,7 @@
               <w:rPr>
                 <w:color w:val="000000"/>
               </w:rPr>
-              <w:t xml:space="preserve">56</w:t>
+              <w:t xml:space="preserve">57</w:t>
             </w:r>
           </w:fldSimple>
           <w:r>
@@ -6909,7 +7019,7 @@
               <w:rPr>
                 <w:color w:val="000000"/>
               </w:rPr>
-              <w:t xml:space="preserve">56</w:t>
+              <w:t xml:space="preserve">57</w:t>
             </w:r>
           </w:fldSimple>
           <w:r>
@@ -6964,7 +7074,7 @@
                 <w:sz w:val="28"/>
                 <w:szCs w:val="28"/>
               </w:rPr>
-              <w:t xml:space="preserve">57</w:t>
+              <w:t xml:space="preserve">58</w:t>
             </w:r>
           </w:fldSimple>
           <w:r>
@@ -7019,7 +7129,7 @@
                 <w:sz w:val="28"/>
                 <w:szCs w:val="28"/>
               </w:rPr>
-              <w:t xml:space="preserve">57</w:t>
+              <w:t xml:space="preserve">58</w:t>
             </w:r>
           </w:fldSimple>
           <w:r>
@@ -7074,7 +7184,7 @@
                 <w:sz w:val="28"/>
                 <w:szCs w:val="28"/>
               </w:rPr>
-              <w:t xml:space="preserve">58</w:t>
+              <w:t xml:space="preserve">59</w:t>
             </w:r>
           </w:fldSimple>
           <w:r>
@@ -7119,7 +7229,7 @@
               <w:rPr>
                 <w:color w:val="000000"/>
               </w:rPr>
-              <w:t xml:space="preserve">58</w:t>
+              <w:t xml:space="preserve">59</w:t>
             </w:r>
           </w:fldSimple>
           <w:r>
@@ -7175,7 +7285,7 @@
                 <w:sz w:val="28"/>
                 <w:szCs w:val="28"/>
               </w:rPr>
-              <w:t xml:space="preserve">59</w:t>
+              <w:t xml:space="preserve">60</w:t>
             </w:r>
           </w:fldSimple>
           <w:r>
@@ -7233,7 +7343,7 @@
                 <w:sz w:val="28"/>
                 <w:szCs w:val="28"/>
               </w:rPr>
-              <w:t xml:space="preserve">60</w:t>
+              <w:t xml:space="preserve">61</w:t>
             </w:r>
           </w:fldSimple>
           <w:r>
@@ -7313,6 +7423,45 @@
             <w:color w:val="000000"/>
             <w:sz w:val="28"/>
           </w:rPr>
+          <w:t xml:space="preserve">12</w:t>
+        </w:r>
+      </w:fldSimple>
+      <w:r/>
+      <w:r/>
+    </w:p>
+    <w:p>
+      <w:pPr>
+        <w:pBdr/>
+        <w:tabs>
+          <w:tab w:val="right" w:leader="dot" w:pos="8856"/>
+        </w:tabs>
+        <w:spacing w:after="0" w:before="0" w:line="360" w:lineRule="auto"/>
+        <w:ind/>
+        <w:jc w:val="left"/>
+        <w:rPr/>
+      </w:pPr>
+      <w:r/>
+      <w:bookmarkStart w:id="2103" w:name="KhanhListFig_03"/>
+      <w:r>
+        <w:rPr>
+          <w:rFonts w:ascii="Times New Roman" w:hAnsi="Times New Roman" w:eastAsia="Times New Roman" w:cs="Times New Roman"/>
+          <w:color w:val="000000"/>
+          <w:sz w:val="28"/>
+        </w:rPr>
+        <w:t xml:space="preserve">Hình 1.2. Khu trưng bày nền tảng KIMQ tại DCCI Summit 2024</w:t>
+      </w:r>
+      <w:r>
+        <w:tab/>
+      </w:r>
+      <w:bookmarkEnd w:id="2103"/>
+      <w:r/>
+      <w:fldSimple w:instr="PAGEREF KhanhFig_01 \h ">
+        <w:r>
+          <w:rPr>
+            <w:rFonts w:ascii="Times New Roman" w:hAnsi="Times New Roman" w:eastAsia="Times New Roman"/>
+            <w:color w:val="000000"/>
+            <w:sz w:val="28"/>
+          </w:rPr>
           <w:t xml:space="preserve">13</w:t>
         </w:r>
       </w:fldSimple>
@@ -7331,6 +7480,45 @@
         <w:rPr/>
       </w:pPr>
       <w:r/>
+      <w:bookmarkStart w:id="3021" w:name="KhanhListFig_12"/>
+      <w:r>
+        <w:rPr>
+          <w:rFonts w:ascii="Times New Roman" w:hAnsi="Times New Roman" w:eastAsia="Times New Roman" w:cs="Times New Roman"/>
+          <w:color w:val="000000"/>
+          <w:sz w:val="28"/>
+        </w:rPr>
+        <w:t xml:space="preserve">Hình 1.3. Trao giải Nhì tại vòng chung kết QVIC 2024</w:t>
+      </w:r>
+      <w:r>
+        <w:tab/>
+      </w:r>
+      <w:bookmarkEnd w:id="3021"/>
+      <w:r/>
+      <w:fldSimple w:instr="PAGEREF KhanhFig_14 \h ">
+        <w:r>
+          <w:rPr>
+            <w:rFonts w:ascii="Times New Roman" w:hAnsi="Times New Roman" w:eastAsia="Times New Roman"/>
+            <w:color w:val="000000"/>
+            <w:sz w:val="28"/>
+          </w:rPr>
+          <w:t xml:space="preserve">14</w:t>
+        </w:r>
+      </w:fldSimple>
+      <w:r/>
+      <w:r/>
+    </w:p>
+    <w:p>
+      <w:pPr>
+        <w:pBdr/>
+        <w:tabs>
+          <w:tab w:val="right" w:leader="dot" w:pos="8856"/>
+        </w:tabs>
+        <w:spacing w:after="0" w:before="0" w:line="360" w:lineRule="auto"/>
+        <w:ind/>
+        <w:jc w:val="left"/>
+        <w:rPr/>
+      </w:pPr>
+      <w:r/>
       <w:bookmarkStart w:id="2101" w:name="KhanhListFig_01"/>
       <w:r>
         <w:rPr>
@@ -7338,7 +7526,7 @@
           <w:color w:val="000000"/>
           <w:sz w:val="28"/>
         </w:rPr>
-        <w:t xml:space="preserve">Hình 1.2. Mô-đun máy tính KIMQ 5430</w:t>
+        <w:t xml:space="preserve">Hình 1.4. Mô-đun máy tính KIMQ 5430</w:t>
       </w:r>
       <w:r>
         <w:tab/>
@@ -7346,6 +7534,343 @@
       <w:bookmarkEnd w:id="2101"/>
       <w:r/>
       <w:fldSimple w:instr="PAGEREF KhanhFig_06 \h ">
+        <w:r>
+          <w:rPr>
+            <w:rFonts w:ascii="Times New Roman" w:hAnsi="Times New Roman" w:eastAsia="Times New Roman"/>
+            <w:color w:val="000000"/>
+            <w:sz w:val="28"/>
+          </w:rPr>
+          <w:t xml:space="preserve">21</w:t>
+        </w:r>
+      </w:fldSimple>
+      <w:r/>
+      <w:r/>
+    </w:p>
+    <w:p>
+      <w:pPr>
+        <w:pBdr/>
+        <w:tabs>
+          <w:tab w:val="right" w:leader="dot" w:pos="8856"/>
+        </w:tabs>
+        <w:spacing w:after="0" w:before="0" w:line="360" w:lineRule="auto"/>
+        <w:ind/>
+        <w:jc w:val="left"/>
+        <w:rPr/>
+      </w:pPr>
+      <w:r/>
+      <w:bookmarkStart w:id="3010" w:name="KhanhListFig_08"/>
+      <w:r>
+        <w:rPr>
+          <w:rFonts w:ascii="Times New Roman" w:hAnsi="Times New Roman" w:eastAsia="Times New Roman" w:cs="Times New Roman"/>
+          <w:color w:val="000000"/>
+          <w:sz w:val="28"/>
+        </w:rPr>
+        <w:t xml:space="preserve">Hình 1.5. Sơ đồ khối mô-đun máy tính KIMQ 8550</w:t>
+      </w:r>
+      <w:r>
+        <w:tab/>
+      </w:r>
+      <w:bookmarkEnd w:id="3010"/>
+      <w:r/>
+      <w:fldSimple w:instr="PAGEREF KhanhFig_08 \h ">
+        <w:r>
+          <w:rPr>
+            <w:rFonts w:ascii="Times New Roman" w:hAnsi="Times New Roman" w:eastAsia="Times New Roman"/>
+            <w:color w:val="000000"/>
+            <w:sz w:val="28"/>
+          </w:rPr>
+          <w:t xml:space="preserve">22</w:t>
+        </w:r>
+      </w:fldSimple>
+      <w:r/>
+      <w:r/>
+    </w:p>
+    <w:p>
+      <w:pPr>
+        <w:pBdr/>
+        <w:tabs>
+          <w:tab w:val="right" w:leader="dot" w:pos="8856"/>
+        </w:tabs>
+        <w:spacing w:after="0" w:before="0" w:line="360" w:lineRule="auto"/>
+        <w:ind/>
+        <w:jc w:val="left"/>
+        <w:rPr/>
+      </w:pPr>
+      <w:r/>
+      <w:bookmarkStart w:id="2102" w:name="KhanhListFig_02"/>
+      <w:r>
+        <w:rPr>
+          <w:rFonts w:ascii="Times New Roman" w:hAnsi="Times New Roman" w:eastAsia="Times New Roman" w:cs="Times New Roman"/>
+          <w:color w:val="000000"/>
+          <w:sz w:val="28"/>
+        </w:rPr>
+        <w:t xml:space="preserve">Hình 1.6. Máy tính biên AI Box 6490</w:t>
+      </w:r>
+      <w:r>
+        <w:tab/>
+      </w:r>
+      <w:bookmarkEnd w:id="2102"/>
+      <w:r/>
+      <w:fldSimple w:instr="PAGEREF KhanhFig_07 \h ">
+        <w:r>
+          <w:rPr>
+            <w:rFonts w:ascii="Times New Roman" w:hAnsi="Times New Roman" w:eastAsia="Times New Roman"/>
+            <w:color w:val="000000"/>
+            <w:sz w:val="28"/>
+          </w:rPr>
+          <w:t xml:space="preserve">23</w:t>
+        </w:r>
+      </w:fldSimple>
+      <w:r/>
+      <w:r/>
+    </w:p>
+    <w:p>
+      <w:pPr>
+        <w:pBdr/>
+        <w:tabs>
+          <w:tab w:val="right" w:leader="dot" w:pos="8856"/>
+        </w:tabs>
+        <w:spacing w:after="0" w:before="0" w:line="360" w:lineRule="auto"/>
+        <w:ind/>
+        <w:jc w:val="left"/>
+        <w:rPr/>
+      </w:pPr>
+      <w:r/>
+      <w:bookmarkStart w:id="2104" w:name="KhanhListFig_04"/>
+      <w:r>
+        <w:rPr>
+          <w:rFonts w:ascii="Times New Roman" w:hAnsi="Times New Roman" w:eastAsia="Times New Roman" w:cs="Times New Roman"/>
+          <w:color w:val="000000"/>
+          <w:sz w:val="28"/>
+        </w:rPr>
+        <w:t xml:space="preserve">Hình 2.1. Quan hệ khái quát giữa hệ điều hành, BSP và phần cứng nhúng</w:t>
+      </w:r>
+      <w:r>
+        <w:tab/>
+      </w:r>
+      <w:bookmarkEnd w:id="2104"/>
+      <w:r/>
+      <w:fldSimple w:instr="PAGEREF KhanhFig_09 \h ">
+        <w:r>
+          <w:rPr>
+            <w:rFonts w:ascii="Times New Roman" w:hAnsi="Times New Roman" w:eastAsia="Times New Roman"/>
+            <w:color w:val="000000"/>
+            <w:sz w:val="28"/>
+          </w:rPr>
+          <w:t xml:space="preserve">32</w:t>
+        </w:r>
+      </w:fldSimple>
+      <w:r/>
+      <w:r/>
+    </w:p>
+    <w:p>
+      <w:pPr>
+        <w:pBdr/>
+        <w:tabs>
+          <w:tab w:val="right" w:leader="dot" w:pos="8856"/>
+        </w:tabs>
+        <w:spacing w:after="0" w:before="0" w:line="360" w:lineRule="auto"/>
+        <w:ind/>
+        <w:jc w:val="left"/>
+        <w:rPr/>
+      </w:pPr>
+      <w:r/>
+      <w:bookmarkStart w:id="2105" w:name="KhanhListFig_05"/>
+      <w:r>
+        <w:rPr>
+          <w:rFonts w:ascii="Times New Roman" w:hAnsi="Times New Roman" w:eastAsia="Times New Roman" w:cs="Times New Roman"/>
+          <w:color w:val="000000"/>
+          <w:sz w:val="28"/>
+        </w:rPr>
+        <w:t xml:space="preserve">Hình 2.2. Chuỗi từ mã nguồn đến kiểm tra phần mềm trên thiết bị</w:t>
+      </w:r>
+      <w:r>
+        <w:tab/>
+      </w:r>
+      <w:bookmarkEnd w:id="2105"/>
+      <w:r/>
+      <w:fldSimple w:instr="PAGEREF KhanhFig_10 \h ">
+        <w:r>
+          <w:rPr>
+            <w:rFonts w:ascii="Times New Roman" w:hAnsi="Times New Roman" w:eastAsia="Times New Roman"/>
+            <w:color w:val="000000"/>
+            <w:sz w:val="28"/>
+          </w:rPr>
+          <w:t xml:space="preserve">33</w:t>
+        </w:r>
+      </w:fldSimple>
+      <w:r/>
+      <w:r/>
+    </w:p>
+    <w:p>
+      <w:pPr>
+        <w:pBdr/>
+        <w:tabs>
+          <w:tab w:val="right" w:leader="dot" w:pos="8856"/>
+        </w:tabs>
+        <w:spacing w:after="0" w:before="0" w:line="360" w:lineRule="auto"/>
+        <w:ind/>
+        <w:jc w:val="left"/>
+        <w:rPr/>
+      </w:pPr>
+      <w:r/>
+      <w:bookmarkStart w:id="2106" w:name="KhanhListFig_06"/>
+      <w:r>
+        <w:rPr>
+          <w:rFonts w:ascii="Times New Roman" w:hAnsi="Times New Roman" w:eastAsia="Times New Roman" w:cs="Times New Roman"/>
+          <w:color w:val="000000"/>
+          <w:sz w:val="28"/>
+        </w:rPr>
+        <w:t xml:space="preserve">Hình 2.3. Luồng kết nối mạng qua Wi-Fi hoặc mạng di động</w:t>
+      </w:r>
+      <w:r>
+        <w:tab/>
+      </w:r>
+      <w:bookmarkEnd w:id="2106"/>
+      <w:r/>
+      <w:fldSimple w:instr="PAGEREF KhanhFig_11 \h ">
+        <w:r>
+          <w:rPr>
+            <w:rFonts w:ascii="Times New Roman" w:hAnsi="Times New Roman" w:eastAsia="Times New Roman"/>
+            <w:color w:val="000000"/>
+            <w:sz w:val="28"/>
+          </w:rPr>
+          <w:t xml:space="preserve">40</w:t>
+        </w:r>
+      </w:fldSimple>
+      <w:r/>
+      <w:r/>
+    </w:p>
+    <w:p>
+      <w:pPr>
+        <w:pBdr/>
+        <w:tabs>
+          <w:tab w:val="right" w:leader="dot" w:pos="8856"/>
+        </w:tabs>
+        <w:spacing w:after="0" w:before="0" w:line="360" w:lineRule="auto"/>
+        <w:ind/>
+        <w:jc w:val="left"/>
+        <w:rPr/>
+      </w:pPr>
+      <w:r/>
+      <w:bookmarkStart w:id="2107" w:name="KhanhListFig_07"/>
+      <w:r>
+        <w:rPr>
+          <w:rFonts w:ascii="Times New Roman" w:hAnsi="Times New Roman" w:eastAsia="Times New Roman" w:cs="Times New Roman"/>
+          <w:color w:val="000000"/>
+          <w:sz w:val="28"/>
+        </w:rPr>
+        <w:t xml:space="preserve">Hình 2.4. Vòng lặp phân tích, thử nghiệm và cập nhật giả thuyết</w:t>
+      </w:r>
+      <w:r>
+        <w:tab/>
+      </w:r>
+      <w:bookmarkEnd w:id="2107"/>
+      <w:r/>
+      <w:fldSimple w:instr="PAGEREF KhanhFig_12 \h ">
+        <w:r>
+          <w:rPr>
+            <w:rFonts w:ascii="Times New Roman" w:hAnsi="Times New Roman" w:eastAsia="Times New Roman"/>
+            <w:color w:val="000000"/>
+            <w:sz w:val="28"/>
+          </w:rPr>
+          <w:t xml:space="preserve">47</w:t>
+        </w:r>
+      </w:fldSimple>
+      <w:r/>
+      <w:r/>
+    </w:p>
+    <w:p>
+      <w:pPr>
+        <w:pStyle w:val="941"/>
+        <w:keepNext w:val="true"/>
+        <w:pBdr/>
+        <w:spacing w:after="0" w:before="0" w:line="360" w:lineRule="auto"/>
+        <w:ind/>
+        <w:jc w:val="center"/>
+        <w:rPr/>
+      </w:pPr>
+      <w:r/>
+      <w:bookmarkStart w:id="86" w:name="KhanhHead_004"/>
+      <w:r>
+        <w:rPr>
+          <w:rFonts w:ascii="Times New Roman" w:hAnsi="Times New Roman" w:eastAsia="Times New Roman" w:cs="Times New Roman"/>
+          <w:b/>
+          <w:color w:val="000000"/>
+          <w:sz w:val="28"/>
+        </w:rPr>
+        <w:t xml:space="preserve">DANH MỤC BẢNG</w:t>
+      </w:r>
+      <w:bookmarkEnd w:id="86"/>
+      <w:r/>
+      <w:r/>
+    </w:p>
+    <w:p>
+      <w:pPr>
+        <w:pBdr/>
+        <w:tabs>
+          <w:tab w:val="right" w:leader="dot" w:pos="8856"/>
+        </w:tabs>
+        <w:spacing w:after="0" w:before="0" w:line="360" w:lineRule="auto"/>
+        <w:ind/>
+        <w:jc w:val="left"/>
+        <w:rPr/>
+      </w:pPr>
+      <w:r/>
+      <w:bookmarkStart w:id="2301" w:name="KhanhListTbl_01"/>
+      <w:r>
+        <w:rPr>
+          <w:rFonts w:ascii="Times New Roman" w:hAnsi="Times New Roman" w:eastAsia="Times New Roman" w:cs="Times New Roman"/>
+          <w:color w:val="000000"/>
+          <w:sz w:val="28"/>
+        </w:rPr>
+        <w:t xml:space="preserve">Bảng 1.1. Năng lực HSPTEK công bố và liên hệ kỹ thuật</w:t>
+      </w:r>
+      <w:r>
+        <w:tab/>
+      </w:r>
+      <w:bookmarkEnd w:id="2301"/>
+      <w:r/>
+      <w:fldSimple w:instr="PAGEREF KhanhTable13 \h ">
+        <w:r>
+          <w:rPr>
+            <w:rFonts w:ascii="Times New Roman" w:hAnsi="Times New Roman" w:eastAsia="Times New Roman"/>
+            <w:color w:val="000000"/>
+            <w:sz w:val="28"/>
+          </w:rPr>
+          <w:t xml:space="preserve">17</w:t>
+        </w:r>
+      </w:fldSimple>
+      <w:r/>
+      <w:r/>
+    </w:p>
+    <w:p>
+      <w:pPr>
+        <w:pBdr/>
+        <w:tabs>
+          <w:tab w:val="right" w:leader="dot" w:pos="8856"/>
+        </w:tabs>
+        <w:spacing w:after="0" w:before="0" w:line="360" w:lineRule="auto"/>
+        <w:ind/>
+        <w:jc w:val="left"/>
+        <w:rPr/>
+      </w:pPr>
+      <w:r/>
+      <w:bookmarkStart w:id="2301" w:name="KhanhListTbl_07"/>
+      <w:r>
+        <w:rPr>
+          <w:rFonts w:ascii="Times New Roman" w:hAnsi="Times New Roman" w:eastAsia="Times New Roman" w:cs="Times New Roman"/>
+          <w:color w:val="000000"/>
+          <w:sz w:val="28"/>
+        </w:rPr>
+        <w:t xml:space="preserve">Bảng 1.2. Các nhóm sản phẩm và nền tảng HSPTEK công bố</w:t>
+      </w:r>
+      <w:r>
+        <w:tab/>
+      </w:r>
+      <w:bookmarkEnd w:id="2301"/>
+      <w:r/>
+      <w:fldSimple w:instr="PAGEREF KhanhTbl_04 \h ">
         <w:r>
           <w:rPr>
             <w:rFonts w:ascii="Times New Roman" w:hAnsi="Times New Roman" w:eastAsia="Times New Roman"/>
@@ -7370,99 +7895,21 @@
         <w:rPr/>
       </w:pPr>
       <w:r/>
-      <w:bookmarkStart w:id="3010" w:name="KhanhListFig_08"/>
-      <w:r>
-        <w:rPr>
-          <w:rFonts w:ascii="Times New Roman" w:hAnsi="Times New Roman" w:eastAsia="Times New Roman" w:cs="Times New Roman"/>
-          <w:color w:val="000000"/>
-          <w:sz w:val="28"/>
-        </w:rPr>
-        <w:t xml:space="preserve">Hình 1.3. Sơ đồ khối mô-đun máy tính KIMQ 8550</w:t>
+      <w:bookmarkStart w:id="2302" w:name="KhanhListTbl_02"/>
+      <w:r>
+        <w:rPr>
+          <w:rFonts w:ascii="Times New Roman" w:hAnsi="Times New Roman" w:eastAsia="Times New Roman" w:cs="Times New Roman"/>
+          <w:color w:val="000000"/>
+          <w:sz w:val="28"/>
+        </w:rPr>
+        <w:t xml:space="preserve">Bảng 1.3. Một số sự kiện giới thiệu nền tảng KIMQ</w:t>
       </w:r>
       <w:r>
         <w:tab/>
       </w:r>
-      <w:bookmarkEnd w:id="3010"/>
-      <w:r/>
-      <w:fldSimple w:instr="PAGEREF KhanhFig_08 \h ">
-        <w:r>
-          <w:rPr>
-            <w:rFonts w:ascii="Times New Roman" w:hAnsi="Times New Roman" w:eastAsia="Times New Roman"/>
-            <w:color w:val="000000"/>
-            <w:sz w:val="28"/>
-          </w:rPr>
-          <w:t xml:space="preserve">21</w:t>
-        </w:r>
-      </w:fldSimple>
-      <w:r/>
-      <w:r/>
-    </w:p>
-    <w:p>
-      <w:pPr>
-        <w:pBdr/>
-        <w:tabs>
-          <w:tab w:val="right" w:leader="dot" w:pos="8856"/>
-        </w:tabs>
-        <w:spacing w:after="0" w:before="0" w:line="360" w:lineRule="auto"/>
-        <w:ind/>
-        <w:jc w:val="left"/>
-        <w:rPr/>
-      </w:pPr>
-      <w:r/>
-      <w:bookmarkStart w:id="2102" w:name="KhanhListFig_02"/>
-      <w:r>
-        <w:rPr>
-          <w:rFonts w:ascii="Times New Roman" w:hAnsi="Times New Roman" w:eastAsia="Times New Roman" w:cs="Times New Roman"/>
-          <w:color w:val="000000"/>
-          <w:sz w:val="28"/>
-        </w:rPr>
-        <w:t xml:space="preserve">Hình 1.4. Máy tính biên AI Box 6490</w:t>
-      </w:r>
-      <w:r>
-        <w:tab/>
-      </w:r>
-      <w:bookmarkEnd w:id="2102"/>
-      <w:r/>
-      <w:fldSimple w:instr="PAGEREF KhanhFig_07 \h ">
-        <w:r>
-          <w:rPr>
-            <w:rFonts w:ascii="Times New Roman" w:hAnsi="Times New Roman" w:eastAsia="Times New Roman"/>
-            <w:color w:val="000000"/>
-            <w:sz w:val="28"/>
-          </w:rPr>
-          <w:t xml:space="preserve">22</w:t>
-        </w:r>
-      </w:fldSimple>
-      <w:r/>
-      <w:r/>
-    </w:p>
-    <w:p>
-      <w:pPr>
-        <w:pBdr/>
-        <w:tabs>
-          <w:tab w:val="right" w:leader="dot" w:pos="8856"/>
-        </w:tabs>
-        <w:spacing w:after="0" w:before="0" w:line="360" w:lineRule="auto"/>
-        <w:ind/>
-        <w:jc w:val="left"/>
-        <w:rPr/>
-      </w:pPr>
-      <w:r/>
-      <w:bookmarkStart w:id="2103" w:name="KhanhListFig_03"/>
-      <w:r>
-        <w:rPr>
-          <w:rFonts w:ascii="Times New Roman" w:hAnsi="Times New Roman" w:eastAsia="Times New Roman" w:cs="Times New Roman"/>
-          <w:color w:val="000000"/>
-          <w:sz w:val="28"/>
-        </w:rPr>
-        <w:t xml:space="preserve">Hình 1.5. KIMQ được giới thiệu tại DCCI Summit 2024</w:t>
-      </w:r>
-      <w:r>
-        <w:tab/>
-      </w:r>
-      <w:bookmarkEnd w:id="2103"/>
-      <w:r/>
-      <w:fldSimple w:instr="PAGEREF KhanhFig_01 \h ">
+      <w:bookmarkEnd w:id="2302"/>
+      <w:r/>
+      <w:fldSimple w:instr="PAGEREF KhanhTbl_05 \h ">
         <w:r>
           <w:rPr>
             <w:rFonts w:ascii="Times New Roman" w:hAnsi="Times New Roman" w:eastAsia="Times New Roman"/>
@@ -7487,28 +7934,28 @@
         <w:rPr/>
       </w:pPr>
       <w:r/>
-      <w:bookmarkStart w:id="2104" w:name="KhanhListFig_04"/>
-      <w:r>
-        <w:rPr>
-          <w:rFonts w:ascii="Times New Roman" w:hAnsi="Times New Roman" w:eastAsia="Times New Roman" w:cs="Times New Roman"/>
-          <w:color w:val="000000"/>
-          <w:sz w:val="28"/>
-        </w:rPr>
-        <w:t xml:space="preserve">Hình 2.1. Quan hệ khái quát giữa hệ điều hành, BSP và phần cứng nhúng</w:t>
+      <w:bookmarkStart w:id="2303" w:name="KhanhListTbl_03"/>
+      <w:r>
+        <w:rPr>
+          <w:rFonts w:ascii="Times New Roman" w:hAnsi="Times New Roman" w:eastAsia="Times New Roman" w:cs="Times New Roman"/>
+          <w:color w:val="000000"/>
+          <w:sz w:val="28"/>
+        </w:rPr>
+        <w:t xml:space="preserve">Bảng 2.1. Đối chiếu khái quát mô hình OSI và TCP/IP</w:t>
       </w:r>
       <w:r>
         <w:tab/>
       </w:r>
-      <w:bookmarkEnd w:id="2104"/>
-      <w:r/>
-      <w:fldSimple w:instr="PAGEREF KhanhFig_09 \h ">
+      <w:bookmarkEnd w:id="2303"/>
+      <w:r/>
+      <w:fldSimple w:instr="PAGEREF KhanhTbl_06 \h ">
         <w:r>
           <w:rPr>
             <w:rFonts w:ascii="Times New Roman" w:hAnsi="Times New Roman" w:eastAsia="Times New Roman"/>
             <w:color w:val="000000"/>
             <w:sz w:val="28"/>
           </w:rPr>
-          <w:t xml:space="preserve">31</w:t>
+          <w:t xml:space="preserve">36</w:t>
         </w:r>
       </w:fldSimple>
       <w:r/>
@@ -7526,99 +7973,21 @@
         <w:rPr/>
       </w:pPr>
       <w:r/>
-      <w:bookmarkStart w:id="2105" w:name="KhanhListFig_05"/>
-      <w:r>
-        <w:rPr>
-          <w:rFonts w:ascii="Times New Roman" w:hAnsi="Times New Roman" w:eastAsia="Times New Roman" w:cs="Times New Roman"/>
-          <w:color w:val="000000"/>
-          <w:sz w:val="28"/>
-        </w:rPr>
-        <w:t xml:space="preserve">Hình 2.2. Chuỗi từ mã nguồn đến kiểm tra phần mềm trên thiết bị</w:t>
+      <w:bookmarkStart w:id="2304" w:name="KhanhListTbl_04"/>
+      <w:r>
+        <w:rPr>
+          <w:rFonts w:ascii="Times New Roman" w:hAnsi="Times New Roman" w:eastAsia="Times New Roman" w:cs="Times New Roman"/>
+          <w:color w:val="000000"/>
+          <w:sz w:val="28"/>
+        </w:rPr>
+        <w:t xml:space="preserve">Bảng 2.2. Các điểm kiểm tra khái quát trong chuỗi kết nối mạng</w:t>
       </w:r>
       <w:r>
         <w:tab/>
       </w:r>
-      <w:bookmarkEnd w:id="2105"/>
-      <w:r/>
-      <w:fldSimple w:instr="PAGEREF KhanhFig_10 \h ">
-        <w:r>
-          <w:rPr>
-            <w:rFonts w:ascii="Times New Roman" w:hAnsi="Times New Roman" w:eastAsia="Times New Roman"/>
-            <w:color w:val="000000"/>
-            <w:sz w:val="28"/>
-          </w:rPr>
-          <w:t xml:space="preserve">32</w:t>
-        </w:r>
-      </w:fldSimple>
-      <w:r/>
-      <w:r/>
-    </w:p>
-    <w:p>
-      <w:pPr>
-        <w:pBdr/>
-        <w:tabs>
-          <w:tab w:val="right" w:leader="dot" w:pos="8856"/>
-        </w:tabs>
-        <w:spacing w:after="0" w:before="0" w:line="360" w:lineRule="auto"/>
-        <w:ind/>
-        <w:jc w:val="left"/>
-        <w:rPr/>
-      </w:pPr>
-      <w:r/>
-      <w:bookmarkStart w:id="2106" w:name="KhanhListFig_06"/>
-      <w:r>
-        <w:rPr>
-          <w:rFonts w:ascii="Times New Roman" w:hAnsi="Times New Roman" w:eastAsia="Times New Roman" w:cs="Times New Roman"/>
-          <w:color w:val="000000"/>
-          <w:sz w:val="28"/>
-        </w:rPr>
-        <w:t xml:space="preserve">Hình 2.3. Luồng kết nối mạng qua Wi-Fi hoặc mạng di động</w:t>
-      </w:r>
-      <w:r>
-        <w:tab/>
-      </w:r>
-      <w:bookmarkEnd w:id="2106"/>
-      <w:r/>
-      <w:fldSimple w:instr="PAGEREF KhanhFig_11 \h ">
-        <w:r>
-          <w:rPr>
-            <w:rFonts w:ascii="Times New Roman" w:hAnsi="Times New Roman" w:eastAsia="Times New Roman"/>
-            <w:color w:val="000000"/>
-            <w:sz w:val="28"/>
-          </w:rPr>
-          <w:t xml:space="preserve">39</w:t>
-        </w:r>
-      </w:fldSimple>
-      <w:r/>
-      <w:r/>
-    </w:p>
-    <w:p>
-      <w:pPr>
-        <w:pBdr/>
-        <w:tabs>
-          <w:tab w:val="right" w:leader="dot" w:pos="8856"/>
-        </w:tabs>
-        <w:spacing w:after="0" w:before="0" w:line="360" w:lineRule="auto"/>
-        <w:ind/>
-        <w:jc w:val="left"/>
-        <w:rPr/>
-      </w:pPr>
-      <w:r/>
-      <w:bookmarkStart w:id="2107" w:name="KhanhListFig_07"/>
-      <w:r>
-        <w:rPr>
-          <w:rFonts w:ascii="Times New Roman" w:hAnsi="Times New Roman" w:eastAsia="Times New Roman" w:cs="Times New Roman"/>
-          <w:color w:val="000000"/>
-          <w:sz w:val="28"/>
-        </w:rPr>
-        <w:t xml:space="preserve">Hình 2.4. Vòng lặp phân tích, thử nghiệm và cập nhật giả thuyết</w:t>
-      </w:r>
-      <w:r>
-        <w:tab/>
-      </w:r>
-      <w:bookmarkEnd w:id="2107"/>
-      <w:r/>
-      <w:fldSimple w:instr="PAGEREF KhanhFig_12 \h ">
+      <w:bookmarkEnd w:id="2304"/>
+      <w:r/>
+      <w:fldSimple w:instr="PAGEREF KhanhTbl_07 \h ">
         <w:r>
           <w:rPr>
             <w:rFonts w:ascii="Times New Roman" w:hAnsi="Times New Roman" w:eastAsia="Times New Roman"/>
@@ -7633,226 +8002,6 @@
     </w:p>
     <w:p>
       <w:pPr>
-        <w:pStyle w:val="941"/>
-        <w:keepNext w:val="true"/>
-        <w:pBdr/>
-        <w:spacing w:after="0" w:before="0" w:line="360" w:lineRule="auto"/>
-        <w:ind/>
-        <w:jc w:val="center"/>
-        <w:rPr/>
-      </w:pPr>
-      <w:r/>
-      <w:bookmarkStart w:id="86" w:name="KhanhHead_004"/>
-      <w:r>
-        <w:rPr>
-          <w:rFonts w:ascii="Times New Roman" w:hAnsi="Times New Roman" w:eastAsia="Times New Roman" w:cs="Times New Roman"/>
-          <w:b/>
-          <w:color w:val="000000"/>
-          <w:sz w:val="28"/>
-        </w:rPr>
-        <w:t xml:space="preserve">DANH MỤC BẢNG</w:t>
-      </w:r>
-      <w:bookmarkEnd w:id="86"/>
-      <w:r/>
-      <w:r/>
-    </w:p>
-    <w:p>
-      <w:pPr>
-        <w:pBdr/>
-        <w:tabs>
-          <w:tab w:val="right" w:leader="dot" w:pos="8856"/>
-        </w:tabs>
-        <w:spacing w:after="0" w:before="0" w:line="360" w:lineRule="auto"/>
-        <w:ind/>
-        <w:jc w:val="left"/>
-        <w:rPr/>
-      </w:pPr>
-      <w:r/>
-      <w:bookmarkStart w:id="2301" w:name="KhanhListTbl_01"/>
-      <w:r>
-        <w:rPr>
-          <w:rFonts w:ascii="Times New Roman" w:hAnsi="Times New Roman" w:eastAsia="Times New Roman" w:cs="Times New Roman"/>
-          <w:color w:val="000000"/>
-          <w:sz w:val="28"/>
-        </w:rPr>
-        <w:t xml:space="preserve">Bảng 1.1. Năng lực HSPTEK công bố và liên hệ kỹ thuật</w:t>
-      </w:r>
-      <w:r>
-        <w:tab/>
-      </w:r>
-      <w:bookmarkEnd w:id="2301"/>
-      <w:r/>
-      <w:fldSimple w:instr="PAGEREF KhanhTable13 \h ">
-        <w:r>
-          <w:rPr>
-            <w:rFonts w:ascii="Times New Roman" w:hAnsi="Times New Roman" w:eastAsia="Times New Roman"/>
-            <w:color w:val="000000"/>
-            <w:sz w:val="28"/>
-          </w:rPr>
-          <w:t xml:space="preserve">16</w:t>
-        </w:r>
-      </w:fldSimple>
-      <w:r/>
-      <w:r/>
-    </w:p>
-    <w:p>
-      <w:pPr>
-        <w:pBdr/>
-        <w:tabs>
-          <w:tab w:val="right" w:leader="dot" w:pos="8856"/>
-        </w:tabs>
-        <w:spacing w:after="0" w:before="0" w:line="360" w:lineRule="auto"/>
-        <w:ind/>
-        <w:jc w:val="left"/>
-        <w:rPr/>
-      </w:pPr>
-      <w:r/>
-      <w:bookmarkStart w:id="2301" w:name="KhanhListTbl_07"/>
-      <w:r>
-        <w:rPr>
-          <w:rFonts w:ascii="Times New Roman" w:hAnsi="Times New Roman" w:eastAsia="Times New Roman" w:cs="Times New Roman"/>
-          <w:color w:val="000000"/>
-          <w:sz w:val="28"/>
-        </w:rPr>
-        <w:t xml:space="preserve">Bảng 1.2. Các nhóm sản phẩm và nền tảng HSPTEK công bố</w:t>
-      </w:r>
-      <w:r>
-        <w:tab/>
-      </w:r>
-      <w:bookmarkEnd w:id="2301"/>
-      <w:r/>
-      <w:fldSimple w:instr="PAGEREF KhanhTbl_04 \h ">
-        <w:r>
-          <w:rPr>
-            <w:rFonts w:ascii="Times New Roman" w:hAnsi="Times New Roman" w:eastAsia="Times New Roman"/>
-            <w:color w:val="000000"/>
-            <w:sz w:val="28"/>
-          </w:rPr>
-          <w:t xml:space="preserve">19</w:t>
-        </w:r>
-      </w:fldSimple>
-      <w:r/>
-      <w:r/>
-    </w:p>
-    <w:p>
-      <w:pPr>
-        <w:pBdr/>
-        <w:tabs>
-          <w:tab w:val="right" w:leader="dot" w:pos="8856"/>
-        </w:tabs>
-        <w:spacing w:after="0" w:before="0" w:line="360" w:lineRule="auto"/>
-        <w:ind/>
-        <w:jc w:val="left"/>
-        <w:rPr/>
-      </w:pPr>
-      <w:r/>
-      <w:bookmarkStart w:id="2302" w:name="KhanhListTbl_02"/>
-      <w:r>
-        <w:rPr>
-          <w:rFonts w:ascii="Times New Roman" w:hAnsi="Times New Roman" w:eastAsia="Times New Roman" w:cs="Times New Roman"/>
-          <w:color w:val="000000"/>
-          <w:sz w:val="28"/>
-        </w:rPr>
-        <w:t xml:space="preserve">Bảng 1.3. Một số sự kiện giới thiệu nền tảng KIMQ</w:t>
-      </w:r>
-      <w:r>
-        <w:tab/>
-      </w:r>
-      <w:bookmarkEnd w:id="2302"/>
-      <w:r/>
-      <w:fldSimple w:instr="PAGEREF KhanhTbl_05 \h ">
-        <w:r>
-          <w:rPr>
-            <w:rFonts w:ascii="Times New Roman" w:hAnsi="Times New Roman" w:eastAsia="Times New Roman"/>
-            <w:color w:val="000000"/>
-            <w:sz w:val="28"/>
-          </w:rPr>
-          <w:t xml:space="preserve">24</w:t>
-        </w:r>
-      </w:fldSimple>
-      <w:r/>
-      <w:r/>
-    </w:p>
-    <w:p>
-      <w:pPr>
-        <w:pBdr/>
-        <w:tabs>
-          <w:tab w:val="right" w:leader="dot" w:pos="8856"/>
-        </w:tabs>
-        <w:spacing w:after="0" w:before="0" w:line="360" w:lineRule="auto"/>
-        <w:ind/>
-        <w:jc w:val="left"/>
-        <w:rPr/>
-      </w:pPr>
-      <w:r/>
-      <w:bookmarkStart w:id="2303" w:name="KhanhListTbl_03"/>
-      <w:r>
-        <w:rPr>
-          <w:rFonts w:ascii="Times New Roman" w:hAnsi="Times New Roman" w:eastAsia="Times New Roman" w:cs="Times New Roman"/>
-          <w:color w:val="000000"/>
-          <w:sz w:val="28"/>
-        </w:rPr>
-        <w:t xml:space="preserve">Bảng 2.1. Đối chiếu khái quát mô hình OSI và TCP/IP</w:t>
-      </w:r>
-      <w:r>
-        <w:tab/>
-      </w:r>
-      <w:bookmarkEnd w:id="2303"/>
-      <w:r/>
-      <w:fldSimple w:instr="PAGEREF KhanhTbl_06 \h ">
-        <w:r>
-          <w:rPr>
-            <w:rFonts w:ascii="Times New Roman" w:hAnsi="Times New Roman" w:eastAsia="Times New Roman"/>
-            <w:color w:val="000000"/>
-            <w:sz w:val="28"/>
-          </w:rPr>
-          <w:t xml:space="preserve">35</w:t>
-        </w:r>
-      </w:fldSimple>
-      <w:r/>
-      <w:r/>
-    </w:p>
-    <w:p>
-      <w:pPr>
-        <w:pBdr/>
-        <w:tabs>
-          <w:tab w:val="right" w:leader="dot" w:pos="8856"/>
-        </w:tabs>
-        <w:spacing w:after="0" w:before="0" w:line="360" w:lineRule="auto"/>
-        <w:ind/>
-        <w:jc w:val="left"/>
-        <w:rPr/>
-      </w:pPr>
-      <w:r/>
-      <w:bookmarkStart w:id="2304" w:name="KhanhListTbl_04"/>
-      <w:r>
-        <w:rPr>
-          <w:rFonts w:ascii="Times New Roman" w:hAnsi="Times New Roman" w:eastAsia="Times New Roman" w:cs="Times New Roman"/>
-          <w:color w:val="000000"/>
-          <w:sz w:val="28"/>
-        </w:rPr>
-        <w:t xml:space="preserve">Bảng 2.2. Các điểm kiểm tra khái quát trong chuỗi kết nối mạng</w:t>
-      </w:r>
-      <w:r>
-        <w:tab/>
-      </w:r>
-      <w:bookmarkEnd w:id="2304"/>
-      <w:r/>
-      <w:fldSimple w:instr="PAGEREF KhanhTbl_07 \h ">
-        <w:r>
-          <w:rPr>
-            <w:rFonts w:ascii="Times New Roman" w:hAnsi="Times New Roman" w:eastAsia="Times New Roman"/>
-            <w:color w:val="000000"/>
-            <w:sz w:val="28"/>
-          </w:rPr>
-          <w:t xml:space="preserve">45</w:t>
-        </w:r>
-      </w:fldSimple>
-      <w:r/>
-      <w:r/>
-    </w:p>
-    <w:p>
-      <w:pPr>
         <w:pBdr/>
         <w:tabs>
           <w:tab w:val="right" w:leader="dot" w:pos="8856"/>
@@ -7884,7 +8033,7 @@
             <w:color w:val="000000"/>
             <w:sz w:val="28"/>
           </w:rPr>
-          <w:t xml:space="preserve">53</w:t>
+          <w:t xml:space="preserve">54</w:t>
         </w:r>
       </w:fldSimple>
       <w:r/>
@@ -7923,7 +8072,7 @@
             <w:color w:val="000000"/>
             <w:sz w:val="28"/>
           </w:rPr>
-          <w:t xml:space="preserve">55</w:t>
+          <w:t xml:space="preserve">56</w:t>
         </w:r>
       </w:fldSimple>
       <w:r/>
@@ -10676,7 +10825,7 @@
           <w:szCs w:val="28"/>
           <w:lang w:val="vi-VN"/>
         </w:rPr>
-        <w:t xml:space="preserve">Phạm vi báo cáo gồm thông tin công khai về HSPTEK, kiến thức nền tảng liên quan đến hệ thống nhúng và những nội dung thực tập có thể trình bày trên cơ sở thông tin đã xác nhận. Các nội dung chuyên môn được sắp xếp từ khái quát đến cụ thể để làm rõ kiến thức cần thiết trước khi trình bày quá trình thực tập.</w:t>
+        <w:t xml:space="preserve">Phạm vi báo cáo gồm thông tin công khai về HSPTEK, </w:t>
       </w:r>
       <w:r>
         <w:rPr>
@@ -10686,7 +10835,7 @@
           <w:szCs w:val="28"/>
           <w:lang w:val="vi-VN"/>
         </w:rPr>
-        <w:t xml:space="preserve"/>
+        <w:t xml:space="preserve">kiến thức nền tảng liên quan đến hệ thống nhúng và những nội dung thực tập có thể trình bày trên cơ sở thông tin đã xác nhận. Các nội dung chuyên môn được sắp xếp từ khái quát đến cụ thể để làm rõ kiến thức cần thiết trước khi trình bày quá trình thực tập.</w:t>
       </w:r>
       <w:r>
         <w:rPr>
@@ -10700,29 +10849,29 @@
     </w:p>
     <w:p>
       <w:pPr>
+        <w:keepLines w:val="true"/>
         <w:widowControl w:val="true"/>
         <w:pBdr/>
         <w:spacing w:after="0" w:before="0" w:line="360" w:lineRule="auto"/>
         <w:ind w:firstLine="720"/>
         <w:jc w:val="both"/>
         <w:rPr/>
-        <w:keepLines/>
-      </w:pPr>
-      <w:r>
-        <w:rPr>
-          <w:rFonts w:ascii="Times New Roman" w:hAnsi="Times New Roman" w:eastAsia="Times New Roman" w:cs="Times New Roman"/>
-          <w:color w:val="000000"/>
-          <w:sz w:val="28"/>
-        </w:rPr>
-        <w:t xml:space="preserve">Để bảo đảm yêu cầu bảo mật, báo cáo không nêu tên hoặc mã dự án, mã bo mạch, thông tin khách hàng, nhật ký hệ thống, cấu hình nội bộ hay thông số kiểm thử. Các sơ đồ chỉ minh họa quy trình khái quát; nội dung chưa xác nhận không được trình bày như kết luận kỹ thuật.</w:t>
-      </w:r>
-      <w:r>
-        <w:rPr>
-          <w:rFonts w:ascii="Times New Roman" w:hAnsi="Times New Roman" w:eastAsia="Times New Roman" w:cs="Times New Roman"/>
-          <w:color w:val="000000"/>
-          <w:sz w:val="28"/>
-        </w:rPr>
-        <w:t xml:space="preserve"/>
+      </w:pPr>
+      <w:r>
+        <w:rPr>
+          <w:rFonts w:ascii="Times New Roman" w:hAnsi="Times New Roman" w:eastAsia="Times New Roman" w:cs="Times New Roman"/>
+          <w:color w:val="000000"/>
+          <w:sz w:val="28"/>
+        </w:rPr>
+        <w:t xml:space="preserve">Để bảo đảm</w:t>
+      </w:r>
+      <w:r>
+        <w:rPr>
+          <w:rFonts w:ascii="Times New Roman" w:hAnsi="Times New Roman" w:eastAsia="Times New Roman" w:cs="Times New Roman"/>
+          <w:color w:val="000000"/>
+          <w:sz w:val="28"/>
+        </w:rPr>
+        <w:t xml:space="preserve"> yêu cầu bảo mật, báo cáo không nêu tên hoặc mã dự án, mã bo mạch, thông tin khách hàng, nhật ký hệ thống, cấu hình nội bộ hay thông số kiểm thử. Các sơ đồ chỉ minh họa quy trình khái quát; nội dung chưa xác nhận không được trình bày như kết luận kỹ thuật.</w:t>
       </w:r>
       <w:r>
         <w:rPr>
@@ -10776,16 +10925,6 @@
       <w:r>
         <w:rPr>
           <w:rFonts w:ascii="Times New Roman" w:hAnsi="Times New Roman" w:eastAsia="Times New Roman" w:cs="Times New Roman"/>
-          <w:color w:val="000000"/>
-          <w:sz w:val="28"/>
-          <w:szCs w:val="28"/>
-          <w:lang w:val="vi-VN"/>
-        </w:rPr>
-        <w:t xml:space="preserve"/>
-      </w:r>
-      <w:r>
-        <w:rPr>
-          <w:rFonts w:ascii="Times New Roman" w:hAnsi="Times New Roman" w:eastAsia="Times New Roman" w:cs="Times New Roman"/>
           <w:sz w:val="28"/>
           <w:szCs w:val="28"/>
           <w:lang w:val="vi-VN"/>
@@ -11010,67 +11149,6 @@
       <w:r/>
       <w:bookmarkEnd w:id="90"/>
       <w:r/>
-      <w:r/>
-    </w:p>
-    <w:p>
-      <w:pPr>
-        <w:widowControl w:val="true"/>
-        <w:pBdr/>
-        <w:spacing w:after="0" w:before="0" w:line="360" w:lineRule="auto"/>
-        <w:ind w:firstLine="720"/>
-        <w:jc w:val="both"/>
-        <w:rPr/>
-      </w:pPr>
-      <w:r>
-        <w:rPr>
-          <w:rFonts w:ascii="Times New Roman" w:hAnsi="Times New Roman" w:eastAsia="Times New Roman" w:cs="Times New Roman"/>
-          <w:color w:val="000000"/>
-          <w:sz w:val="28"/>
-        </w:rPr>
-        <w:t xml:space="preserve">Chương này lần lượt giới thiệu HSPTEK, quá trình phát triể</w:t>
-      </w:r>
-      <w:r>
-        <w:rPr>
-          <w:rFonts w:ascii="Times New Roman" w:hAnsi="Times New Roman" w:eastAsia="Times New Roman" w:cs="Times New Roman"/>
-          <w:color w:val="000000"/>
-          <w:sz w:val="28"/>
-        </w:rPr>
-        <w:t xml:space="preserve">n, lĩnh vực hoạt động, sản phẩm công khai, bộ phận thực tập và định hướng của doanh nghiệp. Trình tự này đặt nội dung BSP và Network ở các chương sau vào bối cảnh phát triển thiết bị điện tử, nơi phần cứng và phần mềm cần được tích hợp qua nhiều giai đoạn.</w:t>
-      </w:r>
-      <w:r>
-        <w:rPr>
-          <w:rFonts w:ascii="Times New Roman" w:hAnsi="Times New Roman" w:eastAsia="Times New Roman" w:cs="Times New Roman"/>
-          <w:color w:val="000000"/>
-          <w:sz w:val="28"/>
-        </w:rPr>
-      </w:r>
-      <w:r/>
-    </w:p>
-    <w:p>
-      <w:pPr>
-        <w:widowControl w:val="true"/>
-        <w:pBdr/>
-        <w:spacing w:after="0" w:before="0" w:line="360" w:lineRule="auto"/>
-        <w:ind w:firstLine="720"/>
-        <w:jc w:val="both"/>
-        <w:rPr/>
-      </w:pPr>
-      <w:r>
-        <w:rPr>
-          <w:rFonts w:ascii="Times New Roman" w:hAnsi="Times New Roman" w:eastAsia="Times New Roman" w:cs="Times New Roman"/>
-          <w:color w:val="000000"/>
-          <w:sz w:val="28"/>
-        </w:rPr>
-        <w:t xml:space="preserve">Thông tin trong mục này được tổng hợp từ trang giới thiệu và dịch vụ chính thức của HSPTEK. Đây</w:t>
-      </w:r>
-      <w:r>
-        <w:rPr>
-          <w:rFonts w:ascii="Times New Roman" w:hAnsi="Times New Roman" w:eastAsia="Times New Roman" w:cs="Times New Roman"/>
-          <w:color w:val="000000"/>
-          <w:sz w:val="28"/>
-        </w:rPr>
-        <w:t xml:space="preserve"> là mô tả do doanh nghiệp công bố, không phải kết quả đánh giá độc lập về quy mô, chất lượng hay thị phần. Báo cáo chỉ dùng các dữ kiện đó để giới thiệu bối cảnh nơi thực tập, không mở rộng thành nhận định định lượng khi không có dữ liệu công khai phù hợp.</w:t>
-      </w:r>
       <w:r/>
     </w:p>
     <w:p>
@@ -11338,6 +11416,30 @@
     </w:p>
     <w:p>
       <w:pPr>
+        <w:keepNext w:val="true"/>
+        <w:pBdr/>
+        <w:spacing w:after="0" w:before="0" w:line="360" w:lineRule="auto"/>
+        <w:ind w:firstLine="0"/>
+        <w:jc w:val="left"/>
+        <w:rPr/>
+      </w:pPr>
+      <w:r/>
+      <w:bookmarkStart w:id="3018" w:name="KhanhHead_101"/>
+      <w:r>
+        <w:rPr>
+          <w:rFonts w:ascii="Times New Roman" w:hAnsi="Times New Roman" w:eastAsia="Times New Roman" w:cs="Times New Roman"/>
+          <w:b/>
+          <w:color w:val="000000"/>
+          <w:sz w:val="28"/>
+        </w:rPr>
+        <w:t xml:space="preserve">1.1.2.1. Quá trình hình thành</w:t>
+      </w:r>
+      <w:bookmarkEnd w:id="3018"/>
+      <w:r/>
+      <w:r/>
+    </w:p>
+    <w:p>
+      <w:pPr>
         <w:pBdr/>
         <w:spacing w:after="0" w:before="0" w:line="360" w:lineRule="auto"/>
         <w:ind w:firstLine="720"/>
@@ -11352,8 +11454,31 @@
           <w:szCs w:val="28"/>
           <w:lang w:val="vi-VN"/>
         </w:rPr>
-        <w:t xml:space="preserve">Công ty Cổ phần HSPTEK được thành lập năm 2023. Theo thông tin doanh nghiệp công bố, hoạt động được xây dựng trên kinh nghiệm sẵn có của đội ngũ trong nghiên cứu, phát triển và sản xuất sản phẩm điện tử.</w:t>
-      </w:r>
+        <w:t xml:space="preserve">Công ty Cổ phần HSPTEK được thành lập năm 2023. Hồ sơ doanh nghiệp cho biết công ty hình thành trên nền tảng đội ngũ có kinh nghiệm trong nghiên cứu, phát triển và sản xuất sản phẩm điện tử công nghệ cao.</w:t>
+      </w:r>
+    </w:p>
+    <w:p>
+      <w:pPr>
+        <w:keepNext w:val="true"/>
+        <w:pBdr/>
+        <w:spacing w:after="0" w:before="0" w:line="360" w:lineRule="auto"/>
+        <w:ind w:firstLine="0"/>
+        <w:jc w:val="left"/>
+        <w:rPr/>
+      </w:pPr>
+      <w:r/>
+      <w:bookmarkStart w:id="3020" w:name="KhanhHead_102"/>
+      <w:r>
+        <w:rPr>
+          <w:rFonts w:ascii="Times New Roman" w:hAnsi="Times New Roman" w:eastAsia="Times New Roman" w:cs="Times New Roman"/>
+          <w:b/>
+          <w:color w:val="000000"/>
+          <w:sz w:val="28"/>
+        </w:rPr>
+        <w:t xml:space="preserve">1.1.2.2. Các dấu mốc phát triển và thành tựu</w:t>
+      </w:r>
+      <w:bookmarkEnd w:id="3020"/>
+      <w:r/>
       <w:r/>
     </w:p>
     <w:p>
@@ -11372,48 +11497,8 @@
           <w:szCs w:val="28"/>
           <w:lang w:val="vi-VN"/>
         </w:rPr>
-        <w:t xml:space="preserve">Tháng 3 năm 2024, HSPTEK giớ</w:t>
-      </w:r>
-      <w:r>
-        <w:rPr>
-          <w:rFonts w:ascii="Times New Roman" w:hAnsi="Times New Roman" w:eastAsia="Times New Roman" w:cs="Times New Roman"/>
-          <w:color w:val="000000"/>
-          <w:sz w:val="28"/>
-          <w:szCs w:val="28"/>
-          <w:lang w:val="vi-VN"/>
-        </w:rPr>
-        <w:t xml:space="preserve">i thiệu nền tảng máy tính AI điện toán biên KIMQ tại Data Center &amp; Cloud Infrastructure Summit (DCCI Summit). Điện toán biên là cách xử lý dữ liệu ngay tại hoặc gần thiết bị tạo dữ liệu, thay vì chuyển toàn bộ dữ liệu đến máy chủ ở xa. KIMQ là tên dòng sản</w:t>
-      </w:r>
-      <w:r>
-        <w:rPr>
-          <w:rFonts w:ascii="Times New Roman" w:hAnsi="Times New Roman" w:eastAsia="Times New Roman" w:cs="Times New Roman"/>
-          <w:color w:val="000000"/>
-          <w:sz w:val="28"/>
-          <w:szCs w:val="28"/>
-          <w:lang w:val="vi-VN"/>
-        </w:rPr>
-        <w:t xml:space="preserve"> phẩm do HSPTEK giới thiệu; các mô-đun KIMQ 5430 và KIMQ 6490 ban đầu sử dụng hệ thống trên chip (System on Chip, SoC) Qualcomm QCS5430 và QCS6490. SoC tích hợp các khối xử lý và giao tiếp chính của thiết bị. Theo bài viết kỷ niệm hai năm thành lập, các mố</w:t>
-      </w:r>
-      <w:r>
-        <w:rPr>
-          <w:rFonts w:ascii="Times New Roman" w:hAnsi="Times New Roman" w:eastAsia="Times New Roman" w:cs="Times New Roman"/>
-          <w:color w:val="000000"/>
-          <w:sz w:val="28"/>
-          <w:szCs w:val="28"/>
-          <w:lang w:val="vi-VN"/>
-        </w:rPr>
-        <w:t xml:space="preserve">c tiếp theo gồm giải Nhì tại Qualcomm Vietnam Innovation Challenge 2024, giải Vàng Make in Vietnam cho nền tảng KIMQ, lô sản phẩm đầu tiên được xuất khẩu trong giai đoạn sản xuất hàng loạt vào tháng 3 năm 2025 và việc ra mắt KIMQ 8550 vào tháng 5 năm 2025.</w:t>
-      </w:r>
-      <w:r>
-        <w:rPr>
-          <w:rFonts w:ascii="Times New Roman" w:hAnsi="Times New Roman" w:eastAsia="Times New Roman" w:cs="Times New Roman"/>
-          <w:color w:val="000000"/>
-          <w:sz w:val="28"/>
-          <w:szCs w:val="28"/>
-          <w:lang w:val="vi-VN"/>
-        </w:rPr>
-      </w:r>
-      <w:r/>
+        <w:t xml:space="preserve">Các mốc dưới đây được sắp xếp theo trình tự thời gian, căn cứ thông tin do HSPTEK và các đơn vị tổ chức công bố:</w:t>
+      </w:r>
     </w:p>
     <w:p>
       <w:pPr>
@@ -11430,8 +11515,9 @@
           <w:sz w:val="28"/>
           <w:szCs w:val="28"/>
           <w:lang w:val="vi-VN"/>
-        </w:rPr>
-        <w:t xml:space="preserve">Các mốc trên cho thấy HSPTEK từng bước giới thiệu thêm các sản phẩm điện toán biên mang thương hiệu KIMQ. Đây là thông tin do doanh nghiệp công bố tại thời điểm tra cứu; báo cáo không xem các mốc này là đánh giá độc lập về mức độ thương mại hóa.</w:t>
+          <w:b w:val="1"/>
+        </w:rPr>
+        <w:t xml:space="preserve">Tháng 3/2024: </w:t>
       </w:r>
       <w:r>
         <w:rPr>
@@ -11441,8 +11527,355 @@
           <w:szCs w:val="28"/>
           <w:lang w:val="vi-VN"/>
         </w:rPr>
-      </w:r>
-      <w:r/>
+        <w:t xml:space="preserve">HSPTEK giới thiệu nền tảng máy tính AI điện toán biên KIMQ tại DCCI Summit 2024. Theo doanh nghiệp, các mô-đun KIMQ 5430 và KIMQ 6490 sử dụng nền tảng Qualcomm QCS5430 và QCS6490.</w:t>
+      </w:r>
+    </w:p>
+    <w:p>
+      <w:pPr>
+        <w:keepNext w:val="true"/>
+        <w:pBdr/>
+        <w:spacing w:after="0" w:before="0" w:line="360" w:lineRule="auto"/>
+        <w:ind/>
+        <w:jc w:val="center"/>
+        <w:rPr/>
+      </w:pPr>
+      <w:r>
+        <mc:AlternateContent>
+          <mc:Choice Requires="wpg">
+            <w:drawing>
+              <wp:inline distT="0" distB="0" distL="0" distR="0">
+                <wp:extent cx="4892040" cy="3669030"/>
+                <wp:effectExtent l="0" t="0" r="0" b="0"/>
+                <wp:docPr id="9" name="Picture 903694901" descr="Khu trưng bày nền tảng KIMQ của HSPTEK với mô-đun và AI Box tại một sự kiện công nghệ." title="Hình 1.1. Khu trưng bày các sản phẩm KIMQ tại DCCI Summit 2024"/>
+                <wp:cNvGraphicFramePr>
+                  <a:graphicFrameLocks noChangeAspect="1"/>
+                </wp:cNvGraphicFramePr>
+                <a:graphic>
+                  <a:graphicData uri="http://schemas.openxmlformats.org/drawingml/2006/picture">
+                    <pic:pic xmlns:pic="http://schemas.openxmlformats.org/drawingml/2006/picture">
+                      <pic:nvPicPr>
+                        <pic:cNvPr id="0" name="hsptek_kimq2.jpg"/>
+                        <pic:cNvPicPr>
+                          <a:picLocks noChangeAspect="1"/>
+                        </pic:cNvPicPr>
+                        <pic:nvPr/>
+                      </pic:nvPicPr>
+                      <pic:blipFill rotWithShape="1">
+                        <a:blip r:embed="rId20"/>
+                        <a:stretch/>
+                      </pic:blipFill>
+                      <pic:spPr bwMode="auto">
+                        <a:xfrm>
+                          <a:off x="0" y="0"/>
+                          <a:ext cx="4892039" cy="3669030"/>
+                        </a:xfrm>
+                        <a:prstGeom prst="rect">
+                          <a:avLst/>
+                        </a:prstGeom>
+                      </pic:spPr>
+                    </pic:pic>
+                  </a:graphicData>
+                </a:graphic>
+              </wp:inline>
+            </w:drawing>
+          </mc:Choice>
+          <mc:Fallback>
+            <w:pict>
+              <v:shapetype id="_x0000_t75" coordsize="21600,21600" o:spt="75" o:preferrelative="t" path="m@4@5l@4@11@9@11@9@5xe" filled="f" stroked="f">
+                <v:stroke joinstyle="miter"/>
+                <v:formulas>
+                  <v:f eqn="if lineDrawn pixelLineWidth 0"/>
+                  <v:f eqn="sum @0 1 0"/>
+                  <v:f eqn="sum 0 0 @1"/>
+                  <v:f eqn="prod @2 1 2"/>
+                  <v:f eqn="prod @3 21600 pixelWidth"/>
+                  <v:f eqn="prod @3 21600 pixelHeight"/>
+                  <v:f eqn="sum @0 0 1"/>
+                  <v:f eqn="prod @6 1 2"/>
+                  <v:f eqn="prod @7 21600 pixelWidth"/>
+                  <v:f eqn="sum @8 21600 0"/>
+                  <v:f eqn="prod @7 21600 pixelHeight"/>
+                  <v:f eqn="sum @10 21600 0"/>
+                </v:formulas>
+                <v:path o:extrusionok="f" gradientshapeok="t" o:connecttype="rect"/>
+                <o:lock v:ext="edit" aspectratio="t"/>
+              </v:shapetype>
+              <v:shape id="_x0000_i8" o:spid="_x0000_s8" type="#_x0000_t75" style="width:385.20pt;height:288.90pt;mso-wrap-distance-left:0.00pt;mso-wrap-distance-top:0.00pt;mso-wrap-distance-right:0.00pt;mso-wrap-distance-bottom:0.00pt;z-index:1;" stroked="false">
+                <v:imagedata r:id="rId20" o:title=""/>
+                <o:lock v:ext="edit" rotation="t"/>
+              </v:shape>
+            </w:pict>
+          </mc:Fallback>
+        </mc:AlternateContent>
+      </w:r>
+      <w:r/>
+    </w:p>
+    <w:p>
+      <w:pPr>
+        <w:pBdr/>
+        <w:spacing w:after="0" w:before="0" w:line="360" w:lineRule="auto"/>
+        <w:ind/>
+        <w:jc w:val="center"/>
+        <w:rPr/>
+      </w:pPr>
+      <w:r/>
+      <w:bookmarkStart w:id="170" w:name="KhanhFig_01"/>
+      <w:r>
+        <w:rPr>
+          <w:rFonts w:ascii="Times New Roman" w:hAnsi="Times New Roman" w:eastAsia="Times New Roman" w:cs="Times New Roman"/>
+          <w:i/>
+          <w:iCs/>
+          <w:color w:val="000000"/>
+          <w:sz w:val="28"/>
+        </w:rPr>
+        <w:t xml:space="preserve">Hình 1.2. Khu trưng bày nền tảng KIMQ tại DCCI Summit 2024</w:t>
+      </w:r>
+      <w:bookmarkEnd w:id="170"/>
+      <w:r/>
+      <w:r/>
+    </w:p>
+    <w:p>
+      <w:pPr>
+        <w:pBdr/>
+        <w:spacing w:after="0" w:before="0" w:line="360" w:lineRule="auto"/>
+        <w:ind w:firstLine="720"/>
+        <w:jc w:val="both"/>
+        <w:rPr/>
+      </w:pPr>
+      <w:r>
+        <w:rPr>
+          <w:rFonts w:ascii="Times New Roman" w:hAnsi="Times New Roman" w:eastAsia="Times New Roman" w:cs="Times New Roman"/>
+          <w:color w:val="000000"/>
+          <w:sz w:val="28"/>
+          <w:szCs w:val="28"/>
+          <w:lang w:val="vi-VN"/>
+          <w:b w:val="1"/>
+        </w:rPr>
+        <w:t xml:space="preserve">Tháng 8/2024: </w:t>
+      </w:r>
+      <w:r>
+        <w:rPr>
+          <w:rFonts w:ascii="Times New Roman" w:hAnsi="Times New Roman" w:eastAsia="Times New Roman" w:cs="Times New Roman"/>
+          <w:color w:val="000000"/>
+          <w:sz w:val="28"/>
+          <w:szCs w:val="28"/>
+          <w:lang w:val="vi-VN"/>
+        </w:rPr>
+        <w:t xml:space="preserve">HSPTEK đạt giải Nhì tại vòng chung kết Qualcomm Vietnam Innovation Challenge (QVIC) 2024. Kết quả này cũng được Qualcomm ghi nhận trong danh sách đơn vị đạt giải.</w:t>
+      </w:r>
+    </w:p>
+    <w:p>
+      <w:pPr>
+        <w:keepNext w:val="true"/>
+        <w:pBdr/>
+        <w:spacing w:after="0" w:before="0" w:line="360" w:lineRule="auto"/>
+        <w:ind/>
+        <w:jc w:val="center"/>
+        <w:rPr/>
+      </w:pPr>
+      <w:r>
+        <mc:AlternateContent>
+          <mc:Choice Requires="wpg">
+            <w:drawing>
+              <wp:inline distT="0" distB="0" distL="0" distR="0">
+                <wp:extent cx="4572000" cy="3048000"/>
+                <wp:effectExtent l="0" t="0" r="0" b="0"/>
+                <wp:docPr id="14" name="QVIC 2024 award" descr="Lễ trao giải tại vòng chung kết QVIC 2024; HSPTEK đạt Giải Nhì theo thông tin công bố của HSPTEK và Qualcomm." title="Hình 1.1. Khu trưng bày các sản phẩm KIMQ tại DCCI Summit 2024"/>
+                <wp:cNvGraphicFramePr>
+                  <a:graphicFrameLocks noChangeAspect="1"/>
+                </wp:cNvGraphicFramePr>
+                <a:graphic>
+                  <a:graphicData uri="http://schemas.openxmlformats.org/drawingml/2006/picture">
+                    <pic:pic xmlns:pic="http://schemas.openxmlformats.org/drawingml/2006/picture">
+                      <pic:nvPicPr>
+                        <pic:cNvPr id="14" name="QVIC 2024 award"/>
+                        <pic:cNvPicPr>
+                          <a:picLocks noChangeAspect="1"/>
+                        </pic:cNvPicPr>
+                        <pic:nvPr/>
+                      </pic:nvPicPr>
+                      <pic:blipFill rotWithShape="1">
+                        <a:blip r:embed="rId25"/>
+                        <a:stretch/>
+                      </pic:blipFill>
+                      <pic:spPr bwMode="auto">
+                        <a:xfrm>
+                          <a:off x="0" y="0"/>
+                          <a:ext cx="4892039" cy="3669030"/>
+                        </a:xfrm>
+                        <a:prstGeom prst="rect">
+                          <a:avLst/>
+                        </a:prstGeom>
+                      </pic:spPr>
+                    </pic:pic>
+                  </a:graphicData>
+                </a:graphic>
+              </wp:inline>
+            </w:drawing>
+          </mc:Choice>
+          <mc:Fallback>
+            <w:pict>
+              <v:shapetype id="_x0000_t75" coordsize="21600,21600" o:spt="75" o:preferrelative="t" path="m@4@5l@4@11@9@11@9@5xe" filled="f" stroked="f">
+                <v:stroke joinstyle="miter"/>
+                <v:formulas>
+                  <v:f eqn="if lineDrawn pixelLineWidth 0"/>
+                  <v:f eqn="sum @0 1 0"/>
+                  <v:f eqn="sum 0 0 @1"/>
+                  <v:f eqn="prod @2 1 2"/>
+                  <v:f eqn="prod @3 21600 pixelWidth"/>
+                  <v:f eqn="prod @3 21600 pixelHeight"/>
+                  <v:f eqn="sum @0 0 1"/>
+                  <v:f eqn="prod @6 1 2"/>
+                  <v:f eqn="prod @7 21600 pixelWidth"/>
+                  <v:f eqn="sum @8 21600 0"/>
+                  <v:f eqn="prod @7 21600 pixelHeight"/>
+                  <v:f eqn="sum @10 21600 0"/>
+                </v:formulas>
+                <v:path o:extrusionok="f" gradientshapeok="t" o:connecttype="rect"/>
+                <o:lock v:ext="edit" aspectratio="t"/>
+              </v:shapetype>
+              <v:shape id="_x0000_i8" o:spid="_x0000_s8" type="#_x0000_t75" style="width:385.20pt;height:288.90pt;mso-wrap-distance-left:0.00pt;mso-wrap-distance-top:0.00pt;mso-wrap-distance-right:0.00pt;mso-wrap-distance-bottom:0.00pt;z-index:1;" stroked="false">
+                <v:imagedata r:id="rId20" o:title=""/>
+                <o:lock v:ext="edit" rotation="t"/>
+              </v:shape>
+            </w:pict>
+          </mc:Fallback>
+        </mc:AlternateContent>
+      </w:r>
+      <w:r/>
+    </w:p>
+    <w:p>
+      <w:pPr>
+        <w:pBdr/>
+        <w:spacing w:after="0" w:before="0" w:line="360" w:lineRule="auto"/>
+        <w:ind/>
+        <w:jc w:val="center"/>
+        <w:rPr/>
+      </w:pPr>
+      <w:r/>
+      <w:bookmarkStart w:id="3017" w:name="KhanhFig_14"/>
+      <w:r>
+        <w:rPr>
+          <w:rFonts w:ascii="Times New Roman" w:hAnsi="Times New Roman" w:eastAsia="Times New Roman" w:cs="Times New Roman"/>
+          <w:i/>
+          <w:iCs/>
+          <w:color w:val="000000"/>
+          <w:sz w:val="28"/>
+        </w:rPr>
+        <w:t xml:space="preserve">Hình 1.3. Trao giải Nhì tại vòng chung kết QVIC 2024</w:t>
+      </w:r>
+      <w:bookmarkEnd w:id="3017"/>
+      <w:r/>
+      <w:r/>
+    </w:p>
+    <w:p>
+      <w:pPr>
+        <w:pBdr/>
+        <w:spacing w:after="0" w:before="0" w:line="360" w:lineRule="auto"/>
+        <w:ind w:firstLine="720"/>
+        <w:jc w:val="both"/>
+        <w:rPr/>
+      </w:pPr>
+      <w:r>
+        <w:rPr>
+          <w:rFonts w:ascii="Times New Roman" w:hAnsi="Times New Roman" w:eastAsia="Times New Roman" w:cs="Times New Roman"/>
+          <w:color w:val="000000"/>
+          <w:sz w:val="28"/>
+          <w:szCs w:val="28"/>
+          <w:lang w:val="vi-VN"/>
+          <w:b w:val="1"/>
+        </w:rPr>
+        <w:t xml:space="preserve">Tháng 1/2025: </w:t>
+      </w:r>
+      <w:r>
+        <w:rPr>
+          <w:rFonts w:ascii="Times New Roman" w:hAnsi="Times New Roman" w:eastAsia="Times New Roman" w:cs="Times New Roman"/>
+          <w:color w:val="000000"/>
+          <w:sz w:val="28"/>
+          <w:szCs w:val="28"/>
+          <w:lang w:val="vi-VN"/>
+        </w:rPr>
+        <w:t xml:space="preserve">nền tảng máy tính AIoT KIMQ được trao Giải Vàng trong khuôn khổ Giải thưởng Sản phẩm công nghệ số Make in Vietnam 2024. HSPTEK công bố mốc này trong bài viết kỷ niệm hai năm thành lập; danh sách của Bộ Thông tin và Truyền thông cũng nêu KIMQ trong nhóm sản phẩm đạt Giải Vàng.</w:t>
+      </w:r>
+    </w:p>
+    <w:p>
+      <w:pPr>
+        <w:pBdr/>
+        <w:spacing w:after="0" w:before="0" w:line="360" w:lineRule="auto"/>
+        <w:ind w:firstLine="720"/>
+        <w:jc w:val="both"/>
+        <w:rPr/>
+      </w:pPr>
+      <w:r>
+        <w:rPr>
+          <w:rFonts w:ascii="Times New Roman" w:hAnsi="Times New Roman" w:eastAsia="Times New Roman" w:cs="Times New Roman"/>
+          <w:color w:val="000000"/>
+          <w:sz w:val="28"/>
+          <w:szCs w:val="28"/>
+          <w:lang w:val="vi-VN"/>
+          <w:b w:val="1"/>
+        </w:rPr>
+        <w:t xml:space="preserve">Tháng 3/2025: </w:t>
+      </w:r>
+      <w:r>
+        <w:rPr>
+          <w:rFonts w:ascii="Times New Roman" w:hAnsi="Times New Roman" w:eastAsia="Times New Roman" w:cs="Times New Roman"/>
+          <w:color w:val="000000"/>
+          <w:sz w:val="28"/>
+          <w:szCs w:val="28"/>
+          <w:lang w:val="vi-VN"/>
+        </w:rPr>
+        <w:t xml:space="preserve">HSPTEK cho biết lô sản phẩm MP (Mass Production, sản xuất hàng loạt) đầu tiên đã được xuất khẩu.</w:t>
+      </w:r>
+    </w:p>
+    <w:p>
+      <w:pPr>
+        <w:pBdr/>
+        <w:spacing w:after="0" w:before="0" w:line="360" w:lineRule="auto"/>
+        <w:ind w:firstLine="720"/>
+        <w:jc w:val="both"/>
+        <w:rPr/>
+      </w:pPr>
+      <w:r>
+        <w:rPr>
+          <w:rFonts w:ascii="Times New Roman" w:hAnsi="Times New Roman" w:eastAsia="Times New Roman" w:cs="Times New Roman"/>
+          <w:color w:val="000000"/>
+          <w:sz w:val="28"/>
+          <w:szCs w:val="28"/>
+          <w:lang w:val="vi-VN"/>
+          <w:b w:val="1"/>
+        </w:rPr>
+        <w:t xml:space="preserve">Tháng 5/2025: </w:t>
+      </w:r>
+      <w:r>
+        <w:rPr>
+          <w:rFonts w:ascii="Times New Roman" w:hAnsi="Times New Roman" w:eastAsia="Times New Roman" w:cs="Times New Roman"/>
+          <w:color w:val="000000"/>
+          <w:sz w:val="28"/>
+          <w:szCs w:val="28"/>
+          <w:lang w:val="vi-VN"/>
+        </w:rPr>
+        <w:t xml:space="preserve">doanh nghiệp công bố ra mắt mô-đun KIMQ 8550.</w:t>
+      </w:r>
+    </w:p>
+    <w:p>
+      <w:pPr>
+        <w:pBdr/>
+        <w:spacing w:after="0" w:before="0" w:line="360" w:lineRule="auto"/>
+        <w:ind w:firstLine="720"/>
+        <w:jc w:val="both"/>
+        <w:rPr/>
+      </w:pPr>
+      <w:r>
+        <w:rPr>
+          <w:rFonts w:ascii="Times New Roman" w:hAnsi="Times New Roman" w:eastAsia="Times New Roman" w:cs="Times New Roman"/>
+          <w:color w:val="000000"/>
+          <w:sz w:val="28"/>
+          <w:szCs w:val="28"/>
+          <w:lang w:val="vi-VN"/>
+        </w:rPr>
+        <w:t xml:space="preserve">Các mốc trên ghi nhận quá trình HSPTEK công bố sản phẩm KIMQ, đạt giải thưởng và thông tin về xuất khẩu. Đây là các mốc do doanh nghiệp hoặc đơn vị tổ chức công bố; báo cáo không xem chúng là đánh giá độc lập về mức độ thương mại hóa.</w:t>
+      </w:r>
     </w:p>
     <w:p>
       <w:pPr>
@@ -14029,7 +14462,7 @@
           <w:color w:val="000000"/>
           <w:sz w:val="28"/>
         </w:rPr>
-        <w:t xml:space="preserve">Hình 1.2. Mô-đun máy tính KIMQ 5430</w:t>
+        <w:t xml:space="preserve">Hình 1.4. Mô-đun máy tính KIMQ 5430</w:t>
       </w:r>
       <w:bookmarkEnd w:id="180"/>
       <w:r/>
@@ -14239,7 +14672,7 @@
           <w:color w:val="000000"/>
           <w:sz w:val="28"/>
         </w:rPr>
-        <w:t xml:space="preserve">Hình 1.3. Sơ đồ khối mô-đun máy tính KIMQ 8550</w:t>
+        <w:t xml:space="preserve">Hình 1.5. Sơ đồ khối mô-đun máy tính KIMQ 8550</w:t>
       </w:r>
       <w:bookmarkEnd w:id="3009"/>
       <w:r/>
@@ -14566,7 +14999,7 @@
           <w:color w:val="000000"/>
           <w:sz w:val="28"/>
         </w:rPr>
-        <w:t xml:space="preserve">Hình 1.4. Máy tính biên AI Box 6490</w:t>
+        <w:t xml:space="preserve">Hình 1.6. Máy tính biên AI Box 6490</w:t>
       </w:r>
       <w:bookmarkEnd w:id="186"/>
       <w:r/>
@@ -15557,110 +15990,6 @@
         <w:t xml:space="preserve">Bảng 1.3. Một số sự kiện HSPTEK công bố đã giới thiệu nền tảng KIMQ</w:t>
       </w:r>
       <w:bookmarkEnd w:id="192"/>
-      <w:r/>
-      <w:r/>
-    </w:p>
-    <w:p>
-      <w:pPr>
-        <w:keepNext w:val="true"/>
-        <w:pBdr/>
-        <w:spacing w:after="0" w:before="0" w:line="360" w:lineRule="auto"/>
-        <w:ind/>
-        <w:jc w:val="center"/>
-        <w:rPr/>
-      </w:pPr>
-      <w:r>
-        <mc:AlternateContent>
-          <mc:Choice Requires="wpg">
-            <w:drawing>
-              <wp:inline xmlns:wp="http://schemas.openxmlformats.org/drawingml/2006/wordprocessingDrawing" distT="0" distB="0" distL="0" distR="0">
-                <wp:extent cx="4892040" cy="3669030"/>
-                <wp:effectExtent l="0" t="0" r="0" b="0"/>
-                <wp:docPr id="9" name="Picture 903694901" descr="Khu trưng bày nền tảng KIMQ của HSPTEK với mô-đun và AI Box tại một sự kiện công nghệ." title="Hình 1.1. Khu trưng bày các sản phẩm KIMQ tại DCCI Summit 2024"/>
-                <wp:cNvGraphicFramePr>
-                  <a:graphicFrameLocks xmlns:a="http://schemas.openxmlformats.org/drawingml/2006/main" noChangeAspect="1"/>
-                </wp:cNvGraphicFramePr>
-                <a:graphic xmlns:a="http://schemas.openxmlformats.org/drawingml/2006/main">
-                  <a:graphicData uri="http://schemas.openxmlformats.org/drawingml/2006/picture">
-                    <pic:pic xmlns:pic="http://schemas.openxmlformats.org/drawingml/2006/picture">
-                      <pic:nvPicPr>
-                        <pic:cNvPr id="0" name="hsptek_kimq2.jpg"/>
-                        <pic:cNvPicPr>
-                          <a:picLocks noChangeAspect="1"/>
-                        </pic:cNvPicPr>
-                        <pic:nvPr/>
-                      </pic:nvPicPr>
-                      <pic:blipFill rotWithShape="1">
-                        <a:blip r:embed="rId20"/>
-                        <a:stretch/>
-                      </pic:blipFill>
-                      <pic:spPr bwMode="auto">
-                        <a:xfrm>
-                          <a:off x="0" y="0"/>
-                          <a:ext cx="4892039" cy="3669030"/>
-                        </a:xfrm>
-                        <a:prstGeom prst="rect">
-                          <a:avLst/>
-                        </a:prstGeom>
-                      </pic:spPr>
-                    </pic:pic>
-                  </a:graphicData>
-                </a:graphic>
-              </wp:inline>
-            </w:drawing>
-          </mc:Choice>
-          <mc:Fallback>
-            <w:pict>
-              <v:shapetype id="_x0000_t75" coordsize="21600,21600" o:spt="75" o:preferrelative="t" path="m@4@5l@4@11@9@11@9@5xe" filled="f" stroked="f">
-                <v:stroke joinstyle="miter"/>
-                <v:formulas>
-                  <v:f eqn="if lineDrawn pixelLineWidth 0"/>
-                  <v:f eqn="sum @0 1 0"/>
-                  <v:f eqn="sum 0 0 @1"/>
-                  <v:f eqn="prod @2 1 2"/>
-                  <v:f eqn="prod @3 21600 pixelWidth"/>
-                  <v:f eqn="prod @3 21600 pixelHeight"/>
-                  <v:f eqn="sum @0 0 1"/>
-                  <v:f eqn="prod @6 1 2"/>
-                  <v:f eqn="prod @7 21600 pixelWidth"/>
-                  <v:f eqn="sum @8 21600 0"/>
-                  <v:f eqn="prod @7 21600 pixelHeight"/>
-                  <v:f eqn="sum @10 21600 0"/>
-                </v:formulas>
-                <v:path o:extrusionok="f" gradientshapeok="t" o:connecttype="rect"/>
-                <o:lock v:ext="edit" aspectratio="t"/>
-              </v:shapetype>
-              <v:shape id="_x0000_i8" o:spid="_x0000_s8" type="#_x0000_t75" style="width:385.20pt;height:288.90pt;mso-wrap-distance-left:0.00pt;mso-wrap-distance-top:0.00pt;mso-wrap-distance-right:0.00pt;mso-wrap-distance-bottom:0.00pt;z-index:1;" stroked="false">
-                <v:imagedata r:id="rId20" o:title=""/>
-                <o:lock v:ext="edit" rotation="t"/>
-              </v:shape>
-            </w:pict>
-          </mc:Fallback>
-        </mc:AlternateContent>
-      </w:r>
-      <w:r/>
-    </w:p>
-    <w:p>
-      <w:pPr>
-        <w:pBdr/>
-        <w:spacing w:after="0" w:before="0" w:line="360" w:lineRule="auto"/>
-        <w:ind/>
-        <w:jc w:val="center"/>
-        <w:rPr/>
-      </w:pPr>
-      <w:r/>
-      <w:bookmarkStart w:id="170" w:name="KhanhFig_01"/>
-      <w:r>
-        <w:rPr>
-          <w:rFonts w:ascii="Times New Roman" w:hAnsi="Times New Roman" w:eastAsia="Times New Roman" w:cs="Times New Roman"/>
-          <w:i/>
-          <w:iCs/>
-          <w:color w:val="000000"/>
-          <w:sz w:val="28"/>
-        </w:rPr>
-        <w:t xml:space="preserve">Hình 1.5. KIMQ được giới thiệu tại DCCI Summit 2024</w:t>
-      </w:r>
-      <w:bookmarkEnd w:id="170"/>
       <w:r/>
       <w:r/>
     </w:p>
@@ -25902,6 +26231,66 @@
       </w:r>
       <w:r/>
     </w:p>
+    <w:p>
+      <w:pPr>
+        <w:widowControl w:val="true"/>
+        <w:pBdr/>
+        <w:spacing w:after="0" w:before="0" w:line="360" w:lineRule="auto"/>
+        <w:ind/>
+        <w:jc w:val="left"/>
+        <w:rPr/>
+      </w:pPr>
+      <w:r>
+        <w:rPr>
+          <w:rFonts w:ascii="Times New Roman" w:hAnsi="Times New Roman" w:eastAsia="Times New Roman" w:cs="Times New Roman"/>
+          <w:b w:val="0"/>
+          <w:color w:val="000000"/>
+          <w:sz w:val="28"/>
+        </w:rPr>
+        <w:t xml:space="preserve">[36] Công ty Cổ phần HSPTEK, “HSPTek Đạt Giải Nhì Tại Cuộc Thi Qualcomm Vietnam Innovation Challenge 2024”, https://hsptek.com/vi/hsptek-xuat-sac-gianh-giai-nhi-tai-qualcomm-vietnam-innovation-challenge-2024/ (truy cập ngày 28/09/2026).</w:t>
+      </w:r>
+      <w:r/>
+    </w:p>
+    <w:p>
+      <w:pPr>
+        <w:widowControl w:val="true"/>
+        <w:pBdr/>
+        <w:spacing w:after="0" w:before="0" w:line="360" w:lineRule="auto"/>
+        <w:ind/>
+        <w:jc w:val="left"/>
+        <w:rPr/>
+      </w:pPr>
+      <w:r>
+        <w:rPr>
+          <w:rFonts w:ascii="Times New Roman" w:hAnsi="Times New Roman" w:eastAsia="Times New Roman" w:cs="Times New Roman"/>
+          <w:b w:val="0"/>
+          <w:color w:val="000000"/>
+          <w:sz w:val="28"/>
+        </w:rPr>
+        <w:t xml:space="preserve">[37] Qualcomm Technologies, “Winners of Qualcomm Vietnam Innovation Challenge 2024”, https://www.qualcomm.com/company/locations/vietnam/vietnam-innovation-challenge/qvic-2024 (truy cập ngày 28/09/2026).</w:t>
+      </w:r>
+      <w:r/>
+    </w:p>
+    <w:p>
+      <w:pPr>
+        <w:widowControl w:val="true"/>
+        <w:pBdr/>
+        <w:spacing w:after="0" w:before="0" w:line="360" w:lineRule="auto"/>
+        <w:ind/>
+        <w:jc w:val="left"/>
+        <w:rPr/>
+      </w:pPr>
+      <w:r>
+        <w:rPr>
+          <w:rFonts w:ascii="Times New Roman" w:hAnsi="Times New Roman" w:eastAsia="Times New Roman" w:cs="Times New Roman"/>
+          <w:b w:val="0"/>
+          <w:color w:val="000000"/>
+          <w:sz w:val="28"/>
+        </w:rPr>
+        <w:t xml:space="preserve">[38] Ministry of Information and Communications, “Make in Vietnam businesses take on mission to turn VN into Asian tiger”, https://english.mic.gov.vn/make-in-vietnam-businesses-take-on-mission-to-turn-vn-into-asian-tiger-197250122152539906.htm (truy cập ngày 28/09/2026).</w:t>
+      </w:r>
+      <w:r/>
+    </w:p>
     <w:sectPr>
       <w:headerReference w:type="default" r:id="rId10"/>
       <w:footerReference w:type="default" r:id="rId12"/>
@@ -60078,7 +60467,7 @@
     <customSectPr/>
   </customSectProps>
   <customShpExts>
-    <customShpInfo spid="_x005F_x005F_x005F_x005F_x005F_x005F_x005F_x005F_x005F_x005F_x005F_x005F_x005F_x005F_x005F_x005F_x005F_x005F_x005F_x005F_x005F_x005F_x005F_x005F_x005F_x005F_x005F_x005F_x005F_x005F_x005F_x005F_x005F_x005F_x005F_x005F_x005F_x005F_x005F_x005F_x005F_x005F_x005F_x005F_x005F_x005F_x005F_x005F_x005F_x005F_x005F_x005F_x005F_x005F_x005F_x005F_x005F_x005F_x005F_x005F_x005F_x005F_x005F_x005F_x005F_x005F_x005F_x005F_x005F_x005F_x005F_x005F_x005F_x005F_x005F_x005F_x005F_x005F_x005F_x005F_x005F_x005F_x005F_x005F_x005F_x005F_x005F_x005F_x005F_x005F_x005F_x005F_x005F_x005F_x005F_x005F_x005F_x005F_x005F_x005F_x005F_x005F_x005F_x005F_x005F_x005F_x005F_x005F_x005F_x005F_x005F_x005F_x005F_x005F_x005F_x005F_x005F_x005F_x005F_x005F_x005F_x005F_x005F_x005F_x005F_x005F_x005F_x005F_x005F_x005F_x005F_x005F_x005F_x005F_x005F_x005F_x005F_x005F_x005F_x005F_x005F_x005F_x005F_x005F_x005F_x005F_x005F_x005F_x005F_x005F_x005F_x005F_x005F_x005F_x005F_x005F_x005F_x005F_x005F_x005F_x005F_x005F_x005F_x005F_x005F_x005F_x005F_x005F_x005F_x005F_x005F_x005F_x005F_x005F_x005F_x005F_x005F_x005F_x005F_x005F_x005F_x005F_x005F_x005F_x005F_x005F_x005F_x005F_x005F_x005F_x005F_x005F_x005F_x005F_x005F_x005F_x005F_x005F_x005F_x005F_x005F_x005F_x005F_x005F_x005F_x005F_x005F_x005F_x005F_x005F_x005F_x005F_x005F_x005F_x005F_x005F_x005F_x005F_x005F_x005F_x005F_x005F_x005F_x005F_x005F_x005F_x005F_x005F_x005F_x005F_x005F_x005F_x005F_x005F_x005F_x005F_x005F_x005F_x005F_x005F_x005F_x005F_x005F_x005F_x005F_x005F_x005F_x005F_x005F_x005F_x005F_x005F_x005F_x005F_x005F_x005F_x005F_x005F_x005F_x005F_x005F_x005F_x005F_x005F_x005F_x005F_x005F_x005F_x005F_x005F_x005F_x005F_x005F_x005F_x005F_x005F_x005F_x005F_x005F_x005F_x005F_x005F_x005F_x005F_x005F_x005F_x005F_x005F_x005F_x005F_x005F_x005F_x005F_x005F_x005F_x005F_x005F_x005F_x005F_x005F_x005F_x005F_x005F_x005F_x005F_x005F_x005F_x005F_x005F_x005F_x005F_x005F_x005F_x005F_x005F_x005F_x005F_x005F_x005F_x005F_x005F_x005F_x005F_x005F_x005F_x005F_x005F_x005F_x005F_x005F_x005F_x005F_x005F_x005F_x005F_x005F_x005F_x005F_x005F_x005F_x005F_x005F_x005F_x005F_x005F_x005F_x005F_x005F_x005F_x005F_x005F_x005F_x005F_x005F_x005F_x005F_x005F_x005F_x005F_x005F_x005F_x005F_x005F_x005F_x005F_x005F_x005F_x005F_x005F_x005F_x005F_x005F_x005F_x005F_x005F_x005F_x005F_x005F_x005F_x005F_x005F_x005F_x005F_x005F_x005F_x005F_x005F_x005F_x005F_x005F_x005F_x005F_x005F_x005F_x005F_x005F_x005F_x005F_x005F_x005F_x005F_x005F_x005F_x005F_x005F_x005F_x005F_x005F_x005F_x005F_x005F_x005F_x005F_x005F_x005F_x005F_x005F_x005F_x005F_x005F_x005F_x005F_x005F_x005F_x005F_x005F_x005F_x005F_x005F_x005F_x005F_x005F_x005F_x005F_x005F_x005F_x005F_x005F_x005F_x005F_x005F_x005F_x005F_x005F_x005F_x005F_x005F_x005F_x005F_x005F_x005F_x005F_x005F_x005F_x005F_x005F_x005F_x005F_x005F_x005F_x005F_x005F_x005F_x005F_x005F_x005F_x005F_x005F_x005F_x005F_x005F_x005F_x005F_x005F_x005F_x005F_x005F_x005F_x005F_x005F_x005F_x005F_x005F_x005F_x005F_x005F_x005F_x005F_x005F_x005F_x005F_x005F_x005F_x005F_x005F_x005F_x005F_x005F_x005F_x005F_x005F_x005F_x005F_x005F_x005F_x005F_x005F_x005F_x005F_x005F_x005F_x0000_s1026" textRotate="1"/>
+    <customShpInfo spid="_x005F_x005F_x005F_x005F_x005F_x005F_x005F_x005F_x005F_x005F_x005F_x005F_x005F_x005F_x005F_x005F_x005F_x005F_x005F_x005F_x005F_x005F_x005F_x005F_x005F_x005F_x005F_x005F_x005F_x005F_x005F_x005F_x005F_x005F_x005F_x005F_x005F_x005F_x005F_x005F_x005F_x005F_x005F_x005F_x005F_x005F_x005F_x005F_x005F_x005F_x005F_x005F_x005F_x005F_x005F_x005F_x005F_x005F_x005F_x005F_x005F_x005F_x005F_x005F_x005F_x005F_x005F_x005F_x005F_x005F_x005F_x005F_x005F_x005F_x005F_x005F_x005F_x005F_x005F_x005F_x005F_x005F_x005F_x005F_x005F_x005F_x005F_x005F_x005F_x005F_x005F_x005F_x005F_x005F_x005F_x005F_x005F_x005F_x005F_x005F_x005F_x005F_x005F_x005F_x005F_x005F_x005F_x005F_x005F_x005F_x005F_x005F_x005F_x005F_x005F_x005F_x005F_x005F_x005F_x005F_x005F_x005F_x005F_x005F_x005F_x005F_x005F_x005F_x005F_x005F_x005F_x005F_x005F_x005F_x005F_x005F_x005F_x005F_x005F_x005F_x005F_x005F_x005F_x005F_x005F_x005F_x005F_x005F_x005F_x005F_x005F_x005F_x005F_x005F_x005F_x005F_x005F_x005F_x005F_x005F_x005F_x005F_x005F_x005F_x005F_x005F_x005F_x005F_x005F_x005F_x005F_x005F_x005F_x005F_x005F_x005F_x005F_x005F_x005F_x005F_x005F_x005F_x005F_x005F_x005F_x005F_x005F_x005F_x005F_x005F_x005F_x005F_x005F_x005F_x005F_x005F_x005F_x005F_x005F_x005F_x005F_x005F_x005F_x005F_x005F_x005F_x005F_x005F_x005F_x005F_x005F_x005F_x005F_x005F_x005F_x005F_x005F_x005F_x005F_x005F_x005F_x005F_x005F_x005F_x005F_x005F_x005F_x005F_x005F_x005F_x005F_x005F_x005F_x005F_x005F_x005F_x005F_x005F_x005F_x005F_x005F_x005F_x005F_x005F_x005F_x005F_x005F_x005F_x005F_x005F_x005F_x005F_x005F_x005F_x005F_x005F_x005F_x005F_x005F_x005F_x005F_x005F_x005F_x005F_x005F_x005F_x005F_x005F_x005F_x005F_x005F_x005F_x005F_x005F_x005F_x005F_x005F_x005F_x005F_x005F_x005F_x005F_x005F_x005F_x005F_x005F_x005F_x005F_x005F_x005F_x005F_x005F_x005F_x005F_x005F_x005F_x005F_x005F_x005F_x005F_x005F_x005F_x005F_x005F_x005F_x005F_x005F_x005F_x005F_x005F_x005F_x005F_x005F_x005F_x005F_x005F_x005F_x005F_x005F_x005F_x005F_x005F_x005F_x005F_x005F_x005F_x005F_x005F_x005F_x005F_x005F_x005F_x005F_x005F_x005F_x005F_x005F_x005F_x005F_x005F_x005F_x005F_x005F_x005F_x005F_x005F_x005F_x005F_x005F_x005F_x005F_x005F_x005F_x005F_x005F_x005F_x005F_x005F_x005F_x005F_x005F_x005F_x005F_x005F_x005F_x005F_x005F_x005F_x005F_x005F_x005F_x005F_x005F_x005F_x005F_x005F_x005F_x005F_x005F_x005F_x005F_x005F_x005F_x005F_x005F_x005F_x005F_x005F_x005F_x005F_x005F_x005F_x005F_x005F_x005F_x005F_x005F_x005F_x005F_x005F_x005F_x005F_x005F_x005F_x005F_x005F_x005F_x005F_x005F_x005F_x005F_x005F_x005F_x005F_x005F_x005F_x005F_x005F_x005F_x005F_x005F_x005F_x005F_x005F_x005F_x005F_x005F_x005F_x005F_x005F_x005F_x005F_x005F_x005F_x005F_x005F_x005F_x005F_x005F_x005F_x005F_x005F_x005F_x005F_x005F_x005F_x005F_x005F_x005F_x005F_x005F_x005F_x005F_x005F_x005F_x005F_x005F_x005F_x005F_x005F_x005F_x005F_x005F_x005F_x005F_x005F_x005F_x005F_x005F_x005F_x005F_x005F_x005F_x005F_x005F_x005F_x005F_x005F_x005F_x005F_x005F_x005F_x005F_x005F_x005F_x005F_x005F_x005F_x005F_x005F_x005F_x005F_x005F_x005F_x005F_x005F_x005F_x005F_x005F_x005F_x005F_x005F_x005F_x005F_x005F_x005F_x005F_x005F_x005F_x005F_x005F_x005F_x005F_x005F_x005F_x005F_x005F_x005F_x005F_x005F_x005F_x005F_x005F_x005F_x005F_x005F_x005F_x005F_x005F_x005F_x005F_x005F_x005F_x005F_x005F_x005F_x005F_x005F_x005F_x005F_x005F_x005F_x005F_x005F_x005F_x005F_x005F_x005F_x005F_x005F_x005F_x005F_x005F_x005F_x005F_x005F_x005F_x005F_x005F_x005F_x005F_x005F_x005F_x005F_x005F_x005F_x005F_x005F_x005F_x005F_x005F_x005F_x005F_x005F_x005F_x005F_x005F_x005F_x005F_x005F_x005F_x005F_x005F_x005F_x005F_x005F_x005F_x005F_x005F_x005F_x005F_x005F_x005F_x005F_x005F_x005F_x005F_x005F_x005F_x005F_x005F_x005F_x005F_x005F_x005F_x005F_x005F_x005F_x005F_x005F_x005F_x005F_x005F_x005F_x005F_x005F_x005F_x005F_x005F_x005F_x005F_x005F_x005F_x005F_x005F_x005F_x005F_x005F_x005F_x005F_x005F_x005F_x005F_x005F_x005F_x005F_x005F_x005F_x005F_x005F_x005F_x005F_x005F_x005F_x005F_x005F_x005F_x005F_x005F_x005F_x005F_x005F_x005F_x005F_x005F_x005F_x005F_x005F_x005F_x005F_x005F_x005F_x005F_x005F_x005F_x005F_x005F_x005F_x005F_x005F_x005F_x005F_x005F_x005F_x005F_x005F_x005F_x005F_x005F_x005F_x005F_x005F_x005F_x005F_x005F_x005F_x005F_x005F_x005F_x005F_x005F_x005F_x005F_x005F_x005F_x005F_x005F_x005F_x005F_x005F_x005F_x005F_x005F_x005F_x005F_x005F_x005F_x005F_x005F_x005F_x005F_x005F_x005F_x005F_x005F_x005F_x005F_x005F_x005F_x005F_x005F_x005F_x005F_x005F_x005F_x005F_x005F_x005F_x005F_x005F_x005F_x005F_x005F_x005F_x005F_x005F_x005F_x005F_x005F_x005F_x005F_x005F_x005F_x005F_x005F_x005F_x005F_x005F_x005F_x005F_x005F_x005F_x005F_x005F_x005F_x005F_x005F_x005F_x005F_x005F_x005F_x005F_x005F_x005F_x005F_x005F_x005F_x005F_x005F_x005F_x005F_x005F_x005F_x005F_x005F_x005F_x005F_x005F_x005F_x005F_x005F_x005F_x005F_x005F_x005F_x005F_x005F_x005F_x005F_x005F_x005F_x005F_x005F_x005F_x005F_x005F_x005F_x005F_x005F_x005F_x005F_x005F_x005F_x005F_x005F_x005F_x005F_x005F_x005F_x005F_x005F_x005F_x005F_x005F_x005F_x005F_x005F_x005F_x005F_x005F_x005F_x005F_x005F_x005F_x005F_x005F_x005F_x005F_x005F_x005F_x005F_x005F_x005F_x005F_x005F_x005F_x005F_x005F_x005F_x005F_x005F_x005F_x005F_x005F_x005F_x005F_x005F_x005F_x005F_x005F_x005F_x005F_x005F_x005F_x005F_x005F_x005F_x005F_x005F_x005F_x005F_x005F_x005F_x005F_x005F_x005F_x005F_x005F_x005F_x005F_x005F_x005F_x005F_x005F_x005F_x005F_x005F_x005F_x005F_x005F_x005F_x005F_x005F_x005F_x005F_x005F_x005F_x005F_x005F_x005F_x005F_x005F_x005F_x005F_x005F_x005F_x005F_x005F_x005F_x005F_x005F_x005F_x005F_x005F_x005F_x005F_x005F_x005F_x005F_x005F_x005F_x005F_x005F_x005F_x005F_x005F_x005F_x005F_x005F_x005F_x005F_x005F_x005F_x005F_x005F_x005F_x005F_x005F_x005F_x005F_x005F_x005F_x005F_x005F_x005F_x005F_x005F_x005F_x005F_x005F_x005F_x005F_x005F_x005F_x005F_x005F_x005F_x005F_x005F_x005F_x005F_x005F_x005F_x005F_x005F_x005F_x005F_x005F_x005F_x005F_x005F_x005F_x005F_x005F_x005F_x005F_x005F_x005F_x005F_x005F_x005F_x005F_x005F_x005F_x005F_x005F_x005F_x005F_x005F_x005F_x005F_x005F_x005F_x005F_x005F_x005F_x005F_x005F_x005F_x005F_x005F_x005F_x005F_x005F_x005F_x005F_x005F_x005F_x005F_x005F_x005F_x005F_x005F_x005F_x005F_x005F_x005F_x005F_x005F_x005F_x005F_x005F_x005F_x005F_x005F_x005F_x005F_x005F_x005F_x005F_x005F_x005F_x005F_x0000_s1026" textRotate="1"/>
   </customShpExts>
 </s:customData>
 </file>

</xml_diff>

<commit_message>
Improve report diagrams and mark Network case gaps
</commit_message>
<xml_diff>
--- a/VuDuyKhanh_BCTTTN.docx
+++ b/VuDuyKhanh_BCTTTN.docx
@@ -434,6 +434,7 @@
     <w:p>
       <w:pPr>
         <w:pBdr/>
+        <w:shd w:val="clear" w:color="auto" w:fill="auto"/>
         <w:spacing w:after="0" w:before="0" w:line="360" w:lineRule="auto"/>
         <w:ind/>
         <w:jc w:val="center"/>
@@ -443,6 +444,15 @@
           <w:sz w:val="28"/>
           <w:szCs w:val="28"/>
         </w:rPr>
+        <w:pPrChange w:author="khanh" w:date="2026-09-28T16:39:01Z" w:id="0" oouserid="khanh">
+          <w:pPr>
+            <w:pBdr/>
+            <w:shd w:val="nil" w:color="000000"/>
+            <w:spacing w:after="0" w:before="0" w:line="360" w:lineRule="auto"/>
+            <w:ind/>
+            <w:jc w:val="center"/>
+          </w:pPr>
+        </w:pPrChange>
       </w:pPr>
       <w:r>
         <w:rPr>
@@ -2617,7 +2627,29 @@
           <w:sz w:val="28"/>
           <w:szCs w:val="28"/>
         </w:rPr>
-        <w:t xml:space="preserve">Kỹ thuật Mật mã cùng quý thầy cô Khoa Điện tử - Vi mạch đã giảng dạy, trang bị kiến thức và tạo nền tảng cho quá trình học tập. Em đặc biệt cảm ơn TS. Trần Ngọc Quý đã hướng dẫn, góp ý và định hướng trong quá trình thực tập cũng như khi hoàn thiện báo cáo.</w:t>
+        <w:t xml:space="preserve">Kỹ thuật Mật mã cùng quý thầy cô Khoa Điện tử - Vi mạch đã giảng dạy, trang bị kiến thức và tạo nền tảng cho quá trình học tập. Em đặc biệt cảm ơn</w:t>
+      </w:r>
+      <w:r>
+        <w:rPr>
+          <w:rFonts w:ascii="Times New Roman" w:hAnsi="Times New Roman" w:eastAsia="Times New Roman" w:cs="Times New Roman"/>
+          <w:b w:val="0"/>
+          <w:bCs w:val="0"/>
+          <w:color w:val="000000"/>
+          <w:sz w:val="28"/>
+          <w:szCs w:val="28"/>
+        </w:rPr>
+        <w:t xml:space="preserve"> thầy</w:t>
+      </w:r>
+      <w:r>
+        <w:rPr>
+          <w:rFonts w:ascii="Times New Roman" w:hAnsi="Times New Roman" w:eastAsia="Times New Roman" w:cs="Times New Roman"/>
+          <w:b w:val="0"/>
+          <w:bCs w:val="0"/>
+          <w:color w:val="000000"/>
+          <w:sz w:val="28"/>
+          <w:szCs w:val="28"/>
+        </w:rPr>
+        <w:t xml:space="preserve"> TS. Trần Ngọc Quý đã hướng dẫn, góp ý và định hướng trong quá trình thực tập cũng như khi hoàn thiện báo cáo.</w:t>
       </w:r>
       <w:r>
         <w:rPr>
@@ -2662,7 +2694,51 @@
           <w:sz w:val="28"/>
           <w:szCs w:val="28"/>
         </w:rPr>
-        <w:t xml:space="preserve">Em xin cảm ơn Ban lãnh đạo Công ty Cổ phần HSPTEK đã tiếp nhận và tạo điều kiện thực tập; cảm ơn anh Hồ Phi Hòa cùng các anh chị đồng nghiệp đã tận tình hướng dẫn, chia sẻ kiến thức và hỗ trợ trong thời gian em làm việc tại công ty.</w:t>
+        <w:t xml:space="preserve">Em xin cảm ơn Ban lãnh đạo Công ty Cổ phần HSPTEK đã tiếp nhận và tạo điều kiện thực tập</w:t>
+      </w:r>
+      <w:r>
+        <w:rPr>
+          <w:rFonts w:ascii="Times New Roman" w:hAnsi="Times New Roman" w:eastAsia="Times New Roman" w:cs="Times New Roman"/>
+          <w:b w:val="0"/>
+          <w:bCs w:val="0"/>
+          <w:color w:val="000000"/>
+          <w:sz w:val="28"/>
+          <w:szCs w:val="28"/>
+        </w:rPr>
+        <w:t xml:space="preserve">. Em </w:t>
+      </w:r>
+      <w:r>
+        <w:rPr>
+          <w:rFonts w:ascii="Times New Roman" w:hAnsi="Times New Roman" w:eastAsia="Times New Roman" w:cs="Times New Roman"/>
+          <w:b w:val="0"/>
+          <w:bCs w:val="0"/>
+          <w:color w:val="000000"/>
+          <w:sz w:val="28"/>
+          <w:szCs w:val="28"/>
+        </w:rPr>
+        <w:t xml:space="preserve">xin</w:t>
+      </w:r>
+      <w:r>
+        <w:rPr>
+          <w:rFonts w:ascii="Times New Roman" w:hAnsi="Times New Roman" w:eastAsia="Times New Roman" w:cs="Times New Roman"/>
+          <w:b w:val="0"/>
+          <w:bCs w:val="0"/>
+          <w:color w:val="000000"/>
+          <w:sz w:val="28"/>
+          <w:szCs w:val="28"/>
+        </w:rPr>
+        <w:t xml:space="preserve"> </w:t>
+      </w:r>
+      <w:r>
+        <w:rPr>
+          <w:rFonts w:ascii="Times New Roman" w:hAnsi="Times New Roman" w:eastAsia="Times New Roman" w:cs="Times New Roman"/>
+          <w:b w:val="0"/>
+          <w:bCs w:val="0"/>
+          <w:color w:val="000000"/>
+          <w:sz w:val="28"/>
+          <w:szCs w:val="28"/>
+        </w:rPr>
+        <w:t xml:space="preserve">cảm ơn anh Hồ Phi Hòa cùng các anh chị đồng nghiệp đã tận tình hướng dẫn, chia sẻ kiến thức và hỗ trợ trong thời gian em làm việc tại công ty.</w:t>
       </w:r>
       <w:r>
         <w:rPr>
@@ -5293,7 +5369,38 @@
               <w:sz w:val="28"/>
               <w:szCs w:val="28"/>
             </w:rPr>
-            <w:t xml:space="preserve">2.2.2. Nền tảng Qualcomm và công việc bring-up</w:t>
+            <w:t xml:space="preserve">2.2.2. Nền tảng Qualcomm và công việc </w:t>
+          </w:r>
+          <w:del w:id="15" w:author="Codex" w:date="2026-09-28T17:41:36Z">
+            <w:r>
+              <w:rPr>
+                <w:rFonts w:ascii="Times New Roman" w:hAnsi="Times New Roman" w:eastAsia="Times New Roman" w:cs="Times New Roman"/>
+                <w:color w:val="000000"/>
+                <w:sz w:val="28"/>
+                <w:szCs w:val="28"/>
+              </w:rPr>
+              <w:delText>b</w:delText>
+            </w:r>
+          </w:del>
+          <w:ins w:id="16" w:author="Codex" w:date="2026-09-28T17:41:36Z">
+            <w:r>
+              <w:rPr>
+                <w:rFonts w:ascii="Times New Roman" w:hAnsi="Times New Roman" w:eastAsia="Times New Roman" w:cs="Times New Roman"/>
+                <w:color w:val="000000"/>
+                <w:sz w:val="28"/>
+                <w:szCs w:val="28"/>
+              </w:rPr>
+              <w:t>B</w:t>
+            </w:r>
+          </w:ins>
+          <w:r>
+            <w:rPr>
+              <w:rFonts w:ascii="Times New Roman" w:hAnsi="Times New Roman" w:eastAsia="Times New Roman" w:cs="Times New Roman"/>
+              <w:color w:val="000000"/>
+              <w:sz w:val="28"/>
+              <w:szCs w:val="28"/>
+            </w:rPr>
+            <w:t>ring-up</w:t>
           </w:r>
           <w:r>
             <w:rPr>
@@ -10539,35 +10646,125 @@
         <w:jc w:val="both"/>
         <w:rPr/>
       </w:pPr>
-      <w:r>
-        <w:rPr>
-          <w:rFonts w:ascii="Times New Roman" w:hAnsi="Times New Roman" w:eastAsia="Times New Roman" w:cs="Times New Roman"/>
-          <w:color w:val="000000"/>
-          <w:sz w:val="28"/>
-          <w:szCs w:val="28"/>
-          <w:lang w:val="vi-VN"/>
-        </w:rPr>
-        <w:t xml:space="preserve">Thiết bị nhúng tích </w:t>
-      </w:r>
-      <w:r>
-        <w:rPr>
-          <w:rFonts w:ascii="Times New Roman" w:hAnsi="Times New Roman" w:eastAsia="Times New Roman" w:cs="Times New Roman"/>
-          <w:color w:val="000000"/>
-          <w:sz w:val="28"/>
-          <w:szCs w:val="28"/>
-          <w:lang w:val="vi-VN"/>
-        </w:rPr>
-        <w:t xml:space="preserve">hợp phần cứng và phần mềm để thực hiện các chức năng xác định, như khởi tạo hệ thống, điều khiển thiết bị ngoại vi, xử lý và trao đổi dữ liệu. Để hiểu hoạt động của thiết bị, cần nắm chức năng của từng thành phần và cách chúng phối hợp trong toàn hệ thống.</w:t>
-      </w:r>
-      <w:r>
-        <w:rPr>
-          <w:rFonts w:ascii="Times New Roman" w:hAnsi="Times New Roman" w:eastAsia="Times New Roman" w:cs="Times New Roman"/>
-          <w:sz w:val="28"/>
-          <w:szCs w:val="28"/>
-          <w:lang w:val="vi-VN"/>
-        </w:rPr>
-      </w:r>
-      <w:r/>
+      <w:del w:id="1" w:author="Codex" w:date="2026-09-28T17:20:47Z">
+        <w:r>
+          <w:rPr>
+            <w:rFonts w:ascii="Times New Roman" w:hAnsi="Times New Roman" w:eastAsia="Times New Roman" w:cs="Times New Roman"/>
+            <w:color w:val="000000"/>
+            <w:sz w:val="28"/>
+            <w:szCs w:val="28"/>
+            <w:lang w:val="vi-VN"/>
+          </w:rPr>
+          <w:delText xml:space="preserve">Thiết bị nhúng tích hợp phần cứng và p</w:delText>
+        </w:r>
+      </w:del>
+      <w:del w:id="2" w:author="Codex" w:date="2026-09-28T17:20:47Z">
+        <w:r>
+          <w:rPr>
+            <w:rFonts w:ascii="Times New Roman" w:hAnsi="Times New Roman" w:eastAsia="Times New Roman" w:cs="Times New Roman"/>
+            <w:color w:val="000000"/>
+            <w:sz w:val="28"/>
+            <w:szCs w:val="28"/>
+            <w:lang w:val="vi-VN"/>
+          </w:rPr>
+          <w:delText xml:space="preserve">hần mềm để thực hiện những chức năng chuyên biệt như khởi tạo hệ thống, điều khiển thiết bị ngoại vi, xử lý dữ liệu và trao đổi thông tin. Để hiểu cách thiết bị vận hành, cần xem xét chức năng của từng thành phần và cách chúng phối hợp trong toàn hệ thống.</w:delText>
+        </w:r>
+      </w:del>
+      <w:del w:id="9" w:author="Codex" w:date="2026-09-28T17:41:36Z">
+        <w:r>
+          <w:rPr>
+            <w:rFonts w:ascii="Times New Roman" w:hAnsi="Times New Roman" w:eastAsia="Times New Roman" w:cs="Times New Roman"/>
+            <w:color w:val="000000"/>
+            <w:sz w:val="28"/>
+            <w:szCs w:val="28"/>
+            <w:lang w:val="vi-VN"/>
+          </w:rPr>
+          <w:delText>Thiết bị nhúng là hệ thống kết hợp chặt chẽ giữa phần cứng và phần mềm nhằm thực hiện một hoặc một nhóm chức năng chuyên biệt. Quá trình vận hành của thiết bị bao gồm nhiều hoạt động liên tiếp, từ khởi tạo hệ thống, quản lý tài nguyên và điều khiển ngoại vi đến xử lý, truyền nhận dữ liệu. Vì vậy, việc tiếp cận thiết bị nhúng đòi hỏi không chỉ hiểu từng thành phần riêng lẻ mà còn phải nhận diện được mối quan hệ và cơ chế phối hợp giữa chúng trong toàn hệ thống.</w:delText>
+        </w:r>
+      </w:del>
+      <w:ins w:id="10" w:author="Codex" w:date="2026-09-28T17:41:36Z">
+        <w:r>
+          <w:rPr>
+            <w:rFonts w:ascii="Times New Roman" w:hAnsi="Times New Roman" w:eastAsia="Times New Roman" w:cs="Times New Roman"/>
+            <w:color w:val="000000"/>
+            <w:sz w:val="28"/>
+            <w:szCs w:val="28"/>
+            <w:lang w:val="vi-VN"/>
+          </w:rPr>
+          <w:t>Trong nhiều lĩnh vực, thiết bị nhúng đảm nhiệm các chức năng điều khiển, giám sát và xử lý chuyên biệt. Đây là những hệ thống trong đó phần cứng và phần mềm được lựa chọn, tích hợp để cùng thực hiện một mục tiêu xác định. Tùy yêu cầu ứng dụng, thiết bị có thể khởi tạo hệ thống, quản lý tài nguyên, điều khiển thiết bị ngoại vi, xử lý dữ liệu và trao đổi thông tin. Với thiết bị có kết nối, quá trình vận hành còn bao gồm việc gửi nhận dữ liệu với các thành phần hoặc hệ thống bên ngoài. Vì vậy, thiết bị nhúng cần được nhìn nhận như một chỉnh thể, trong đó chức năng của từng bộ phận gắn với hoạt động của toàn hệ thống.</w:t>
+        </w:r>
+      </w:ins>
+    </w:p>
+    <w:p>
+      <w:pPr>
+        <w:pBdr/>
+        <w:spacing w:after="0" w:before="0" w:line="360" w:lineRule="auto"/>
+        <w:ind w:firstLine="720"/>
+        <w:jc w:val="both"/>
+        <w:rPr>
+          <w:ins w:id="13" w:author="Codex" w:date="2026-09-28T17:41:36Z"/>
+        </w:rPr>
+      </w:pPr>
+      <w:del w:id="3" w:author="Codex" w:date="2026-09-28T17:20:47Z">
+        <w:r>
+          <w:rPr>
+            <w:rFonts w:ascii="Times New Roman" w:hAnsi="Times New Roman" w:eastAsia="Times New Roman" w:cs="Times New Roman"/>
+            <w:color w:val="000000"/>
+            <w:sz w:val="28"/>
+            <w:szCs w:val="28"/>
+            <w:lang w:val="vi-VN"/>
+          </w:rPr>
+          <w:delText xml:space="preserve">Kiến thức về điện tử, hệ thống nhúng và Internet vạn</w:delText>
+        </w:r>
+      </w:del>
+      <w:del w:id="4" w:author="Codex" w:date="2026-09-28T17:20:47Z">
+        <w:r>
+          <w:rPr>
+            <w:rFonts w:ascii="Times New Roman" w:hAnsi="Times New Roman" w:eastAsia="Times New Roman" w:cs="Times New Roman"/>
+            <w:color w:val="000000"/>
+            <w:sz w:val="28"/>
+            <w:szCs w:val="28"/>
+            <w:lang w:val="vi-VN"/>
+          </w:rPr>
+          <w:delText xml:space="preserve"> vật (IoT) được học ở trường tạo nền tảng ban đầu để tiếp cận lĩnh vực này. Bên cạnh đó, kiến thức về hệ điều hành (Operating System, OS), đặc biệt là Linux trên thiết bị nhúng, giúp làm rõ cách phần mềm quản lý tài nguyên và phối hợp với phần cứng. Mạng m</w:delText>
+        </w:r>
+      </w:del>
+      <w:del w:id="5" w:author="Codex" w:date="2026-09-28T17:20:47Z">
+        <w:r>
+          <w:rPr>
+            <w:rFonts w:ascii="Times New Roman" w:hAnsi="Times New Roman" w:eastAsia="Times New Roman" w:cs="Times New Roman"/>
+            <w:color w:val="000000"/>
+            <w:sz w:val="28"/>
+            <w:szCs w:val="28"/>
+            <w:lang w:val="vi-VN"/>
+          </w:rPr>
+          <w:delText xml:space="preserve">áy tính, hạ tầng mạng và viễn thông bổ sung góc nhìn về khả năng kết nối, truyền dữ liệu và trao đổi thông tin giữa thiết bị với các hệ thống khác. Trên cơ sở đó, báo cáo trình bày quá trình thực tập tại HSPTEK cùng những kiến thức chuyên môn có liên quan.</w:delText>
+        </w:r>
+      </w:del>
+      <w:del w:id="11" w:author="Codex" w:date="2026-09-28T17:41:36Z">
+        <w:r>
+          <w:rPr>
+            <w:rFonts w:ascii="Times New Roman" w:hAnsi="Times New Roman" w:eastAsia="Times New Roman" w:cs="Times New Roman"/>
+            <w:color w:val="000000"/>
+            <w:sz w:val="28"/>
+            <w:szCs w:val="28"/>
+            <w:lang w:val="vi-VN"/>
+          </w:rPr>
+          <w:delText>Nền tảng kiến thức về điện tử, hệ thống nhúng và Internet vạn vật (IoT) được trang bị tại nhà trường tạo cơ sở ban đầu cho quá trình tiếp cận lĩnh vực này. Kiến thức về hệ điều hành (Operating System, OS), đặc biệt là Linux trên thiết bị nhúng, giúp lý giải cách phần mềm quản lý tài nguyên, tổ chức các dịch vụ và tương tác với phần cứng. Đồng thời, mạng máy tính, hạ tầng mạng và viễn thông cung cấp nền tảng để tìm hiểu quá trình thiết lập kết nối, truyền dữ liệu và trao đổi thông tin giữa thiết bị với các hệ thống khác. Từ cơ sở đó, báo cáo trình bày quá trình thực tập tại HSPTEK, nội dung công việc được tiếp cận và những kiến thức chuyên môn có liên quan.</w:delText>
+        </w:r>
+      </w:del>
+      <w:ins w:id="12" w:author="Codex" w:date="2026-09-28T17:41:36Z">
+        <w:r>
+          <w:rPr>
+            <w:rFonts w:ascii="Times New Roman" w:hAnsi="Times New Roman" w:eastAsia="Times New Roman" w:cs="Times New Roman"/>
+            <w:color w:val="000000"/>
+            <w:sz w:val="28"/>
+            <w:szCs w:val="28"/>
+            <w:lang w:val="vi-VN"/>
+          </w:rPr>
+          <w:t>Trong chỉnh thể ấy, phần cứng cung cấp khả năng xử lý, lưu trữ và giao tiếp; phần mềm nền tảng khởi tạo, quản lý và khai thác tài nguyên. Hệ điều hành quản lý tiến trình, bộ nhớ, thiết bị ngoại vi và dịch vụ; trình điều khiển hỗ trợ giao tiếp với phần cứng. Dữ liệu được tiếp nhận, xử lý rồi hiển thị, lưu trữ hoặc truyền đi, nên một kết quả quan sát có thể chịu ảnh hưởng của nhiều lớp. Việc tìm hiểu thiết bị vì vậy cần xem xét trạng thái từng thành phần và cách chúng phối hợp trong toàn hệ thống. Nhờ lớp phần mềm này, ứng dụng có thể khai thác phần cứng thông qua các giao diện và dịch vụ được tổ chức thống nhất.</w:t>
+        </w:r>
+      </w:ins>
     </w:p>
     <w:p>
       <w:pPr>
@@ -10577,25 +10774,11 @@
         <w:jc w:val="both"/>
         <w:rPr/>
       </w:pPr>
-      <w:r>
-        <w:rPr>
-          <w:rFonts w:ascii="Times New Roman" w:hAnsi="Times New Roman" w:eastAsia="Times New Roman" w:cs="Times New Roman"/>
-          <w:color w:val="000000"/>
-          <w:sz w:val="28"/>
-          <w:szCs w:val="28"/>
-          <w:lang w:val="vi-VN"/>
-        </w:rPr>
-        <w:t xml:space="preserve">Kiến thức về điện tử, hệ thống nhúng và Internet vạn vật (IoT) được học ở trường là nền tảng ban đầu để tiếp cận lĩnh vực này. Báo cáo trình bày quá trình thực tập tại HSPTEK cùng những kiến thức chuyên môn có liên quan.</w:t>
-      </w:r>
-      <w:r>
-        <w:rPr>
-          <w:rFonts w:ascii="Times New Roman" w:hAnsi="Times New Roman" w:eastAsia="Times New Roman" w:cs="Times New Roman"/>
-          <w:sz w:val="28"/>
-          <w:szCs w:val="28"/>
-          <w:lang w:val="vi-VN"/>
-        </w:rPr>
-      </w:r>
-      <w:r/>
+      <w:ins w:id="14" w:author="Codex" w:date="2026-09-28T17:41:36Z">
+        <w:r>
+          <w:t>Kiến thức về điện tử, hệ thống nhúng và Internet vạn vật (Internet of Things, IoT) được trang bị tại nhà trường tạo nền tảng ban đầu để tiếp cận lĩnh vực này: điện tử giúp hiểu các giao tiếp phần cứng, kiến thức hệ thống nhúng giúp hình dung cấu trúc và quá trình khởi tạo, còn IoT mở rộng góc nhìn về kết nối và trao đổi dữ liệu. Hệ điều hành (Operating System, OS), đặc biệt là Linux trên thiết bị nhúng, giúp làm rõ cách phần mềm quản lý tài nguyên và hỗ trợ các chức năng hệ thống. Mạng máy tính, hạ tầng mạng và viễn thông bổ sung hiểu biết về kết nối, truyền dẫn và trao đổi thông tin với các hệ thống khác. Trên cơ sở đó, báo cáo trình bày quá trình thực tập tại HSPTEK và những kiến thức chuyên môn liên quan, theo trình tự từ nền tảng chung đến nội dung các chương.</w:t>
+        </w:r>
+      </w:ins>
     </w:p>
     <w:p>
       <w:pPr>
@@ -11456,6 +11639,7 @@
         </w:rPr>
         <w:t xml:space="preserve">Công ty Cổ phần HSPTEK được thành lập năm 2023. Hồ sơ doanh nghiệp cho biết công ty hình thành trên nền tảng đội ngũ có kinh nghiệm trong nghiên cứu, phát triển và sản xuất sản phẩm điện tử công nghệ cao.</w:t>
       </w:r>
+      <w:r/>
     </w:p>
     <w:p>
       <w:pPr>
@@ -11499,6 +11683,7 @@
         </w:rPr>
         <w:t xml:space="preserve">Các mốc dưới đây được sắp xếp theo trình tự thời gian, căn cứ thông tin do HSPTEK và các đơn vị tổ chức công bố:</w:t>
       </w:r>
+      <w:r/>
     </w:p>
     <w:p>
       <w:pPr>
@@ -11511,11 +11696,11 @@
       <w:r>
         <w:rPr>
           <w:rFonts w:ascii="Times New Roman" w:hAnsi="Times New Roman" w:eastAsia="Times New Roman" w:cs="Times New Roman"/>
+          <w:b/>
           <w:color w:val="000000"/>
           <w:sz w:val="28"/>
           <w:szCs w:val="28"/>
           <w:lang w:val="vi-VN"/>
-          <w:b w:val="1"/>
         </w:rPr>
         <w:t xml:space="preserve">Tháng 3/2024: </w:t>
       </w:r>
@@ -11529,6 +11714,7 @@
         </w:rPr>
         <w:t xml:space="preserve">HSPTEK giới thiệu nền tảng máy tính AI điện toán biên KIMQ tại DCCI Summit 2024. Theo doanh nghiệp, các mô-đun KIMQ 5430 và KIMQ 6490 sử dụng nền tảng Qualcomm QCS5430 và QCS6490.</w:t>
       </w:r>
+      <w:r/>
     </w:p>
     <w:p>
       <w:pPr>
@@ -11543,14 +11729,14 @@
         <mc:AlternateContent>
           <mc:Choice Requires="wpg">
             <w:drawing>
-              <wp:inline distT="0" distB="0" distL="0" distR="0">
+              <wp:inline xmlns:wp="http://schemas.openxmlformats.org/drawingml/2006/wordprocessingDrawing" distT="0" distB="0" distL="0" distR="0">
                 <wp:extent cx="4892040" cy="3669030"/>
                 <wp:effectExtent l="0" t="0" r="0" b="0"/>
-                <wp:docPr id="9" name="Picture 903694901" descr="Khu trưng bày nền tảng KIMQ của HSPTEK với mô-đun và AI Box tại một sự kiện công nghệ." title="Hình 1.1. Khu trưng bày các sản phẩm KIMQ tại DCCI Summit 2024"/>
+                <wp:docPr id="6" name="Picture 903694901" descr="Khu trưng bày nền tảng KIMQ của HSPTEK với mô-đun và AI Box tại một sự kiện công nghệ." title="Hình 1.1. Khu trưng bày các sản phẩm KIMQ tại DCCI Summit 2024"/>
                 <wp:cNvGraphicFramePr>
-                  <a:graphicFrameLocks noChangeAspect="1"/>
+                  <a:graphicFrameLocks xmlns:a="http://schemas.openxmlformats.org/drawingml/2006/main" noChangeAspect="1"/>
                 </wp:cNvGraphicFramePr>
-                <a:graphic>
+                <a:graphic xmlns:a="http://schemas.openxmlformats.org/drawingml/2006/main">
                   <a:graphicData uri="http://schemas.openxmlformats.org/drawingml/2006/picture">
                     <pic:pic xmlns:pic="http://schemas.openxmlformats.org/drawingml/2006/picture">
                       <pic:nvPicPr>
@@ -11561,7 +11747,7 @@
                         <pic:nvPr/>
                       </pic:nvPicPr>
                       <pic:blipFill rotWithShape="1">
-                        <a:blip r:embed="rId20"/>
+                        <a:blip r:embed="rId17"/>
                         <a:stretch/>
                       </pic:blipFill>
                       <pic:spPr bwMode="auto">
@@ -11600,8 +11786,8 @@
                 <v:path o:extrusionok="f" gradientshapeok="t" o:connecttype="rect"/>
                 <o:lock v:ext="edit" aspectratio="t"/>
               </v:shapetype>
-              <v:shape id="_x0000_i8" o:spid="_x0000_s8" type="#_x0000_t75" style="width:385.20pt;height:288.90pt;mso-wrap-distance-left:0.00pt;mso-wrap-distance-top:0.00pt;mso-wrap-distance-right:0.00pt;mso-wrap-distance-bottom:0.00pt;z-index:1;" stroked="false">
-                <v:imagedata r:id="rId20" o:title=""/>
+              <v:shape id="_x0000_i5" o:spid="_x0000_s5" type="#_x0000_t75" style="width:385.20pt;height:288.90pt;mso-wrap-distance-left:0.00pt;mso-wrap-distance-top:0.00pt;mso-wrap-distance-right:0.00pt;mso-wrap-distance-bottom:0.00pt;z-index:1;" stroked="false">
+                <v:imagedata r:id="rId17" o:title=""/>
                 <o:lock v:ext="edit" rotation="t"/>
               </v:shape>
             </w:pict>
@@ -11645,11 +11831,11 @@
       <w:r>
         <w:rPr>
           <w:rFonts w:ascii="Times New Roman" w:hAnsi="Times New Roman" w:eastAsia="Times New Roman" w:cs="Times New Roman"/>
+          <w:b/>
           <w:color w:val="000000"/>
           <w:sz w:val="28"/>
           <w:szCs w:val="28"/>
           <w:lang w:val="vi-VN"/>
-          <w:b w:val="1"/>
         </w:rPr>
         <w:t xml:space="preserve">Tháng 8/2024: </w:t>
       </w:r>
@@ -11663,6 +11849,7 @@
         </w:rPr>
         <w:t xml:space="preserve">HSPTEK đạt giải Nhì tại vòng chung kết Qualcomm Vietnam Innovation Challenge (QVIC) 2024. Kết quả này cũng được Qualcomm ghi nhận trong danh sách đơn vị đạt giải.</w:t>
       </w:r>
+      <w:r/>
     </w:p>
     <w:p>
       <w:pPr>
@@ -11677,14 +11864,14 @@
         <mc:AlternateContent>
           <mc:Choice Requires="wpg">
             <w:drawing>
-              <wp:inline distT="0" distB="0" distL="0" distR="0">
+              <wp:inline xmlns:wp="http://schemas.openxmlformats.org/drawingml/2006/wordprocessingDrawing" distT="0" distB="0" distL="0" distR="0">
                 <wp:extent cx="4572000" cy="3048000"/>
                 <wp:effectExtent l="0" t="0" r="0" b="0"/>
-                <wp:docPr id="14" name="QVIC 2024 award" descr="Lễ trao giải tại vòng chung kết QVIC 2024; HSPTEK đạt Giải Nhì theo thông tin công bố của HSPTEK và Qualcomm." title="Hình 1.1. Khu trưng bày các sản phẩm KIMQ tại DCCI Summit 2024"/>
+                <wp:docPr id="7" name="QVIC 2024 award" descr="Lễ trao giải tại vòng chung kết QVIC 2024; HSPTEK đạt Giải Nhì theo thông tin công bố của HSPTEK và Qualcomm." title="Hình 1.1. Khu trưng bày các sản phẩm KIMQ tại DCCI Summit 2024"/>
                 <wp:cNvGraphicFramePr>
-                  <a:graphicFrameLocks noChangeAspect="1"/>
+                  <a:graphicFrameLocks xmlns:a="http://schemas.openxmlformats.org/drawingml/2006/main" noChangeAspect="1"/>
                 </wp:cNvGraphicFramePr>
-                <a:graphic>
+                <a:graphic xmlns:a="http://schemas.openxmlformats.org/drawingml/2006/main">
                   <a:graphicData uri="http://schemas.openxmlformats.org/drawingml/2006/picture">
                     <pic:pic xmlns:pic="http://schemas.openxmlformats.org/drawingml/2006/picture">
                       <pic:nvPicPr>
@@ -11695,7 +11882,7 @@
                         <pic:nvPr/>
                       </pic:nvPicPr>
                       <pic:blipFill rotWithShape="1">
-                        <a:blip r:embed="rId25"/>
+                        <a:blip r:embed="rId18"/>
                         <a:stretch/>
                       </pic:blipFill>
                       <pic:spPr bwMode="auto">
@@ -11734,8 +11921,8 @@
                 <v:path o:extrusionok="f" gradientshapeok="t" o:connecttype="rect"/>
                 <o:lock v:ext="edit" aspectratio="t"/>
               </v:shapetype>
-              <v:shape id="_x0000_i8" o:spid="_x0000_s8" type="#_x0000_t75" style="width:385.20pt;height:288.90pt;mso-wrap-distance-left:0.00pt;mso-wrap-distance-top:0.00pt;mso-wrap-distance-right:0.00pt;mso-wrap-distance-bottom:0.00pt;z-index:1;" stroked="false">
-                <v:imagedata r:id="rId20" o:title=""/>
+              <v:shape id="_x0000_i6" o:spid="_x0000_s6" type="#_x0000_t75" style="width:360.00pt;height:240.00pt;mso-wrap-distance-left:0.00pt;mso-wrap-distance-top:0.00pt;mso-wrap-distance-right:0.00pt;mso-wrap-distance-bottom:0.00pt;z-index:1;" stroked="false">
+                <v:imagedata r:id="rId18" o:title=""/>
                 <o:lock v:ext="edit" rotation="t"/>
               </v:shape>
             </w:pict>
@@ -11779,11 +11966,11 @@
       <w:r>
         <w:rPr>
           <w:rFonts w:ascii="Times New Roman" w:hAnsi="Times New Roman" w:eastAsia="Times New Roman" w:cs="Times New Roman"/>
+          <w:b/>
           <w:color w:val="000000"/>
           <w:sz w:val="28"/>
           <w:szCs w:val="28"/>
           <w:lang w:val="vi-VN"/>
-          <w:b w:val="1"/>
         </w:rPr>
         <w:t xml:space="preserve">Tháng 1/2025: </w:t>
       </w:r>
@@ -11795,8 +11982,19 @@
           <w:szCs w:val="28"/>
           <w:lang w:val="vi-VN"/>
         </w:rPr>
-        <w:t xml:space="preserve">nền tảng máy tính AIoT KIMQ được trao Giải Vàng trong khuôn khổ Giải thưởng Sản phẩm công nghệ số Make in Vietnam 2024. HSPTEK công bố mốc này trong bài viết kỷ niệm hai năm thành lập; danh sách của Bộ Thông tin và Truyền thông cũng nêu KIMQ trong nhóm sản phẩm đạt Giải Vàng.</w:t>
-      </w:r>
+        <w:t xml:space="preserve">nền tảng máy tính AI</w:t>
+      </w:r>
+      <w:r>
+        <w:rPr>
+          <w:rFonts w:ascii="Times New Roman" w:hAnsi="Times New Roman" w:eastAsia="Times New Roman" w:cs="Times New Roman"/>
+          <w:color w:val="000000"/>
+          <w:sz w:val="28"/>
+          <w:szCs w:val="28"/>
+          <w:lang w:val="vi-VN"/>
+        </w:rPr>
+        <w:t xml:space="preserve">oT KIMQ được trao Giải Vàng trong khuôn khổ Giải thưởng Sản phẩm công nghệ số Make in Vietnam 2024. HSPTEK công bố mốc này trong bài viết kỷ niệm hai năm thành lập; danh sách của Bộ Thông tin và Truyền thông cũng nêu KIMQ trong nhóm sản phẩm đạt Giải Vàng.</w:t>
+      </w:r>
+      <w:r/>
     </w:p>
     <w:p>
       <w:pPr>
@@ -11809,11 +12007,11 @@
       <w:r>
         <w:rPr>
           <w:rFonts w:ascii="Times New Roman" w:hAnsi="Times New Roman" w:eastAsia="Times New Roman" w:cs="Times New Roman"/>
+          <w:b/>
           <w:color w:val="000000"/>
           <w:sz w:val="28"/>
           <w:szCs w:val="28"/>
           <w:lang w:val="vi-VN"/>
-          <w:b w:val="1"/>
         </w:rPr>
         <w:t xml:space="preserve">Tháng 3/2025: </w:t>
       </w:r>
@@ -11827,6 +12025,7 @@
         </w:rPr>
         <w:t xml:space="preserve">HSPTEK cho biết lô sản phẩm MP (Mass Production, sản xuất hàng loạt) đầu tiên đã được xuất khẩu.</w:t>
       </w:r>
+      <w:r/>
     </w:p>
     <w:p>
       <w:pPr>
@@ -11839,11 +12038,11 @@
       <w:r>
         <w:rPr>
           <w:rFonts w:ascii="Times New Roman" w:hAnsi="Times New Roman" w:eastAsia="Times New Roman" w:cs="Times New Roman"/>
+          <w:b/>
           <w:color w:val="000000"/>
           <w:sz w:val="28"/>
           <w:szCs w:val="28"/>
           <w:lang w:val="vi-VN"/>
-          <w:b w:val="1"/>
         </w:rPr>
         <w:t xml:space="preserve">Tháng 5/2025: </w:t>
       </w:r>
@@ -11857,6 +12056,7 @@
         </w:rPr>
         <w:t xml:space="preserve">doanh nghiệp công bố ra mắt mô-đun KIMQ 8550.</w:t>
       </w:r>
+      <w:r/>
     </w:p>
     <w:p>
       <w:pPr>
@@ -11876,6 +12076,7 @@
         </w:rPr>
         <w:t xml:space="preserve">Các mốc trên ghi nhận quá trình HSPTEK công bố sản phẩm KIMQ, đạt giải thưởng và thông tin về xuất khẩu. Đây là các mốc do doanh nghiệp hoặc đơn vị tổ chức công bố; báo cáo không xem chúng là đánh giá độc lập về mức độ thương mại hóa.</w:t>
       </w:r>
+      <w:r/>
     </w:p>
     <w:p>
       <w:pPr>
@@ -13370,15 +13571,71 @@
           <w:color w:val="000000"/>
           <w:sz w:val="28"/>
         </w:rPr>
-        <w:t xml:space="preserve">Giai đoạn tích hợp ban đầu, thường gọi là bring-up, là quá trình đưa phần cứng và phần mềm nền tảng đến trạng thái có thể khởi động, nhận di</w:t>
-      </w:r>
-      <w:r>
-        <w:rPr>
-          <w:rFonts w:ascii="Times New Roman" w:hAnsi="Times New Roman" w:eastAsia="Times New Roman" w:cs="Times New Roman"/>
-          <w:color w:val="000000"/>
-          <w:sz w:val="28"/>
-        </w:rPr>
-        <w:t xml:space="preserve">ện thành phần và kiểm tra chức năng cơ bản. Sơ đồ, mô tả giao tiếp, phiên bản nền tảng và yêu cầu cấp nguồn giúp xác định bối cảnh trước khi kiểm tra hành vi ở cấp hệ điều hành. Vì vậy, bring-up có liên hệ với cả thiết kế phần cứng lẫn phát triển phần mềm.</w:t>
+        <w:t xml:space="preserve">Giai đoạn tích hợp ban đầu, thường gọi là </w:t>
+      </w:r>
+      <w:del w:id="17" w:author="Codex" w:date="2026-09-28T17:41:36Z">
+        <w:r>
+          <w:rPr>
+            <w:rFonts w:ascii="Times New Roman" w:hAnsi="Times New Roman" w:eastAsia="Times New Roman" w:cs="Times New Roman"/>
+            <w:color w:val="000000"/>
+            <w:sz w:val="28"/>
+          </w:rPr>
+          <w:delText>b</w:delText>
+        </w:r>
+      </w:del>
+      <w:ins w:id="18" w:author="Codex" w:date="2026-09-28T17:41:36Z">
+        <w:r>
+          <w:rPr>
+            <w:rFonts w:ascii="Times New Roman" w:hAnsi="Times New Roman" w:eastAsia="Times New Roman" w:cs="Times New Roman"/>
+            <w:color w:val="000000"/>
+            <w:sz w:val="28"/>
+          </w:rPr>
+          <w:t>B</w:t>
+        </w:r>
+      </w:ins>
+      <w:r>
+        <w:rPr>
+          <w:rFonts w:ascii="Times New Roman" w:hAnsi="Times New Roman" w:eastAsia="Times New Roman" w:cs="Times New Roman"/>
+          <w:color w:val="000000"/>
+          <w:sz w:val="28"/>
+        </w:rPr>
+        <w:t>ring-up, là quá trình đưa phần cứng và phần mềm nền tảng đến trạng thái có thể khởi động, nhận di</w:t>
+      </w:r>
+      <w:r>
+        <w:rPr>
+          <w:rFonts w:ascii="Times New Roman" w:hAnsi="Times New Roman" w:eastAsia="Times New Roman" w:cs="Times New Roman"/>
+          <w:color w:val="000000"/>
+          <w:sz w:val="28"/>
+        </w:rPr>
+        <w:t xml:space="preserve">ện thành phần và kiểm tra chức năng cơ bản. Sơ đồ, mô tả giao tiếp, phiên bản nền tảng và yêu cầu cấp nguồn giúp xác định bối cảnh trước khi kiểm tra hành vi ở cấp hệ điều hành. Vì vậy, </w:t>
+      </w:r>
+      <w:del w:id="19" w:author="Codex" w:date="2026-09-28T17:41:36Z">
+        <w:r>
+          <w:rPr>
+            <w:rFonts w:ascii="Times New Roman" w:hAnsi="Times New Roman" w:eastAsia="Times New Roman" w:cs="Times New Roman"/>
+            <w:color w:val="000000"/>
+            <w:sz w:val="28"/>
+          </w:rPr>
+          <w:delText>b</w:delText>
+        </w:r>
+      </w:del>
+      <w:ins w:id="20" w:author="Codex" w:date="2026-09-28T17:41:36Z">
+        <w:r>
+          <w:rPr>
+            <w:rFonts w:ascii="Times New Roman" w:hAnsi="Times New Roman" w:eastAsia="Times New Roman" w:cs="Times New Roman"/>
+            <w:color w:val="000000"/>
+            <w:sz w:val="28"/>
+          </w:rPr>
+          <w:t>B</w:t>
+        </w:r>
+      </w:ins>
+      <w:r>
+        <w:rPr>
+          <w:rFonts w:ascii="Times New Roman" w:hAnsi="Times New Roman" w:eastAsia="Times New Roman" w:cs="Times New Roman"/>
+          <w:color w:val="000000"/>
+          <w:sz w:val="28"/>
+        </w:rPr>
+        <w:t>ring-up có liên hệ với cả thiết kế phần cứng lẫn phát triển phần mềm.</w:t>
       </w:r>
       <w:r>
         <w:rPr>
@@ -14378,7 +14635,7 @@
               <wp:inline xmlns:wp="http://schemas.openxmlformats.org/drawingml/2006/wordprocessingDrawing" distT="0" distB="0" distL="0" distR="0">
                 <wp:extent cx="3200400" cy="2138907"/>
                 <wp:effectExtent l="0" t="0" r="0" b="0"/>
-                <wp:docPr id="6" name="Picture 903694901"/>
+                <wp:docPr id="8" name="Picture 903694901"/>
                 <wp:cNvGraphicFramePr>
                   <a:graphicFrameLocks xmlns:a="http://schemas.openxmlformats.org/drawingml/2006/main" noChangeAspect="1"/>
                 </wp:cNvGraphicFramePr>
@@ -14393,7 +14650,7 @@
                         <pic:nvPr/>
                       </pic:nvPicPr>
                       <pic:blipFill rotWithShape="1">
-                        <a:blip r:embed="rId17"/>
+                        <a:blip r:embed="rId19"/>
                         <a:stretch/>
                       </pic:blipFill>
                       <pic:spPr bwMode="auto">
@@ -14432,8 +14689,8 @@
                 <v:path o:extrusionok="f" gradientshapeok="t" o:connecttype="rect"/>
                 <o:lock v:ext="edit" aspectratio="t"/>
               </v:shapetype>
-              <v:shape id="_x0000_i5" o:spid="_x0000_s5" type="#_x0000_t75" style="width:252.00pt;height:168.42pt;mso-wrap-distance-left:0.00pt;mso-wrap-distance-top:0.00pt;mso-wrap-distance-right:0.00pt;mso-wrap-distance-bottom:0.00pt;z-index:1;" stroked="false">
-                <v:imagedata r:id="rId17" o:title=""/>
+              <v:shape id="_x0000_i7" o:spid="_x0000_s7" type="#_x0000_t75" style="width:252.00pt;height:168.42pt;mso-wrap-distance-left:0.00pt;mso-wrap-distance-top:0.00pt;mso-wrap-distance-right:0.00pt;mso-wrap-distance-bottom:0.00pt;z-index:1;" stroked="false">
+                <v:imagedata r:id="rId19" o:title=""/>
                 <o:lock v:ext="edit" rotation="t"/>
               </v:shape>
             </w:pict>
@@ -14588,7 +14845,7 @@
               <wp:inline xmlns:wp="http://schemas.openxmlformats.org/drawingml/2006/wordprocessingDrawing" distT="0" distB="0" distL="0" distR="0">
                 <wp:extent cx="5303520" cy="2850642"/>
                 <wp:effectExtent l="0" t="0" r="0" b="0"/>
-                <wp:docPr id="7" name="Sơ đồ khối KIMQ 8550" descr="Sơ đồ khối vẽ lại bằng draw.io, trình bày khái quát theo tài liệu công khai."/>
+                <wp:docPr id="9" name="Sơ đồ khối KIMQ 8550" descr="Sơ đồ giao tiếp khái quát của mô-đun KIMQ 8550, kèm ảnh sản phẩm công khai do HSPTEK công bố."/>
                 <wp:cNvGraphicFramePr>
                   <a:graphicFrameLocks xmlns:a="http://schemas.openxmlformats.org/drawingml/2006/main" noChangeAspect="1"/>
                 </wp:cNvGraphicFramePr>
@@ -14603,7 +14860,7 @@
                         <pic:nvPr/>
                       </pic:nvPicPr>
                       <pic:blipFill rotWithShape="1">
-                        <a:blip r:embed="rId18"/>
+                        <a:blip r:embed="rId20"/>
                         <a:stretch/>
                       </pic:blipFill>
                       <pic:spPr bwMode="auto">
@@ -14642,8 +14899,8 @@
                 <v:path o:extrusionok="f" gradientshapeok="t" o:connecttype="rect"/>
                 <o:lock v:ext="edit" aspectratio="t"/>
               </v:shapetype>
-              <v:shape id="_x0000_i6" o:spid="_x0000_s6" type="#_x0000_t75" style="width:417.60pt;height:224.46pt;mso-wrap-distance-left:0.00pt;mso-wrap-distance-top:0.00pt;mso-wrap-distance-right:0.00pt;mso-wrap-distance-bottom:0.00pt;z-index:1;" stroked="false">
-                <v:imagedata r:id="rId18" o:title=""/>
+              <v:shape id="_x0000_i8" o:spid="_x0000_s8" type="#_x0000_t75" style="width:417.60pt;height:224.46pt;mso-wrap-distance-left:0.00pt;mso-wrap-distance-top:0.00pt;mso-wrap-distance-right:0.00pt;mso-wrap-distance-bottom:0.00pt;z-index:1;" stroked="false">
+                <v:imagedata r:id="rId20" o:title=""/>
                 <o:lock v:ext="edit" rotation="t"/>
               </v:shape>
             </w:pict>
@@ -14915,7 +15172,7 @@
               <wp:inline xmlns:wp="http://schemas.openxmlformats.org/drawingml/2006/wordprocessingDrawing" distT="0" distB="0" distL="0" distR="0">
                 <wp:extent cx="4114800" cy="3086100"/>
                 <wp:effectExtent l="0" t="0" r="0" b="0"/>
-                <wp:docPr id="8" name="Picture 903694902"/>
+                <wp:docPr id="10" name="Picture 903694902"/>
                 <wp:cNvGraphicFramePr>
                   <a:graphicFrameLocks xmlns:a="http://schemas.openxmlformats.org/drawingml/2006/main" noChangeAspect="1"/>
                 </wp:cNvGraphicFramePr>
@@ -14930,7 +15187,7 @@
                         <pic:nvPr/>
                       </pic:nvPicPr>
                       <pic:blipFill rotWithShape="1">
-                        <a:blip r:embed="rId19"/>
+                        <a:blip r:embed="rId21"/>
                         <a:stretch/>
                       </pic:blipFill>
                       <pic:spPr bwMode="auto">
@@ -14969,8 +15226,8 @@
                 <v:path o:extrusionok="f" gradientshapeok="t" o:connecttype="rect"/>
                 <o:lock v:ext="edit" aspectratio="t"/>
               </v:shapetype>
-              <v:shape id="_x0000_i7" o:spid="_x0000_s7" type="#_x0000_t75" style="width:324.00pt;height:243.00pt;mso-wrap-distance-left:0.00pt;mso-wrap-distance-top:0.00pt;mso-wrap-distance-right:0.00pt;mso-wrap-distance-bottom:0.00pt;z-index:1;" stroked="false">
-                <v:imagedata r:id="rId19" o:title=""/>
+              <v:shape id="_x0000_i9" o:spid="_x0000_s9" type="#_x0000_t75" style="width:324.00pt;height:243.00pt;mso-wrap-distance-left:0.00pt;mso-wrap-distance-top:0.00pt;mso-wrap-distance-right:0.00pt;mso-wrap-distance-bottom:0.00pt;z-index:1;" stroked="false">
+                <v:imagedata r:id="rId21" o:title=""/>
                 <o:lock v:ext="edit" rotation="t"/>
               </v:shape>
             </w:pict>
@@ -16080,7 +16337,35 @@
           <w:color w:val="000000"/>
           <w:sz w:val="28"/>
         </w:rPr>
-        <w:t xml:space="preserve">ực hiện bring-up phần cứng trên nền tảng Qualcomm, trong đó Linux là môi trường làm việc thường xuyên. Mô tả này giải thích chức năng liên quan đến đề tài; báo cáo không dựng sơ đồ tổ chức hoặc suy đoán vai trò nội bộ khi chưa có dữ liệu được phép công bố.</w:t>
+        <w:t xml:space="preserve">ực hiện </w:t>
+      </w:r>
+      <w:del w:id="21" w:author="Codex" w:date="2026-09-28T17:41:36Z">
+        <w:r>
+          <w:rPr>
+            <w:rFonts w:ascii="Times New Roman" w:hAnsi="Times New Roman" w:eastAsia="Times New Roman" w:cs="Times New Roman"/>
+            <w:color w:val="000000"/>
+            <w:sz w:val="28"/>
+          </w:rPr>
+          <w:delText>b</w:delText>
+        </w:r>
+      </w:del>
+      <w:ins w:id="22" w:author="Codex" w:date="2026-09-28T17:41:36Z">
+        <w:r>
+          <w:rPr>
+            <w:rFonts w:ascii="Times New Roman" w:hAnsi="Times New Roman" w:eastAsia="Times New Roman" w:cs="Times New Roman"/>
+            <w:color w:val="000000"/>
+            <w:sz w:val="28"/>
+          </w:rPr>
+          <w:t>B</w:t>
+        </w:r>
+      </w:ins>
+      <w:r>
+        <w:rPr>
+          <w:rFonts w:ascii="Times New Roman" w:hAnsi="Times New Roman" w:eastAsia="Times New Roman" w:cs="Times New Roman"/>
+          <w:color w:val="000000"/>
+          <w:sz w:val="28"/>
+        </w:rPr>
+        <w:t>ring-up phần cứng trên nền tảng Qualcomm, trong đó Linux là môi trường làm việc thường xuyên. Mô tả này giải thích chức năng liên quan đến đề tài; báo cáo không dựng sơ đồ tổ chức hoặc suy đoán vai trò nội bộ khi chưa có dữ liệu được phép công bố.</w:t>
       </w:r>
       <w:r>
         <w:rPr>
@@ -16137,7 +16422,41 @@
           <w:szCs w:val="28"/>
           <w:lang w:val="vi-VN"/>
         </w:rPr>
-        <w:t xml:space="preserve">Trong quá trình bring-up, thông thường cần đối</w:t>
+        <w:t xml:space="preserve">Trong quá trình </w:t>
+      </w:r>
+      <w:del w:id="23" w:author="Codex" w:date="2026-09-28T17:41:36Z">
+        <w:r>
+          <w:rPr>
+            <w:rFonts w:ascii="Times New Roman" w:hAnsi="Times New Roman" w:eastAsia="Times New Roman" w:cs="Times New Roman"/>
+            <w:color w:val="000000"/>
+            <w:sz w:val="28"/>
+            <w:szCs w:val="28"/>
+            <w:lang w:val="vi-VN"/>
+          </w:rPr>
+          <w:delText>b</w:delText>
+        </w:r>
+      </w:del>
+      <w:ins w:id="24" w:author="Codex" w:date="2026-09-28T17:41:36Z">
+        <w:r>
+          <w:rPr>
+            <w:rFonts w:ascii="Times New Roman" w:hAnsi="Times New Roman" w:eastAsia="Times New Roman" w:cs="Times New Roman"/>
+            <w:color w:val="000000"/>
+            <w:sz w:val="28"/>
+            <w:szCs w:val="28"/>
+            <w:lang w:val="vi-VN"/>
+          </w:rPr>
+          <w:t>B</w:t>
+        </w:r>
+      </w:ins>
+      <w:r>
+        <w:rPr>
+          <w:rFonts w:ascii="Times New Roman" w:hAnsi="Times New Roman" w:eastAsia="Times New Roman" w:cs="Times New Roman"/>
+          <w:color w:val="000000"/>
+          <w:sz w:val="28"/>
+          <w:szCs w:val="28"/>
+          <w:lang w:val="vi-VN"/>
+        </w:rPr>
+        <w:t>ring-up, thông thường cần đối</w:t>
       </w:r>
       <w:r>
         <w:rPr>
@@ -16466,7 +16785,41 @@
           <w:szCs w:val="28"/>
           <w:lang w:val="vi-VN"/>
         </w:rPr>
-        <w:t xml:space="preserve">rd Support Package, thường dùng để chỉ tập hợp phần mềm, cấu hình và thành phần hỗ trợ để một hệ điều hành vận hành trên một nền tảng phần cứng cụ thể. Trong phạm vi bộ phận BSP tại HSPTEK, nội dung được giới thiệu tập trung vào phát triển phần mềm và brin</w:t>
+        <w:t xml:space="preserve">rd Support Package, thường dùng để chỉ tập hợp phần mềm, cấu hình và thành phần hỗ trợ để một hệ điều hành vận hành trên một nền tảng phần cứng cụ thể. Trong phạm vi bộ phận BSP tại HSPTEK, nội dung được giới thiệu tập trung vào phát triển phần mềm và </w:t>
+      </w:r>
+      <w:del w:id="25" w:author="Codex" w:date="2026-09-28T17:41:36Z">
+        <w:r>
+          <w:rPr>
+            <w:rFonts w:ascii="Times New Roman" w:hAnsi="Times New Roman" w:eastAsia="Times New Roman" w:cs="Times New Roman"/>
+            <w:color w:val="000000"/>
+            <w:sz w:val="28"/>
+            <w:szCs w:val="28"/>
+            <w:lang w:val="vi-VN"/>
+          </w:rPr>
+          <w:delText>b</w:delText>
+        </w:r>
+      </w:del>
+      <w:ins w:id="26" w:author="Codex" w:date="2026-09-28T17:41:36Z">
+        <w:r>
+          <w:rPr>
+            <w:rFonts w:ascii="Times New Roman" w:hAnsi="Times New Roman" w:eastAsia="Times New Roman" w:cs="Times New Roman"/>
+            <w:color w:val="000000"/>
+            <w:sz w:val="28"/>
+            <w:szCs w:val="28"/>
+            <w:lang w:val="vi-VN"/>
+          </w:rPr>
+          <w:t>B</w:t>
+        </w:r>
+      </w:ins>
+      <w:r>
+        <w:rPr>
+          <w:rFonts w:ascii="Times New Roman" w:hAnsi="Times New Roman" w:eastAsia="Times New Roman" w:cs="Times New Roman"/>
+          <w:color w:val="000000"/>
+          <w:sz w:val="28"/>
+          <w:szCs w:val="28"/>
+          <w:lang w:val="vi-VN"/>
+        </w:rPr>
+        <w:t>rin</w:t>
       </w:r>
       <w:r>
         <w:rPr>
@@ -16965,7 +17318,44 @@
           <w:szCs w:val="28"/>
           <w:lang w:val="vi-VN"/>
         </w:rPr>
-        <w:t xml:space="preserve">2.2.2. Nền tảng Qualcomm và công việc bring-up</w:t>
+        <w:t xml:space="preserve">2.2.2. Nền tảng Qualcomm và công việc </w:t>
+      </w:r>
+      <w:del w:id="27" w:author="Codex" w:date="2026-09-28T17:41:36Z">
+        <w:r>
+          <w:rPr>
+            <w:rFonts w:ascii="Times New Roman" w:hAnsi="Times New Roman" w:eastAsia="Times New Roman" w:cs="Times New Roman"/>
+            <w:b/>
+            <w:color w:val="000000"/>
+            <w:sz w:val="28"/>
+            <w:szCs w:val="28"/>
+            <w:lang w:val="vi-VN"/>
+          </w:rPr>
+          <w:delText>b</w:delText>
+        </w:r>
+      </w:del>
+      <w:ins w:id="28" w:author="Codex" w:date="2026-09-28T17:41:36Z">
+        <w:r>
+          <w:rPr>
+            <w:rFonts w:ascii="Times New Roman" w:hAnsi="Times New Roman" w:eastAsia="Times New Roman" w:cs="Times New Roman"/>
+            <w:b/>
+            <w:color w:val="000000"/>
+            <w:sz w:val="28"/>
+            <w:szCs w:val="28"/>
+            <w:lang w:val="vi-VN"/>
+          </w:rPr>
+          <w:t>B</w:t>
+        </w:r>
+      </w:ins>
+      <w:r>
+        <w:rPr>
+          <w:rFonts w:ascii="Times New Roman" w:hAnsi="Times New Roman" w:eastAsia="Times New Roman" w:cs="Times New Roman"/>
+          <w:b/>
+          <w:color w:val="000000"/>
+          <w:sz w:val="28"/>
+          <w:szCs w:val="28"/>
+          <w:lang w:val="vi-VN"/>
+        </w:rPr>
+        <w:t>ring-up</w:t>
       </w:r>
       <w:bookmarkEnd w:id="36"/>
       <w:r/>
@@ -17103,7 +17493,7 @@
               <wp:inline xmlns:wp="http://schemas.openxmlformats.org/drawingml/2006/wordprocessingDrawing" distT="0" distB="0" distL="0" distR="0">
                 <wp:extent cx="5029200" cy="2828925"/>
                 <wp:effectExtent l="0" t="0" r="0" b="0"/>
-                <wp:docPr id="10" name="Picture 903694902" descr="Sơ đồ khối vẽ lại bằng draw.io, trình bày khái quát theo tài liệu công khai." title="Hình 2.1. Quan hệ khái quát giữa hệ điều hành, BSP và phần cứng nhúng"/>
+                <wp:docPr id="11" name="Picture 903694902" descr="Sơ đồ các lớp hệ thống nhúng và phạm vi BSP; kèm ảnh công khai của SoM KIMQ 5430 và AI Box 8550 để minh họa hai dạng sản phẩm." title="Hình 2.1. Quan hệ khái quát giữa hệ điều hành, BSP và phần cứng nhúng"/>
                 <wp:cNvGraphicFramePr>
                   <a:graphicFrameLocks xmlns:a="http://schemas.openxmlformats.org/drawingml/2006/main" noChangeAspect="1"/>
                 </wp:cNvGraphicFramePr>
@@ -17118,7 +17508,7 @@
                         <pic:nvPr/>
                       </pic:nvPicPr>
                       <pic:blipFill rotWithShape="1">
-                        <a:blip r:embed="rId21"/>
+                        <a:blip r:embed="rId22"/>
                         <a:stretch/>
                       </pic:blipFill>
                       <pic:spPr bwMode="auto">
@@ -17157,8 +17547,8 @@
                 <v:path o:extrusionok="f" gradientshapeok="t" o:connecttype="rect"/>
                 <o:lock v:ext="edit" aspectratio="t"/>
               </v:shapetype>
-              <v:shape id="_x0000_i9" o:spid="_x0000_s9" type="#_x0000_t75" style="width:396.00pt;height:222.75pt;mso-wrap-distance-left:0.00pt;mso-wrap-distance-top:0.00pt;mso-wrap-distance-right:0.00pt;mso-wrap-distance-bottom:0.00pt;z-index:1;" stroked="false">
-                <v:imagedata r:id="rId21" o:title=""/>
+              <v:shape id="_x0000_i10" o:spid="_x0000_s10" type="#_x0000_t75" style="width:396.00pt;height:222.75pt;mso-wrap-distance-left:0.00pt;mso-wrap-distance-top:0.00pt;mso-wrap-distance-right:0.00pt;mso-wrap-distance-bottom:0.00pt;z-index:1;" stroked="false">
+                <v:imagedata r:id="rId22" o:title=""/>
                 <o:lock v:ext="edit" rotation="t"/>
               </v:shape>
             </w:pict>
@@ -17219,7 +17609,41 @@
           <w:szCs w:val="28"/>
           <w:lang w:val="vi-VN"/>
         </w:rPr>
-        <w:t xml:space="preserve"> khởi động thiết bị và sử dụng phương pháp debug. Các bước này cho thấy bring-up không phải một thao tác riêng lẻ mà là quá trình kiểm chứng nhiều quan hệ phụ thuộc. Khi vận dụng kiến thức từ tài liệu, cần đối chiếu đúng SoC, phiên bản và bo mạch mục tiêu.</w:t>
+        <w:t xml:space="preserve"> khởi động thiết bị và sử dụng phương pháp debug. Các bước này cho thấy </w:t>
+      </w:r>
+      <w:del w:id="29" w:author="Codex" w:date="2026-09-28T17:41:36Z">
+        <w:r>
+          <w:rPr>
+            <w:rFonts w:ascii="Times New Roman" w:hAnsi="Times New Roman" w:eastAsia="Times New Roman" w:cs="Times New Roman"/>
+            <w:color w:val="000000"/>
+            <w:sz w:val="28"/>
+            <w:szCs w:val="28"/>
+            <w:lang w:val="vi-VN"/>
+          </w:rPr>
+          <w:delText>b</w:delText>
+        </w:r>
+      </w:del>
+      <w:ins w:id="30" w:author="Codex" w:date="2026-09-28T17:41:36Z">
+        <w:r>
+          <w:rPr>
+            <w:rFonts w:ascii="Times New Roman" w:hAnsi="Times New Roman" w:eastAsia="Times New Roman" w:cs="Times New Roman"/>
+            <w:color w:val="000000"/>
+            <w:sz w:val="28"/>
+            <w:szCs w:val="28"/>
+            <w:lang w:val="vi-VN"/>
+          </w:rPr>
+          <w:t>B</w:t>
+        </w:r>
+      </w:ins>
+      <w:r>
+        <w:rPr>
+          <w:rFonts w:ascii="Times New Roman" w:hAnsi="Times New Roman" w:eastAsia="Times New Roman" w:cs="Times New Roman"/>
+          <w:color w:val="000000"/>
+          <w:sz w:val="28"/>
+          <w:szCs w:val="28"/>
+          <w:lang w:val="vi-VN"/>
+        </w:rPr>
+        <w:t>ring-up không phải một thao tác riêng lẻ mà là quá trình kiểm chứng nhiều quan hệ phụ thuộc. Khi vận dụng kiến thức từ tài liệu, cần đối chiếu đúng SoC, phiên bản và bo mạch mục tiêu.</w:t>
       </w:r>
       <w:r/>
     </w:p>
@@ -17446,7 +17870,7 @@
               <wp:inline xmlns:wp="http://schemas.openxmlformats.org/drawingml/2006/wordprocessingDrawing" distT="0" distB="0" distL="0" distR="0">
                 <wp:extent cx="5303520" cy="1359027"/>
                 <wp:effectExtent l="0" t="0" r="0" b="0"/>
-                <wp:docPr id="11" name="Picture 903694903" descr="Sơ đồ khối vẽ lại bằng draw.io, trình bày khái quát theo tài liệu công khai." title="Hình 2.2. Chuỗi tổng quát từ mã nguồn đến kiểm tra phần mềm trên thiết bị"/>
+                <wp:docPr id="12" name="Picture 903694903" descr="Sơ đồ chuỗi tổng quát từ mã nguồn đến kiểm tra phần mềm trên thiết bị." title="Hình 2.2. Chuỗi tổng quát từ mã nguồn đến kiểm tra phần mềm trên thiết bị"/>
                 <wp:cNvGraphicFramePr>
                   <a:graphicFrameLocks xmlns:a="http://schemas.openxmlformats.org/drawingml/2006/main" noChangeAspect="1"/>
                 </wp:cNvGraphicFramePr>
@@ -17461,7 +17885,7 @@
                         <pic:nvPr/>
                       </pic:nvPicPr>
                       <pic:blipFill rotWithShape="1">
-                        <a:blip r:embed="rId22"/>
+                        <a:blip r:embed="rId23"/>
                         <a:stretch/>
                       </pic:blipFill>
                       <pic:spPr bwMode="auto">
@@ -17500,8 +17924,8 @@
                 <v:path o:extrusionok="f" gradientshapeok="t" o:connecttype="rect"/>
                 <o:lock v:ext="edit" aspectratio="t"/>
               </v:shapetype>
-              <v:shape id="_x0000_i10" o:spid="_x0000_s10" type="#_x0000_t75" style="width:417.60pt;height:107.01pt;mso-wrap-distance-left:0.00pt;mso-wrap-distance-top:0.00pt;mso-wrap-distance-right:0.00pt;mso-wrap-distance-bottom:0.00pt;z-index:1;" stroked="false">
-                <v:imagedata r:id="rId22" o:title=""/>
+              <v:shape id="_x0000_i11" o:spid="_x0000_s11" type="#_x0000_t75" style="width:417.60pt;height:107.01pt;mso-wrap-distance-left:0.00pt;mso-wrap-distance-top:0.00pt;mso-wrap-distance-right:0.00pt;mso-wrap-distance-bottom:0.00pt;z-index:1;" stroked="false">
+                <v:imagedata r:id="rId23" o:title=""/>
                 <o:lock v:ext="edit" rotation="t"/>
               </v:shape>
             </w:pict>
@@ -19475,7 +19899,7 @@
               <wp:inline xmlns:wp="http://schemas.openxmlformats.org/drawingml/2006/wordprocessingDrawing" distT="0" distB="0" distL="0" distR="0">
                 <wp:extent cx="4937760" cy="2962656"/>
                 <wp:effectExtent l="0" t="0" r="0" b="0"/>
-                <wp:docPr id="12" name="Picture 903694904" descr="Sơ đồ khối vẽ lại bằng draw.io, trình bày khái quát theo tài liệu công khai." title="Hình 2.3. Đường đi khái quát từ ứng dụng tới mạng ngoài qua Wi-Fi hoặc modem"/>
+                <wp:docPr id="13" name="Picture 903694904" descr="Sơ đồ đường đi khái quát từ ứng dụng tới mạng ngoài qua Wi-Fi hoặc modem." title="Hình 2.3. Đường đi khái quát từ ứng dụng tới mạng ngoài qua Wi-Fi hoặc modem"/>
                 <wp:cNvGraphicFramePr>
                   <a:graphicFrameLocks xmlns:a="http://schemas.openxmlformats.org/drawingml/2006/main" noChangeAspect="1"/>
                 </wp:cNvGraphicFramePr>
@@ -19490,7 +19914,7 @@
                         <pic:nvPr/>
                       </pic:nvPicPr>
                       <pic:blipFill rotWithShape="1">
-                        <a:blip r:embed="rId23"/>
+                        <a:blip r:embed="rId24"/>
                         <a:stretch/>
                       </pic:blipFill>
                       <pic:spPr bwMode="auto">
@@ -19529,8 +19953,8 @@
                 <v:path o:extrusionok="f" gradientshapeok="t" o:connecttype="rect"/>
                 <o:lock v:ext="edit" aspectratio="t"/>
               </v:shapetype>
-              <v:shape id="_x0000_i11" o:spid="_x0000_s11" type="#_x0000_t75" style="width:388.80pt;height:233.28pt;mso-wrap-distance-left:0.00pt;mso-wrap-distance-top:0.00pt;mso-wrap-distance-right:0.00pt;mso-wrap-distance-bottom:0.00pt;z-index:1;" stroked="false">
-                <v:imagedata r:id="rId23" o:title=""/>
+              <v:shape id="_x0000_i12" o:spid="_x0000_s12" type="#_x0000_t75" style="width:388.80pt;height:233.28pt;mso-wrap-distance-left:0.00pt;mso-wrap-distance-top:0.00pt;mso-wrap-distance-right:0.00pt;mso-wrap-distance-bottom:0.00pt;z-index:1;" stroked="false">
+                <v:imagedata r:id="rId24" o:title=""/>
                 <o:lock v:ext="edit" rotation="t"/>
               </v:shape>
             </w:pict>
@@ -20040,7 +20464,35 @@
           <w:color w:val="000000"/>
           <w:sz w:val="28"/>
         </w:rPr>
-        <w:t xml:space="preserve">c khi thay đổi cấu hình hoặc nạp phần mềm. Một lần khởi động thành công chỉ xác nhận thiết bị hoạt động trong điều kiện vừa thử; muốn khẳng định độ ổn định cần thêm điều kiện và lần kiểm tra. Việc làm quen không đồng nghĩa với việc đã tự hoàn tất bring-up.</w:t>
+        <w:t xml:space="preserve">c khi thay đổi cấu hình hoặc nạp phần mềm. Một lần khởi động thành công chỉ xác nhận thiết bị hoạt động trong điều kiện vừa thử; muốn khẳng định độ ổn định cần thêm điều kiện và lần kiểm tra. Việc làm quen không đồng nghĩa với việc đã tự hoàn tất </w:t>
+      </w:r>
+      <w:del w:id="31" w:author="Codex" w:date="2026-09-28T17:41:36Z">
+        <w:r>
+          <w:rPr>
+            <w:rFonts w:ascii="Times New Roman" w:hAnsi="Times New Roman" w:eastAsia="Times New Roman" w:cs="Times New Roman"/>
+            <w:color w:val="000000"/>
+            <w:sz w:val="28"/>
+          </w:rPr>
+          <w:delText>b</w:delText>
+        </w:r>
+      </w:del>
+      <w:ins w:id="32" w:author="Codex" w:date="2026-09-28T17:41:36Z">
+        <w:r>
+          <w:rPr>
+            <w:rFonts w:ascii="Times New Roman" w:hAnsi="Times New Roman" w:eastAsia="Times New Roman" w:cs="Times New Roman"/>
+            <w:color w:val="000000"/>
+            <w:sz w:val="28"/>
+          </w:rPr>
+          <w:t>B</w:t>
+        </w:r>
+      </w:ins>
+      <w:r>
+        <w:rPr>
+          <w:rFonts w:ascii="Times New Roman" w:hAnsi="Times New Roman" w:eastAsia="Times New Roman" w:cs="Times New Roman"/>
+          <w:color w:val="000000"/>
+          <w:sz w:val="28"/>
+        </w:rPr>
+        <w:t>ring-up.</w:t>
       </w:r>
       <w:r>
         <w:rPr>
@@ -20256,6 +20708,200 @@
         <w:t xml:space="preserve"> bị không kết nối được hoặc hoạt động khác mong đợi. Wi-Fi, chip mạng, driver và công suất tín hiệu là những khái niệm nền đang được xem xét; việc đề cập ở đây không xác nhận rằng tất cả đều có trên bo mạch đang tìm hiểu hoặc là nguyên nhân của hiện tượng.</w:t>
       </w:r>
       <w:r/>
+    </w:p>
+    <w:p>
+      <w:pPr>
+        <w:spacing w:before="0" w:after="0" w:line="360" w:lineRule="auto"/>
+        <w:ind w:left="0"/>
+        <w:keepNext/>
+        <w:keepLines/>
+      </w:pPr>
+      <w:ins w:id="39" w:author="Codex" w:date="2026-09-28T18:00:23Z">
+        <w:r>
+          <w:rPr>
+            <w:rFonts w:ascii="Times New Roman" w:hAnsi="Times New Roman" w:eastAsia="Times New Roman" w:cs="Times New Roman"/>
+            <w:color w:val="000000"/>
+            <w:sz w:val="28"/>
+            <w:szCs w:val="28"/>
+            <w:b/>
+            <w:bCs/>
+          </w:rPr>
+          <w:t>GHI CHÚ HOÀN THIỆN CA THỰC TẾ — CẦN BỔ SUNG TRƯỚC KHI CHỐT BÁO CÁO</w:t>
+        </w:r>
+      </w:ins>
+    </w:p>
+    <w:p>
+      <w:pPr>
+        <w:spacing w:before="0" w:after="0" w:line="360" w:lineRule="auto"/>
+        <w:ind w:firstLine="720"/>
+        <w:jc w:val="both"/>
+        <w:keepLines/>
+      </w:pPr>
+      <w:ins w:id="40" w:author="Codex" w:date="2026-09-28T18:00:23Z">
+        <w:r>
+          <w:rPr>
+            <w:rFonts w:ascii="Times New Roman" w:hAnsi="Times New Roman" w:eastAsia="Times New Roman" w:cs="Times New Roman"/>
+            <w:color w:val="000000"/>
+            <w:sz w:val="28"/>
+            <w:szCs w:val="28"/>
+          </w:rPr>
+          <w:t>Dự thảo theo thông tin đã xác nhận: Định hướng Network được giao trước kỳ thực tập. Trong bộ phận BSP trên nền tảng Qualcomm/Linux, hiện đang tìm hiểu và debug một bo mạch có nội dung liên quan đến Network, với tài liệu và hướng dẫn của kỹ sư đi trước. Nội dung có thể mô tả ở mức quá trình tiếp cận đang tiếp diễn; chưa có căn cứ để nêu giao diện, triệu chứng, nguyên nhân, thao tác cụ thể hoặc kết quả kỹ thuật.</w:t>
+        </w:r>
+      </w:ins>
+    </w:p>
+    <w:p>
+      <w:pPr>
+        <w:spacing w:before="0" w:after="0" w:line="360" w:lineRule="auto"/>
+        <w:ind w:left="0"/>
+        <w:keepNext/>
+        <w:keepLines/>
+      </w:pPr>
+      <w:ins w:id="41" w:author="Codex" w:date="2026-09-28T18:00:23Z">
+        <w:r>
+          <w:rPr>
+            <w:rFonts w:ascii="Times New Roman" w:hAnsi="Times New Roman" w:eastAsia="Times New Roman" w:cs="Times New Roman"/>
+            <w:color w:val="000000"/>
+            <w:sz w:val="28"/>
+            <w:szCs w:val="28"/>
+            <w:b/>
+            <w:bCs/>
+          </w:rPr>
+          <w:t>CÁC DỮ KIỆN CẦN BỔ SUNG (chỉ cung cấp mức được phép công bố)</w:t>
+        </w:r>
+      </w:ins>
+    </w:p>
+    <w:p>
+      <w:pPr>
+        <w:spacing w:before="0" w:after="0" w:line="360" w:lineRule="auto"/>
+        <w:ind w:left="360" w:hanging="360"/>
+        <w:jc w:val="both"/>
+        <w:keepLines/>
+      </w:pPr>
+      <w:ins w:id="42" w:author="Codex" w:date="2026-09-28T18:00:23Z">
+        <w:r>
+          <w:rPr>
+            <w:rFonts w:ascii="Times New Roman" w:hAnsi="Times New Roman" w:eastAsia="Times New Roman" w:cs="Times New Roman"/>
+            <w:color w:val="000000"/>
+            <w:sz w:val="28"/>
+            <w:szCs w:val="28"/>
+          </w:rPr>
+          <w:t>• Mã dự án/bo mạch đã ẩn danh và quyền sử dụng tên, ảnh, sơ đồ; nếu không thể nêu, xác nhận cách gọi chung.</w:t>
+        </w:r>
+      </w:ins>
+    </w:p>
+    <w:p>
+      <w:pPr>
+        <w:spacing w:before="0" w:after="0" w:line="360" w:lineRule="auto"/>
+        <w:ind w:left="360" w:hanging="360"/>
+        <w:jc w:val="both"/>
+        <w:keepLines/>
+      </w:pPr>
+      <w:ins w:id="43" w:author="Codex" w:date="2026-09-28T18:00:23Z">
+        <w:r>
+          <w:rPr>
+            <w:rFonts w:ascii="Times New Roman" w:hAnsi="Times New Roman" w:eastAsia="Times New Roman" w:cs="Times New Roman"/>
+            <w:color w:val="000000"/>
+            <w:sz w:val="28"/>
+            <w:szCs w:val="28"/>
+          </w:rPr>
+          <w:t>• Nền tảng có thể công bố: SoC, model bo, phiên bản Linux/phần mềm, loại kết nối liên quan (Ethernet, Wi-Fi, modem...) — các chi tiết này hiện chưa được xác nhận.</w:t>
+        </w:r>
+      </w:ins>
+    </w:p>
+    <w:p>
+      <w:pPr>
+        <w:spacing w:before="0" w:after="0" w:line="360" w:lineRule="auto"/>
+        <w:ind w:left="360" w:hanging="360"/>
+        <w:jc w:val="both"/>
+        <w:keepLines/>
+      </w:pPr>
+      <w:ins w:id="44" w:author="Codex" w:date="2026-09-28T18:00:23Z">
+        <w:r>
+          <w:rPr>
+            <w:rFonts w:ascii="Times New Roman" w:hAnsi="Times New Roman" w:eastAsia="Times New Roman" w:cs="Times New Roman"/>
+            <w:color w:val="000000"/>
+            <w:sz w:val="28"/>
+            <w:szCs w:val="28"/>
+          </w:rPr>
+          <w:t>• Mục tiêu chức năng, điều kiện ban đầu, hành vi mong đợi, biểu hiện quan sát được và cách tái hiện nếu được phép.</w:t>
+        </w:r>
+      </w:ins>
+    </w:p>
+    <w:p>
+      <w:pPr>
+        <w:spacing w:before="0" w:after="0" w:line="360" w:lineRule="auto"/>
+        <w:ind w:left="360" w:hanging="360"/>
+        <w:jc w:val="both"/>
+        <w:keepLines/>
+      </w:pPr>
+      <w:ins w:id="45" w:author="Codex" w:date="2026-09-28T18:00:23Z">
+        <w:r>
+          <w:rPr>
+            <w:rFonts w:ascii="Times New Roman" w:hAnsi="Times New Roman" w:eastAsia="Times New Roman" w:cs="Times New Roman"/>
+            <w:color w:val="000000"/>
+            <w:sz w:val="28"/>
+            <w:szCs w:val="28"/>
+          </w:rPr>
+          <w:t>• Phạm vi cá nhân: nội dung được giao; phần trực tiếp thao tác so với quan sát/được hướng dẫn; công cụ và thay đổi thực tế.</w:t>
+        </w:r>
+      </w:ins>
+    </w:p>
+    <w:p>
+      <w:pPr>
+        <w:spacing w:before="0" w:after="0" w:line="360" w:lineRule="auto"/>
+        <w:ind w:left="360" w:hanging="360"/>
+        <w:jc w:val="both"/>
+        <w:keepLines/>
+      </w:pPr>
+      <w:ins w:id="46" w:author="Codex" w:date="2026-09-28T18:00:23Z">
+        <w:r>
+          <w:rPr>
+            <w:rFonts w:ascii="Times New Roman" w:hAnsi="Times New Roman" w:eastAsia="Times New Roman" w:cs="Times New Roman"/>
+            <w:color w:val="000000"/>
+            <w:sz w:val="28"/>
+            <w:szCs w:val="28"/>
+          </w:rPr>
+          <w:t>• Bằng chứng đã thu thập, giả thuyết đã kiểm tra, trạng thái hiện tại và kết quả được người hướng dẫn xác nhận.</w:t>
+        </w:r>
+      </w:ins>
+    </w:p>
+    <w:p>
+      <w:pPr>
+        <w:spacing w:before="0" w:after="0" w:line="360" w:lineRule="auto"/>
+        <w:ind w:left="360" w:hanging="360"/>
+        <w:jc w:val="both"/>
+        <w:keepLines/>
+      </w:pPr>
+      <w:ins w:id="47" w:author="Codex" w:date="2026-09-28T18:00:23Z">
+        <w:r>
+          <w:rPr>
+            <w:rFonts w:ascii="Times New Roman" w:hAnsi="Times New Roman" w:eastAsia="Times New Roman" w:cs="Times New Roman"/>
+            <w:color w:val="000000"/>
+            <w:sz w:val="28"/>
+            <w:szCs w:val="28"/>
+          </w:rPr>
+          <w:t>• Ảnh/sơ đồ thực tế đã được duyệt công bố (nếu có); hiện chưa có ảnh/sơ đồ bo mạch thực tập được phép sử dụng.</w:t>
+        </w:r>
+      </w:ins>
+    </w:p>
+    <w:p>
+      <w:pPr>
+        <w:spacing w:before="0" w:after="0" w:line="360" w:lineRule="auto"/>
+        <w:ind w:left="0"/>
+        <w:keepLines/>
+      </w:pPr>
+      <w:ins w:id="48" w:author="Codex" w:date="2026-09-28T18:00:23Z">
+        <w:r>
+          <w:rPr>
+            <w:rFonts w:ascii="Times New Roman" w:hAnsi="Times New Roman" w:eastAsia="Times New Roman" w:cs="Times New Roman"/>
+            <w:color w:val="000000"/>
+            <w:sz w:val="28"/>
+            <w:szCs w:val="28"/>
+            <w:i/>
+          </w:rPr>
+          <w:t>Ghi chú biên tập tạm thời: thay bằng nội dung đã xác minh hoặc xóa trước khi nộp.</w:t>
+        </w:r>
+      </w:ins>
     </w:p>
     <w:p>
       <w:pPr>
@@ -21474,7 +22120,7 @@
               <wp:inline xmlns:wp="http://schemas.openxmlformats.org/drawingml/2006/wordprocessingDrawing" distT="0" distB="0" distL="0" distR="0">
                 <wp:extent cx="5074920" cy="2854642"/>
                 <wp:effectExtent l="0" t="0" r="0" b="0"/>
-                <wp:docPr id="13" name="Picture 903694905" descr="Sơ đồ khối vẽ lại bằng draw.io, trình bày khái quát theo tài liệu công khai." title="Hình 2.4. Vòng lặp phân tích, thử nghiệm và cập nhật giả thuyết"/>
+                <wp:docPr id="14" name="Picture 903694905" descr="Quy trình lặp phân tích dựa trên bằng chứng, kèm dữ kiện đã xác nhận và dữ kiện còn cần bổ sung cho ca Network." title="Hình 2.4. Vòng lặp phân tích, thử nghiệm và cập nhật giả thuyết"/>
                 <wp:cNvGraphicFramePr>
                   <a:graphicFrameLocks xmlns:a="http://schemas.openxmlformats.org/drawingml/2006/main" noChangeAspect="1"/>
                 </wp:cNvGraphicFramePr>
@@ -21489,7 +22135,7 @@
                         <pic:nvPr/>
                       </pic:nvPicPr>
                       <pic:blipFill rotWithShape="1">
-                        <a:blip r:embed="rId24"/>
+                        <a:blip r:embed="rId25"/>
                         <a:stretch/>
                       </pic:blipFill>
                       <pic:spPr bwMode="auto">
@@ -21528,8 +22174,8 @@
                 <v:path o:extrusionok="f" gradientshapeok="t" o:connecttype="rect"/>
                 <o:lock v:ext="edit" aspectratio="t"/>
               </v:shapetype>
-              <v:shape id="_x0000_i12" o:spid="_x0000_s12" type="#_x0000_t75" style="width:399.60pt;height:224.77pt;mso-wrap-distance-left:0.00pt;mso-wrap-distance-top:0.00pt;mso-wrap-distance-right:0.00pt;mso-wrap-distance-bottom:0.00pt;z-index:1;" stroked="false">
-                <v:imagedata r:id="rId24" o:title=""/>
+              <v:shape id="_x0000_i13" o:spid="_x0000_s13" type="#_x0000_t75" style="width:399.60pt;height:224.77pt;mso-wrap-distance-left:0.00pt;mso-wrap-distance-top:0.00pt;mso-wrap-distance-right:0.00pt;mso-wrap-distance-bottom:0.00pt;z-index:1;" stroked="false">
+                <v:imagedata r:id="rId25" o:title=""/>
                 <o:lock v:ext="edit" rotation="t"/>
               </v:shape>
             </w:pict>
@@ -22246,7 +22892,41 @@
           <w:szCs w:val="28"/>
           <w:lang w:val="vi-VN"/>
         </w:rPr>
-        <w:t xml:space="preserve">nền tảng Qualcomm, quá trình build và bring-up, mô hình mạng, driver và Wi-Fi là những nội dung cần hiểu để tiếp cận công việc. Quá trình tìm hiểu gồm củng cố kiến thức, đọc tài liệu, làm quen với bo mạch phát triển và tiếp tục tìm hiểu một vấn đề Network.</w:t>
+        <w:t xml:space="preserve">nền tảng Qualcomm, quá trình build và </w:t>
+      </w:r>
+      <w:del w:id="33" w:author="Codex" w:date="2026-09-28T17:41:36Z">
+        <w:r>
+          <w:rPr>
+            <w:rFonts w:ascii="Times New Roman" w:hAnsi="Times New Roman" w:eastAsia="Times New Roman" w:cs="Times New Roman"/>
+            <w:color w:val="000000"/>
+            <w:sz w:val="28"/>
+            <w:szCs w:val="28"/>
+            <w:lang w:val="vi-VN"/>
+          </w:rPr>
+          <w:delText>b</w:delText>
+        </w:r>
+      </w:del>
+      <w:ins w:id="34" w:author="Codex" w:date="2026-09-28T17:41:36Z">
+        <w:r>
+          <w:rPr>
+            <w:rFonts w:ascii="Times New Roman" w:hAnsi="Times New Roman" w:eastAsia="Times New Roman" w:cs="Times New Roman"/>
+            <w:color w:val="000000"/>
+            <w:sz w:val="28"/>
+            <w:szCs w:val="28"/>
+            <w:lang w:val="vi-VN"/>
+          </w:rPr>
+          <w:t>B</w:t>
+        </w:r>
+      </w:ins>
+      <w:r>
+        <w:rPr>
+          <w:rFonts w:ascii="Times New Roman" w:hAnsi="Times New Roman" w:eastAsia="Times New Roman" w:cs="Times New Roman"/>
+          <w:color w:val="000000"/>
+          <w:sz w:val="28"/>
+          <w:szCs w:val="28"/>
+          <w:lang w:val="vi-VN"/>
+        </w:rPr>
+        <w:t>ring-up, mô hình mạng, driver và Wi-Fi là những nội dung cần hiểu để tiếp cận công việc. Quá trình tìm hiểu gồm củng cố kiến thức, đọc tài liệu, làm quen với bo mạch phát triển và tiếp tục tìm hiểu một vấn đề Network.</w:t>
       </w:r>
       <w:r>
         <w:rPr>
@@ -23317,7 +23997,38 @@
                 <w:color w:val="000000"/>
                 <w:sz w:val="28"/>
               </w:rPr>
-              <w:t xml:space="preserve">Qualcomm/BSP/bring-up</w:t>
+              <w:t>Qualcomm/BSP/</w:t>
+            </w:r>
+            <w:del w:id="35" w:author="Codex" w:date="2026-09-28T17:41:36Z">
+              <w:r>
+                <w:rPr>
+                  <w:rFonts w:ascii="Times New Roman" w:hAnsi="Times New Roman" w:eastAsia="Times New Roman" w:cs="Times New Roman"/>
+                  <w:b w:val="0"/>
+                  <w:color w:val="000000"/>
+                  <w:sz w:val="28"/>
+                </w:rPr>
+                <w:delText>b</w:delText>
+              </w:r>
+            </w:del>
+            <w:ins w:id="36" w:author="Codex" w:date="2026-09-28T17:41:36Z">
+              <w:r>
+                <w:rPr>
+                  <w:rFonts w:ascii="Times New Roman" w:hAnsi="Times New Roman" w:eastAsia="Times New Roman" w:cs="Times New Roman"/>
+                  <w:b w:val="0"/>
+                  <w:color w:val="000000"/>
+                  <w:sz w:val="28"/>
+                </w:rPr>
+                <w:t>B</w:t>
+              </w:r>
+            </w:ins>
+            <w:r>
+              <w:rPr>
+                <w:rFonts w:ascii="Times New Roman" w:hAnsi="Times New Roman" w:eastAsia="Times New Roman" w:cs="Times New Roman"/>
+                <w:b w:val="0"/>
+                <w:color w:val="000000"/>
+                <w:sz w:val="28"/>
+              </w:rPr>
+              <w:t>ring-up</w:t>
             </w:r>
             <w:r/>
           </w:p>
@@ -25403,7 +26114,41 @@
           <w:szCs w:val="28"/>
           <w:lang w:val="vi-VN"/>
         </w:rPr>
-        <w:t xml:space="preserve">Quá trình thực tập tại Công ty Cổ phần HSPTEK tạo điều kiện tiếp cận môi trường phát triển phần mềm và bring-up phần cứng trên nền tảng Qualcomm tại bộ phận BSP. Qua</w:t>
+        <w:t xml:space="preserve">Quá trình thực tập tại Công ty Cổ phần HSPTEK tạo điều kiện tiếp cận môi trường phát triển phần mềm và </w:t>
+      </w:r>
+      <w:del w:id="37" w:author="Codex" w:date="2026-09-28T17:41:36Z">
+        <w:r>
+          <w:rPr>
+            <w:rFonts w:ascii="Times New Roman" w:hAnsi="Times New Roman" w:eastAsia="Times New Roman" w:cs="Times New Roman"/>
+            <w:color w:val="000000"/>
+            <w:sz w:val="28"/>
+            <w:szCs w:val="28"/>
+            <w:lang w:val="vi-VN"/>
+          </w:rPr>
+          <w:delText>b</w:delText>
+        </w:r>
+      </w:del>
+      <w:ins w:id="38" w:author="Codex" w:date="2026-09-28T17:41:36Z">
+        <w:r>
+          <w:rPr>
+            <w:rFonts w:ascii="Times New Roman" w:hAnsi="Times New Roman" w:eastAsia="Times New Roman" w:cs="Times New Roman"/>
+            <w:color w:val="000000"/>
+            <w:sz w:val="28"/>
+            <w:szCs w:val="28"/>
+            <w:lang w:val="vi-VN"/>
+          </w:rPr>
+          <w:t>B</w:t>
+        </w:r>
+      </w:ins>
+      <w:r>
+        <w:rPr>
+          <w:rFonts w:ascii="Times New Roman" w:hAnsi="Times New Roman" w:eastAsia="Times New Roman" w:cs="Times New Roman"/>
+          <w:color w:val="000000"/>
+          <w:sz w:val="28"/>
+          <w:szCs w:val="28"/>
+          <w:lang w:val="vi-VN"/>
+        </w:rPr>
+        <w:t>ring-up phần cứng trên nền tảng Qualcomm tại bộ phận BSP. Qua</w:t>
       </w:r>
       <w:r>
         <w:rPr>
@@ -26287,7 +27032,16 @@
           <w:color w:val="000000"/>
           <w:sz w:val="28"/>
         </w:rPr>
-        <w:t xml:space="preserve">[38] Ministry of Information and Communications, “Make in Vietnam businesses take on mission to turn VN into Asian tiger”, https://english.mic.gov.vn/make-in-vietnam-businesses-take-on-mission-to-turn-vn-into-asian-tiger-197250122152539906.htm (truy cập ngày 28/09/2026).</w:t>
+        <w:t xml:space="preserve">[38] Ministry o</w:t>
+      </w:r>
+      <w:r>
+        <w:rPr>
+          <w:rFonts w:ascii="Times New Roman" w:hAnsi="Times New Roman" w:eastAsia="Times New Roman" w:cs="Times New Roman"/>
+          <w:b w:val="0"/>
+          <w:color w:val="000000"/>
+          <w:sz w:val="28"/>
+        </w:rPr>
+        <w:t xml:space="preserve">f Information and Communications, “Make in Vietnam businesses take on mission to turn VN into Asian tiger”, https://english.mic.gov.vn/make-in-vietnam-businesses-take-on-mission-to-turn-vn-into-asian-tiger-197250122152539906.htm (truy cập ngày 28/09/2026).</w:t>
       </w:r>
       <w:r/>
     </w:p>
@@ -60467,7 +61221,7 @@
     <customSectPr/>
   </customSectProps>
   <customShpExts>
-    <customShpInfo spid="_x005F_x005F_x005F_x005F_x005F_x005F_x005F_x005F_x005F_x005F_x005F_x005F_x005F_x005F_x005F_x005F_x005F_x005F_x005F_x005F_x005F_x005F_x005F_x005F_x005F_x005F_x005F_x005F_x005F_x005F_x005F_x005F_x005F_x005F_x005F_x005F_x005F_x005F_x005F_x005F_x005F_x005F_x005F_x005F_x005F_x005F_x005F_x005F_x005F_x005F_x005F_x005F_x005F_x005F_x005F_x005F_x005F_x005F_x005F_x005F_x005F_x005F_x005F_x005F_x005F_x005F_x005F_x005F_x005F_x005F_x005F_x005F_x005F_x005F_x005F_x005F_x005F_x005F_x005F_x005F_x005F_x005F_x005F_x005F_x005F_x005F_x005F_x005F_x005F_x005F_x005F_x005F_x005F_x005F_x005F_x005F_x005F_x005F_x005F_x005F_x005F_x005F_x005F_x005F_x005F_x005F_x005F_x005F_x005F_x005F_x005F_x005F_x005F_x005F_x005F_x005F_x005F_x005F_x005F_x005F_x005F_x005F_x005F_x005F_x005F_x005F_x005F_x005F_x005F_x005F_x005F_x005F_x005F_x005F_x005F_x005F_x005F_x005F_x005F_x005F_x005F_x005F_x005F_x005F_x005F_x005F_x005F_x005F_x005F_x005F_x005F_x005F_x005F_x005F_x005F_x005F_x005F_x005F_x005F_x005F_x005F_x005F_x005F_x005F_x005F_x005F_x005F_x005F_x005F_x005F_x005F_x005F_x005F_x005F_x005F_x005F_x005F_x005F_x005F_x005F_x005F_x005F_x005F_x005F_x005F_x005F_x005F_x005F_x005F_x005F_x005F_x005F_x005F_x005F_x005F_x005F_x005F_x005F_x005F_x005F_x005F_x005F_x005F_x005F_x005F_x005F_x005F_x005F_x005F_x005F_x005F_x005F_x005F_x005F_x005F_x005F_x005F_x005F_x005F_x005F_x005F_x005F_x005F_x005F_x005F_x005F_x005F_x005F_x005F_x005F_x005F_x005F_x005F_x005F_x005F_x005F_x005F_x005F_x005F_x005F_x005F_x005F_x005F_x005F_x005F_x005F_x005F_x005F_x005F_x005F_x005F_x005F_x005F_x005F_x005F_x005F_x005F_x005F_x005F_x005F_x005F_x005F_x005F_x005F_x005F_x005F_x005F_x005F_x005F_x005F_x005F_x005F_x005F_x005F_x005F_x005F_x005F_x005F_x005F_x005F_x005F_x005F_x005F_x005F_x005F_x005F_x005F_x005F_x005F_x005F_x005F_x005F_x005F_x005F_x005F_x005F_x005F_x005F_x005F_x005F_x005F_x005F_x005F_x005F_x005F_x005F_x005F_x005F_x005F_x005F_x005F_x005F_x005F_x005F_x005F_x005F_x005F_x005F_x005F_x005F_x005F_x005F_x005F_x005F_x005F_x005F_x005F_x005F_x005F_x005F_x005F_x005F_x005F_x005F_x005F_x005F_x005F_x005F_x005F_x005F_x005F_x005F_x005F_x005F_x005F_x005F_x005F_x005F_x005F_x005F_x005F_x005F_x005F_x005F_x005F_x005F_x005F_x005F_x005F_x005F_x005F_x005F_x005F_x005F_x005F_x005F_x005F_x005F_x005F_x005F_x005F_x005F_x005F_x005F_x005F_x005F_x005F_x005F_x005F_x005F_x005F_x005F_x005F_x005F_x005F_x005F_x005F_x005F_x005F_x005F_x005F_x005F_x005F_x005F_x005F_x005F_x005F_x005F_x005F_x005F_x005F_x005F_x005F_x005F_x005F_x005F_x005F_x005F_x005F_x005F_x005F_x005F_x005F_x005F_x005F_x005F_x005F_x005F_x005F_x005F_x005F_x005F_x005F_x005F_x005F_x005F_x005F_x005F_x005F_x005F_x005F_x005F_x005F_x005F_x005F_x005F_x005F_x005F_x005F_x005F_x005F_x005F_x005F_x005F_x005F_x005F_x005F_x005F_x005F_x005F_x005F_x005F_x005F_x005F_x005F_x005F_x005F_x005F_x005F_x005F_x005F_x005F_x005F_x005F_x005F_x005F_x005F_x005F_x005F_x005F_x005F_x005F_x005F_x005F_x005F_x005F_x005F_x005F_x005F_x005F_x005F_x005F_x005F_x005F_x005F_x005F_x005F_x005F_x005F_x005F_x005F_x005F_x005F_x005F_x005F_x005F_x005F_x005F_x005F_x005F_x005F_x005F_x005F_x005F_x005F_x005F_x005F_x005F_x005F_x005F_x005F_x005F_x005F_x005F_x005F_x005F_x005F_x005F_x005F_x005F_x005F_x005F_x005F_x005F_x005F_x005F_x005F_x005F_x005F_x005F_x005F_x005F_x005F_x005F_x005F_x005F_x005F_x005F_x005F_x005F_x005F_x005F_x005F_x005F_x005F_x005F_x005F_x005F_x005F_x005F_x005F_x005F_x005F_x005F_x005F_x005F_x005F_x005F_x005F_x005F_x005F_x005F_x005F_x005F_x005F_x005F_x005F_x005F_x005F_x005F_x005F_x005F_x005F_x005F_x005F_x005F_x005F_x005F_x005F_x005F_x005F_x005F_x005F_x005F_x005F_x005F_x005F_x005F_x005F_x005F_x005F_x005F_x005F_x005F_x005F_x005F_x005F_x005F_x005F_x005F_x005F_x005F_x005F_x005F_x005F_x005F_x005F_x005F_x005F_x005F_x005F_x005F_x005F_x005F_x005F_x005F_x005F_x005F_x005F_x005F_x005F_x005F_x005F_x005F_x005F_x005F_x005F_x005F_x005F_x005F_x005F_x005F_x005F_x005F_x005F_x005F_x005F_x005F_x005F_x005F_x005F_x005F_x005F_x005F_x005F_x005F_x005F_x005F_x005F_x005F_x005F_x005F_x005F_x005F_x005F_x005F_x005F_x005F_x005F_x005F_x005F_x005F_x005F_x005F_x005F_x005F_x005F_x005F_x005F_x005F_x005F_x005F_x005F_x005F_x005F_x005F_x005F_x005F_x005F_x005F_x005F_x005F_x005F_x005F_x005F_x005F_x005F_x005F_x005F_x005F_x005F_x005F_x005F_x005F_x005F_x005F_x005F_x005F_x005F_x005F_x005F_x005F_x005F_x005F_x005F_x005F_x005F_x005F_x005F_x005F_x005F_x005F_x005F_x005F_x005F_x005F_x005F_x005F_x005F_x005F_x005F_x005F_x005F_x005F_x005F_x005F_x005F_x005F_x005F_x005F_x005F_x005F_x005F_x005F_x005F_x005F_x005F_x005F_x005F_x005F_x005F_x005F_x005F_x005F_x005F_x005F_x005F_x005F_x005F_x005F_x005F_x005F_x005F_x005F_x005F_x005F_x005F_x005F_x005F_x005F_x005F_x005F_x005F_x005F_x005F_x005F_x005F_x005F_x005F_x005F_x005F_x005F_x005F_x005F_x005F_x005F_x005F_x005F_x005F_x005F_x005F_x005F_x005F_x005F_x005F_x005F_x005F_x005F_x005F_x005F_x005F_x005F_x005F_x005F_x005F_x005F_x005F_x005F_x005F_x005F_x005F_x005F_x005F_x005F_x005F_x005F_x005F_x005F_x005F_x005F_x005F_x005F_x005F_x005F_x005F_x005F_x005F_x005F_x005F_x005F_x005F_x005F_x005F_x005F_x005F_x005F_x005F_x005F_x005F_x005F_x005F_x005F_x005F_x005F_x005F_x005F_x005F_x005F_x005F_x005F_x005F_x005F_x005F_x005F_x005F_x005F_x005F_x005F_x005F_x005F_x005F_x005F_x005F_x005F_x005F_x005F_x005F_x005F_x005F_x005F_x005F_x005F_x005F_x005F_x005F_x005F_x005F_x005F_x005F_x005F_x005F_x005F_x005F_x005F_x005F_x005F_x005F_x005F_x005F_x005F_x005F_x005F_x005F_x005F_x005F_x005F_x005F_x005F_x005F_x005F_x005F_x005F_x005F_x005F_x005F_x005F_x005F_x005F_x005F_x005F_x005F_x005F_x005F_x005F_x005F_x005F_x005F_x005F_x005F_x005F_x005F_x005F_x005F_x005F_x005F_x005F_x005F_x005F_x005F_x005F_x005F_x005F_x005F_x005F_x005F_x005F_x005F_x005F_x005F_x005F_x005F_x005F_x005F_x005F_x005F_x005F_x005F_x005F_x005F_x005F_x005F_x005F_x005F_x005F_x005F_x005F_x005F_x005F_x005F_x005F_x005F_x005F_x005F_x005F_x005F_x005F_x005F_x005F_x005F_x005F_x005F_x005F_x005F_x005F_x005F_x005F_x005F_x005F_x005F_x005F_x005F_x005F_x005F_x005F_x005F_x005F_x005F_x005F_x005F_x005F_x005F_x005F_x005F_x005F_x005F_x005F_x005F_x005F_x005F_x005F_x005F_x005F_x005F_x005F_x005F_x005F_x005F_x005F_x005F_x005F_x005F_x005F_x005F_x005F_x005F_x005F_x005F_x005F_x005F_x005F_x005F_x005F_x005F_x005F_x005F_x005F_x005F_x005F_x005F_x005F_x005F_x005F_x005F_x0000_s1026" textRotate="1"/>
+    <customShpInfo spid="_x005F_x005F_x005F_x005F_x005F_x005F_x005F_x005F_x005F_x005F_x005F_x005F_x005F_x005F_x005F_x005F_x005F_x005F_x005F_x005F_x005F_x005F_x005F_x005F_x005F_x005F_x005F_x005F_x005F_x005F_x005F_x005F_x005F_x005F_x005F_x005F_x005F_x005F_x005F_x005F_x005F_x005F_x005F_x005F_x005F_x005F_x005F_x005F_x005F_x005F_x005F_x005F_x005F_x005F_x005F_x005F_x005F_x005F_x005F_x005F_x005F_x005F_x005F_x005F_x005F_x005F_x005F_x005F_x005F_x005F_x005F_x005F_x005F_x005F_x005F_x005F_x005F_x005F_x005F_x005F_x005F_x005F_x005F_x005F_x005F_x005F_x005F_x005F_x005F_x005F_x005F_x005F_x005F_x005F_x005F_x005F_x005F_x005F_x005F_x005F_x005F_x005F_x005F_x005F_x005F_x005F_x005F_x005F_x005F_x005F_x005F_x005F_x005F_x005F_x005F_x005F_x005F_x005F_x005F_x005F_x005F_x005F_x005F_x005F_x005F_x005F_x005F_x005F_x005F_x005F_x005F_x005F_x005F_x005F_x005F_x005F_x005F_x005F_x005F_x005F_x005F_x005F_x005F_x005F_x005F_x005F_x005F_x005F_x005F_x005F_x005F_x005F_x005F_x005F_x005F_x005F_x005F_x005F_x005F_x005F_x005F_x005F_x005F_x005F_x005F_x005F_x005F_x005F_x005F_x005F_x005F_x005F_x005F_x005F_x005F_x005F_x005F_x005F_x005F_x005F_x005F_x005F_x005F_x005F_x005F_x005F_x005F_x005F_x005F_x005F_x005F_x005F_x005F_x005F_x005F_x005F_x005F_x005F_x005F_x005F_x005F_x005F_x005F_x005F_x005F_x005F_x005F_x005F_x005F_x005F_x005F_x005F_x005F_x005F_x005F_x005F_x005F_x005F_x005F_x005F_x005F_x005F_x005F_x005F_x005F_x005F_x005F_x005F_x005F_x005F_x005F_x005F_x005F_x005F_x005F_x005F_x005F_x005F_x005F_x005F_x005F_x005F_x005F_x005F_x005F_x005F_x005F_x005F_x005F_x005F_x005F_x005F_x005F_x005F_x005F_x005F_x005F_x005F_x005F_x005F_x005F_x005F_x005F_x005F_x005F_x005F_x005F_x005F_x005F_x005F_x005F_x005F_x005F_x005F_x005F_x005F_x005F_x005F_x005F_x005F_x005F_x005F_x005F_x005F_x005F_x005F_x005F_x005F_x005F_x005F_x005F_x005F_x005F_x005F_x005F_x005F_x005F_x005F_x005F_x005F_x005F_x005F_x005F_x005F_x005F_x005F_x005F_x005F_x005F_x005F_x005F_x005F_x005F_x005F_x005F_x005F_x005F_x005F_x005F_x005F_x005F_x005F_x005F_x005F_x005F_x005F_x005F_x005F_x005F_x005F_x005F_x005F_x005F_x005F_x005F_x005F_x005F_x005F_x005F_x005F_x005F_x005F_x005F_x005F_x005F_x005F_x005F_x005F_x005F_x005F_x005F_x005F_x005F_x005F_x005F_x005F_x005F_x005F_x005F_x005F_x005F_x005F_x005F_x005F_x005F_x005F_x005F_x005F_x005F_x005F_x005F_x005F_x005F_x005F_x005F_x005F_x005F_x005F_x005F_x005F_x005F_x005F_x005F_x005F_x005F_x005F_x005F_x005F_x005F_x005F_x005F_x005F_x005F_x005F_x005F_x005F_x005F_x005F_x005F_x005F_x005F_x005F_x005F_x005F_x005F_x005F_x005F_x005F_x005F_x005F_x005F_x005F_x005F_x005F_x005F_x005F_x005F_x005F_x005F_x005F_x005F_x005F_x005F_x005F_x005F_x005F_x005F_x005F_x005F_x005F_x005F_x005F_x005F_x005F_x005F_x005F_x005F_x005F_x005F_x005F_x005F_x005F_x005F_x005F_x005F_x005F_x005F_x005F_x005F_x005F_x005F_x005F_x005F_x005F_x005F_x005F_x005F_x005F_x005F_x005F_x005F_x005F_x005F_x005F_x005F_x005F_x005F_x005F_x005F_x005F_x005F_x005F_x005F_x005F_x005F_x005F_x005F_x005F_x005F_x005F_x005F_x005F_x005F_x005F_x005F_x005F_x005F_x005F_x005F_x005F_x005F_x005F_x005F_x005F_x005F_x005F_x005F_x005F_x005F_x005F_x005F_x005F_x005F_x005F_x005F_x005F_x005F_x005F_x005F_x005F_x005F_x005F_x005F_x005F_x005F_x005F_x005F_x005F_x005F_x005F_x005F_x005F_x005F_x005F_x005F_x005F_x005F_x005F_x005F_x005F_x005F_x005F_x005F_x005F_x005F_x005F_x005F_x005F_x005F_x005F_x005F_x005F_x005F_x005F_x005F_x005F_x005F_x005F_x005F_x005F_x005F_x005F_x005F_x005F_x005F_x005F_x005F_x005F_x005F_x005F_x005F_x005F_x005F_x005F_x005F_x005F_x005F_x005F_x005F_x005F_x005F_x005F_x005F_x005F_x005F_x005F_x005F_x005F_x005F_x005F_x005F_x005F_x005F_x005F_x005F_x005F_x005F_x005F_x005F_x005F_x005F_x005F_x005F_x005F_x005F_x005F_x005F_x005F_x005F_x005F_x005F_x005F_x005F_x005F_x005F_x005F_x005F_x005F_x005F_x005F_x005F_x005F_x005F_x005F_x005F_x005F_x005F_x005F_x005F_x005F_x005F_x005F_x005F_x005F_x005F_x005F_x005F_x005F_x005F_x005F_x005F_x005F_x005F_x005F_x005F_x005F_x005F_x005F_x005F_x005F_x005F_x005F_x005F_x005F_x005F_x005F_x005F_x005F_x005F_x005F_x005F_x005F_x005F_x005F_x005F_x005F_x005F_x005F_x005F_x005F_x005F_x005F_x005F_x005F_x005F_x005F_x005F_x005F_x005F_x005F_x005F_x005F_x005F_x005F_x005F_x005F_x005F_x005F_x005F_x005F_x005F_x005F_x005F_x005F_x005F_x005F_x005F_x005F_x005F_x005F_x005F_x005F_x005F_x005F_x005F_x005F_x005F_x005F_x005F_x005F_x005F_x005F_x005F_x005F_x005F_x005F_x005F_x005F_x005F_x005F_x005F_x005F_x005F_x005F_x005F_x005F_x005F_x005F_x005F_x005F_x005F_x005F_x005F_x005F_x005F_x005F_x005F_x005F_x005F_x005F_x005F_x005F_x005F_x005F_x005F_x005F_x005F_x005F_x005F_x005F_x005F_x005F_x005F_x005F_x005F_x005F_x005F_x005F_x005F_x005F_x005F_x005F_x005F_x005F_x005F_x005F_x005F_x005F_x005F_x005F_x005F_x005F_x005F_x005F_x005F_x005F_x005F_x005F_x005F_x005F_x005F_x005F_x005F_x005F_x005F_x005F_x005F_x005F_x005F_x005F_x005F_x005F_x005F_x005F_x005F_x005F_x005F_x005F_x005F_x005F_x005F_x005F_x005F_x005F_x005F_x005F_x005F_x005F_x005F_x005F_x005F_x005F_x005F_x005F_x005F_x005F_x005F_x005F_x005F_x005F_x005F_x005F_x005F_x005F_x005F_x005F_x005F_x005F_x005F_x005F_x005F_x005F_x005F_x005F_x005F_x005F_x005F_x005F_x005F_x005F_x005F_x005F_x005F_x005F_x005F_x005F_x005F_x005F_x005F_x005F_x005F_x005F_x005F_x005F_x005F_x005F_x005F_x005F_x005F_x005F_x005F_x005F_x005F_x005F_x005F_x005F_x005F_x005F_x005F_x005F_x005F_x005F_x005F_x005F_x005F_x005F_x005F_x005F_x005F_x005F_x005F_x005F_x005F_x005F_x005F_x005F_x005F_x005F_x005F_x005F_x005F_x005F_x005F_x005F_x005F_x005F_x005F_x005F_x005F_x005F_x005F_x005F_x005F_x005F_x005F_x005F_x005F_x005F_x005F_x005F_x005F_x005F_x005F_x005F_x005F_x005F_x005F_x005F_x005F_x005F_x005F_x005F_x005F_x005F_x005F_x005F_x005F_x005F_x005F_x005F_x005F_x005F_x005F_x005F_x005F_x005F_x005F_x005F_x005F_x005F_x005F_x005F_x005F_x005F_x005F_x005F_x005F_x005F_x005F_x005F_x005F_x005F_x005F_x005F_x005F_x005F_x005F_x005F_x005F_x005F_x005F_x005F_x005F_x005F_x005F_x005F_x005F_x005F_x005F_x005F_x005F_x005F_x005F_x005F_x005F_x005F_x005F_x005F_x005F_x005F_x005F_x005F_x005F_x005F_x005F_x005F_x005F_x005F_x005F_x005F_x005F_x005F_x005F_x005F_x005F_x005F_x005F_x005F_x005F_x005F_x005F_x005F_x005F_x005F_x005F_x005F_x005F_x005F_x005F_x005F_x005F_x005F_x005F_x005F_x005F_x005F_x005F_x005F_x005F_x005F_x005F_x005F_x005F_x005F_x005F_x005F_x005F_x005F_x005F_x005F_x005F_x005F_x005F_x005F_x005F_x005F_x005F_x005F_x005F_x005F_x005F_x005F_x005F_x005F_x005F_x005F_x005F_x005F_x005F_x005F_x005F_x005F_x005F_x005F_x005F_x005F_x005F_x005F_x005F_x005F_x005F_x005F_x005F_x005F_x005F_x005F_x005F_x005F_x005F_x005F_x005F_x005F_x005F_x005F_x005F_x005F_x005F_x005F_x005F_x005F_x005F_x005F_x005F_x005F_x005F_x005F_x005F_x005F_x005F_x005F_x005F_x005F_x005F_x005F_x005F_x005F_x005F_x005F_x005F_x005F_x005F_x005F_x005F_x005F_x005F_x005F_x005F_x005F_x005F_x005F_x005F_x005F_x005F_x005F_x005F_x005F_x005F_x005F_x005F_x005F_x005F_x005F_x005F_x005F_x005F_x005F_x005F_x005F_x005F_x005F_x005F_x005F_x005F_x005F_x005F_x005F_x005F_x005F_x005F_x005F_x005F_x005F_x005F_x005F_x005F_x005F_x005F_x005F_x005F_x005F_x005F_x005F_x005F_x005F_x005F_x005F_x005F_x005F_x005F_x005F_x005F_x005F_x005F_x005F_x005F_x005F_x005F_x005F_x005F_x005F_x005F_x005F_x005F_x005F_x005F_x005F_x005F_x005F_x005F_x005F_x005F_x005F_x005F_x005F_x005F_x005F_x005F_x005F_x005F_x005F_x005F_x005F_x005F_x005F_x005F_x005F_x005F_x005F_x005F_x005F_x005F_x005F_x005F_x005F_x005F_x005F_x005F_x005F_x005F_x005F_x005F_x005F_x005F_x005F_x005F_x005F_x005F_x005F_x005F_x005F_x005F_x005F_x005F_x005F_x005F_x005F_x005F_x005F_x005F_x005F_x005F_x005F_x005F_x005F_x005F_x005F_x005F_x005F_x005F_x005F_x005F_x005F_x005F_x005F_x005F_x005F_x005F_x005F_x005F_x005F_x005F_x005F_x005F_x005F_x005F_x005F_x005F_x005F_x005F_x005F_x005F_x005F_x005F_x005F_x005F_x005F_x005F_x005F_x005F_x005F_x005F_x005F_x005F_x005F_x005F_x005F_x005F_x005F_x005F_x005F_x005F_x005F_x005F_x005F_x005F_x005F_x005F_x005F_x005F_x005F_x005F_x005F_x005F_x005F_x005F_x005F_x005F_x005F_x005F_x005F_x005F_x005F_x005F_x005F_x005F_x005F_x005F_x005F_x005F_x005F_x005F_x005F_x005F_x005F_x005F_x005F_x005F_x005F_x005F_x005F_x005F_x005F_x005F_x005F_x005F_x005F_x005F_x005F_x005F_x005F_x005F_x005F_x005F_x005F_x005F_x005F_x005F_x005F_x005F_x005F_x005F_x005F_x005F_x005F_x005F_x005F_x005F_x005F_x005F_x005F_x005F_x005F_x005F_x005F_x005F_x005F_x005F_x005F_x005F_x005F_x005F_x005F_x005F_x005F_x005F_x005F_x005F_x005F_x005F_x005F_x005F_x005F_x005F_x005F_x005F_x005F_x005F_x005F_x005F_x005F_x005F_x005F_x005F_x005F_x005F_x005F_x005F_x005F_x005F_x005F_x005F_x005F_x005F_x005F_x005F_x005F_x005F_x005F_x005F_x005F_x005F_x005F_x005F_x005F_x005F_x005F_x005F_x005F_x005F_x005F_x005F_x005F_x005F_x005F_x005F_x005F_x005F_x005F_x005F_x005F_x005F_x005F_x005F_x005F_x005F_x005F_x005F_x005F_x005F_x005F_x005F_x005F_x005F_x005F_x005F_x005F_x005F_x005F_x005F_x005F_x005F_x005F_x005F_x005F_x005F_x005F_x005F_x005F_x005F_x005F_x005F_x005F_x005F_x005F_x005F_x005F_x005F_x005F_x005F_x005F_x005F_x005F_x005F_x005F_x005F_x005F_x005F_x005F_x005F_x005F_x005F_x005F_x005F_x005F_x005F_x005F_x005F_x005F_x005F_x005F_x005F_x005F_x005F_x005F_x005F_x005F_x005F_x005F_x005F_x005F_x005F_x005F_x005F_x005F_x005F_x005F_x005F_x005F_x005F_x005F_x005F_x005F_x005F_x005F_x005F_x005F_x005F_x005F_x005F_x005F_x005F_x005F_x005F_x005F_x005F_x005F_x005F_x005F_x005F_x005F_x005F_x005F_x005F_x005F_x005F_x005F_x005F_x005F_x005F_x005F_x005F_x005F_x005F_x005F_x005F_x005F_x005F_x005F_x005F_x005F_x005F_x005F_x005F_x005F_x005F_x005F_x005F_x005F_x005F_x005F_x005F_x005F_x005F_x005F_x005F_x005F_x005F_x005F_x005F_x005F_x005F_x005F_x005F_x005F_x005F_x005F_x005F_x005F_x005F_x005F_x005F_x005F_x005F_x005F_x005F_x005F_x005F_x005F_x005F_x005F_x005F_x005F_x005F_x005F_x005F_x005F_x005F_x005F_x005F_x005F_x005F_x005F_x005F_x005F_x005F_x005F_x005F_x005F_x005F_x005F_x005F_x005F_x005F_x005F_x005F_x005F_x005F_x005F_x005F_x005F_x005F_x005F_x005F_x005F_x005F_x005F_x005F_x005F_x005F_x005F_x005F_x005F_x005F_x005F_x005F_x005F_x005F_x005F_x005F_x005F_x005F_x005F_x005F_x005F_x005F_x005F_x005F_x005F_x005F_x005F_x005F_x005F_x005F_x005F_x005F_x005F_x005F_x005F_x005F_x005F_x005F_x005F_x005F_x005F_x005F_x005F_x005F_x005F_x005F_x005F_x005F_x005F_x005F_x005F_x005F_x005F_x005F_x005F_x005F_x005F_x005F_x005F_x005F_x005F_x005F_x005F_x005F_x005F_x005F_x005F_x005F_x005F_x005F_x005F_x005F_x005F_x005F_x005F_x005F_x005F_x005F_x005F_x005F_x005F_x005F_x005F_x005F_x005F_x005F_x005F_x005F_x005F_x005F_x005F_x005F_x005F_x005F_x005F_x005F_x005F_x005F_x005F_x005F_x005F_x005F_x005F_x005F_x005F_x005F_x005F_x005F_x005F_x005F_x005F_x005F_x005F_x005F_x005F_x005F_x005F_x005F_x005F_x005F_x005F_x005F_x005F_x005F_x005F_x005F_x005F_x005F_x005F_x005F_x005F_x005F_x005F_x005F_x005F_x005F_x005F_x005F_x005F_x005F_x005F_x005F_x005F_x005F_x005F_x005F_x005F_x005F_x005F_x005F_x005F_x005F_x005F_x005F_x005F_x005F_x005F_x005F_x005F_x005F_x005F_x005F_x005F_x005F_x005F_x005F_x005F_x005F_x005F_x005F_x005F_x005F_x005F_x005F_x005F_x005F_x005F_x005F_x005F_x005F_x005F_x005F_x005F_x005F_x005F_x005F_x005F_x005F_x005F_x005F_x005F_x005F_x005F_x005F_x005F_x005F_x005F_x005F_x005F_x005F_x005F_x005F_x005F_x005F_x005F_x005F_x005F_x005F_x005F_x005F_x005F_x005F_x005F_x005F_x005F_x005F_x005F_x005F_x005F_x005F_x005F_x005F_x005F_x005F_x005F_x005F_x005F_x005F_x005F_x005F_x005F_x005F_x005F_x005F_x005F_x005F_x005F_x005F_x005F_x005F_x005F_x005F_x005F_x005F_x005F_x005F_x005F_x005F_x005F_x005F_x005F_x005F_x005F_x005F_x005F_x005F_x005F_x005F_x005F_x005F_x005F_x005F_x005F_x005F_x005F_x005F_x005F_x005F_x005F_x005F_x005F_x005F_x005F_x005F_x005F_x005F_x005F_x005F_x005F_x005F_x005F_x005F_x005F_x005F_x005F_x005F_x005F_x005F_x005F_x005F_x005F_x005F_x005F_x005F_x005F_x005F_x005F_x005F_x005F_x005F_x005F_x005F_x005F_x005F_x005F_x005F_x005F_x005F_x005F_x005F_x005F_x005F_x005F_x005F_x005F_x005F_x005F_x005F_x005F_x005F_x005F_x005F_x005F_x005F_x005F_x005F_x005F_x005F_x005F_x005F_x005F_x005F_x005F_x005F_x005F_x005F_x005F_x005F_x005F_x005F_x005F_x005F_x005F_x005F_x005F_x005F_x005F_x005F_x005F_x005F_x005F_x005F_x005F_x005F_x005F_x005F_x005F_x005F_x005F_x005F_x005F_x005F_x005F_x005F_x005F_x005F_x005F_x005F_x005F_x005F_x005F_x005F_x005F_x005F_x005F_x005F_x005F_x005F_x005F_x005F_x005F_x005F_x005F_x005F_x005F_x005F_x005F_x005F_x005F_x005F_x005F_x005F_x005F_x005F_x005F_x005F_x005F_x005F_x005F_x005F_x005F_x005F_x005F_x005F_x005F_x005F_x005F_x005F_x005F_x005F_x005F_x005F_x005F_x005F_x005F_x005F_x005F_x005F_x005F_x005F_x005F_x005F_x005F_x005F_x005F_x005F_x005F_x005F_x005F_x005F_x005F_x005F_x005F_x005F_x005F_x005F_x005F_x005F_x005F_x005F_x005F_x005F_x005F_x005F_x005F_x005F_x005F_x005F_x005F_x005F_x005F_x005F_x005F_x005F_x005F_x005F_x005F_x005F_x005F_x005F_x005F_x005F_x005F_x005F_x005F_x005F_x005F_x005F_x005F_x005F_x005F_x005F_x005F_x005F_x005F_x005F_x005F_x005F_x005F_x005F_x005F_x005F_x005F_x005F_x005F_x005F_x005F_x005F_x005F_x005F_x005F_x005F_x005F_x005F_x005F_x005F_x005F_x005F_x005F_x005F_x005F_x005F_x005F_x005F_x005F_x005F_x005F_x005F_x005F_x005F_x005F_x005F_x005F_x005F_x005F_x005F_x005F_x005F_x005F_x005F_x005F_x005F_x005F_x005F_x005F_x005F_x005F_x005F_x005F_x005F_x005F_x005F_x005F_x005F_x005F_x005F_x005F_x005F_x005F_x005F_x005F_x005F_x005F_x005F_x005F_x005F_x005F_x005F_x005F_x005F_x005F_x005F_x005F_x005F_x005F_x005F_x005F_x005F_x005F_x005F_x005F_x005F_x005F_x005F_x005F_x005F_x005F_x005F_x005F_x005F_x005F_x005F_x005F_x005F_x005F_x005F_x005F_x005F_x005F_x005F_x005F_x005F_x005F_x005F_x005F_x005F_x005F_x005F_x005F_x005F_x005F_x005F_x005F_x005F_x005F_x005F_x005F_x005F_x005F_x005F_x005F_x005F_x005F_x005F_x005F_x005F_x005F_x005F_x005F_x005F_x005F_x005F_x005F_x005F_x005F_x005F_x005F_x005F_x005F_x005F_x005F_x005F_x005F_x005F_x005F_x005F_x005F_x005F_x005F_x005F_x005F_x005F_x005F_x005F_x005F_x005F_x005F_x005F_x005F_x005F_x005F_x005F_x005F_x005F_x005F_x005F_x005F_x005F_x005F_x005F_x005F_x005F_x005F_x005F_x005F_x005F_x005F_x005F_x005F_x005F_x005F_x005F_x005F_x005F_x005F_x005F_x005F_x005F_x005F_x005F_x005F_x005F_x005F_x005F_x005F_x005F_x005F_x005F_x005F_x005F_x005F_x005F_x005F_x005F_x005F_x005F_x005F_x005F_x005F_x005F_x005F_x005F_x005F_x005F_x005F_x005F_x005F_x005F_x005F_x005F_x005F_x005F_x005F_x005F_x005F_x005F_x005F_x005F_x005F_x005F_x005F_x005F_x005F_x005F_x005F_x005F_x005F_x005F_x005F_x005F_x005F_x005F_x005F_x005F_x005F_x005F_x005F_x005F_x005F_x005F_x005F_x005F_x005F_x005F_x005F_x005F_x005F_x005F_x005F_x005F_x005F_x005F_x005F_x005F_x005F_x005F_x005F_x005F_x005F_x005F_x005F_x005F_x005F_x005F_x005F_x005F_x005F_x005F_x005F_x005F_x005F_x005F_x005F_x005F_x005F_x005F_x005F_x005F_x005F_x005F_x005F_x005F_x005F_x005F_x005F_x005F_x005F_x005F_x005F_x005F_x005F_x005F_x005F_x005F_x005F_x005F_x005F_x005F_x005F_x005F_x005F_x005F_x005F_x005F_x005F_x005F_x005F_x005F_x005F_x005F_x005F_x005F_x005F_x005F_x005F_x005F_x005F_x005F_x005F_x005F_x005F_x005F_x005F_x005F_x005F_x005F_x005F_x005F_x005F_x005F_x005F_x005F_x005F_x005F_x005F_x005F_x005F_x005F_x005F_x005F_x005F_x005F_x005F_x005F_x005F_x005F_x005F_x005F_x005F_x005F_x005F_x005F_x005F_x005F_x005F_x005F_x005F_x005F_x005F_x005F_x005F_x005F_x005F_x005F_x005F_x005F_x005F_x005F_x005F_x005F_x005F_x005F_x005F_x005F_x005F_x005F_x005F_x005F_x005F_x005F_x005F_x005F_x005F_x005F_x005F_x005F_x005F_x005F_x005F_x005F_x005F_x005F_x005F_x005F_x005F_x005F_x005F_x005F_x005F_x005F_x005F_x005F_x005F_x005F_x005F_x005F_x005F_x005F_x005F_x005F_x005F_x005F_x005F_x005F_x005F_x005F_x005F_x005F_x005F_x005F_x005F_x005F_x005F_x005F_x005F_x005F_x005F_x005F_x005F_x005F_x005F_x005F_x005F_x005F_x005F_x005F_x005F_x005F_x005F_x005F_x005F_x005F_x005F_x005F_x005F_x005F_x005F_x005F_x005F_x005F_x005F_x005F_x005F_x005F_x005F_x005F_x005F_x005F_x005F_x005F_x005F_x005F_x005F_x005F_x005F_x005F_x005F_x005F_x005F_x005F_x005F_x005F_x005F_x005F_x005F_x005F_x005F_x005F_x005F_x005F_x005F_x005F_x005F_x005F_x005F_x005F_x005F_x005F_x005F_x005F_x005F_x005F_x005F_x005F_x005F_x005F_x005F_x005F_x005F_x005F_x005F_x005F_x005F_x005F_x005F_x005F_x005F_x005F_x005F_x005F_x005F_x005F_x005F_x005F_x005F_x005F_x005F_x005F_x005F_x005F_x005F_x005F_x005F_x005F_x005F_x005F_x005F_x005F_x005F_x005F_x005F_x005F_x005F_x005F_x005F_x005F_x005F_x005F_x005F_x005F_x005F_x005F_x005F_x005F_x005F_x005F_x005F_x005F_x005F_x005F_x005F_x005F_x005F_x005F_x005F_x005F_x005F_x005F_x005F_x005F_x005F_x005F_x005F_x005F_x005F_x005F_x005F_x005F_x005F_x005F_x005F_x005F_x005F_x005F_x005F_x005F_x005F_x005F_x005F_x005F_x005F_x005F_x005F_x005F_x005F_x005F_x005F_x005F_x005F_x005F_x005F_x005F_x005F_x005F_x005F_x005F_x005F_x005F_x005F_x005F_x005F_x005F_x005F_x005F_x005F_x005F_x005F_x005F_x005F_x005F_x005F_x005F_x005F_x005F_x005F_x005F_x005F_x005F_x005F_x005F_x005F_x005F_x005F_x005F_x005F_x005F_x005F_x005F_x005F_x005F_x005F_x005F_x005F_x005F_x005F_x005F_x005F_x005F_x005F_x005F_x005F_x005F_x005F_x005F_x005F_x005F_x005F_x005F_x005F_x005F_x005F_x005F_x005F_x005F_x005F_x005F_x005F_x005F_x005F_x005F_x005F_x005F_x005F_x005F_x005F_x005F_x005F_x005F_x005F_x005F_x005F_x005F_x005F_x005F_x005F_x005F_x005F_x005F_x005F_x005F_x005F_x005F_x005F_x005F_x005F_x005F_x005F_x005F_x005F_x005F_x005F_x005F_x005F_x005F_x005F_x005F_x005F_x005F_x005F_x005F_x005F_x005F_x005F_x005F_x005F_x005F_x005F_x005F_x005F_x005F_x005F_x005F_x005F_x005F_x005F_x005F_x005F_x005F_x005F_x005F_x005F_x005F_x005F_x005F_x005F_x005F_x005F_x005F_x005F_x005F_x005F_x005F_x005F_x005F_x005F_x005F_x005F_x005F_x005F_x005F_x005F_x005F_x005F_x005F_x005F_x005F_x005F_x005F_x005F_x005F_x005F_x005F_x005F_x005F_x005F_x005F_x005F_x005F_x005F_x005F_x005F_x005F_x005F_x005F_x005F_x005F_x005F_x005F_x005F_x005F_x005F_x005F_x005F_x005F_x005F_x005F_x005F_x005F_x005F_x005F_x005F_x005F_x005F_x005F_x005F_x005F_x005F_x005F_x005F_x005F_x005F_x005F_x005F_x005F_x005F_x005F_x005F_x005F_x005F_x005F_x005F_x005F_x005F_x005F_x005F_x005F_x005F_x005F_x005F_x005F_x005F_x005F_x005F_x005F_x005F_x005F_x005F_x005F_x005F_x005F_x005F_x005F_x005F_x005F_x005F_x005F_x005F_x005F_x005F_x005F_x005F_x005F_x005F_x005F_x005F_x005F_x005F_x005F_x005F_x005F_x005F_x005F_x005F_x005F_x005F_x005F_x005F_x005F_x005F_x005F_x005F_x005F_x005F_x005F_x005F_x005F_x005F_x005F_x005F_x005F_x005F_x005F_x005F_x005F_x005F_x005F_x005F_x005F_x005F_x005F_x005F_x005F_x005F_x005F_x005F_x005F_x005F_x005F_x005F_x005F_x005F_x005F_x005F_x005F_x005F_x005F_x005F_x005F_x005F_x005F_x005F_x005F_x005F_x005F_x005F_x005F_x005F_x005F_x005F_x005F_x005F_x005F_x005F_x005F_x005F_x005F_x005F_x005F_x005F_x005F_x005F_x005F_x005F_x005F_x005F_x005F_x005F_x005F_x005F_x005F_x005F_x005F_x005F_x005F_x005F_x005F_x005F_x005F_x005F_x005F_x005F_x005F_x005F_x005F_x005F_x005F_x005F_x005F_x005F_x005F_x005F_x005F_x005F_x005F_x005F_x005F_x005F_x005F_x005F_x005F_x005F_x005F_x005F_x005F_x005F_x005F_x005F_x005F_x005F_x005F_x005F_x005F_x005F_x005F_x005F_x005F_x005F_x005F_x005F_x005F_x005F_x005F_x005F_x005F_x005F_x005F_x005F_x005F_x005F_x005F_x005F_x005F_x005F_x005F_x005F_x005F_x005F_x005F_x005F_x005F_x005F_x005F_x005F_x005F_x005F_x005F_x005F_x005F_x005F_x005F_x005F_x005F_x005F_x005F_x005F_x005F_x005F_x005F_x005F_x005F_x005F_x005F_x005F_x005F_x005F_x005F_x005F_x005F_x005F_x005F_x005F_x005F_x005F_x005F_x005F_x005F_x005F_x005F_x005F_x005F_x005F_x005F_x005F_x005F_x005F_x005F_x005F_x005F_x005F_x005F_x005F_x005F_x005F_x005F_x005F_x005F_x005F_x005F_x005F_x005F_x005F_x005F_x005F_x005F_x005F_x005F_x005F_x005F_x005F_x005F_x005F_x005F_x005F_x005F_x005F_x005F_x005F_x005F_x005F_x005F_x005F_x005F_x005F_x005F_x005F_x005F_x005F_x005F_x005F_x005F_x005F_x005F_x005F_x005F_x005F_x005F_x005F_x005F_x005F_x005F_x005F_x005F_x005F_x005F_x005F_x005F_x005F_x005F_x005F_x005F_x005F_x005F_x005F_x005F_x005F_x005F_x005F_x005F_x005F_x005F_x005F_x005F_x005F_x005F_x005F_x005F_x005F_x005F_x005F_x005F_x005F_x005F_x005F_x005F_x005F_x005F_x005F_x005F_x005F_x005F_x005F_x005F_x005F_x005F_x005F_x005F_x005F_x005F_x005F_x005F_x005F_x005F_x005F_x005F_x005F_x005F_x005F_x005F_x005F_x005F_x005F_x005F_x005F_x005F_x005F_x005F_x005F_x005F_x005F_x005F_x005F_x005F_x005F_x005F_x005F_x005F_x005F_x005F_x005F_x005F_x005F_x005F_x005F_x005F_x005F_x005F_x005F_x005F_x005F_x005F_x005F_x005F_x005F_x005F_x005F_x005F_x005F_x005F_x005F_x005F_x005F_x005F_x005F_x005F_x005F_x005F_x005F_x005F_x005F_x005F_x005F_x005F_x005F_x005F_x005F_x005F_x005F_x005F_x005F_x005F_x005F_x005F_x005F_x005F_x005F_x005F_x005F_x005F_x005F_x005F_x005F_x005F_x005F_x005F_x005F_x005F_x005F_x005F_x005F_x005F_x005F_x005F_x005F_x005F_x005F_x005F_x005F_x005F_x005F_x005F_x005F_x005F_x005F_x005F_x005F_x005F_x005F_x005F_x005F_x005F_x005F_x005F_x005F_x005F_x005F_x005F_x005F_x005F_x005F_x005F_x005F_x005F_x005F_x005F_x005F_x005F_x005F_x005F_x005F_x005F_x005F_x005F_x005F_x005F_x005F_x005F_x005F_x005F_x005F_x005F_x005F_x005F_x005F_x005F_x005F_x005F_x005F_x005F_x005F_x005F_x005F_x005F_x005F_x005F_x005F_x005F_x005F_x005F_x005F_x005F_x005F_x005F_x005F_x005F_x005F_x005F_x005F_x005F_x005F_x005F_x005F_x005F_x005F_x005F_x005F_x005F_x005F_x005F_x005F_x005F_x005F_x005F_x005F_x005F_x005F_x005F_x005F_x005F_x005F_x005F_x005F_x005F_x005F_x005F_x005F_x005F_x005F_x005F_x005F_x005F_x005F_x005F_x005F_x005F_x005F_x005F_x005F_x005F_x005F_x005F_x005F_x005F_x005F_x005F_x005F_x005F_x005F_x005F_x005F_x005F_x005F_x005F_x005F_x005F_x005F_x005F_x005F_x005F_x005F_x005F_x005F_x005F_x005F_x005F_x005F_x005F_x005F_x005F_x005F_x005F_x005F_x005F_x005F_x005F_x005F_x005F_x005F_x005F_x005F_x005F_x005F_x005F_x005F_x005F_x005F_x005F_x005F_x005F_x005F_x005F_x005F_x005F_x005F_x005F_x005F_x005F_x005F_x005F_x005F_x005F_x005F_x005F_x005F_x005F_x005F_x005F_x005F_x005F_x005F_x005F_x005F_x005F_x005F_x005F_x005F_x005F_x005F_x005F_x005F_x005F_x005F_x005F_x005F_x005F_x005F_x005F_x005F_x005F_x005F_x005F_x005F_x005F_x005F_x005F_x005F_x005F_x005F_x005F_x005F_x005F_x005F_x005F_x005F_x005F_x005F_x005F_x005F_x005F_x005F_x005F_x005F_x005F_x005F_x005F_x005F_x005F_x005F_x005F_x005F_x005F_x005F_x005F_x005F_x005F_x005F_x005F_x005F_x005F_x005F_x005F_x005F_x005F_x005F_x005F_x005F_x005F_x005F_x005F_x005F_x005F_x005F_x005F_x005F_x005F_x005F_x005F_x005F_x005F_x005F_x005F_x005F_x005F_x005F_x005F_x005F_x005F_x005F_x005F_x005F_x005F_x005F_x005F_x005F_x005F_x005F_x005F_x005F_x005F_x005F_x005F_x005F_x005F_x005F_x005F_x005F_x005F_x005F_x005F_x005F_x005F_x005F_x005F_x005F_x005F_x005F_x005F_x005F_x005F_x005F_x005F_x005F_x005F_x005F_x005F_x005F_x005F_x005F_x005F_x005F_x005F_x005F_x005F_x005F_x005F_x005F_x005F_x005F_x005F_x005F_x005F_x005F_x005F_x005F_x005F_x005F_x005F_x005F_x005F_x005F_x005F_x005F_x005F_x005F_x005F_x005F_x005F_x005F_x005F_x005F_x005F_x005F_x005F_x005F_x005F_x005F_x005F_x005F_x005F_x005F_x005F_x005F_x005F_x005F_x005F_x005F_x005F_x005F_x005F_x005F_x005F_x005F_x005F_x005F_x005F_x005F_x005F_x005F_x005F_x005F_x005F_x005F_x005F_x005F_x005F_x005F_x005F_x005F_x005F_x005F_x005F_x005F_x005F_x005F_x005F_x005F_x005F_x005F_x005F_x005F_x005F_x005F_x005F_x005F_x005F_x005F_x005F_x005F_x005F_x005F_x005F_x005F_x005F_x005F_x005F_x005F_x005F_x005F_x005F_x005F_x005F_x005F_x005F_x005F_x005F_x005F_x005F_x005F_x005F_x005F_x005F_x005F_x005F_x005F_x005F_x005F_x005F_x005F_x005F_x005F_x005F_x005F_x005F_x005F_x005F_x005F_x005F_x005F_x005F_x005F_x005F_x005F_x005F_x005F_x005F_x005F_x005F_x005F_x005F_x005F_x005F_x005F_x005F_x005F_x005F_x005F_x005F_x005F_x005F_x005F_x005F_x005F_x005F_x005F_x005F_x005F_x005F_x005F_x005F_x005F_x005F_x005F_x005F_x005F_x005F_x005F_x005F_x005F_x005F_x005F_x005F_x005F_x005F_x005F_x005F_x005F_x005F_x005F_x005F_x005F_x005F_x005F_x005F_x005F_x005F_x005F_x005F_x005F_x005F_x005F_x005F_x005F_x005F_x005F_x005F_x005F_x005F_x005F_x005F_x005F_x005F_x005F_x005F_x005F_x005F_x005F_x005F_x005F_x005F_x005F_x005F_x005F_x005F_x005F_x005F_x005F_x005F_x005F_x005F_x005F_x005F_x005F_x005F_x005F_x005F_x005F_x005F_x005F_x005F_x005F_x005F_x005F_x005F_x005F_x005F_x005F_x005F_x005F_x005F_x005F_x005F_x005F_x005F_x005F_x005F_x005F_x005F_x005F_x005F_x005F_x005F_x005F_x005F_x005F_x005F_x005F_x005F_x005F_x005F_x005F_x005F_x005F_x005F_x005F_x005F_x005F_x005F_x005F_x005F_x005F_x005F_x005F_x005F_x005F_x005F_x005F_x005F_x005F_x005F_x005F_x005F_x005F_x005F_x005F_x005F_x005F_x005F_x005F_x005F_x005F_x005F_x005F_x005F_x005F_x005F_x005F_x005F_x005F_x005F_x005F_x005F_x005F_x005F_x005F_x005F_x005F_x005F_x005F_x005F_x005F_x005F_x005F_x005F_x005F_x005F_x005F_x005F_x005F_x005F_x005F_x005F_x005F_x005F_x005F_x005F_x005F_x005F_x005F_x005F_x005F_x005F_x005F_x005F_x005F_x005F_x005F_x005F_x005F_x005F_x005F_x005F_x005F_x005F_x005F_x005F_x005F_x005F_x005F_x005F_x005F_x005F_x005F_x005F_x005F_x005F_x005F_x005F_x005F_x005F_x005F_x005F_x005F_x005F_x005F_x005F_x005F_x005F_x005F_x005F_x005F_x005F_x005F_x005F_x005F_x005F_x005F_x005F_x005F_x005F_x005F_x005F_x005F_x005F_x005F_x005F_x005F_x005F_x005F_x005F_x005F_x005F_x005F_x005F_x005F_x005F_x005F_x005F_x005F_x005F_x005F_x005F_x005F_x005F_x005F_x005F_x005F_x005F_x005F_x005F_x005F_x005F_x005F_x005F_x005F_x005F_x005F_x005F_x005F_x005F_x005F_x005F_x005F_x005F_x005F_x005F_x005F_x005F_x005F_x005F_x005F_x005F_x005F_x005F_x005F_x005F_x005F_x005F_x005F_x005F_x005F_x005F_x005F_x005F_x005F_x005F_x005F_x005F_x005F_x005F_x005F_x005F_x005F_x005F_x0000_s1026" textRotate="1"/>
   </customShpExts>
 </s:customData>
 </file>

</xml_diff>

<commit_message>
Correct report page references and proofread text
</commit_message>
<xml_diff>
--- a/VuDuyKhanh_BCTTTN.docx
+++ b/VuDuyKhanh_BCTTTN.docx
@@ -685,7 +685,7 @@
           <w:szCs w:val="28"/>
           <w:lang w:val="vi-VN"/>
         </w:rPr>
-        <w:t xml:space="preserve"> </w:t>
+        <w:t xml:space="preserve"/>
       </w:r>
       <w:r>
         <w:rPr>
@@ -3418,7 +3418,7 @@
                 <w:sz w:val="28"/>
                 <w:szCs w:val="28"/>
               </w:rPr>
-              <w:t xml:space="preserve">12</w:t>
+              <w:t xml:space="preserve">14</w:t>
             </w:r>
           </w:fldSimple>
           <w:r>
@@ -3465,7 +3465,7 @@
               <w:rPr>
                 <w:color w:val="000000"/>
               </w:rPr>
-              <w:t xml:space="preserve">12</w:t>
+              <w:t xml:space="preserve">14</w:t>
             </w:r>
           </w:fldSimple>
           <w:r>
@@ -3520,7 +3520,7 @@
                 <w:sz w:val="28"/>
                 <w:szCs w:val="28"/>
               </w:rPr>
-              <w:t xml:space="preserve">12</w:t>
+              <w:t xml:space="preserve">14</w:t>
             </w:r>
           </w:fldSimple>
           <w:r>
@@ -3575,7 +3575,7 @@
                 <w:sz w:val="28"/>
                 <w:szCs w:val="28"/>
               </w:rPr>
-              <w:t xml:space="preserve">12</w:t>
+              <w:t xml:space="preserve">14</w:t>
             </w:r>
           </w:fldSimple>
           <w:r>
@@ -3630,7 +3630,7 @@
                 <w:sz w:val="28"/>
                 <w:szCs w:val="28"/>
               </w:rPr>
-              <w:t xml:space="preserve">12</w:t>
+              <w:t xml:space="preserve">14</w:t>
             </w:r>
           </w:fldSimple>
           <w:r>
@@ -3685,7 +3685,7 @@
                 <w:sz w:val="28"/>
                 <w:szCs w:val="28"/>
               </w:rPr>
-              <w:t xml:space="preserve">13</w:t>
+              <w:t xml:space="preserve">15</w:t>
             </w:r>
           </w:fldSimple>
           <w:r>
@@ -3730,7 +3730,7 @@
               <w:rPr>
                 <w:color w:val="000000"/>
               </w:rPr>
-              <w:t xml:space="preserve">14</w:t>
+              <w:t xml:space="preserve">16</w:t>
             </w:r>
           </w:fldSimple>
           <w:r>
@@ -3785,7 +3785,7 @@
                 <w:sz w:val="28"/>
                 <w:szCs w:val="28"/>
               </w:rPr>
-              <w:t xml:space="preserve">14</w:t>
+              <w:t xml:space="preserve">16</w:t>
             </w:r>
           </w:fldSimple>
           <w:r>
@@ -3840,7 +3840,7 @@
                 <w:sz w:val="28"/>
                 <w:szCs w:val="28"/>
               </w:rPr>
-              <w:t xml:space="preserve">15</w:t>
+              <w:t xml:space="preserve">17</w:t>
             </w:r>
           </w:fldSimple>
           <w:r>
@@ -3895,7 +3895,7 @@
                 <w:sz w:val="28"/>
                 <w:szCs w:val="28"/>
               </w:rPr>
-              <w:t xml:space="preserve">16</w:t>
+              <w:t xml:space="preserve">18</w:t>
             </w:r>
           </w:fldSimple>
           <w:r>
@@ -3950,7 +3950,7 @@
                 <w:sz w:val="28"/>
                 <w:szCs w:val="28"/>
               </w:rPr>
-              <w:t xml:space="preserve">17</w:t>
+              <w:t xml:space="preserve">19</w:t>
             </w:r>
           </w:fldSimple>
           <w:r>
@@ -3995,7 +3995,7 @@
               <w:rPr>
                 <w:color w:val="000000"/>
               </w:rPr>
-              <w:t xml:space="preserve">19</w:t>
+              <w:t xml:space="preserve">20</w:t>
             </w:r>
           </w:fldSimple>
           <w:r>
@@ -4050,7 +4050,7 @@
                 <w:sz w:val="28"/>
                 <w:szCs w:val="28"/>
               </w:rPr>
-              <w:t xml:space="preserve">20</w:t>
+              <w:t xml:space="preserve">21</w:t>
             </w:r>
           </w:fldSimple>
           <w:r>
@@ -4105,7 +4105,7 @@
                 <w:sz w:val="28"/>
                 <w:szCs w:val="28"/>
               </w:rPr>
-              <w:t xml:space="preserve">21</w:t>
+              <w:t xml:space="preserve">22</w:t>
             </w:r>
           </w:fldSimple>
           <w:r>
@@ -4160,7 +4160,7 @@
                 <w:sz w:val="28"/>
                 <w:szCs w:val="28"/>
               </w:rPr>
-              <w:t xml:space="preserve">21</w:t>
+              <w:t xml:space="preserve">22</w:t>
             </w:r>
           </w:fldSimple>
           <w:r>
@@ -4215,7 +4215,7 @@
                 <w:sz w:val="28"/>
                 <w:szCs w:val="28"/>
               </w:rPr>
-              <w:t xml:space="preserve">21</w:t>
+              <w:t xml:space="preserve">22</w:t>
             </w:r>
           </w:fldSimple>
           <w:r>
@@ -4270,7 +4270,7 @@
                 <w:sz w:val="28"/>
                 <w:szCs w:val="28"/>
               </w:rPr>
-              <w:t xml:space="preserve">22</w:t>
+              <w:t xml:space="preserve">23</w:t>
             </w:r>
           </w:fldSimple>
           <w:r>
@@ -4325,7 +4325,7 @@
                 <w:sz w:val="28"/>
                 <w:szCs w:val="28"/>
               </w:rPr>
-              <w:t xml:space="preserve">22</w:t>
+              <w:t xml:space="preserve">23</w:t>
             </w:r>
           </w:fldSimple>
           <w:r>
@@ -4380,7 +4380,7 @@
                 <w:sz w:val="28"/>
                 <w:szCs w:val="28"/>
               </w:rPr>
-              <w:t xml:space="preserve">22</w:t>
+              <w:t xml:space="preserve">23</w:t>
             </w:r>
           </w:fldSimple>
           <w:r>
@@ -4435,7 +4435,7 @@
                 <w:sz w:val="28"/>
                 <w:szCs w:val="28"/>
               </w:rPr>
-              <w:t xml:space="preserve">23</w:t>
+              <w:t xml:space="preserve">24</w:t>
             </w:r>
           </w:fldSimple>
           <w:r>
@@ -4490,7 +4490,7 @@
                 <w:sz w:val="28"/>
                 <w:szCs w:val="28"/>
               </w:rPr>
-              <w:t xml:space="preserve">23</w:t>
+              <w:t xml:space="preserve">24</w:t>
             </w:r>
           </w:fldSimple>
           <w:r>
@@ -4545,7 +4545,7 @@
                 <w:sz w:val="28"/>
                 <w:szCs w:val="28"/>
               </w:rPr>
-              <w:t xml:space="preserve">23</w:t>
+              <w:t xml:space="preserve">24</w:t>
             </w:r>
           </w:fldSimple>
           <w:r>
@@ -4600,7 +4600,7 @@
                 <w:sz w:val="28"/>
                 <w:szCs w:val="28"/>
               </w:rPr>
-              <w:t xml:space="preserve">24</w:t>
+              <w:t xml:space="preserve">25</w:t>
             </w:r>
           </w:fldSimple>
           <w:r>
@@ -4655,7 +4655,7 @@
                 <w:sz w:val="28"/>
                 <w:szCs w:val="28"/>
               </w:rPr>
-              <w:t xml:space="preserve">24</w:t>
+              <w:t xml:space="preserve">25</w:t>
             </w:r>
           </w:fldSimple>
           <w:r>
@@ -4710,7 +4710,7 @@
                 <w:sz w:val="28"/>
                 <w:szCs w:val="28"/>
               </w:rPr>
-              <w:t xml:space="preserve">24</w:t>
+              <w:t xml:space="preserve">25</w:t>
             </w:r>
           </w:fldSimple>
           <w:r>
@@ -4765,7 +4765,7 @@
                 <w:sz w:val="28"/>
                 <w:szCs w:val="28"/>
               </w:rPr>
-              <w:t xml:space="preserve">25</w:t>
+              <w:t xml:space="preserve">26</w:t>
             </w:r>
           </w:fldSimple>
           <w:r>
@@ -4810,7 +4810,7 @@
               <w:rPr>
                 <w:color w:val="000000"/>
               </w:rPr>
-              <w:t xml:space="preserve">25</w:t>
+              <w:t xml:space="preserve">26</w:t>
             </w:r>
           </w:fldSimple>
           <w:r>
@@ -4865,7 +4865,7 @@
                 <w:sz w:val="28"/>
                 <w:szCs w:val="28"/>
               </w:rPr>
-              <w:t xml:space="preserve">26</w:t>
+              <w:t xml:space="preserve">27</w:t>
             </w:r>
           </w:fldSimple>
           <w:r>
@@ -4920,7 +4920,7 @@
                 <w:sz w:val="28"/>
                 <w:szCs w:val="28"/>
               </w:rPr>
-              <w:t xml:space="preserve">26</w:t>
+              <w:t xml:space="preserve">27</w:t>
             </w:r>
           </w:fldSimple>
           <w:r>
@@ -4965,7 +4965,7 @@
               <w:rPr>
                 <w:color w:val="000000"/>
               </w:rPr>
-              <w:t xml:space="preserve">26</w:t>
+              <w:t xml:space="preserve">27</w:t>
             </w:r>
           </w:fldSimple>
           <w:r>
@@ -5010,7 +5010,7 @@
               <w:rPr>
                 <w:color w:val="000000"/>
               </w:rPr>
-              <w:t xml:space="preserve">26</w:t>
+              <w:t xml:space="preserve">27</w:t>
             </w:r>
           </w:fldSimple>
           <w:r>
@@ -5061,7 +5061,7 @@
                 <w:sz w:val="28"/>
                 <w:szCs w:val="28"/>
               </w:rPr>
-              <w:t xml:space="preserve">1</w:t>
+              <w:t xml:space="preserve">28</w:t>
             </w:r>
           </w:fldSimple>
         </w:p>
@@ -5092,7 +5092,7 @@
               <w:rPr>
                 <w:color w:val="000000"/>
               </w:rPr>
-              <w:t xml:space="preserve">1</w:t>
+              <w:t xml:space="preserve">28</w:t>
             </w:r>
           </w:fldSimple>
         </w:p>
@@ -5128,7 +5128,7 @@
                 <w:sz w:val="28"/>
                 <w:szCs w:val="28"/>
               </w:rPr>
-              <w:t xml:space="preserve">1</w:t>
+              <w:t xml:space="preserve">28</w:t>
             </w:r>
           </w:fldSimple>
         </w:p>
@@ -5164,7 +5164,7 @@
                 <w:sz w:val="28"/>
                 <w:szCs w:val="28"/>
               </w:rPr>
-              <w:t xml:space="preserve">1</w:t>
+              <w:t xml:space="preserve">29</w:t>
             </w:r>
           </w:fldSimple>
         </w:p>
@@ -5195,7 +5195,7 @@
               <w:rPr>
                 <w:color w:val="000000"/>
               </w:rPr>
-              <w:t xml:space="preserve">1</w:t>
+              <w:t xml:space="preserve">29</w:t>
             </w:r>
           </w:fldSimple>
         </w:p>
@@ -5231,7 +5231,7 @@
                 <w:sz w:val="28"/>
                 <w:szCs w:val="28"/>
               </w:rPr>
-              <w:t xml:space="preserve">1</w:t>
+              <w:t xml:space="preserve">29</w:t>
             </w:r>
           </w:fldSimple>
         </w:p>
@@ -5267,7 +5267,7 @@
                 <w:sz w:val="28"/>
                 <w:szCs w:val="28"/>
               </w:rPr>
-              <w:t xml:space="preserve">1</w:t>
+              <w:t xml:space="preserve">31</w:t>
             </w:r>
           </w:fldSimple>
         </w:p>
@@ -5303,7 +5303,7 @@
                 <w:sz w:val="28"/>
                 <w:szCs w:val="28"/>
               </w:rPr>
-              <w:t xml:space="preserve">1</w:t>
+              <w:t xml:space="preserve">33</w:t>
             </w:r>
           </w:fldSimple>
         </w:p>
@@ -5339,7 +5339,7 @@
                 <w:sz w:val="28"/>
                 <w:szCs w:val="28"/>
               </w:rPr>
-              <w:t xml:space="preserve">1</w:t>
+              <w:t xml:space="preserve">34</w:t>
             </w:r>
           </w:fldSimple>
         </w:p>
@@ -5375,7 +5375,7 @@
                 <w:sz w:val="28"/>
                 <w:szCs w:val="28"/>
               </w:rPr>
-              <w:t xml:space="preserve">1</w:t>
+              <w:t xml:space="preserve">36</w:t>
             </w:r>
           </w:fldSimple>
         </w:p>
@@ -5411,7 +5411,7 @@
                 <w:sz w:val="28"/>
                 <w:szCs w:val="28"/>
               </w:rPr>
-              <w:t xml:space="preserve">1</w:t>
+              <w:t xml:space="preserve">36</w:t>
             </w:r>
           </w:fldSimple>
         </w:p>
@@ -5447,7 +5447,7 @@
                 <w:sz w:val="28"/>
                 <w:szCs w:val="28"/>
               </w:rPr>
-              <w:t xml:space="preserve">1</w:t>
+              <w:t xml:space="preserve">38</w:t>
             </w:r>
           </w:fldSimple>
         </w:p>
@@ -5483,7 +5483,7 @@
                 <w:sz w:val="28"/>
                 <w:szCs w:val="28"/>
               </w:rPr>
-              <w:t xml:space="preserve">1</w:t>
+              <w:t xml:space="preserve">39</w:t>
             </w:r>
           </w:fldSimple>
         </w:p>
@@ -5519,7 +5519,7 @@
                 <w:sz w:val="28"/>
                 <w:szCs w:val="28"/>
               </w:rPr>
-              <w:t xml:space="preserve">1</w:t>
+              <w:t xml:space="preserve">40</w:t>
             </w:r>
           </w:fldSimple>
         </w:p>
@@ -5550,7 +5550,7 @@
               <w:rPr>
                 <w:color w:val="000000"/>
               </w:rPr>
-              <w:t xml:space="preserve">1</w:t>
+              <w:t xml:space="preserve">41</w:t>
             </w:r>
           </w:fldSimple>
         </w:p>
@@ -5586,7 +5586,7 @@
                 <w:sz w:val="28"/>
                 <w:szCs w:val="28"/>
               </w:rPr>
-              <w:t xml:space="preserve">1</w:t>
+              <w:t xml:space="preserve">41</w:t>
             </w:r>
           </w:fldSimple>
         </w:p>
@@ -5622,7 +5622,7 @@
                 <w:sz w:val="28"/>
                 <w:szCs w:val="28"/>
               </w:rPr>
-              <w:t xml:space="preserve">1</w:t>
+              <w:t xml:space="preserve">42</w:t>
             </w:r>
           </w:fldSimple>
         </w:p>
@@ -5658,7 +5658,7 @@
                 <w:sz w:val="28"/>
                 <w:szCs w:val="28"/>
               </w:rPr>
-              <w:t xml:space="preserve">1</w:t>
+              <w:t xml:space="preserve">43</w:t>
             </w:r>
           </w:fldSimple>
         </w:p>
@@ -5694,7 +5694,7 @@
                 <w:sz w:val="28"/>
                 <w:szCs w:val="28"/>
               </w:rPr>
-              <w:t xml:space="preserve">1</w:t>
+              <w:t xml:space="preserve">45</w:t>
             </w:r>
           </w:fldSimple>
         </w:p>
@@ -5730,7 +5730,7 @@
                 <w:sz w:val="28"/>
                 <w:szCs w:val="28"/>
               </w:rPr>
-              <w:t xml:space="preserve">1</w:t>
+              <w:t xml:space="preserve">45</w:t>
             </w:r>
           </w:fldSimple>
         </w:p>
@@ -5761,7 +5761,7 @@
               <w:rPr>
                 <w:color w:val="000000"/>
               </w:rPr>
-              <w:t xml:space="preserve">1</w:t>
+              <w:t xml:space="preserve">46</w:t>
             </w:r>
           </w:fldSimple>
         </w:p>
@@ -5797,7 +5797,7 @@
                 <w:sz w:val="28"/>
                 <w:szCs w:val="28"/>
               </w:rPr>
-              <w:t xml:space="preserve">1</w:t>
+              <w:t xml:space="preserve">48</w:t>
             </w:r>
           </w:fldSimple>
         </w:p>
@@ -5833,7 +5833,7 @@
                 <w:sz w:val="28"/>
                 <w:szCs w:val="28"/>
               </w:rPr>
-              <w:t xml:space="preserve">1</w:t>
+              <w:t xml:space="preserve">49</w:t>
             </w:r>
           </w:fldSimple>
         </w:p>
@@ -5869,7 +5869,7 @@
                 <w:sz w:val="28"/>
                 <w:szCs w:val="28"/>
               </w:rPr>
-              <w:t xml:space="preserve">1</w:t>
+              <w:t xml:space="preserve">51</w:t>
             </w:r>
           </w:fldSimple>
         </w:p>
@@ -5905,7 +5905,7 @@
                 <w:sz w:val="28"/>
                 <w:szCs w:val="28"/>
               </w:rPr>
-              <w:t xml:space="preserve">1</w:t>
+              <w:t xml:space="preserve">51</w:t>
             </w:r>
           </w:fldSimple>
         </w:p>
@@ -5941,7 +5941,7 @@
                 <w:sz w:val="28"/>
                 <w:szCs w:val="28"/>
               </w:rPr>
-              <w:t xml:space="preserve">1</w:t>
+              <w:t xml:space="preserve">52</w:t>
             </w:r>
           </w:fldSimple>
         </w:p>
@@ -5977,7 +5977,7 @@
                 <w:sz w:val="28"/>
                 <w:szCs w:val="28"/>
               </w:rPr>
-              <w:t xml:space="preserve">1</w:t>
+              <w:t xml:space="preserve">53</w:t>
             </w:r>
           </w:fldSimple>
         </w:p>
@@ -6008,7 +6008,7 @@
               <w:rPr>
                 <w:color w:val="000000"/>
               </w:rPr>
-              <w:t xml:space="preserve">1</w:t>
+              <w:t xml:space="preserve">53</w:t>
             </w:r>
           </w:fldSimple>
         </w:p>
@@ -6039,7 +6039,7 @@
               <w:rPr>
                 <w:color w:val="000000"/>
               </w:rPr>
-              <w:t xml:space="preserve">1</w:t>
+              <w:t xml:space="preserve">53</w:t>
             </w:r>
           </w:fldSimple>
         </w:p>
@@ -6076,7 +6076,7 @@
                 <w:sz w:val="28"/>
                 <w:szCs w:val="28"/>
               </w:rPr>
-              <w:t xml:space="preserve">1</w:t>
+              <w:t xml:space="preserve">55</w:t>
             </w:r>
           </w:fldSimple>
         </w:p>
@@ -6107,7 +6107,7 @@
               <w:rPr>
                 <w:color w:val="000000"/>
               </w:rPr>
-              <w:t xml:space="preserve">51</w:t>
+              <w:t xml:space="preserve">55</w:t>
             </w:r>
           </w:fldSimple>
           <w:r>
@@ -6162,7 +6162,7 @@
                 <w:sz w:val="28"/>
                 <w:szCs w:val="28"/>
               </w:rPr>
-              <w:t xml:space="preserve">51</w:t>
+              <w:t xml:space="preserve">55</w:t>
             </w:r>
           </w:fldSimple>
           <w:r>
@@ -6212,7 +6212,7 @@
                 <w:sz w:val="28"/>
                 <w:szCs w:val="28"/>
               </w:rPr>
-              <w:t xml:space="preserve">1</w:t>
+              <w:t xml:space="preserve">56</w:t>
             </w:r>
           </w:fldSimple>
         </w:p>
@@ -6253,7 +6253,7 @@
                 <w:sz w:val="28"/>
                 <w:szCs w:val="28"/>
               </w:rPr>
-              <w:t xml:space="preserve">53</w:t>
+              <w:t xml:space="preserve">56</w:t>
             </w:r>
           </w:fldSimple>
           <w:r>
@@ -6298,7 +6298,7 @@
               <w:rPr>
                 <w:color w:val="000000"/>
               </w:rPr>
-              <w:t xml:space="preserve">54</w:t>
+              <w:t xml:space="preserve">57</w:t>
             </w:r>
           </w:fldSimple>
           <w:r>
@@ -6343,7 +6343,7 @@
               <w:rPr>
                 <w:color w:val="000000"/>
               </w:rPr>
-              <w:t xml:space="preserve">55</w:t>
+              <w:t xml:space="preserve">58</w:t>
             </w:r>
           </w:fldSimple>
           <w:r>
@@ -6388,7 +6388,7 @@
               <w:rPr>
                 <w:color w:val="000000"/>
               </w:rPr>
-              <w:t xml:space="preserve">56</w:t>
+              <w:t xml:space="preserve">59</w:t>
             </w:r>
           </w:fldSimple>
           <w:r>
@@ -6433,7 +6433,7 @@
               <w:rPr>
                 <w:color w:val="000000"/>
               </w:rPr>
-              <w:t xml:space="preserve">56</w:t>
+              <w:t xml:space="preserve">59</w:t>
             </w:r>
           </w:fldSimple>
           <w:r>
@@ -6478,7 +6478,7 @@
               <w:rPr>
                 <w:color w:val="000000"/>
               </w:rPr>
-              <w:t xml:space="preserve">57</w:t>
+              <w:t xml:space="preserve">59</w:t>
             </w:r>
           </w:fldSimple>
           <w:r>
@@ -6523,7 +6523,7 @@
               <w:rPr>
                 <w:color w:val="000000"/>
               </w:rPr>
-              <w:t xml:space="preserve">57</w:t>
+              <w:t xml:space="preserve">60</w:t>
             </w:r>
           </w:fldSimple>
           <w:r>
@@ -6578,7 +6578,7 @@
                 <w:sz w:val="28"/>
                 <w:szCs w:val="28"/>
               </w:rPr>
-              <w:t xml:space="preserve">58</w:t>
+              <w:t xml:space="preserve">60</w:t>
             </w:r>
           </w:fldSimple>
           <w:r>
@@ -6633,7 +6633,7 @@
                 <w:sz w:val="28"/>
                 <w:szCs w:val="28"/>
               </w:rPr>
-              <w:t xml:space="preserve">58</w:t>
+              <w:t xml:space="preserve">61</w:t>
             </w:r>
           </w:fldSimple>
           <w:r>
@@ -6688,7 +6688,7 @@
                 <w:sz w:val="28"/>
                 <w:szCs w:val="28"/>
               </w:rPr>
-              <w:t xml:space="preserve">59</w:t>
+              <w:t xml:space="preserve">61</w:t>
             </w:r>
           </w:fldSimple>
           <w:r>
@@ -6733,7 +6733,7 @@
               <w:rPr>
                 <w:color w:val="000000"/>
               </w:rPr>
-              <w:t xml:space="preserve">59</w:t>
+              <w:t xml:space="preserve">61</w:t>
             </w:r>
           </w:fldSimple>
           <w:r>
@@ -6789,7 +6789,7 @@
                 <w:sz w:val="28"/>
                 <w:szCs w:val="28"/>
               </w:rPr>
-              <w:t xml:space="preserve">60</w:t>
+              <w:t xml:space="preserve">62</w:t>
             </w:r>
           </w:fldSimple>
           <w:r>
@@ -6847,7 +6847,7 @@
                 <w:sz w:val="28"/>
                 <w:szCs w:val="28"/>
               </w:rPr>
-              <w:t xml:space="preserve">61</w:t>
+              <w:t xml:space="preserve">63</w:t>
             </w:r>
           </w:fldSimple>
           <w:r>
@@ -6927,7 +6927,7 @@
             <w:color w:val="000000"/>
             <w:sz w:val="28"/>
           </w:rPr>
-          <w:t xml:space="preserve">12</w:t>
+          <w:t xml:space="preserve">14</w:t>
         </w:r>
       </w:fldSimple>
       <w:r/>
@@ -6966,7 +6966,7 @@
             <w:color w:val="000000"/>
             <w:sz w:val="28"/>
           </w:rPr>
-          <w:t xml:space="preserve">13</w:t>
+          <w:t xml:space="preserve">15</w:t>
         </w:r>
       </w:fldSimple>
       <w:r/>
@@ -7005,7 +7005,7 @@
             <w:color w:val="000000"/>
             <w:sz w:val="28"/>
           </w:rPr>
-          <w:t xml:space="preserve">14</w:t>
+          <w:t xml:space="preserve">16</w:t>
         </w:r>
       </w:fldSimple>
       <w:r/>
@@ -7038,6 +7038,630 @@
       <w:bookmarkEnd w:id="2101"/>
       <w:r/>
       <w:fldSimple w:instr="PAGEREF KhanhFig_06 \h " w:dirty="true">
+        <w:r>
+          <w:rPr>
+            <w:rFonts w:ascii="Times New Roman" w:hAnsi="Times New Roman" w:eastAsia="Times New Roman"/>
+            <w:color w:val="000000"/>
+            <w:sz w:val="28"/>
+          </w:rPr>
+          <w:t xml:space="preserve">22</w:t>
+        </w:r>
+      </w:fldSimple>
+      <w:r/>
+      <w:r/>
+    </w:p>
+    <w:p>
+      <w:pPr>
+        <w:pBdr/>
+        <w:tabs>
+          <w:tab w:val="right" w:leader="dot" w:pos="8856"/>
+        </w:tabs>
+        <w:spacing w:after="0" w:before="0" w:line="360" w:lineRule="auto"/>
+        <w:ind/>
+        <w:jc w:val="left"/>
+        <w:rPr/>
+      </w:pPr>
+      <w:r/>
+      <w:bookmarkStart w:id="3010" w:name="KhanhListFig_08"/>
+      <w:r>
+        <w:rPr>
+          <w:rFonts w:ascii="Times New Roman" w:hAnsi="Times New Roman" w:eastAsia="Times New Roman" w:cs="Times New Roman"/>
+          <w:color w:val="000000"/>
+          <w:sz w:val="28"/>
+        </w:rPr>
+        <w:t xml:space="preserve">Hình 1.5. Sơ đồ khối mô-đun máy tính KIMQ 8550</w:t>
+      </w:r>
+      <w:r>
+        <w:tab/>
+      </w:r>
+      <w:bookmarkEnd w:id="3010"/>
+      <w:r/>
+      <w:fldSimple w:instr="PAGEREF KhanhFig_08 \h " w:dirty="true">
+        <w:r>
+          <w:rPr>
+            <w:rFonts w:ascii="Times New Roman" w:hAnsi="Times New Roman" w:eastAsia="Times New Roman"/>
+            <w:color w:val="000000"/>
+            <w:sz w:val="28"/>
+          </w:rPr>
+          <w:t xml:space="preserve">23</w:t>
+        </w:r>
+      </w:fldSimple>
+      <w:r/>
+      <w:r/>
+    </w:p>
+    <w:p>
+      <w:pPr>
+        <w:pBdr/>
+        <w:tabs>
+          <w:tab w:val="right" w:leader="dot" w:pos="8856"/>
+        </w:tabs>
+        <w:spacing w:after="0" w:before="0" w:line="360" w:lineRule="auto"/>
+        <w:ind/>
+        <w:jc w:val="left"/>
+        <w:rPr/>
+      </w:pPr>
+      <w:r/>
+      <w:bookmarkStart w:id="2102" w:name="KhanhListFig_02"/>
+      <w:r>
+        <w:rPr>
+          <w:rFonts w:ascii="Times New Roman" w:hAnsi="Times New Roman" w:eastAsia="Times New Roman" w:cs="Times New Roman"/>
+          <w:color w:val="000000"/>
+          <w:sz w:val="28"/>
+        </w:rPr>
+        <w:t xml:space="preserve">Hình 1.6. Máy tính biên AI Box 6490</w:t>
+      </w:r>
+      <w:r>
+        <w:tab/>
+      </w:r>
+      <w:bookmarkEnd w:id="2102"/>
+      <w:r/>
+      <w:fldSimple w:instr="PAGEREF KhanhFig_07 \h " w:dirty="true">
+        <w:r>
+          <w:rPr>
+            <w:rFonts w:ascii="Times New Roman" w:hAnsi="Times New Roman" w:eastAsia="Times New Roman"/>
+            <w:color w:val="000000"/>
+            <w:sz w:val="28"/>
+          </w:rPr>
+          <w:t xml:space="preserve">24</w:t>
+        </w:r>
+      </w:fldSimple>
+      <w:r/>
+      <w:r/>
+    </w:p>
+    <w:p>
+      <w:pPr>
+        <w:pBdr/>
+        <w:tabs>
+          <w:tab w:val="right" w:leader="dot" w:pos="8856"/>
+        </w:tabs>
+        <w:spacing w:after="0" w:before="0" w:line="360" w:lineRule="auto"/>
+        <w:ind/>
+        <w:jc w:val="left"/>
+        <w:rPr/>
+      </w:pPr>
+    </w:p>
+    <w:p>
+      <w:pPr>
+        <w:pBdr/>
+        <w:tabs>
+          <w:tab w:val="right" w:leader="dot" w:pos="8856"/>
+        </w:tabs>
+        <w:spacing w:after="0" w:before="0" w:line="360" w:lineRule="auto"/>
+        <w:ind/>
+        <w:jc w:val="left"/>
+        <w:rPr/>
+      </w:pPr>
+    </w:p>
+    <w:p>
+      <w:pPr>
+        <w:pBdr/>
+        <w:tabs>
+          <w:tab w:val="right" w:leader="dot" w:pos="8856"/>
+        </w:tabs>
+        <w:spacing w:after="0" w:before="0" w:line="360" w:lineRule="auto"/>
+        <w:ind/>
+        <w:jc w:val="left"/>
+        <w:rPr/>
+      </w:pPr>
+    </w:p>
+    <w:p>
+      <w:pPr>
+        <w:pBdr/>
+        <w:tabs>
+          <w:tab w:val="right" w:leader="dot" w:pos="8856"/>
+        </w:tabs>
+        <w:spacing w:after="0" w:before="0" w:line="360" w:lineRule="auto"/>
+        <w:ind/>
+        <w:jc w:val="left"/>
+        <w:rPr/>
+      </w:pPr>
+    </w:p>
+    <w:p>
+      <w:pPr>
+        <w:pBdr/>
+        <w:tabs>
+          <w:tab w:val="right" w:leader="dot" w:pos="8856"/>
+        </w:tabs>
+        <w:spacing w:after="0" w:before="0" w:line="360" w:lineRule="auto"/>
+        <w:ind/>
+        <w:jc w:val="left"/>
+        <w:rPr/>
+      </w:pPr>
+      <w:bookmarkStart w:id="3122" w:name="KhanhListFig_101"/>
+      <w:r>
+        <w:rPr>
+          <w:rFonts w:ascii="Times New Roman" w:hAnsi="Times New Roman" w:eastAsia="Times New Roman" w:cs="Times New Roman"/>
+          <w:color w:val="000000"/>
+          <w:sz w:val="28"/>
+        </w:rPr>
+        <w:t>Hình 2.1. Kiến trúc phân cấp của thiết bị nhúng có kết nối mạng</w:t>
+      </w:r>
+      <w:r>
+        <w:tab/>
+      </w:r>
+      <w:bookmarkEnd w:id="3122"/>
+      <w:fldSimple w:instr="PAGEREF KhanhFig_09 \h " w:dirty="true">
+        <w:r>
+          <w:t>31</w:t>
+        </w:r>
+      </w:fldSimple>
+    </w:p>
+    <w:p>
+      <w:pPr>
+        <w:pBdr/>
+        <w:tabs>
+          <w:tab w:val="right" w:leader="dot" w:pos="8856"/>
+        </w:tabs>
+        <w:spacing w:after="0" w:before="0" w:line="360" w:lineRule="auto"/>
+        <w:ind/>
+        <w:jc w:val="left"/>
+        <w:rPr/>
+      </w:pPr>
+      <w:bookmarkStart w:id="3123" w:name="KhanhListFig_102"/>
+      <w:r>
+        <w:rPr>
+          <w:rFonts w:ascii="Times New Roman" w:hAnsi="Times New Roman" w:eastAsia="Times New Roman" w:cs="Times New Roman"/>
+          <w:color w:val="000000"/>
+          <w:sz w:val="28"/>
+        </w:rPr>
+        <w:t>Hình 2.2. Các lớp chính của hệ điều hành Linux nhúng</w:t>
+      </w:r>
+      <w:r>
+        <w:tab/>
+      </w:r>
+      <w:bookmarkEnd w:id="3123"/>
+      <w:fldSimple w:instr="PAGEREF KhanhFig_10 \h " w:dirty="true">
+        <w:r>
+          <w:t>32</w:t>
+        </w:r>
+      </w:fldSimple>
+    </w:p>
+    <w:p>
+      <w:pPr>
+        <w:pBdr/>
+        <w:tabs>
+          <w:tab w:val="right" w:leader="dot" w:pos="8856"/>
+        </w:tabs>
+        <w:spacing w:after="0" w:before="0" w:line="360" w:lineRule="auto"/>
+        <w:ind/>
+        <w:jc w:val="left"/>
+        <w:rPr/>
+      </w:pPr>
+      <w:bookmarkStart w:id="3124" w:name="KhanhListFig_103"/>
+      <w:r>
+        <w:rPr>
+          <w:rFonts w:ascii="Times New Roman" w:hAnsi="Times New Roman" w:eastAsia="Times New Roman" w:cs="Times New Roman"/>
+          <w:color w:val="000000"/>
+          <w:sz w:val="28"/>
+        </w:rPr>
+        <w:t>Hình 2.3. Ngăn xếp phần mềm nền tảng Android</w:t>
+      </w:r>
+      <w:r>
+        <w:tab/>
+      </w:r>
+      <w:bookmarkEnd w:id="3124"/>
+      <w:fldSimple w:instr="PAGEREF KhanhFig_11 \h " w:dirty="true">
+        <w:r>
+          <w:t>33</w:t>
+        </w:r>
+      </w:fldSimple>
+    </w:p>
+    <w:p>
+      <w:pPr>
+        <w:pBdr/>
+        <w:tabs>
+          <w:tab w:val="right" w:leader="dot" w:pos="8856"/>
+        </w:tabs>
+        <w:spacing w:after="0" w:before="0" w:line="360" w:lineRule="auto"/>
+        <w:ind/>
+        <w:jc w:val="left"/>
+        <w:rPr/>
+      </w:pPr>
+      <w:bookmarkStart w:id="3125" w:name="KhanhListFig_104"/>
+      <w:r>
+        <w:rPr>
+          <w:rFonts w:ascii="Times New Roman" w:hAnsi="Times New Roman" w:eastAsia="Times New Roman" w:cs="Times New Roman"/>
+          <w:color w:val="000000"/>
+          <w:sz w:val="28"/>
+        </w:rPr>
+        <w:t>Hình 2.4. Các thành phần khái quát trong ngăn xếp Network của Linux</w:t>
+      </w:r>
+      <w:r>
+        <w:tab/>
+      </w:r>
+      <w:bookmarkEnd w:id="3125"/>
+      <w:fldSimple w:instr="PAGEREF KhanhFig_12 \h " w:dirty="true">
+        <w:r>
+          <w:t>35</w:t>
+        </w:r>
+      </w:fldSimple>
+    </w:p>
+    <w:p>
+      <w:pPr>
+        <w:pBdr/>
+        <w:tabs>
+          <w:tab w:val="right" w:leader="dot" w:pos="8856"/>
+        </w:tabs>
+        <w:spacing w:after="0" w:before="0" w:line="360" w:lineRule="auto"/>
+        <w:ind/>
+        <w:jc w:val="left"/>
+        <w:rPr/>
+      </w:pPr>
+      <w:bookmarkStart w:id="3126" w:name="KhanhListFig_105"/>
+      <w:r>
+        <w:rPr>
+          <w:rFonts w:ascii="Times New Roman" w:hAnsi="Times New Roman" w:eastAsia="Times New Roman" w:cs="Times New Roman"/>
+          <w:color w:val="000000"/>
+          <w:sz w:val="28"/>
+        </w:rPr>
+        <w:t>Hình 2.5. Ánh xạ tham khảo giữa mô hình OSI và bộ giao thức TCP/IP</w:t>
+      </w:r>
+      <w:r>
+        <w:tab/>
+      </w:r>
+      <w:bookmarkEnd w:id="3126"/>
+      <w:fldSimple w:instr="PAGEREF KhanhFig_201 \h " w:dirty="true">
+        <w:r>
+          <w:t>37</w:t>
+        </w:r>
+      </w:fldSimple>
+    </w:p>
+    <w:p>
+      <w:pPr>
+        <w:pBdr/>
+        <w:tabs>
+          <w:tab w:val="right" w:leader="dot" w:pos="8856"/>
+        </w:tabs>
+        <w:spacing w:after="0" w:before="0" w:line="360" w:lineRule="auto"/>
+        <w:ind/>
+        <w:jc w:val="left"/>
+        <w:rPr/>
+      </w:pPr>
+      <w:bookmarkStart w:id="3127" w:name="KhanhListFig_106"/>
+      <w:r>
+        <w:rPr>
+          <w:rFonts w:ascii="Times New Roman" w:hAnsi="Times New Roman" w:eastAsia="Times New Roman" w:cs="Times New Roman"/>
+          <w:color w:val="000000"/>
+          <w:sz w:val="28"/>
+        </w:rPr>
+        <w:t>Hình 2.6. Các trục độc lập để phân loại Network</w:t>
+      </w:r>
+      <w:r>
+        <w:tab/>
+      </w:r>
+      <w:bookmarkEnd w:id="3127"/>
+      <w:fldSimple w:instr="PAGEREF KhanhFig_202 \h " w:dirty="true">
+        <w:r>
+          <w:t>39</w:t>
+        </w:r>
+      </w:fldSimple>
+    </w:p>
+    <w:p>
+      <w:pPr>
+        <w:pBdr/>
+        <w:tabs>
+          <w:tab w:val="right" w:leader="dot" w:pos="8856"/>
+        </w:tabs>
+        <w:spacing w:after="0" w:before="0" w:line="360" w:lineRule="auto"/>
+        <w:ind/>
+        <w:jc w:val="left"/>
+        <w:rPr/>
+      </w:pPr>
+      <w:bookmarkStart w:id="3128" w:name="KhanhListFig_107"/>
+      <w:r>
+        <w:rPr>
+          <w:rFonts w:ascii="Times New Roman" w:hAnsi="Times New Roman" w:eastAsia="Times New Roman" w:cs="Times New Roman"/>
+          <w:color w:val="000000"/>
+          <w:sz w:val="28"/>
+        </w:rPr>
+        <w:t>Hình 2.7. Từ liên kết truy nhập đến dịch vụ IP đầu cuối</w:t>
+      </w:r>
+      <w:r>
+        <w:tab/>
+      </w:r>
+      <w:bookmarkEnd w:id="3128"/>
+      <w:fldSimple w:instr="PAGEREF KhanhFig_203 \h " w:dirty="true">
+        <w:r>
+          <w:t>40</w:t>
+        </w:r>
+      </w:fldSimple>
+    </w:p>
+    <w:p>
+      <w:pPr>
+        <w:pBdr/>
+        <w:tabs>
+          <w:tab w:val="right" w:leader="dot" w:pos="8856"/>
+        </w:tabs>
+        <w:spacing w:after="0" w:before="0" w:line="360" w:lineRule="auto"/>
+        <w:ind/>
+        <w:jc w:val="left"/>
+        <w:rPr/>
+      </w:pPr>
+      <w:bookmarkStart w:id="3129" w:name="KhanhListFig_108"/>
+      <w:r>
+        <w:rPr>
+          <w:rFonts w:ascii="Times New Roman" w:hAnsi="Times New Roman" w:eastAsia="Times New Roman" w:cs="Times New Roman"/>
+          <w:color w:val="000000"/>
+          <w:sz w:val="28"/>
+        </w:rPr>
+        <w:t>Hình 2.8. Đường kết nối Ethernet từ thiết bị đến mạng ngoài</w:t>
+      </w:r>
+      <w:r>
+        <w:tab/>
+      </w:r>
+      <w:bookmarkEnd w:id="3129"/>
+      <w:fldSimple w:instr="PAGEREF KhanhFig_204 \h " w:dirty="true">
+        <w:r>
+          <w:t>42</w:t>
+        </w:r>
+      </w:fldSimple>
+    </w:p>
+    <w:p>
+      <w:pPr>
+        <w:pBdr/>
+        <w:tabs>
+          <w:tab w:val="right" w:leader="dot" w:pos="8856"/>
+        </w:tabs>
+        <w:spacing w:after="0" w:before="0" w:line="360" w:lineRule="auto"/>
+        <w:ind/>
+        <w:jc w:val="left"/>
+        <w:rPr/>
+      </w:pPr>
+      <w:bookmarkStart w:id="3130" w:name="KhanhListFig_109"/>
+      <w:r>
+        <w:rPr>
+          <w:rFonts w:ascii="Times New Roman" w:hAnsi="Times New Roman" w:eastAsia="Times New Roman" w:cs="Times New Roman"/>
+          <w:color w:val="000000"/>
+          <w:sz w:val="28"/>
+        </w:rPr>
+        <w:t>Hình 2.9. Đường kết nối Wi-Fi qua WLAN và điểm truy cập</w:t>
+      </w:r>
+      <w:r>
+        <w:tab/>
+      </w:r>
+      <w:bookmarkEnd w:id="3130"/>
+      <w:fldSimple w:instr="PAGEREF KhanhFig_205 \h " w:dirty="true">
+        <w:r>
+          <w:t>43</w:t>
+        </w:r>
+      </w:fldSimple>
+    </w:p>
+    <w:p>
+      <w:pPr>
+        <w:pBdr/>
+        <w:tabs>
+          <w:tab w:val="right" w:leader="dot" w:pos="8856"/>
+        </w:tabs>
+        <w:spacing w:after="0" w:before="0" w:line="360" w:lineRule="auto"/>
+        <w:ind/>
+        <w:jc w:val="left"/>
+        <w:rPr/>
+      </w:pPr>
+      <w:bookmarkStart w:id="3131" w:name="KhanhListFig_110"/>
+      <w:r>
+        <w:rPr>
+          <w:rFonts w:ascii="Times New Roman" w:hAnsi="Times New Roman" w:eastAsia="Times New Roman" w:cs="Times New Roman"/>
+          <w:color w:val="000000"/>
+          <w:sz w:val="28"/>
+        </w:rPr>
+        <w:t>Hình 2.10. Kiến trúc kết nối di động minh họa theo 4G/5G</w:t>
+      </w:r>
+      <w:r>
+        <w:tab/>
+      </w:r>
+      <w:bookmarkEnd w:id="3131"/>
+      <w:fldSimple w:instr="PAGEREF KhanhFig_206 \h " w:dirty="true">
+        <w:r>
+          <w:t>44</w:t>
+        </w:r>
+      </w:fldSimple>
+    </w:p>
+    <w:p>
+      <w:pPr>
+        <w:pBdr/>
+        <w:tabs>
+          <w:tab w:val="right" w:leader="dot" w:pos="8856"/>
+        </w:tabs>
+        <w:spacing w:after="0" w:before="0" w:line="360" w:lineRule="auto"/>
+        <w:ind/>
+        <w:jc w:val="left"/>
+        <w:rPr/>
+      </w:pPr>
+      <w:bookmarkStart w:id="3132" w:name="KhanhListFig_111"/>
+      <w:r>
+        <w:rPr>
+          <w:rFonts w:ascii="Times New Roman" w:hAnsi="Times New Roman" w:eastAsia="Times New Roman" w:cs="Times New Roman"/>
+          <w:color w:val="000000"/>
+          <w:sz w:val="28"/>
+        </w:rPr>
+        <w:t>Hình 2.11. Các giai đoạn Bring-up chức năng mạng trên thiết bị</w:t>
+      </w:r>
+      <w:r>
+        <w:tab/>
+      </w:r>
+      <w:bookmarkEnd w:id="3132"/>
+      <w:fldSimple w:instr="PAGEREF KhanhFig_207 \h " w:dirty="true">
+        <w:r>
+          <w:t>47</w:t>
+        </w:r>
+      </w:fldSimple>
+    </w:p>
+    <w:p>
+      <w:pPr>
+        <w:pBdr/>
+        <w:tabs>
+          <w:tab w:val="right" w:leader="dot" w:pos="8856"/>
+        </w:tabs>
+        <w:spacing w:after="0" w:before="0" w:line="360" w:lineRule="auto"/>
+        <w:ind/>
+        <w:jc w:val="left"/>
+        <w:rPr/>
+      </w:pPr>
+      <w:bookmarkStart w:id="3133" w:name="KhanhListFig_112"/>
+      <w:r>
+        <w:rPr>
+          <w:rFonts w:ascii="Times New Roman" w:hAnsi="Times New Roman" w:eastAsia="Times New Roman" w:cs="Times New Roman"/>
+          <w:color w:val="000000"/>
+          <w:sz w:val="28"/>
+        </w:rPr>
+        <w:t>Hình 2.12. Trình tự phân tích lỗi mạng theo bằng chứng từng lớp</w:t>
+      </w:r>
+      <w:r>
+        <w:tab/>
+      </w:r>
+      <w:bookmarkEnd w:id="3133"/>
+      <w:fldSimple w:instr="PAGEREF KhanhFig_208 \h " w:dirty="true">
+        <w:r>
+          <w:t>49</w:t>
+        </w:r>
+      </w:fldSimple>
+    </w:p>
+    <w:p>
+      <w:pPr>
+        <w:pBdr/>
+        <w:tabs>
+          <w:tab w:val="right" w:leader="dot" w:pos="8856"/>
+        </w:tabs>
+        <w:spacing w:after="0" w:before="0" w:line="360" w:lineRule="auto"/>
+        <w:ind/>
+        <w:jc w:val="left"/>
+        <w:rPr/>
+      </w:pPr>
+      <w:bookmarkStart w:id="3134" w:name="KhanhListFig_113"/>
+      <w:r>
+        <w:rPr>
+          <w:rFonts w:ascii="Times New Roman" w:hAnsi="Times New Roman" w:eastAsia="Times New Roman" w:cs="Times New Roman"/>
+          <w:color w:val="000000"/>
+          <w:sz w:val="28"/>
+        </w:rPr>
+        <w:t>Hình 2.13. Từ Bring-up nền tảng đến sản phẩm sẵn sàng triển khai</w:t>
+      </w:r>
+      <w:r>
+        <w:tab/>
+      </w:r>
+      <w:bookmarkEnd w:id="3134"/>
+      <w:fldSimple w:instr="PAGEREF KhanhFig_209 \h " w:dirty="true">
+        <w:r>
+          <w:rPr>
+            <w:rFonts w:ascii="Times New Roman" w:hAnsi="Times New Roman" w:eastAsia="Times New Roman"/>
+            <w:color w:val="000000"/>
+            <w:sz w:val="28"/>
+          </w:rPr>
+          <w:t>51</w:t>
+        </w:r>
+      </w:fldSimple>
+    </w:p>
+    <w:p>
+      <w:pPr>
+        <w:pStyle w:val="941"/>
+        <w:keepNext w:val="true"/>
+        <w:pBdr/>
+        <w:spacing w:after="0" w:before="0" w:line="360" w:lineRule="auto"/>
+        <w:ind/>
+        <w:jc w:val="center"/>
+        <w:rPr/>
+      </w:pPr>
+      <w:r/>
+      <w:bookmarkStart w:id="86" w:name="KhanhHead_004"/>
+      <w:r>
+        <w:rPr>
+          <w:rFonts w:ascii="Times New Roman" w:hAnsi="Times New Roman" w:eastAsia="Times New Roman" w:cs="Times New Roman"/>
+          <w:b/>
+          <w:color w:val="000000"/>
+          <w:sz w:val="28"/>
+        </w:rPr>
+        <w:t xml:space="preserve">DANH MỤC BẢNG</w:t>
+      </w:r>
+      <w:bookmarkEnd w:id="86"/>
+      <w:r/>
+      <w:r/>
+    </w:p>
+    <w:p>
+      <w:pPr>
+        <w:pBdr/>
+        <w:tabs>
+          <w:tab w:val="right" w:leader="dot" w:pos="8856"/>
+        </w:tabs>
+        <w:spacing w:after="0" w:before="0" w:line="360" w:lineRule="auto"/>
+        <w:ind/>
+        <w:jc w:val="left"/>
+        <w:rPr/>
+      </w:pPr>
+      <w:r/>
+      <w:bookmarkStart w:id="2301" w:name="KhanhListTbl_01"/>
+      <w:r>
+        <w:rPr>
+          <w:rFonts w:ascii="Times New Roman" w:hAnsi="Times New Roman" w:eastAsia="Times New Roman" w:cs="Times New Roman"/>
+          <w:color w:val="000000"/>
+          <w:sz w:val="28"/>
+        </w:rPr>
+        <w:t xml:space="preserve">Bảng 1.1. Năng lực HSPTEK công bố và liên hệ kỹ thuật</w:t>
+      </w:r>
+      <w:r>
+        <w:tab/>
+      </w:r>
+      <w:bookmarkEnd w:id="2301"/>
+      <w:r/>
+      <w:fldSimple w:instr="PAGEREF KhanhTable13 \h " w:dirty="true">
+        <w:r>
+          <w:rPr>
+            <w:rFonts w:ascii="Times New Roman" w:hAnsi="Times New Roman" w:eastAsia="Times New Roman"/>
+            <w:color w:val="000000"/>
+            <w:sz w:val="28"/>
+          </w:rPr>
+          <w:t xml:space="preserve">19</w:t>
+        </w:r>
+      </w:fldSimple>
+      <w:r/>
+      <w:r/>
+    </w:p>
+    <w:p>
+      <w:pPr>
+        <w:pBdr/>
+        <w:tabs>
+          <w:tab w:val="right" w:leader="dot" w:pos="8856"/>
+        </w:tabs>
+        <w:spacing w:after="0" w:before="0" w:line="360" w:lineRule="auto"/>
+        <w:ind/>
+        <w:jc w:val="left"/>
+        <w:rPr/>
+      </w:pPr>
+      <w:r/>
+      <w:bookmarkStart w:id="9011" w:name="KhanhListTbl_07"/>
+      <w:r>
+        <w:rPr>
+          <w:rFonts w:ascii="Times New Roman" w:hAnsi="Times New Roman" w:eastAsia="Times New Roman" w:cs="Times New Roman"/>
+          <w:color w:val="000000"/>
+          <w:sz w:val="28"/>
+        </w:rPr>
+        <w:t xml:space="preserve">Bảng 1.2. Các nhóm sản phẩm và nền tảng HSPTEK công bố</w:t>
+      </w:r>
+      <w:r>
+        <w:tab/>
+      </w:r>
+      <w:bookmarkEnd w:id="9011"/>
+      <w:r/>
+      <w:fldSimple w:instr="PAGEREF KhanhTbl_04 \h " w:dirty="true">
         <w:r>
           <w:rPr>
             <w:rFonts w:ascii="Times New Roman" w:hAnsi="Times New Roman" w:eastAsia="Times New Roman"/>
@@ -7062,630 +7686,6 @@
         <w:rPr/>
       </w:pPr>
       <w:r/>
-      <w:bookmarkStart w:id="3010" w:name="KhanhListFig_08"/>
-      <w:r>
-        <w:rPr>
-          <w:rFonts w:ascii="Times New Roman" w:hAnsi="Times New Roman" w:eastAsia="Times New Roman" w:cs="Times New Roman"/>
-          <w:color w:val="000000"/>
-          <w:sz w:val="28"/>
-        </w:rPr>
-        <w:t xml:space="preserve">Hình 1.5. Sơ đồ khối mô-đun máy tính KIMQ 8550</w:t>
-      </w:r>
-      <w:r>
-        <w:tab/>
-      </w:r>
-      <w:bookmarkEnd w:id="3010"/>
-      <w:r/>
-      <w:fldSimple w:instr="PAGEREF KhanhFig_08 \h " w:dirty="true">
-        <w:r>
-          <w:rPr>
-            <w:rFonts w:ascii="Times New Roman" w:hAnsi="Times New Roman" w:eastAsia="Times New Roman"/>
-            <w:color w:val="000000"/>
-            <w:sz w:val="28"/>
-          </w:rPr>
-          <w:t xml:space="preserve">22</w:t>
-        </w:r>
-      </w:fldSimple>
-      <w:r/>
-      <w:r/>
-    </w:p>
-    <w:p>
-      <w:pPr>
-        <w:pBdr/>
-        <w:tabs>
-          <w:tab w:val="right" w:leader="dot" w:pos="8856"/>
-        </w:tabs>
-        <w:spacing w:after="0" w:before="0" w:line="360" w:lineRule="auto"/>
-        <w:ind/>
-        <w:jc w:val="left"/>
-        <w:rPr/>
-      </w:pPr>
-      <w:r/>
-      <w:bookmarkStart w:id="2102" w:name="KhanhListFig_02"/>
-      <w:r>
-        <w:rPr>
-          <w:rFonts w:ascii="Times New Roman" w:hAnsi="Times New Roman" w:eastAsia="Times New Roman" w:cs="Times New Roman"/>
-          <w:color w:val="000000"/>
-          <w:sz w:val="28"/>
-        </w:rPr>
-        <w:t xml:space="preserve">Hình 1.6. Máy tính biên AI Box 6490</w:t>
-      </w:r>
-      <w:r>
-        <w:tab/>
-      </w:r>
-      <w:bookmarkEnd w:id="2102"/>
-      <w:r/>
-      <w:fldSimple w:instr="PAGEREF KhanhFig_07 \h " w:dirty="true">
-        <w:r>
-          <w:rPr>
-            <w:rFonts w:ascii="Times New Roman" w:hAnsi="Times New Roman" w:eastAsia="Times New Roman"/>
-            <w:color w:val="000000"/>
-            <w:sz w:val="28"/>
-          </w:rPr>
-          <w:t xml:space="preserve">23</w:t>
-        </w:r>
-      </w:fldSimple>
-      <w:r/>
-      <w:r/>
-    </w:p>
-    <w:p>
-      <w:pPr>
-        <w:pBdr/>
-        <w:tabs>
-          <w:tab w:val="right" w:leader="dot" w:pos="8856"/>
-        </w:tabs>
-        <w:spacing w:after="0" w:before="0" w:line="360" w:lineRule="auto"/>
-        <w:ind/>
-        <w:jc w:val="left"/>
-        <w:rPr/>
-      </w:pPr>
-    </w:p>
-    <w:p>
-      <w:pPr>
-        <w:pBdr/>
-        <w:tabs>
-          <w:tab w:val="right" w:leader="dot" w:pos="8856"/>
-        </w:tabs>
-        <w:spacing w:after="0" w:before="0" w:line="360" w:lineRule="auto"/>
-        <w:ind/>
-        <w:jc w:val="left"/>
-        <w:rPr/>
-      </w:pPr>
-    </w:p>
-    <w:p>
-      <w:pPr>
-        <w:pBdr/>
-        <w:tabs>
-          <w:tab w:val="right" w:leader="dot" w:pos="8856"/>
-        </w:tabs>
-        <w:spacing w:after="0" w:before="0" w:line="360" w:lineRule="auto"/>
-        <w:ind/>
-        <w:jc w:val="left"/>
-        <w:rPr/>
-      </w:pPr>
-    </w:p>
-    <w:p>
-      <w:pPr>
-        <w:pBdr/>
-        <w:tabs>
-          <w:tab w:val="right" w:leader="dot" w:pos="8856"/>
-        </w:tabs>
-        <w:spacing w:after="0" w:before="0" w:line="360" w:lineRule="auto"/>
-        <w:ind/>
-        <w:jc w:val="left"/>
-        <w:rPr/>
-      </w:pPr>
-    </w:p>
-    <w:p>
-      <w:pPr>
-        <w:pBdr/>
-        <w:tabs>
-          <w:tab w:val="right" w:leader="dot" w:pos="8856"/>
-        </w:tabs>
-        <w:spacing w:after="0" w:before="0" w:line="360" w:lineRule="auto"/>
-        <w:ind/>
-        <w:jc w:val="left"/>
-        <w:rPr/>
-      </w:pPr>
-      <w:bookmarkStart w:id="3122" w:name="KhanhListFig_101"/>
-      <w:r>
-        <w:rPr>
-          <w:rFonts w:ascii="Times New Roman" w:hAnsi="Times New Roman" w:eastAsia="Times New Roman" w:cs="Times New Roman"/>
-          <w:color w:val="000000"/>
-          <w:sz w:val="28"/>
-        </w:rPr>
-        <w:t>Hình 2.1. Kiến trúc phân cấp của thiết bị nhúng có kết nối mạng</w:t>
-      </w:r>
-      <w:r>
-        <w:tab/>
-      </w:r>
-      <w:bookmarkEnd w:id="3122"/>
-      <w:fldSimple w:instr="PAGEREF KhanhFig_09 \h " w:dirty="true">
-        <w:r>
-          <w:t>1</w:t>
-        </w:r>
-      </w:fldSimple>
-    </w:p>
-    <w:p>
-      <w:pPr>
-        <w:pBdr/>
-        <w:tabs>
-          <w:tab w:val="right" w:leader="dot" w:pos="8856"/>
-        </w:tabs>
-        <w:spacing w:after="0" w:before="0" w:line="360" w:lineRule="auto"/>
-        <w:ind/>
-        <w:jc w:val="left"/>
-        <w:rPr/>
-      </w:pPr>
-      <w:bookmarkStart w:id="3123" w:name="KhanhListFig_102"/>
-      <w:r>
-        <w:rPr>
-          <w:rFonts w:ascii="Times New Roman" w:hAnsi="Times New Roman" w:eastAsia="Times New Roman" w:cs="Times New Roman"/>
-          <w:color w:val="000000"/>
-          <w:sz w:val="28"/>
-        </w:rPr>
-        <w:t>Hình 2.2. Các lớp chính của hệ điều hành Linux nhúng</w:t>
-      </w:r>
-      <w:r>
-        <w:tab/>
-      </w:r>
-      <w:bookmarkEnd w:id="3123"/>
-      <w:fldSimple w:instr="PAGEREF KhanhFig_10 \h " w:dirty="true">
-        <w:r>
-          <w:t>1</w:t>
-        </w:r>
-      </w:fldSimple>
-    </w:p>
-    <w:p>
-      <w:pPr>
-        <w:pBdr/>
-        <w:tabs>
-          <w:tab w:val="right" w:leader="dot" w:pos="8856"/>
-        </w:tabs>
-        <w:spacing w:after="0" w:before="0" w:line="360" w:lineRule="auto"/>
-        <w:ind/>
-        <w:jc w:val="left"/>
-        <w:rPr/>
-      </w:pPr>
-      <w:bookmarkStart w:id="3124" w:name="KhanhListFig_103"/>
-      <w:r>
-        <w:rPr>
-          <w:rFonts w:ascii="Times New Roman" w:hAnsi="Times New Roman" w:eastAsia="Times New Roman" w:cs="Times New Roman"/>
-          <w:color w:val="000000"/>
-          <w:sz w:val="28"/>
-        </w:rPr>
-        <w:t>Hình 2.3. Ngăn xếp phần mềm nền tảng Android</w:t>
-      </w:r>
-      <w:r>
-        <w:tab/>
-      </w:r>
-      <w:bookmarkEnd w:id="3124"/>
-      <w:fldSimple w:instr="PAGEREF KhanhFig_11 \h " w:dirty="true">
-        <w:r>
-          <w:t>1</w:t>
-        </w:r>
-      </w:fldSimple>
-    </w:p>
-    <w:p>
-      <w:pPr>
-        <w:pBdr/>
-        <w:tabs>
-          <w:tab w:val="right" w:leader="dot" w:pos="8856"/>
-        </w:tabs>
-        <w:spacing w:after="0" w:before="0" w:line="360" w:lineRule="auto"/>
-        <w:ind/>
-        <w:jc w:val="left"/>
-        <w:rPr/>
-      </w:pPr>
-      <w:bookmarkStart w:id="3125" w:name="KhanhListFig_104"/>
-      <w:r>
-        <w:rPr>
-          <w:rFonts w:ascii="Times New Roman" w:hAnsi="Times New Roman" w:eastAsia="Times New Roman" w:cs="Times New Roman"/>
-          <w:color w:val="000000"/>
-          <w:sz w:val="28"/>
-        </w:rPr>
-        <w:t>Hình 2.4. Các thành phần khái quát trong ngăn xếp Network của Linux</w:t>
-      </w:r>
-      <w:r>
-        <w:tab/>
-      </w:r>
-      <w:bookmarkEnd w:id="3125"/>
-      <w:fldSimple w:instr="PAGEREF KhanhFig_12 \h " w:dirty="true">
-        <w:r>
-          <w:t>1</w:t>
-        </w:r>
-      </w:fldSimple>
-    </w:p>
-    <w:p>
-      <w:pPr>
-        <w:pBdr/>
-        <w:tabs>
-          <w:tab w:val="right" w:leader="dot" w:pos="8856"/>
-        </w:tabs>
-        <w:spacing w:after="0" w:before="0" w:line="360" w:lineRule="auto"/>
-        <w:ind/>
-        <w:jc w:val="left"/>
-        <w:rPr/>
-      </w:pPr>
-      <w:bookmarkStart w:id="3126" w:name="KhanhListFig_105"/>
-      <w:r>
-        <w:rPr>
-          <w:rFonts w:ascii="Times New Roman" w:hAnsi="Times New Roman" w:eastAsia="Times New Roman" w:cs="Times New Roman"/>
-          <w:color w:val="000000"/>
-          <w:sz w:val="28"/>
-        </w:rPr>
-        <w:t>Hình 2.5. Ánh xạ tham khảo giữa mô hình OSI và bộ giao thức TCP/IP</w:t>
-      </w:r>
-      <w:r>
-        <w:tab/>
-      </w:r>
-      <w:bookmarkEnd w:id="3126"/>
-      <w:fldSimple w:instr="PAGEREF KhanhFig_201 \h " w:dirty="true">
-        <w:r>
-          <w:t>1</w:t>
-        </w:r>
-      </w:fldSimple>
-    </w:p>
-    <w:p>
-      <w:pPr>
-        <w:pBdr/>
-        <w:tabs>
-          <w:tab w:val="right" w:leader="dot" w:pos="8856"/>
-        </w:tabs>
-        <w:spacing w:after="0" w:before="0" w:line="360" w:lineRule="auto"/>
-        <w:ind/>
-        <w:jc w:val="left"/>
-        <w:rPr/>
-      </w:pPr>
-      <w:bookmarkStart w:id="3127" w:name="KhanhListFig_106"/>
-      <w:r>
-        <w:rPr>
-          <w:rFonts w:ascii="Times New Roman" w:hAnsi="Times New Roman" w:eastAsia="Times New Roman" w:cs="Times New Roman"/>
-          <w:color w:val="000000"/>
-          <w:sz w:val="28"/>
-        </w:rPr>
-        <w:t>Hình 2.6. Các trục độc lập để phân loại Network</w:t>
-      </w:r>
-      <w:r>
-        <w:tab/>
-      </w:r>
-      <w:bookmarkEnd w:id="3127"/>
-      <w:fldSimple w:instr="PAGEREF KhanhFig_202 \h " w:dirty="true">
-        <w:r>
-          <w:t>1</w:t>
-        </w:r>
-      </w:fldSimple>
-    </w:p>
-    <w:p>
-      <w:pPr>
-        <w:pBdr/>
-        <w:tabs>
-          <w:tab w:val="right" w:leader="dot" w:pos="8856"/>
-        </w:tabs>
-        <w:spacing w:after="0" w:before="0" w:line="360" w:lineRule="auto"/>
-        <w:ind/>
-        <w:jc w:val="left"/>
-        <w:rPr/>
-      </w:pPr>
-      <w:bookmarkStart w:id="3128" w:name="KhanhListFig_107"/>
-      <w:r>
-        <w:rPr>
-          <w:rFonts w:ascii="Times New Roman" w:hAnsi="Times New Roman" w:eastAsia="Times New Roman" w:cs="Times New Roman"/>
-          <w:color w:val="000000"/>
-          <w:sz w:val="28"/>
-        </w:rPr>
-        <w:t>Hình 2.7. Từ liên kết truy nhập đến dịch vụ IP đầu cuối</w:t>
-      </w:r>
-      <w:r>
-        <w:tab/>
-      </w:r>
-      <w:bookmarkEnd w:id="3128"/>
-      <w:fldSimple w:instr="PAGEREF KhanhFig_203 \h " w:dirty="true">
-        <w:r>
-          <w:t>1</w:t>
-        </w:r>
-      </w:fldSimple>
-    </w:p>
-    <w:p>
-      <w:pPr>
-        <w:pBdr/>
-        <w:tabs>
-          <w:tab w:val="right" w:leader="dot" w:pos="8856"/>
-        </w:tabs>
-        <w:spacing w:after="0" w:before="0" w:line="360" w:lineRule="auto"/>
-        <w:ind/>
-        <w:jc w:val="left"/>
-        <w:rPr/>
-      </w:pPr>
-      <w:bookmarkStart w:id="3129" w:name="KhanhListFig_108"/>
-      <w:r>
-        <w:rPr>
-          <w:rFonts w:ascii="Times New Roman" w:hAnsi="Times New Roman" w:eastAsia="Times New Roman" w:cs="Times New Roman"/>
-          <w:color w:val="000000"/>
-          <w:sz w:val="28"/>
-        </w:rPr>
-        <w:t>Hình 2.8. Đường kết nối Ethernet từ thiết bị đến mạng ngoài</w:t>
-      </w:r>
-      <w:r>
-        <w:tab/>
-      </w:r>
-      <w:bookmarkEnd w:id="3129"/>
-      <w:fldSimple w:instr="PAGEREF KhanhFig_204 \h " w:dirty="true">
-        <w:r>
-          <w:t>1</w:t>
-        </w:r>
-      </w:fldSimple>
-    </w:p>
-    <w:p>
-      <w:pPr>
-        <w:pBdr/>
-        <w:tabs>
-          <w:tab w:val="right" w:leader="dot" w:pos="8856"/>
-        </w:tabs>
-        <w:spacing w:after="0" w:before="0" w:line="360" w:lineRule="auto"/>
-        <w:ind/>
-        <w:jc w:val="left"/>
-        <w:rPr/>
-      </w:pPr>
-      <w:bookmarkStart w:id="3130" w:name="KhanhListFig_109"/>
-      <w:r>
-        <w:rPr>
-          <w:rFonts w:ascii="Times New Roman" w:hAnsi="Times New Roman" w:eastAsia="Times New Roman" w:cs="Times New Roman"/>
-          <w:color w:val="000000"/>
-          <w:sz w:val="28"/>
-        </w:rPr>
-        <w:t>Hình 2.9. Đường kết nối Wi-Fi qua WLAN và điểm truy cập</w:t>
-      </w:r>
-      <w:r>
-        <w:tab/>
-      </w:r>
-      <w:bookmarkEnd w:id="3130"/>
-      <w:fldSimple w:instr="PAGEREF KhanhFig_205 \h " w:dirty="true">
-        <w:r>
-          <w:t>1</w:t>
-        </w:r>
-      </w:fldSimple>
-    </w:p>
-    <w:p>
-      <w:pPr>
-        <w:pBdr/>
-        <w:tabs>
-          <w:tab w:val="right" w:leader="dot" w:pos="8856"/>
-        </w:tabs>
-        <w:spacing w:after="0" w:before="0" w:line="360" w:lineRule="auto"/>
-        <w:ind/>
-        <w:jc w:val="left"/>
-        <w:rPr/>
-      </w:pPr>
-      <w:bookmarkStart w:id="3131" w:name="KhanhListFig_110"/>
-      <w:r>
-        <w:rPr>
-          <w:rFonts w:ascii="Times New Roman" w:hAnsi="Times New Roman" w:eastAsia="Times New Roman" w:cs="Times New Roman"/>
-          <w:color w:val="000000"/>
-          <w:sz w:val="28"/>
-        </w:rPr>
-        <w:t>Hình 2.10. Kiến trúc kết nối di động minh họa theo 4G/5G</w:t>
-      </w:r>
-      <w:r>
-        <w:tab/>
-      </w:r>
-      <w:bookmarkEnd w:id="3131"/>
-      <w:fldSimple w:instr="PAGEREF KhanhFig_206 \h " w:dirty="true">
-        <w:r>
-          <w:t>1</w:t>
-        </w:r>
-      </w:fldSimple>
-    </w:p>
-    <w:p>
-      <w:pPr>
-        <w:pBdr/>
-        <w:tabs>
-          <w:tab w:val="right" w:leader="dot" w:pos="8856"/>
-        </w:tabs>
-        <w:spacing w:after="0" w:before="0" w:line="360" w:lineRule="auto"/>
-        <w:ind/>
-        <w:jc w:val="left"/>
-        <w:rPr/>
-      </w:pPr>
-      <w:bookmarkStart w:id="3132" w:name="KhanhListFig_111"/>
-      <w:r>
-        <w:rPr>
-          <w:rFonts w:ascii="Times New Roman" w:hAnsi="Times New Roman" w:eastAsia="Times New Roman" w:cs="Times New Roman"/>
-          <w:color w:val="000000"/>
-          <w:sz w:val="28"/>
-        </w:rPr>
-        <w:t>Hình 2.11. Các giai đoạn Bring-up chức năng mạng trên thiết bị</w:t>
-      </w:r>
-      <w:r>
-        <w:tab/>
-      </w:r>
-      <w:bookmarkEnd w:id="3132"/>
-      <w:fldSimple w:instr="PAGEREF KhanhFig_207 \h " w:dirty="true">
-        <w:r>
-          <w:t>1</w:t>
-        </w:r>
-      </w:fldSimple>
-    </w:p>
-    <w:p>
-      <w:pPr>
-        <w:pBdr/>
-        <w:tabs>
-          <w:tab w:val="right" w:leader="dot" w:pos="8856"/>
-        </w:tabs>
-        <w:spacing w:after="0" w:before="0" w:line="360" w:lineRule="auto"/>
-        <w:ind/>
-        <w:jc w:val="left"/>
-        <w:rPr/>
-      </w:pPr>
-      <w:bookmarkStart w:id="3133" w:name="KhanhListFig_112"/>
-      <w:r>
-        <w:rPr>
-          <w:rFonts w:ascii="Times New Roman" w:hAnsi="Times New Roman" w:eastAsia="Times New Roman" w:cs="Times New Roman"/>
-          <w:color w:val="000000"/>
-          <w:sz w:val="28"/>
-        </w:rPr>
-        <w:t>Hình 2.12. Trình tự phân tích lỗi mạng theo bằng chứng từng lớp</w:t>
-      </w:r>
-      <w:r>
-        <w:tab/>
-      </w:r>
-      <w:bookmarkEnd w:id="3133"/>
-      <w:fldSimple w:instr="PAGEREF KhanhFig_208 \h " w:dirty="true">
-        <w:r>
-          <w:t>1</w:t>
-        </w:r>
-      </w:fldSimple>
-    </w:p>
-    <w:p>
-      <w:pPr>
-        <w:pBdr/>
-        <w:tabs>
-          <w:tab w:val="right" w:leader="dot" w:pos="8856"/>
-        </w:tabs>
-        <w:spacing w:after="0" w:before="0" w:line="360" w:lineRule="auto"/>
-        <w:ind/>
-        <w:jc w:val="left"/>
-        <w:rPr/>
-      </w:pPr>
-      <w:bookmarkStart w:id="3134" w:name="KhanhListFig_113"/>
-      <w:r>
-        <w:rPr>
-          <w:rFonts w:ascii="Times New Roman" w:hAnsi="Times New Roman" w:eastAsia="Times New Roman" w:cs="Times New Roman"/>
-          <w:color w:val="000000"/>
-          <w:sz w:val="28"/>
-        </w:rPr>
-        <w:t>Hình 2.13. Từ Bring-up nền tảng đến sản phẩm sẵn sàng triển khai</w:t>
-      </w:r>
-      <w:r>
-        <w:tab/>
-      </w:r>
-      <w:bookmarkEnd w:id="3134"/>
-      <w:fldSimple w:instr="PAGEREF KhanhFig_209 \h " w:dirty="true">
-        <w:r>
-          <w:rPr>
-            <w:rFonts w:ascii="Times New Roman" w:hAnsi="Times New Roman" w:eastAsia="Times New Roman"/>
-            <w:color w:val="000000"/>
-            <w:sz w:val="28"/>
-          </w:rPr>
-          <w:t>1</w:t>
-        </w:r>
-      </w:fldSimple>
-    </w:p>
-    <w:p>
-      <w:pPr>
-        <w:pStyle w:val="941"/>
-        <w:keepNext w:val="true"/>
-        <w:pBdr/>
-        <w:spacing w:after="0" w:before="0" w:line="360" w:lineRule="auto"/>
-        <w:ind/>
-        <w:jc w:val="center"/>
-        <w:rPr/>
-      </w:pPr>
-      <w:r/>
-      <w:bookmarkStart w:id="86" w:name="KhanhHead_004"/>
-      <w:r>
-        <w:rPr>
-          <w:rFonts w:ascii="Times New Roman" w:hAnsi="Times New Roman" w:eastAsia="Times New Roman" w:cs="Times New Roman"/>
-          <w:b/>
-          <w:color w:val="000000"/>
-          <w:sz w:val="28"/>
-        </w:rPr>
-        <w:t xml:space="preserve">DANH MỤC BẢNG</w:t>
-      </w:r>
-      <w:bookmarkEnd w:id="86"/>
-      <w:r/>
-      <w:r/>
-    </w:p>
-    <w:p>
-      <w:pPr>
-        <w:pBdr/>
-        <w:tabs>
-          <w:tab w:val="right" w:leader="dot" w:pos="8856"/>
-        </w:tabs>
-        <w:spacing w:after="0" w:before="0" w:line="360" w:lineRule="auto"/>
-        <w:ind/>
-        <w:jc w:val="left"/>
-        <w:rPr/>
-      </w:pPr>
-      <w:r/>
-      <w:bookmarkStart w:id="2301" w:name="KhanhListTbl_01"/>
-      <w:r>
-        <w:rPr>
-          <w:rFonts w:ascii="Times New Roman" w:hAnsi="Times New Roman" w:eastAsia="Times New Roman" w:cs="Times New Roman"/>
-          <w:color w:val="000000"/>
-          <w:sz w:val="28"/>
-        </w:rPr>
-        <w:t xml:space="preserve">Bảng 1.1. Năng lực HSPTEK công bố và liên hệ kỹ thuật</w:t>
-      </w:r>
-      <w:r>
-        <w:tab/>
-      </w:r>
-      <w:bookmarkEnd w:id="2301"/>
-      <w:r/>
-      <w:fldSimple w:instr="PAGEREF KhanhTable13 \h " w:dirty="true">
-        <w:r>
-          <w:rPr>
-            <w:rFonts w:ascii="Times New Roman" w:hAnsi="Times New Roman" w:eastAsia="Times New Roman"/>
-            <w:color w:val="000000"/>
-            <w:sz w:val="28"/>
-          </w:rPr>
-          <w:t xml:space="preserve">17</w:t>
-        </w:r>
-      </w:fldSimple>
-      <w:r/>
-      <w:r/>
-    </w:p>
-    <w:p>
-      <w:pPr>
-        <w:pBdr/>
-        <w:tabs>
-          <w:tab w:val="right" w:leader="dot" w:pos="8856"/>
-        </w:tabs>
-        <w:spacing w:after="0" w:before="0" w:line="360" w:lineRule="auto"/>
-        <w:ind/>
-        <w:jc w:val="left"/>
-        <w:rPr/>
-      </w:pPr>
-      <w:r/>
-      <w:bookmarkStart w:id="9011" w:name="KhanhListTbl_07"/>
-      <w:r>
-        <w:rPr>
-          <w:rFonts w:ascii="Times New Roman" w:hAnsi="Times New Roman" w:eastAsia="Times New Roman" w:cs="Times New Roman"/>
-          <w:color w:val="000000"/>
-          <w:sz w:val="28"/>
-        </w:rPr>
-        <w:t xml:space="preserve">Bảng 1.2. Các nhóm sản phẩm và nền tảng HSPTEK công bố</w:t>
-      </w:r>
-      <w:r>
-        <w:tab/>
-      </w:r>
-      <w:bookmarkEnd w:id="9011"/>
-      <w:r/>
-      <w:fldSimple w:instr="PAGEREF KhanhTbl_04 \h " w:dirty="true">
-        <w:r>
-          <w:rPr>
-            <w:rFonts w:ascii="Times New Roman" w:hAnsi="Times New Roman" w:eastAsia="Times New Roman"/>
-            <w:color w:val="000000"/>
-            <w:sz w:val="28"/>
-          </w:rPr>
-          <w:t xml:space="preserve">20</w:t>
-        </w:r>
-      </w:fldSimple>
-      <w:r/>
-      <w:r/>
-    </w:p>
-    <w:p>
-      <w:pPr>
-        <w:pBdr/>
-        <w:tabs>
-          <w:tab w:val="right" w:leader="dot" w:pos="8856"/>
-        </w:tabs>
-        <w:spacing w:after="0" w:before="0" w:line="360" w:lineRule="auto"/>
-        <w:ind/>
-        <w:jc w:val="left"/>
-        <w:rPr/>
-      </w:pPr>
-      <w:r/>
       <w:bookmarkStart w:id="2302" w:name="KhanhListTbl_02"/>
       <w:r>
         <w:rPr>
@@ -7707,7 +7707,7 @@
             <w:color w:val="000000"/>
             <w:sz w:val="28"/>
           </w:rPr>
-          <w:t xml:space="preserve">25</w:t>
+          <w:t xml:space="preserve">26</w:t>
         </w:r>
       </w:fldSimple>
       <w:r/>
@@ -7770,7 +7770,7 @@
             <w:color w:val="000000"/>
             <w:sz w:val="28"/>
           </w:rPr>
-          <w:t xml:space="preserve">54</w:t>
+          <w:t xml:space="preserve">57</w:t>
         </w:r>
       </w:fldSimple>
       <w:r/>
@@ -7809,7 +7809,7 @@
             <w:color w:val="000000"/>
             <w:sz w:val="28"/>
           </w:rPr>
-          <w:t xml:space="preserve">56</w:t>
+          <w:t xml:space="preserve">59</w:t>
         </w:r>
       </w:fldSimple>
       <w:r/>
@@ -7841,7 +7841,7 @@
       <w:bookmarkEnd w:id="3142"/>
       <w:fldSimple w:instr="PAGEREF KhanhTbl_06 \h " w:dirty="true">
         <w:r>
-          <w:t>1</w:t>
+          <w:t>38</w:t>
         </w:r>
       </w:fldSimple>
     </w:p>
@@ -7871,7 +7871,7 @@
       <w:bookmarkEnd w:id="3143"/>
       <w:fldSimple w:instr="PAGEREF KhanhTbl_201 \h " w:dirty="true">
         <w:r>
-          <w:t>1</w:t>
+          <w:t>39</w:t>
         </w:r>
       </w:fldSimple>
     </w:p>
@@ -7906,7 +7906,7 @@
             <w:color w:val="000000"/>
             <w:sz w:val="28"/>
           </w:rPr>
-          <w:t>1</w:t>
+          <w:t>48</w:t>
         </w:r>
       </w:fldSimple>
     </w:p>

</xml_diff>